<commit_message>
Deploying to gh-pages from @ Morrison-Lab/pds@7c3ff5b6807a004baedf30de98d21214414128f2 🚀
</commit_message>
<xml_diff>
--- a/random-variables.docx
+++ b/random-variables.docx
@@ -15,7 +15,7 @@
         <w:pStyle w:val="Date"/>
       </w:pPr>
       <w:r>
-        <w:t xml:space="preserve">Last modified: 2026-10-08 22:59:46 (PDT)</w:t>
+        <w:t xml:space="preserve">Last modified: 2026-10-09 09:51:06 (PDT)</w:t>
       </w:r>
     </w:p>
     <w:bookmarkStart w:id="24" w:name="sec-random-variables"/>
@@ -41965,94 +41965,98 @@
                 </m:rPr>
                 <m:t>=</m:t>
               </m:r>
-              <m:f>
-                <m:fPr>
-                  <m:type m:val="bar"/>
-                </m:fPr>
-                <m:num>
-                  <m:r>
-                    <m:rPr>
-                      <m:sty m:val="p"/>
-                    </m:rPr>
-                    <m:t>∂</m:t>
-                  </m:r>
-                </m:num>
-                <m:den>
-                  <m:r>
-                    <m:rPr>
-                      <m:sty m:val="p"/>
-                    </m:rPr>
-                    <m:t>∂</m:t>
-                  </m:r>
-                  <m:r>
-                    <m:rPr>
-                      <m:sty m:val="p"/>
-                    </m:rPr>
-                    <m:t>Δ</m:t>
-                  </m:r>
-                </m:den>
-              </m:f>
-              <m:r>
-                <m:t>​</m:t>
-              </m:r>
-              <m:d>
-                <m:dPr>
-                  <m:begChr m:val="("/>
-                  <m:sepChr m:val=""/>
-                  <m:endChr m:val=")"/>
-                  <m:grow/>
-                </m:dPr>
+              <m:sSub>
                 <m:e>
-                  <m:r>
-                    <m:t>1</m:t>
-                  </m:r>
-                  <m:r>
-                    <m:rPr>
-                      <m:sty m:val="p"/>
-                    </m:rPr>
-                    <m:t>−</m:t>
-                  </m:r>
-                  <m:sSup>
+                  <m:d>
+                    <m:dPr>
+                      <m:begChr m:val=""/>
+                      <m:sepChr m:val=""/>
+                      <m:endChr m:val="|"/>
+                      <m:grow/>
+                    </m:dPr>
                     <m:e>
+                      <m:f>
+                        <m:fPr>
+                          <m:type m:val="bar"/>
+                        </m:fPr>
+                        <m:num>
+                          <m:r>
+                            <m:rPr>
+                              <m:sty m:val="p"/>
+                            </m:rPr>
+                            <m:t>∂</m:t>
+                          </m:r>
+                        </m:num>
+                        <m:den>
+                          <m:r>
+                            <m:rPr>
+                              <m:sty m:val="p"/>
+                            </m:rPr>
+                            <m:t>∂</m:t>
+                          </m:r>
+                          <m:r>
+                            <m:rPr>
+                              <m:sty m:val="p"/>
+                            </m:rPr>
+                            <m:t>Δ</m:t>
+                          </m:r>
+                        </m:den>
+                      </m:f>
                       <m:r>
-                        <m:rPr>
-                          <m:nor/>
-                          <m:sty m:val="p"/>
-                        </m:rPr>
-                        <m:t>e</m:t>
+                        <m:t>​</m:t>
+                      </m:r>
+                      <m:d>
+                        <m:dPr>
+                          <m:begChr m:val="("/>
+                          <m:sepChr m:val=""/>
+                          <m:endChr m:val=")"/>
+                          <m:grow/>
+                        </m:dPr>
+                        <m:e>
+                          <m:r>
+                            <m:t>1</m:t>
+                          </m:r>
+                          <m:r>
+                            <m:rPr>
+                              <m:sty m:val="p"/>
+                            </m:rPr>
+                            <m:t>−</m:t>
+                          </m:r>
+                          <m:sSup>
+                            <m:e>
+                              <m:r>
+                                <m:rPr>
+                                  <m:nor/>
+                                  <m:sty m:val="p"/>
+                                </m:rPr>
+                                <m:t>e</m:t>
+                              </m:r>
+                            </m:e>
+                            <m:sup>
+                              <m:r>
+                                <m:rPr>
+                                  <m:sty m:val="p"/>
+                                </m:rPr>
+                                <m:t>−</m:t>
+                              </m:r>
+                              <m:r>
+                                <m:t>2</m:t>
+                              </m:r>
+                              <m:r>
+                                <m:rPr>
+                                  <m:sty m:val="p"/>
+                                </m:rPr>
+                                <m:t>Δ</m:t>
+                              </m:r>
+                            </m:sup>
+                          </m:sSup>
+                        </m:e>
+                      </m:d>
+                      <m:r>
+                        <m:t>​</m:t>
                       </m:r>
                     </m:e>
-                    <m:sup>
-                      <m:r>
-                        <m:rPr>
-                          <m:sty m:val="p"/>
-                        </m:rPr>
-                        <m:t>−</m:t>
-                      </m:r>
-                      <m:r>
-                        <m:t>2</m:t>
-                      </m:r>
-                      <m:r>
-                        <m:rPr>
-                          <m:sty m:val="p"/>
-                        </m:rPr>
-                        <m:t>Δ</m:t>
-                      </m:r>
-                    </m:sup>
-                  </m:sSup>
-                </m:e>
-              </m:d>
-              <m:r>
-                <m:t>​</m:t>
-              </m:r>
-              <m:sSub>
-                <m:e>
-                  <m:r>
-                    <m:rPr>
-                      <m:sty m:val="p"/>
-                    </m:rPr>
-                    <m:t>|</m:t>
-                  </m:r>
+                  </m:d>
                 </m:e>
                 <m:sub>
                   <m:r>

</xml_diff>

<commit_message>
Deploying to gh-pages from @ Morrison-Lab/pds@5cf02bca6e37a0f03bfdf7cd29bef23026ba30b5 🚀
</commit_message>
<xml_diff>
--- a/random-variables.docx
+++ b/random-variables.docx
@@ -15,7 +15,7 @@
         <w:pStyle w:val="Date"/>
       </w:pPr>
       <w:r>
-        <w:t xml:space="preserve">Last modified: 2026-10-14 00:28:11 (PDT)</w:t>
+        <w:t xml:space="preserve">Last modified: 2026-10-14 00:48:01 (PDT)</w:t>
       </w:r>
     </w:p>
     <w:bookmarkStart w:id="25" w:name="sec-random-variables"/>
@@ -10930,19 +10930,25 @@
         <w:t xml:space="preserve">. </w:t>
       </w:r>
       <w:r>
-        <w:t xml:space="preserve">The proof evaluates three integrals by calculus,</w:t>
-      </w:r>
-      <w:r>
-        <w:t xml:space="preserve"> </w:t>
-      </w:r>
-      <w:r>
-        <w:t xml:space="preserve">one of them the Gaussian integral;</w:t>
-      </w:r>
-      <w:r>
-        <w:t xml:space="preserve"> </w:t>
-      </w:r>
-      <w:r>
-        <w:t xml:space="preserve">it is omitted here</w:t>
+        <w:t xml:space="preserve">The proofs of these two theorems evaluate three integrals by calculus:</w:t>
+      </w:r>
+      <w:r>
+        <w:t xml:space="preserve"> </w:t>
+      </w:r>
+      <w:r>
+        <w:t xml:space="preserve">the total of the density, the mean integral and the variance integral.</w:t>
+      </w:r>
+      <w:r>
+        <w:t xml:space="preserve"> </w:t>
+      </w:r>
+      <w:r>
+        <w:t xml:space="preserve">The total is the Gaussian integral.</w:t>
+      </w:r>
+      <w:r>
+        <w:t xml:space="preserve"> </w:t>
+      </w:r>
+      <w:r>
+        <w:t xml:space="preserve">This page omits the proofs</w:t>
       </w:r>
       <w:r>
         <w:t xml:space="preserve"> </w:t>

</xml_diff>

<commit_message>
Deploying to gh-pages from @ Morrison-Lab/pds@fca35cf780ce8f036e13f6a96625c2bf6921615d 🚀
</commit_message>
<xml_diff>
--- a/random-variables.docx
+++ b/random-variables.docx
@@ -15,7 +15,7 @@
         <w:pStyle w:val="Date"/>
       </w:pPr>
       <w:r>
-        <w:t xml:space="preserve">Last modified: 2026-10-15 02:38:29 (PDT)</w:t>
+        <w:t xml:space="preserve">Last modified: 2026-10-15 02:44:50 (PDT)</w:t>
       </w:r>
     </w:p>
     <w:bookmarkStart w:id="25" w:name="sec-random-variables"/>
@@ -9385,7 +9385,7 @@
           <w:b/>
           <w:bCs/>
         </w:rPr>
-        <w:t xml:space="preserve">Definition 10 (Normal distribution)</w:t>
+        <w:t xml:space="preserve">Definition 10 (Normal distribution (Gaussian distribution))</w:t>
       </w:r>
       <w:r>
         <w:t xml:space="preserve"> </w:t>
@@ -25196,7 +25196,7 @@
           <w:b/>
           <w:bCs/>
         </w:rPr>
-        <w:t xml:space="preserve">Definition 17 (Joint probability mass function)</w:t>
+        <w:t xml:space="preserve">Definition 17 (Joint probability mass function (joint PMF))</w:t>
       </w:r>
       <w:r>
         <w:t xml:space="preserve"> </w:t>
@@ -25266,7 +25266,17 @@
         <w:t xml:space="preserve"> </w:t>
       </w:r>
       <w:r>
-        <w:t xml:space="preserve">(joint PMF) of</w:t>
+        <w:t xml:space="preserve">(</w:t>
+      </w:r>
+      <w:r>
+        <w:rPr>
+          <w:b/>
+          <w:bCs/>
+        </w:rPr>
+        <w:t xml:space="preserve">joint PMF</w:t>
+      </w:r>
+      <w:r>
+        <w:t xml:space="preserve">) of</w:t>
       </w:r>
       <w:r>
         <w:t xml:space="preserve"> </w:t>
@@ -27782,7 +27792,7 @@
           <w:b/>
           <w:bCs/>
         </w:rPr>
-        <w:t xml:space="preserve">Definition 19 (Joint probability density function)</w:t>
+        <w:t xml:space="preserve">Definition 19 (Joint probability density function (joint density))</w:t>
       </w:r>
       <w:r>
         <w:t xml:space="preserve"> </w:t>
@@ -27852,7 +27862,17 @@
         <w:t xml:space="preserve"> </w:t>
       </w:r>
       <w:r>
-        <w:t xml:space="preserve">(joint density) of</w:t>
+        <w:t xml:space="preserve">(</w:t>
+      </w:r>
+      <w:r>
+        <w:rPr>
+          <w:b/>
+          <w:bCs/>
+        </w:rPr>
+        <w:t xml:space="preserve">joint density</w:t>
+      </w:r>
+      <w:r>
+        <w:t xml:space="preserve">) of</w:t>
       </w:r>
       <w:r>
         <w:t xml:space="preserve"> </w:t>
@@ -37793,7 +37813,7 @@
           <w:b/>
           <w:bCs/>
         </w:rPr>
-        <w:t xml:space="preserve">Definition 21 (Survival function)</w:t>
+        <w:t xml:space="preserve">Definition 21 (Survival function (survivor function))</w:t>
       </w:r>
       <w:r>
         <w:t xml:space="preserve"> </w:t>
@@ -40023,7 +40043,7 @@
           <w:b/>
           <w:bCs/>
         </w:rPr>
-        <w:t xml:space="preserve">Definition 22 (Hazard function)</w:t>
+        <w:t xml:space="preserve">Definition 22 (Hazard function (hazard rate, hazard rate function))</w:t>
       </w:r>
       <w:r>
         <w:t xml:space="preserve"> </w:t>

</xml_diff>

<commit_message>
Deploying to gh-pages from @ Morrison-Lab/pds@f456ab63a7e8833c6b3afcc795e0f4b2f87cdc21 🚀
</commit_message>
<xml_diff>
--- a/random-variables.docx
+++ b/random-variables.docx
@@ -15,7 +15,7 @@
         <w:pStyle w:val="Date"/>
       </w:pPr>
       <w:r>
-        <w:t xml:space="preserve">Last modified: 2026-10-15 09:00:56 (PDT)</w:t>
+        <w:t xml:space="preserve">Last modified: 2026-10-15 09:10:11 (PDT)</w:t>
       </w:r>
     </w:p>
     <w:bookmarkStart w:id="25" w:name="sec-random-variables"/>
@@ -4714,7 +4714,7 @@
     </w:p>
     <w:bookmarkEnd w:id="24"/>
     <w:bookmarkEnd w:id="25"/>
-    <w:bookmarkStart w:id="107" w:name="X07e058d1329d8fa48179146f153d016c4f9ff9a"/>
+    <w:bookmarkStart w:id="111" w:name="X07e058d1329d8fa48179146f153d016c4f9ff9a"/>
     <w:p>
       <w:pPr>
         <w:pStyle w:val="Heading2"/>
@@ -12284,22 +12284,29 @@
         </m:oMathParaPr>
         <m:oMath>
           <m:r>
+            <m:rPr>
+              <m:sty m:val="p"/>
+            </m:rPr>
             <m:t>F</m:t>
           </m:r>
           <m:r>
-            <m:rPr>
-              <m:sty m:val="p"/>
-            </m:rPr>
-            <m:t>(</m:t>
+            <m:t>​</m:t>
           </m:r>
+          <m:d>
+            <m:dPr>
+              <m:begChr m:val="("/>
+              <m:sepChr m:val=""/>
+              <m:endChr m:val=")"/>
+              <m:grow/>
+            </m:dPr>
+            <m:e>
+              <m:r>
+                <m:t>t</m:t>
+              </m:r>
+            </m:e>
+          </m:d>
           <m:r>
-            <m:t>t</m:t>
-          </m:r>
-          <m:r>
-            <m:rPr>
-              <m:sty m:val="p"/>
-            </m:rPr>
-            <m:t>)</m:t>
+            <m:t>​</m:t>
           </m:r>
           <m:limUpp>
             <m:e>
@@ -12493,22 +12500,29 @@
         </m:oMathParaPr>
         <m:oMath>
           <m:r>
+            <m:rPr>
+              <m:sty m:val="p"/>
+            </m:rPr>
             <m:t>F</m:t>
           </m:r>
           <m:r>
-            <m:rPr>
-              <m:sty m:val="p"/>
-            </m:rPr>
-            <m:t>(</m:t>
+            <m:t>​</m:t>
           </m:r>
+          <m:d>
+            <m:dPr>
+              <m:begChr m:val="("/>
+              <m:sepChr m:val=""/>
+              <m:endChr m:val=")"/>
+              <m:grow/>
+            </m:dPr>
+            <m:e>
+              <m:r>
+                <m:t>t</m:t>
+              </m:r>
+            </m:e>
+          </m:d>
           <m:r>
-            <m:t>t</m:t>
-          </m:r>
-          <m:r>
-            <m:rPr>
-              <m:sty m:val="p"/>
-            </m:rPr>
-            <m:t>)</m:t>
+            <m:t>​</m:t>
           </m:r>
           <m:r>
             <m:rPr>
@@ -12734,6 +12748,9 @@
       </w:r>
       <m:oMath>
         <m:r>
+          <m:rPr>
+            <m:sty m:val="p"/>
+          </m:rPr>
           <m:t>F</m:t>
         </m:r>
       </m:oMath>
@@ -12807,22 +12824,29 @@
             </m:lim>
           </m:limLow>
           <m:r>
+            <m:rPr>
+              <m:sty m:val="p"/>
+            </m:rPr>
             <m:t>F</m:t>
           </m:r>
           <m:r>
-            <m:rPr>
-              <m:sty m:val="p"/>
-            </m:rPr>
-            <m:t>(</m:t>
+            <m:t>​</m:t>
           </m:r>
+          <m:d>
+            <m:dPr>
+              <m:begChr m:val="("/>
+              <m:sepChr m:val=""/>
+              <m:endChr m:val=")"/>
+              <m:grow/>
+            </m:dPr>
+            <m:e>
+              <m:r>
+                <m:t>t</m:t>
+              </m:r>
+            </m:e>
+          </m:d>
           <m:r>
-            <m:t>t</m:t>
-          </m:r>
-          <m:r>
-            <m:rPr>
-              <m:sty m:val="p"/>
-            </m:rPr>
-            <m:t>)</m:t>
+            <m:t>​</m:t>
           </m:r>
           <m:r>
             <m:rPr>
@@ -12870,22 +12894,29 @@
             </m:lim>
           </m:limLow>
           <m:r>
+            <m:rPr>
+              <m:sty m:val="p"/>
+            </m:rPr>
             <m:t>F</m:t>
           </m:r>
           <m:r>
-            <m:rPr>
-              <m:sty m:val="p"/>
-            </m:rPr>
-            <m:t>(</m:t>
+            <m:t>​</m:t>
           </m:r>
+          <m:d>
+            <m:dPr>
+              <m:begChr m:val="("/>
+              <m:sepChr m:val=""/>
+              <m:endChr m:val=")"/>
+              <m:grow/>
+            </m:dPr>
+            <m:e>
+              <m:r>
+                <m:t>t</m:t>
+              </m:r>
+            </m:e>
+          </m:d>
           <m:r>
-            <m:t>t</m:t>
-          </m:r>
-          <m:r>
-            <m:rPr>
-              <m:sty m:val="p"/>
-            </m:rPr>
-            <m:t>)</m:t>
+            <m:t>​</m:t>
           </m:r>
           <m:r>
             <m:rPr>
@@ -13094,22 +13125,29 @@
           <m:eqArr>
             <m:e>
               <m:r>
+                <m:rPr>
+                  <m:sty m:val="p"/>
+                </m:rPr>
                 <m:t>F</m:t>
               </m:r>
               <m:r>
-                <m:rPr>
-                  <m:sty m:val="p"/>
-                </m:rPr>
-                <m:t>(</m:t>
-              </m:r>
-              <m:r>
-                <m:t>t</m:t>
-              </m:r>
-              <m:r>
-                <m:rPr>
-                  <m:sty m:val="p"/>
-                </m:rPr>
-                <m:t>)</m:t>
+                <m:t>​</m:t>
+              </m:r>
+              <m:d>
+                <m:dPr>
+                  <m:begChr m:val="("/>
+                  <m:sepChr m:val=""/>
+                  <m:endChr m:val=")"/>
+                  <m:grow/>
+                </m:dPr>
+                <m:e>
+                  <m:r>
+                    <m:t>t</m:t>
+                  </m:r>
+                </m:e>
+              </m:d>
+              <m:r>
+                <m:t>​</m:t>
               </m:r>
               <m:r>
                 <m:t>&amp;</m:t>
@@ -13274,22 +13312,29 @@
                 <m:t>=</m:t>
               </m:r>
               <m:r>
+                <m:rPr>
+                  <m:sty m:val="p"/>
+                </m:rPr>
                 <m:t>F</m:t>
               </m:r>
               <m:r>
-                <m:rPr>
-                  <m:sty m:val="p"/>
-                </m:rPr>
-                <m:t>(</m:t>
-              </m:r>
-              <m:r>
-                <m:t>s</m:t>
-              </m:r>
-              <m:r>
-                <m:rPr>
-                  <m:sty m:val="p"/>
-                </m:rPr>
-                <m:t>)</m:t>
+                <m:t>​</m:t>
+              </m:r>
+              <m:d>
+                <m:dPr>
+                  <m:begChr m:val="("/>
+                  <m:sepChr m:val=""/>
+                  <m:endChr m:val=")"/>
+                  <m:grow/>
+                </m:dPr>
+                <m:e>
+                  <m:r>
+                    <m:t>s</m:t>
+                  </m:r>
+                </m:e>
+              </m:d>
+              <m:r>
+                <m:t>​</m:t>
               </m:r>
               <m:r>
                 <m:t>&amp;</m:t>
@@ -13587,28 +13632,35 @@
       </w:r>
       <m:oMath>
         <m:r>
+          <m:rPr>
+            <m:sty m:val="p"/>
+          </m:rPr>
           <m:t>F</m:t>
         </m:r>
         <m:r>
-          <m:rPr>
-            <m:sty m:val="p"/>
-          </m:rPr>
-          <m:t>(</m:t>
-        </m:r>
-        <m:r>
-          <m:rPr>
-            <m:sty m:val="p"/>
-          </m:rPr>
-          <m:t>−</m:t>
-        </m:r>
-        <m:r>
-          <m:t>n</m:t>
-        </m:r>
-        <m:r>
-          <m:rPr>
-            <m:sty m:val="p"/>
-          </m:rPr>
-          <m:t>)</m:t>
+          <m:t>​</m:t>
+        </m:r>
+        <m:d>
+          <m:dPr>
+            <m:begChr m:val="("/>
+            <m:sepChr m:val=""/>
+            <m:endChr m:val=")"/>
+            <m:grow/>
+          </m:dPr>
+          <m:e>
+            <m:r>
+              <m:rPr>
+                <m:sty m:val="p"/>
+              </m:rPr>
+              <m:t>−</m:t>
+            </m:r>
+            <m:r>
+              <m:t>n</m:t>
+            </m:r>
+          </m:e>
+        </m:d>
+        <m:r>
+          <m:t>​</m:t>
         </m:r>
         <m:r>
           <m:rPr>
@@ -13705,22 +13757,29 @@
           <m:t>≤</m:t>
         </m:r>
         <m:r>
+          <m:rPr>
+            <m:sty m:val="p"/>
+          </m:rPr>
           <m:t>F</m:t>
         </m:r>
         <m:r>
-          <m:rPr>
-            <m:sty m:val="p"/>
-          </m:rPr>
-          <m:t>(</m:t>
-        </m:r>
-        <m:r>
-          <m:t>t</m:t>
-        </m:r>
-        <m:r>
-          <m:rPr>
-            <m:sty m:val="p"/>
-          </m:rPr>
-          <m:t>)</m:t>
+          <m:t>​</m:t>
+        </m:r>
+        <m:d>
+          <m:dPr>
+            <m:begChr m:val="("/>
+            <m:sepChr m:val=""/>
+            <m:endChr m:val=")"/>
+            <m:grow/>
+          </m:dPr>
+          <m:e>
+            <m:r>
+              <m:t>t</m:t>
+            </m:r>
+          </m:e>
+        </m:d>
+        <m:r>
+          <m:t>​</m:t>
         </m:r>
         <m:r>
           <m:rPr>
@@ -13729,28 +13788,35 @@
           <m:t>≤</m:t>
         </m:r>
         <m:r>
+          <m:rPr>
+            <m:sty m:val="p"/>
+          </m:rPr>
           <m:t>F</m:t>
         </m:r>
         <m:r>
-          <m:rPr>
-            <m:sty m:val="p"/>
-          </m:rPr>
-          <m:t>(</m:t>
-        </m:r>
-        <m:r>
-          <m:rPr>
-            <m:sty m:val="p"/>
-          </m:rPr>
-          <m:t>−</m:t>
-        </m:r>
-        <m:r>
-          <m:t>n</m:t>
-        </m:r>
-        <m:r>
-          <m:rPr>
-            <m:sty m:val="p"/>
-          </m:rPr>
-          <m:t>)</m:t>
+          <m:t>​</m:t>
+        </m:r>
+        <m:d>
+          <m:dPr>
+            <m:begChr m:val="("/>
+            <m:sepChr m:val=""/>
+            <m:endChr m:val=")"/>
+            <m:grow/>
+          </m:dPr>
+          <m:e>
+            <m:r>
+              <m:rPr>
+                <m:sty m:val="p"/>
+              </m:rPr>
+              <m:t>−</m:t>
+            </m:r>
+            <m:r>
+              <m:t>n</m:t>
+            </m:r>
+          </m:e>
+        </m:d>
+        <m:r>
+          <m:t>​</m:t>
         </m:r>
       </m:oMath>
       <w:r>
@@ -13761,6 +13827,9 @@
       </w:r>
       <m:oMath>
         <m:r>
+          <m:rPr>
+            <m:sty m:val="p"/>
+          </m:rPr>
           <m:t>F</m:t>
         </m:r>
       </m:oMath>
@@ -13781,22 +13850,29 @@
       </w:r>
       <m:oMath>
         <m:r>
+          <m:rPr>
+            <m:sty m:val="p"/>
+          </m:rPr>
           <m:t>F</m:t>
         </m:r>
         <m:r>
-          <m:rPr>
-            <m:sty m:val="p"/>
-          </m:rPr>
-          <m:t>(</m:t>
-        </m:r>
-        <m:r>
-          <m:t>t</m:t>
-        </m:r>
-        <m:r>
-          <m:rPr>
-            <m:sty m:val="p"/>
-          </m:rPr>
-          <m:t>)</m:t>
+          <m:t>​</m:t>
+        </m:r>
+        <m:d>
+          <m:dPr>
+            <m:begChr m:val="("/>
+            <m:sepChr m:val=""/>
+            <m:endChr m:val=")"/>
+            <m:grow/>
+          </m:dPr>
+          <m:e>
+            <m:r>
+              <m:t>t</m:t>
+            </m:r>
+          </m:e>
+        </m:d>
+        <m:r>
+          <m:t>​</m:t>
         </m:r>
         <m:r>
           <m:rPr>
@@ -14121,22 +14197,29 @@
           <m:eqArr>
             <m:e>
               <m:r>
+                <m:rPr>
+                  <m:sty m:val="p"/>
+                </m:rPr>
                 <m:t>F</m:t>
               </m:r>
               <m:r>
-                <m:rPr>
-                  <m:sty m:val="p"/>
-                </m:rPr>
-                <m:t>(</m:t>
-              </m:r>
-              <m:r>
-                <m:t>n</m:t>
-              </m:r>
-              <m:r>
-                <m:rPr>
-                  <m:sty m:val="p"/>
-                </m:rPr>
-                <m:t>)</m:t>
+                <m:t>​</m:t>
+              </m:r>
+              <m:d>
+                <m:dPr>
+                  <m:begChr m:val="("/>
+                  <m:sepChr m:val=""/>
+                  <m:endChr m:val=")"/>
+                  <m:grow/>
+                </m:dPr>
+                <m:e>
+                  <m:r>
+                    <m:t>n</m:t>
+                  </m:r>
+                </m:e>
+              </m:d>
+              <m:r>
+                <m:t>​</m:t>
               </m:r>
               <m:r>
                 <m:t>&amp;</m:t>
@@ -14318,22 +14401,29 @@
       </w:r>
       <m:oMath>
         <m:r>
+          <m:rPr>
+            <m:sty m:val="p"/>
+          </m:rPr>
           <m:t>F</m:t>
         </m:r>
         <m:r>
-          <m:rPr>
-            <m:sty m:val="p"/>
-          </m:rPr>
-          <m:t>(</m:t>
-        </m:r>
-        <m:r>
-          <m:t>n</m:t>
-        </m:r>
-        <m:r>
-          <m:rPr>
-            <m:sty m:val="p"/>
-          </m:rPr>
-          <m:t>)</m:t>
+          <m:t>​</m:t>
+        </m:r>
+        <m:d>
+          <m:dPr>
+            <m:begChr m:val="("/>
+            <m:sepChr m:val=""/>
+            <m:endChr m:val=")"/>
+            <m:grow/>
+          </m:dPr>
+          <m:e>
+            <m:r>
+              <m:t>n</m:t>
+            </m:r>
+          </m:e>
+        </m:d>
+        <m:r>
+          <m:t>​</m:t>
         </m:r>
         <m:r>
           <m:rPr>
@@ -14342,22 +14432,29 @@
           <m:t>≤</m:t>
         </m:r>
         <m:r>
+          <m:rPr>
+            <m:sty m:val="p"/>
+          </m:rPr>
           <m:t>F</m:t>
         </m:r>
         <m:r>
-          <m:rPr>
-            <m:sty m:val="p"/>
-          </m:rPr>
-          <m:t>(</m:t>
-        </m:r>
-        <m:r>
-          <m:t>t</m:t>
-        </m:r>
-        <m:r>
-          <m:rPr>
-            <m:sty m:val="p"/>
-          </m:rPr>
-          <m:t>)</m:t>
+          <m:t>​</m:t>
+        </m:r>
+        <m:d>
+          <m:dPr>
+            <m:begChr m:val="("/>
+            <m:sepChr m:val=""/>
+            <m:endChr m:val=")"/>
+            <m:grow/>
+          </m:dPr>
+          <m:e>
+            <m:r>
+              <m:t>t</m:t>
+            </m:r>
+          </m:e>
+        </m:d>
+        <m:r>
+          <m:t>​</m:t>
         </m:r>
         <m:r>
           <m:rPr>
@@ -14377,6 +14474,9 @@
       </w:r>
       <m:oMath>
         <m:r>
+          <m:rPr>
+            <m:sty m:val="p"/>
+          </m:rPr>
           <m:t>F</m:t>
         </m:r>
       </m:oMath>
@@ -14397,22 +14497,29 @@
       </w:r>
       <m:oMath>
         <m:r>
+          <m:rPr>
+            <m:sty m:val="p"/>
+          </m:rPr>
           <m:t>F</m:t>
         </m:r>
         <m:r>
-          <m:rPr>
-            <m:sty m:val="p"/>
-          </m:rPr>
-          <m:t>(</m:t>
-        </m:r>
-        <m:r>
-          <m:t>t</m:t>
-        </m:r>
-        <m:r>
-          <m:rPr>
-            <m:sty m:val="p"/>
-          </m:rPr>
-          <m:t>)</m:t>
+          <m:t>​</m:t>
+        </m:r>
+        <m:d>
+          <m:dPr>
+            <m:begChr m:val="("/>
+            <m:sepChr m:val=""/>
+            <m:endChr m:val=")"/>
+            <m:grow/>
+          </m:dPr>
+          <m:e>
+            <m:r>
+              <m:t>t</m:t>
+            </m:r>
+          </m:e>
+        </m:d>
+        <m:r>
+          <m:t>​</m:t>
         </m:r>
         <m:r>
           <m:rPr>
@@ -14741,6 +14848,9 @@
       </w:r>
       <m:oMath>
         <m:r>
+          <m:rPr>
+            <m:sty m:val="p"/>
+          </m:rPr>
           <m:t>F</m:t>
         </m:r>
       </m:oMath>
@@ -14774,6 +14884,9 @@
       </w:r>
       <m:oMath>
         <m:r>
+          <m:rPr>
+            <m:sty m:val="p"/>
+          </m:rPr>
           <m:t>F</m:t>
         </m:r>
       </m:oMath>
@@ -14797,22 +14910,29 @@
         </m:oMathParaPr>
         <m:oMath>
           <m:r>
+            <m:rPr>
+              <m:sty m:val="p"/>
+            </m:rPr>
             <m:t>Q</m:t>
           </m:r>
           <m:r>
-            <m:rPr>
-              <m:sty m:val="p"/>
-            </m:rPr>
-            <m:t>(</m:t>
+            <m:t>​</m:t>
           </m:r>
+          <m:d>
+            <m:dPr>
+              <m:begChr m:val="("/>
+              <m:sepChr m:val=""/>
+              <m:endChr m:val=")"/>
+              <m:grow/>
+            </m:dPr>
+            <m:e>
+              <m:r>
+                <m:t>p</m:t>
+              </m:r>
+            </m:e>
+          </m:d>
           <m:r>
-            <m:t>p</m:t>
-          </m:r>
-          <m:r>
-            <m:rPr>
-              <m:sty m:val="p"/>
-            </m:rPr>
-            <m:t>)</m:t>
+            <m:t>​</m:t>
           </m:r>
           <m:limUpp>
             <m:e>
@@ -14840,52 +14960,63 @@
             <m:t>inf</m:t>
           </m:r>
           <m:r>
-            <m:rPr>
-              <m:sty m:val="p"/>
-            </m:rPr>
-            <m:t>{</m:t>
+            <m:t>​</m:t>
           </m:r>
+          <m:d>
+            <m:dPr>
+              <m:begChr m:val="{"/>
+              <m:sepChr m:val=""/>
+              <m:endChr m:val="}"/>
+              <m:grow/>
+            </m:dPr>
+            <m:e>
+              <m:r>
+                <m:t>t</m:t>
+              </m:r>
+              <m:r>
+                <m:rPr>
+                  <m:sty m:val="p"/>
+                </m:rPr>
+                <m:t>:</m:t>
+              </m:r>
+              <m:r>
+                <m:rPr>
+                  <m:sty m:val="p"/>
+                </m:rPr>
+                <m:t>F</m:t>
+              </m:r>
+              <m:r>
+                <m:t>​</m:t>
+              </m:r>
+              <m:d>
+                <m:dPr>
+                  <m:begChr m:val="("/>
+                  <m:sepChr m:val=""/>
+                  <m:endChr m:val=")"/>
+                  <m:grow/>
+                </m:dPr>
+                <m:e>
+                  <m:r>
+                    <m:t>t</m:t>
+                  </m:r>
+                </m:e>
+              </m:d>
+              <m:r>
+                <m:t>​</m:t>
+              </m:r>
+              <m:r>
+                <m:rPr>
+                  <m:sty m:val="p"/>
+                </m:rPr>
+                <m:t>≥</m:t>
+              </m:r>
+              <m:r>
+                <m:t>p</m:t>
+              </m:r>
+            </m:e>
+          </m:d>
           <m:r>
-            <m:t>t</m:t>
-          </m:r>
-          <m:r>
-            <m:rPr>
-              <m:sty m:val="p"/>
-            </m:rPr>
-            <m:t>:</m:t>
-          </m:r>
-          <m:r>
-            <m:t>F</m:t>
-          </m:r>
-          <m:r>
-            <m:rPr>
-              <m:sty m:val="p"/>
-            </m:rPr>
-            <m:t>(</m:t>
-          </m:r>
-          <m:r>
-            <m:t>t</m:t>
-          </m:r>
-          <m:r>
-            <m:rPr>
-              <m:sty m:val="p"/>
-            </m:rPr>
-            <m:t>)</m:t>
-          </m:r>
-          <m:r>
-            <m:rPr>
-              <m:sty m:val="p"/>
-            </m:rPr>
-            <m:t>≥</m:t>
-          </m:r>
-          <m:r>
-            <m:t>p</m:t>
-          </m:r>
-          <m:r>
-            <m:rPr>
-              <m:sty m:val="p"/>
-            </m:rPr>
-            <m:t>}</m:t>
+            <m:t>​</m:t>
           </m:r>
           <m:r>
             <m:rPr>
@@ -14897,25 +15028,37 @@
             <m:t> </m:t>
           </m:r>
           <m:r>
+            <m:t>p</m:t>
+          </m:r>
+          <m:r>
+            <m:rPr>
+              <m:sty m:val="p"/>
+            </m:rPr>
+            <m:t>∈</m:t>
+          </m:r>
+          <m:r>
+            <m:rPr>
+              <m:sty m:val="p"/>
+            </m:rPr>
+            <m:t>(</m:t>
+          </m:r>
+          <m:r>
             <m:t>0</m:t>
           </m:r>
           <m:r>
             <m:rPr>
               <m:sty m:val="p"/>
             </m:rPr>
-            <m:t>&lt;</m:t>
+            <m:t>,</m:t>
           </m:r>
           <m:r>
-            <m:t>p</m:t>
+            <m:t>1</m:t>
           </m:r>
           <m:r>
             <m:rPr>
               <m:sty m:val="p"/>
             </m:rPr>
-            <m:t>&lt;</m:t>
-          </m:r>
-          <m:r>
-            <m:t>1</m:t>
+            <m:t>)</m:t>
           </m:r>
           <m:r>
             <m:rPr>
@@ -14949,14 +15092,91 @@
       </w:r>
       <m:oMath>
         <m:r>
+          <m:t>p</m:t>
+        </m:r>
+        <m:r>
+          <m:rPr>
+            <m:sty m:val="p"/>
+          </m:rPr>
+          <m:t>∈</m:t>
+        </m:r>
+        <m:r>
+          <m:rPr>
+            <m:sty m:val="p"/>
+          </m:rPr>
+          <m:t>(</m:t>
+        </m:r>
+        <m:r>
           <m:t>0</m:t>
         </m:r>
         <m:r>
           <m:rPr>
             <m:sty m:val="p"/>
           </m:rPr>
-          <m:t>&lt;</m:t>
-        </m:r>
+          <m:t>,</m:t>
+        </m:r>
+        <m:r>
+          <m:t>1</m:t>
+        </m:r>
+        <m:r>
+          <m:rPr>
+            <m:sty m:val="p"/>
+          </m:rPr>
+          <m:t>)</m:t>
+        </m:r>
+      </m:oMath>
+      <w:r>
+        <w:t xml:space="preserve"> </w:t>
+      </w:r>
+      <w:r>
+        <w:t xml:space="preserve">keeps</w:t>
+      </w:r>
+      <w:r>
+        <w:t xml:space="preserve"> </w:t>
+      </w:r>
+      <m:oMath>
+        <m:r>
+          <m:rPr>
+            <m:sty m:val="p"/>
+          </m:rPr>
+          <m:t>Q</m:t>
+        </m:r>
+        <m:r>
+          <m:t>​</m:t>
+        </m:r>
+        <m:d>
+          <m:dPr>
+            <m:begChr m:val="("/>
+            <m:sepChr m:val=""/>
+            <m:endChr m:val=")"/>
+            <m:grow/>
+          </m:dPr>
+          <m:e>
+            <m:r>
+              <m:t>p</m:t>
+            </m:r>
+          </m:e>
+        </m:d>
+        <m:r>
+          <m:t>​</m:t>
+        </m:r>
+      </m:oMath>
+      <w:r>
+        <w:t xml:space="preserve"> </w:t>
+      </w:r>
+      <w:r>
+        <w:t xml:space="preserve">finite:</w:t>
+      </w:r>
+      <w:r>
+        <w:t xml:space="preserve"> </w:t>
+      </w:r>
+      <w:r>
+        <w:t xml:space="preserve">for</w:t>
+      </w:r>
+      <w:r>
+        <w:t xml:space="preserve"> </w:t>
+      </w:r>
+      <m:oMath>
         <m:r>
           <m:t>p</m:t>
         </m:r>
@@ -14964,71 +15184,13 @@
           <m:rPr>
             <m:sty m:val="p"/>
           </m:rPr>
-          <m:t>&lt;</m:t>
+          <m:t>=</m:t>
         </m:r>
         <m:r>
           <m:t>1</m:t>
         </m:r>
       </m:oMath>
       <w:r>
-        <w:t xml:space="preserve"> </w:t>
-      </w:r>
-      <w:r>
-        <w:t xml:space="preserve">keeps</w:t>
-      </w:r>
-      <w:r>
-        <w:t xml:space="preserve"> </w:t>
-      </w:r>
-      <m:oMath>
-        <m:r>
-          <m:t>Q</m:t>
-        </m:r>
-        <m:r>
-          <m:rPr>
-            <m:sty m:val="p"/>
-          </m:rPr>
-          <m:t>(</m:t>
-        </m:r>
-        <m:r>
-          <m:t>p</m:t>
-        </m:r>
-        <m:r>
-          <m:rPr>
-            <m:sty m:val="p"/>
-          </m:rPr>
-          <m:t>)</m:t>
-        </m:r>
-      </m:oMath>
-      <w:r>
-        <w:t xml:space="preserve"> </w:t>
-      </w:r>
-      <w:r>
-        <w:t xml:space="preserve">finite:</w:t>
-      </w:r>
-      <w:r>
-        <w:t xml:space="preserve"> </w:t>
-      </w:r>
-      <w:r>
-        <w:t xml:space="preserve">for</w:t>
-      </w:r>
-      <w:r>
-        <w:t xml:space="preserve"> </w:t>
-      </w:r>
-      <m:oMath>
-        <m:r>
-          <m:t>p</m:t>
-        </m:r>
-        <m:r>
-          <m:rPr>
-            <m:sty m:val="p"/>
-          </m:rPr>
-          <m:t>=</m:t>
-        </m:r>
-        <m:r>
-          <m:t>1</m:t>
-        </m:r>
-      </m:oMath>
-      <w:r>
         <w:t xml:space="preserve">, the set</w:t>
       </w:r>
       <w:r>
@@ -15036,81 +15198,99 @@
       </w:r>
       <m:oMath>
         <m:r>
-          <m:rPr>
-            <m:sty m:val="p"/>
-          </m:rPr>
-          <m:t>{</m:t>
-        </m:r>
-        <m:r>
-          <m:t>t</m:t>
-        </m:r>
-        <m:r>
-          <m:rPr>
-            <m:sty m:val="p"/>
-          </m:rPr>
-          <m:t>:</m:t>
-        </m:r>
-        <m:r>
+          <m:t>​</m:t>
+        </m:r>
+        <m:d>
+          <m:dPr>
+            <m:begChr m:val="{"/>
+            <m:sepChr m:val=""/>
+            <m:endChr m:val="}"/>
+            <m:grow/>
+          </m:dPr>
+          <m:e>
+            <m:r>
+              <m:t>t</m:t>
+            </m:r>
+            <m:r>
+              <m:rPr>
+                <m:sty m:val="p"/>
+              </m:rPr>
+              <m:t>:</m:t>
+            </m:r>
+            <m:r>
+              <m:rPr>
+                <m:sty m:val="p"/>
+              </m:rPr>
+              <m:t>F</m:t>
+            </m:r>
+            <m:r>
+              <m:t>​</m:t>
+            </m:r>
+            <m:d>
+              <m:dPr>
+                <m:begChr m:val="("/>
+                <m:sepChr m:val=""/>
+                <m:endChr m:val=")"/>
+                <m:grow/>
+              </m:dPr>
+              <m:e>
+                <m:r>
+                  <m:t>t</m:t>
+                </m:r>
+              </m:e>
+            </m:d>
+            <m:r>
+              <m:t>​</m:t>
+            </m:r>
+            <m:r>
+              <m:rPr>
+                <m:sty m:val="p"/>
+              </m:rPr>
+              <m:t>≥</m:t>
+            </m:r>
+            <m:r>
+              <m:t>1</m:t>
+            </m:r>
+          </m:e>
+        </m:d>
+        <m:r>
+          <m:t>​</m:t>
+        </m:r>
+      </m:oMath>
+      <w:r>
+        <w:t xml:space="preserve"> </w:t>
+      </w:r>
+      <w:r>
+        <w:t xml:space="preserve">is empty whenever</w:t>
+      </w:r>
+      <w:r>
+        <w:t xml:space="preserve"> </w:t>
+      </w:r>
+      <m:oMath>
+        <m:r>
+          <m:rPr>
+            <m:sty m:val="p"/>
+          </m:rPr>
           <m:t>F</m:t>
         </m:r>
         <m:r>
-          <m:rPr>
-            <m:sty m:val="p"/>
-          </m:rPr>
-          <m:t>(</m:t>
-        </m:r>
-        <m:r>
-          <m:t>t</m:t>
-        </m:r>
-        <m:r>
-          <m:rPr>
-            <m:sty m:val="p"/>
-          </m:rPr>
-          <m:t>)</m:t>
-        </m:r>
-        <m:r>
-          <m:rPr>
-            <m:sty m:val="p"/>
-          </m:rPr>
-          <m:t>≥</m:t>
-        </m:r>
-        <m:r>
-          <m:t>1</m:t>
-        </m:r>
-        <m:r>
-          <m:rPr>
-            <m:sty m:val="p"/>
-          </m:rPr>
-          <m:t>}</m:t>
-        </m:r>
-      </m:oMath>
-      <w:r>
-        <w:t xml:space="preserve"> </w:t>
-      </w:r>
-      <w:r>
-        <w:t xml:space="preserve">is empty whenever</w:t>
-      </w:r>
-      <w:r>
-        <w:t xml:space="preserve"> </w:t>
-      </w:r>
-      <m:oMath>
-        <m:r>
-          <m:t>F</m:t>
-        </m:r>
-        <m:r>
-          <m:rPr>
-            <m:sty m:val="p"/>
-          </m:rPr>
-          <m:t>(</m:t>
-        </m:r>
-        <m:r>
-          <m:t>t</m:t>
-        </m:r>
-        <m:r>
-          <m:rPr>
-            <m:sty m:val="p"/>
-          </m:rPr>
-          <m:t>)</m:t>
+          <m:t>​</m:t>
+        </m:r>
+        <m:d>
+          <m:dPr>
+            <m:begChr m:val="("/>
+            <m:sepChr m:val=""/>
+            <m:endChr m:val=")"/>
+            <m:grow/>
+          </m:dPr>
+          <m:e>
+            <m:r>
+              <m:t>t</m:t>
+            </m:r>
+          </m:e>
+        </m:d>
+        <m:r>
+          <m:t>​</m:t>
         </m:r>
         <m:r>
           <m:rPr>
@@ -15217,14 +15397,50 @@
       </w:r>
       <m:oMath>
         <m:r>
+          <m:rPr>
+            <m:sty m:val="p"/>
+          </m:rPr>
           <m:t>F</m:t>
         </m:r>
         <m:r>
-          <m:rPr>
-            <m:sty m:val="p"/>
-          </m:rPr>
-          <m:t>(</m:t>
-        </m:r>
+          <m:t>​</m:t>
+        </m:r>
+        <m:d>
+          <m:dPr>
+            <m:begChr m:val="("/>
+            <m:sepChr m:val=""/>
+            <m:endChr m:val=")"/>
+            <m:grow/>
+          </m:dPr>
+          <m:e>
+            <m:r>
+              <m:t>t</m:t>
+            </m:r>
+          </m:e>
+        </m:d>
+        <m:r>
+          <m:t>​</m:t>
+        </m:r>
+        <m:r>
+          <m:rPr>
+            <m:sty m:val="p"/>
+          </m:rPr>
+          <m:t>≥</m:t>
+        </m:r>
+        <m:r>
+          <m:t>0.5</m:t>
+        </m:r>
+      </m:oMath>
+      <w:r>
+        <w:t xml:space="preserve"> </w:t>
+      </w:r>
+      <w:r>
+        <w:t xml:space="preserve">first holds at</w:t>
+      </w:r>
+      <w:r>
+        <w:t xml:space="preserve"> </w:t>
+      </w:r>
+      <m:oMath>
         <m:r>
           <m:t>t</m:t>
         </m:r>
@@ -15232,35 +15448,6 @@
           <m:rPr>
             <m:sty m:val="p"/>
           </m:rPr>
-          <m:t>)</m:t>
-        </m:r>
-        <m:r>
-          <m:rPr>
-            <m:sty m:val="p"/>
-          </m:rPr>
-          <m:t>≥</m:t>
-        </m:r>
-        <m:r>
-          <m:t>0.5</m:t>
-        </m:r>
-      </m:oMath>
-      <w:r>
-        <w:t xml:space="preserve"> </w:t>
-      </w:r>
-      <w:r>
-        <w:t xml:space="preserve">first holds at</w:t>
-      </w:r>
-      <w:r>
-        <w:t xml:space="preserve"> </w:t>
-      </w:r>
-      <m:oMath>
-        <m:r>
-          <m:t>t</m:t>
-        </m:r>
-        <m:r>
-          <m:rPr>
-            <m:sty m:val="p"/>
-          </m:rPr>
           <m:t>=</m:t>
         </m:r>
         <m:r>
@@ -15281,22 +15468,29 @@
       </w:r>
       <m:oMath>
         <m:r>
+          <m:rPr>
+            <m:sty m:val="p"/>
+          </m:rPr>
           <m:t>Q</m:t>
         </m:r>
         <m:r>
-          <m:rPr>
-            <m:sty m:val="p"/>
-          </m:rPr>
-          <m:t>(</m:t>
-        </m:r>
-        <m:r>
-          <m:t>0.5</m:t>
-        </m:r>
-        <m:r>
-          <m:rPr>
-            <m:sty m:val="p"/>
-          </m:rPr>
-          <m:t>)</m:t>
+          <m:t>​</m:t>
+        </m:r>
+        <m:d>
+          <m:dPr>
+            <m:begChr m:val="("/>
+            <m:sepChr m:val=""/>
+            <m:endChr m:val=")"/>
+            <m:grow/>
+          </m:dPr>
+          <m:e>
+            <m:r>
+              <m:t>0.5</m:t>
+            </m:r>
+          </m:e>
+        </m:d>
+        <m:r>
+          <m:t>​</m:t>
         </m:r>
         <m:r>
           <m:rPr>
@@ -15313,7 +15507,168 @@
       </w:r>
     </w:p>
     <w:bookmarkEnd w:id="60"/>
-    <w:bookmarkStart w:id="61" w:name="thm-density-vs-CDF"/>
+    <w:p>
+      <w:pPr>
+        <w:pStyle w:val="BodyText"/>
+      </w:pPr>
+      <w:r>
+        <w:rPr>
+          <w:i/>
+          <w:iCs/>
+        </w:rPr>
+        <w:t xml:space="preserve">Remark</w:t>
+      </w:r>
+      <w:r>
+        <w:t xml:space="preserve">. </w:t>
+      </w:r>
+      <w:hyperlink w:anchor="fig-pmf-cdf-quantile">
+        <w:r>
+          <w:rPr>
+            <w:rStyle w:val="Hyperlink"/>
+          </w:rPr>
+          <w:t xml:space="preserve">Figure 1</w:t>
+        </w:r>
+      </w:hyperlink>
+      <w:r>
+        <w:t xml:space="preserve"> </w:t>
+      </w:r>
+      <w:r>
+        <w:t xml:space="preserve">shows the mass function, CDF and quantile function</w:t>
+      </w:r>
+      <w:r>
+        <w:t xml:space="preserve"> </w:t>
+      </w:r>
+      <w:r>
+        <w:t xml:space="preserve">of the number of heads in two fair coin flips (top row),</w:t>
+      </w:r>
+      <w:r>
+        <w:t xml:space="preserve"> </w:t>
+      </w:r>
+      <w:r>
+        <w:t xml:space="preserve">beside the density, CDF and quantile function of a standard normal variable (bottom row).</w:t>
+      </w:r>
+    </w:p>
+    <w:tbl>
+      <w:tblPr>
+        <w:tblStyle w:val="Table"/>
+        <w:tblW w:type="pct" w:w="5000"/>
+        <w:tblLayout w:type="fixed"/>
+        <w:tblLook w:firstRow="0" w:lastRow="0" w:firstColumn="0" w:lastColumn="0" w:noHBand="0" w:noVBand="0" w:val="0000"/>
+      </w:tblPr>
+      <w:tblGrid>
+        <w:gridCol w:w="7920"/>
+      </w:tblGrid>
+      <w:tr>
+        <w:tc>
+          <w:tcPr/>
+          <w:bookmarkStart w:id="64" w:name="fig-pmf-cdf-quantile"/>
+          <w:p>
+            <w:pPr>
+              <w:jc w:val="center"/>
+            </w:pPr>
+            <w:r>
+              <w:drawing>
+                <wp:inline>
+                  <wp:extent cx="5334000" cy="2963333"/>
+                  <wp:effectExtent b="0" l="0" r="0" t="0"/>
+                  <wp:docPr descr="" title="" id="62" name="Picture"/>
+                  <a:graphic>
+                    <a:graphicData uri="http://schemas.openxmlformats.org/drawingml/2006/picture">
+                      <pic:pic>
+                        <pic:nvPicPr>
+                          <pic:cNvPr descr="random-variables_files/figure-docx/pmf-cdf-quantile-plot-1.png" id="63" name="Picture"/>
+                          <pic:cNvPicPr>
+                            <a:picLocks noChangeArrowheads="1" noChangeAspect="1"/>
+                          </pic:cNvPicPr>
+                        </pic:nvPicPr>
+                        <pic:blipFill>
+                          <a:blip r:embed="rId61"/>
+                          <a:stretch>
+                            <a:fillRect/>
+                          </a:stretch>
+                        </pic:blipFill>
+                        <pic:spPr bwMode="auto">
+                          <a:xfrm>
+                            <a:off x="0" y="0"/>
+                            <a:ext cx="5334000" cy="2963333"/>
+                          </a:xfrm>
+                          <a:prstGeom prst="rect">
+                            <a:avLst/>
+                          </a:prstGeom>
+                          <a:noFill/>
+                          <a:ln w="9525">
+                            <a:noFill/>
+                            <a:headEnd/>
+                            <a:tailEnd/>
+                          </a:ln>
+                        </pic:spPr>
+                      </pic:pic>
+                    </a:graphicData>
+                  </a:graphic>
+                </wp:inline>
+              </w:drawing>
+            </w:r>
+          </w:p>
+          <w:p>
+            <w:pPr>
+              <w:jc w:val="center"/>
+            </w:pPr>
+            <w:pPr>
+              <w:jc w:val="left"/>
+              <w:spacing w:before="200"/>
+              <w:pStyle w:val="ImageCaption"/>
+            </w:pPr>
+            <w:r>
+              <w:t xml:space="preserve">Figure 1: A probability mass function, cumulative distribution function and quantile function</w:t>
+            </w:r>
+            <w:r>
+              <w:t xml:space="preserve"> </w:t>
+            </w:r>
+            <w:r>
+              <w:t xml:space="preserve">for a discrete random variable</w:t>
+            </w:r>
+            <w:r>
+              <w:t xml:space="preserve"> </w:t>
+            </w:r>
+            <w:r>
+              <w:t xml:space="preserve">(top row: the number of heads in two fair coin flips)</w:t>
+            </w:r>
+            <w:r>
+              <w:t xml:space="preserve"> </w:t>
+            </w:r>
+            <w:r>
+              <w:t xml:space="preserve">and a continuous one</w:t>
+            </w:r>
+            <w:r>
+              <w:t xml:space="preserve"> </w:t>
+            </w:r>
+            <w:r>
+              <w:t xml:space="preserve">(bottom row: the standard normal distribution).</w:t>
+            </w:r>
+            <w:r>
+              <w:t xml:space="preserve"> </w:t>
+            </w:r>
+            <w:r>
+              <w:t xml:space="preserve">The shaded area under the normal density up to a point equals the CDF at that point.</w:t>
+            </w:r>
+            <w:r>
+              <w:t xml:space="preserve"> </w:t>
+            </w:r>
+            <w:r>
+              <w:t xml:space="preserve">The quantile function reverses the CDF:</w:t>
+            </w:r>
+            <w:r>
+              <w:t xml:space="preserve"> </w:t>
+            </w:r>
+            <w:r>
+              <w:t xml:space="preserve">its axes are the CDF’s, swapped.</w:t>
+            </w:r>
+          </w:p>
+          <w:bookmarkEnd w:id="64"/>
+        </w:tc>
+      </w:tr>
+    </w:tbl>
+    <w:bookmarkStart w:id="65" w:name="thm-density-vs-CDF"/>
     <w:p>
       <w:pPr>
         <w:pStyle w:val="BodyText"/>
@@ -15364,6 +15719,9 @@
       </w:r>
       <m:oMath>
         <m:r>
+          <m:rPr>
+            <m:sty m:val="p"/>
+          </m:rPr>
           <m:t>F</m:t>
         </m:r>
       </m:oMath>
@@ -15398,22 +15756,29 @@
         </m:oMathParaPr>
         <m:oMath>
           <m:r>
+            <m:rPr>
+              <m:sty m:val="p"/>
+            </m:rPr>
             <m:t>F</m:t>
           </m:r>
           <m:r>
-            <m:rPr>
-              <m:sty m:val="p"/>
-            </m:rPr>
-            <m:t>(</m:t>
+            <m:t>​</m:t>
           </m:r>
+          <m:d>
+            <m:dPr>
+              <m:begChr m:val="("/>
+              <m:sepChr m:val=""/>
+              <m:endChr m:val=")"/>
+              <m:grow/>
+            </m:dPr>
+            <m:e>
+              <m:r>
+                <m:t>t</m:t>
+              </m:r>
+            </m:e>
+          </m:d>
           <m:r>
-            <m:t>t</m:t>
-          </m:r>
-          <m:r>
-            <m:rPr>
-              <m:sty m:val="p"/>
-            </m:rPr>
-            <m:t>)</m:t>
+            <m:t>​</m:t>
           </m:r>
           <m:r>
             <m:rPr>
@@ -15480,7 +15845,7 @@
         </m:oMath>
       </m:oMathPara>
     </w:p>
-    <w:bookmarkEnd w:id="61"/>
+    <w:bookmarkEnd w:id="65"/>
     <w:p>
       <w:pPr>
         <w:pStyle w:val="FirstParagraph"/>
@@ -15718,22 +16083,29 @@
           <m:eqArr>
             <m:e>
               <m:r>
+                <m:rPr>
+                  <m:sty m:val="p"/>
+                </m:rPr>
                 <m:t>F</m:t>
               </m:r>
               <m:r>
-                <m:rPr>
-                  <m:sty m:val="p"/>
-                </m:rPr>
-                <m:t>(</m:t>
-              </m:r>
-              <m:r>
-                <m:t>t</m:t>
-              </m:r>
-              <m:r>
-                <m:rPr>
-                  <m:sty m:val="p"/>
-                </m:rPr>
-                <m:t>)</m:t>
+                <m:t>​</m:t>
+              </m:r>
+              <m:d>
+                <m:dPr>
+                  <m:begChr m:val="("/>
+                  <m:sepChr m:val=""/>
+                  <m:endChr m:val=")"/>
+                  <m:grow/>
+                </m:dPr>
+                <m:e>
+                  <m:r>
+                    <m:t>t</m:t>
+                  </m:r>
+                </m:e>
+              </m:d>
+              <m:r>
+                <m:t>​</m:t>
               </m:r>
               <m:r>
                 <m:t>&amp;</m:t>
@@ -15844,22 +16216,29 @@
                 <m:t>=</m:t>
               </m:r>
               <m:r>
+                <m:rPr>
+                  <m:sty m:val="p"/>
+                </m:rPr>
                 <m:t>F</m:t>
               </m:r>
               <m:r>
-                <m:rPr>
-                  <m:sty m:val="p"/>
-                </m:rPr>
-                <m:t>(</m:t>
-              </m:r>
-              <m:r>
-                <m:t>a</m:t>
-              </m:r>
-              <m:r>
-                <m:rPr>
-                  <m:sty m:val="p"/>
-                </m:rPr>
-                <m:t>)</m:t>
+                <m:t>​</m:t>
+              </m:r>
+              <m:d>
+                <m:dPr>
+                  <m:begChr m:val="("/>
+                  <m:sepChr m:val=""/>
+                  <m:endChr m:val=")"/>
+                  <m:grow/>
+                </m:dPr>
+                <m:e>
+                  <m:r>
+                    <m:t>a</m:t>
+                  </m:r>
+                </m:e>
+              </m:d>
+              <m:r>
+                <m:t>​</m:t>
               </m:r>
               <m:r>
                 <m:rPr>
@@ -15977,22 +16356,29 @@
                 <m:t>=</m:t>
               </m:r>
               <m:r>
+                <m:rPr>
+                  <m:sty m:val="p"/>
+                </m:rPr>
                 <m:t>F</m:t>
               </m:r>
               <m:r>
-                <m:rPr>
-                  <m:sty m:val="p"/>
-                </m:rPr>
-                <m:t>(</m:t>
-              </m:r>
-              <m:r>
-                <m:t>a</m:t>
-              </m:r>
-              <m:r>
-                <m:rPr>
-                  <m:sty m:val="p"/>
-                </m:rPr>
-                <m:t>)</m:t>
+                <m:t>​</m:t>
+              </m:r>
+              <m:d>
+                <m:dPr>
+                  <m:begChr m:val="("/>
+                  <m:sepChr m:val=""/>
+                  <m:endChr m:val=")"/>
+                  <m:grow/>
+                </m:dPr>
+                <m:e>
+                  <m:r>
+                    <m:t>a</m:t>
+                  </m:r>
+                </m:e>
+              </m:d>
+              <m:r>
+                <m:t>​</m:t>
               </m:r>
               <m:r>
                 <m:rPr>
@@ -16106,22 +16492,29 @@
       </w:r>
       <m:oMath>
         <m:r>
+          <m:rPr>
+            <m:sty m:val="p"/>
+          </m:rPr>
           <m:t>F</m:t>
         </m:r>
         <m:r>
-          <m:rPr>
-            <m:sty m:val="p"/>
-          </m:rPr>
-          <m:t>(</m:t>
-        </m:r>
-        <m:r>
-          <m:t>a</m:t>
-        </m:r>
-        <m:r>
-          <m:rPr>
-            <m:sty m:val="p"/>
-          </m:rPr>
-          <m:t>)</m:t>
+          <m:t>​</m:t>
+        </m:r>
+        <m:d>
+          <m:dPr>
+            <m:begChr m:val="("/>
+            <m:sepChr m:val=""/>
+            <m:endChr m:val=")"/>
+            <m:grow/>
+          </m:dPr>
+          <m:e>
+            <m:r>
+              <m:t>a</m:t>
+            </m:r>
+          </m:e>
+        </m:d>
+        <m:r>
+          <m:t>​</m:t>
         </m:r>
         <m:r>
           <m:rPr>
@@ -16161,22 +16554,29 @@
       </w:r>
       <m:oMath>
         <m:r>
+          <m:rPr>
+            <m:sty m:val="p"/>
+          </m:rPr>
           <m:t>F</m:t>
         </m:r>
         <m:r>
-          <m:rPr>
-            <m:sty m:val="p"/>
-          </m:rPr>
-          <m:t>(</m:t>
-        </m:r>
-        <m:r>
-          <m:t>t</m:t>
-        </m:r>
-        <m:r>
-          <m:rPr>
-            <m:sty m:val="p"/>
-          </m:rPr>
-          <m:t>)</m:t>
+          <m:t>​</m:t>
+        </m:r>
+        <m:d>
+          <m:dPr>
+            <m:begChr m:val="("/>
+            <m:sepChr m:val=""/>
+            <m:endChr m:val=")"/>
+            <m:grow/>
+          </m:dPr>
+          <m:e>
+            <m:r>
+              <m:t>t</m:t>
+            </m:r>
+          </m:e>
+        </m:d>
+        <m:r>
+          <m:t>​</m:t>
         </m:r>
         <m:r>
           <m:rPr>
@@ -16245,7 +16645,7 @@
         <w:t xml:space="preserve">.</w:t>
       </w:r>
     </w:p>
-    <w:bookmarkStart w:id="62" w:name="thm-cdf-derivative-is-density"/>
+    <w:bookmarkStart w:id="66" w:name="thm-cdf-derivative-is-density"/>
     <w:p>
       <w:pPr>
         <w:pStyle w:val="BodyText"/>
@@ -16296,6 +16696,9 @@
       </w:r>
       <m:oMath>
         <m:r>
+          <m:rPr>
+            <m:sty m:val="p"/>
+          </m:rPr>
           <m:t>F</m:t>
         </m:r>
       </m:oMath>
@@ -16395,27 +16798,34 @@
             </m:den>
           </m:f>
           <m:r>
+            <m:rPr>
+              <m:sty m:val="p"/>
+            </m:rPr>
             <m:t>F</m:t>
           </m:r>
           <m:r>
-            <m:rPr>
-              <m:sty m:val="p"/>
-            </m:rPr>
-            <m:t>(</m:t>
+            <m:t>​</m:t>
           </m:r>
+          <m:d>
+            <m:dPr>
+              <m:begChr m:val="("/>
+              <m:sepChr m:val=""/>
+              <m:endChr m:val=")"/>
+              <m:grow/>
+            </m:dPr>
+            <m:e>
+              <m:r>
+                <m:t>t</m:t>
+              </m:r>
+            </m:e>
+          </m:d>
           <m:r>
-            <m:t>t</m:t>
-          </m:r>
-          <m:r>
-            <m:rPr>
-              <m:sty m:val="p"/>
-            </m:rPr>
-            <m:t>)</m:t>
+            <m:t>​</m:t>
           </m:r>
         </m:oMath>
       </m:oMathPara>
     </w:p>
-    <w:bookmarkEnd w:id="62"/>
+    <w:bookmarkEnd w:id="66"/>
     <w:p>
       <w:pPr>
         <w:pStyle w:val="FirstParagraph"/>
@@ -16452,22 +16862,29 @@
       </w:r>
       <m:oMath>
         <m:r>
+          <m:rPr>
+            <m:sty m:val="p"/>
+          </m:rPr>
           <m:t>F</m:t>
         </m:r>
         <m:r>
-          <m:rPr>
-            <m:sty m:val="p"/>
-          </m:rPr>
-          <m:t>(</m:t>
-        </m:r>
-        <m:r>
-          <m:t>t</m:t>
-        </m:r>
-        <m:r>
-          <m:rPr>
-            <m:sty m:val="p"/>
-          </m:rPr>
-          <m:t>)</m:t>
+          <m:t>​</m:t>
+        </m:r>
+        <m:d>
+          <m:dPr>
+            <m:begChr m:val="("/>
+            <m:sepChr m:val=""/>
+            <m:endChr m:val=")"/>
+            <m:grow/>
+          </m:dPr>
+          <m:e>
+            <m:r>
+              <m:t>t</m:t>
+            </m:r>
+          </m:e>
+        </m:d>
+        <m:r>
+          <m:t>​</m:t>
         </m:r>
         <m:r>
           <m:rPr>
@@ -16685,7 +17102,7 @@
         <w:t xml:space="preserve">is continuous.</w:t>
       </w:r>
     </w:p>
-    <w:bookmarkStart w:id="63" w:name="cor-cdf-derivative-density-ae"/>
+    <w:bookmarkStart w:id="67" w:name="cor-cdf-derivative-density-ae"/>
     <w:p>
       <w:pPr>
         <w:pStyle w:val="BodyText"/>
@@ -16722,6 +17139,9 @@
       </w:r>
       <m:oMath>
         <m:r>
+          <m:rPr>
+            <m:sty m:val="p"/>
+          </m:rPr>
           <m:t>F</m:t>
         </m:r>
       </m:oMath>
@@ -16756,6 +17176,9 @@
       </w:r>
       <m:oMath>
         <m:r>
+          <m:rPr>
+            <m:sty m:val="p"/>
+          </m:rPr>
           <m:t>F</m:t>
         </m:r>
       </m:oMath>
@@ -16772,6 +17195,9 @@
         <m:sSup>
           <m:e>
             <m:r>
+              <m:rPr>
+                <m:sty m:val="p"/>
+              </m:rPr>
               <m:t>F</m:t>
             </m:r>
           </m:e>
@@ -16801,7 +17227,7 @@
         <w:t xml:space="preserve">at all but finitely many points.</w:t>
       </w:r>
     </w:p>
-    <w:bookmarkEnd w:id="63"/>
+    <w:bookmarkEnd w:id="67"/>
     <w:p>
       <w:pPr>
         <w:pStyle w:val="BodyText"/>
@@ -16871,6 +17297,9 @@
         <m:sSup>
           <m:e>
             <m:r>
+              <m:rPr>
+                <m:sty m:val="p"/>
+              </m:rPr>
               <m:t>F</m:t>
             </m:r>
           </m:e>
@@ -16974,7 +17403,7 @@
         <w:t xml:space="preserve">applies to each of them.</w:t>
       </w:r>
     </w:p>
-    <w:bookmarkStart w:id="64" w:name="exm-density-vs-CDF"/>
+    <w:bookmarkStart w:id="68" w:name="exm-density-vs-CDF"/>
     <w:p>
       <w:pPr>
         <w:pStyle w:val="BodyText"/>
@@ -17131,22 +17560,29 @@
           <m:eqArr>
             <m:e>
               <m:r>
+                <m:rPr>
+                  <m:sty m:val="p"/>
+                </m:rPr>
                 <m:t>F</m:t>
               </m:r>
               <m:r>
-                <m:rPr>
-                  <m:sty m:val="p"/>
-                </m:rPr>
-                <m:t>(</m:t>
-              </m:r>
-              <m:r>
-                <m:t>t</m:t>
-              </m:r>
-              <m:r>
-                <m:rPr>
-                  <m:sty m:val="p"/>
-                </m:rPr>
-                <m:t>)</m:t>
+                <m:t>​</m:t>
+              </m:r>
+              <m:d>
+                <m:dPr>
+                  <m:begChr m:val="("/>
+                  <m:sepChr m:val=""/>
+                  <m:endChr m:val=")"/>
+                  <m:grow/>
+                </m:dPr>
+                <m:e>
+                  <m:r>
+                    <m:t>t</m:t>
+                  </m:r>
+                </m:e>
+              </m:d>
+              <m:r>
+                <m:t>​</m:t>
               </m:r>
               <m:r>
                 <m:t>&amp;</m:t>
@@ -17470,22 +17906,29 @@
                 </m:den>
               </m:f>
               <m:r>
+                <m:rPr>
+                  <m:sty m:val="p"/>
+                </m:rPr>
                 <m:t>F</m:t>
               </m:r>
               <m:r>
-                <m:rPr>
-                  <m:sty m:val="p"/>
-                </m:rPr>
-                <m:t>(</m:t>
-              </m:r>
-              <m:r>
-                <m:t>t</m:t>
-              </m:r>
-              <m:r>
-                <m:rPr>
-                  <m:sty m:val="p"/>
-                </m:rPr>
-                <m:t>)</m:t>
+                <m:t>​</m:t>
+              </m:r>
+              <m:d>
+                <m:dPr>
+                  <m:begChr m:val="("/>
+                  <m:sepChr m:val=""/>
+                  <m:endChr m:val=")"/>
+                  <m:grow/>
+                </m:dPr>
+                <m:e>
+                  <m:r>
+                    <m:t>t</m:t>
+                  </m:r>
+                </m:e>
+              </m:d>
+              <m:r>
+                <m:t>​</m:t>
               </m:r>
               <m:r>
                 <m:t>&amp;</m:t>
@@ -17585,6 +18028,9 @@
       </w:r>
       <m:oMath>
         <m:r>
+          <m:rPr>
+            <m:sty m:val="p"/>
+          </m:rPr>
           <m:t>F</m:t>
         </m:r>
       </m:oMath>
@@ -17601,8 +18047,8 @@
         <w:t xml:space="preserve">its slope is 1 on the left and 0 on the right.</w:t>
       </w:r>
     </w:p>
-    <w:bookmarkEnd w:id="64"/>
-    <w:bookmarkStart w:id="65" w:name="thm-cdf-derivative-density"/>
+    <w:bookmarkEnd w:id="68"/>
+    <w:bookmarkStart w:id="69" w:name="thm-cdf-derivative-density"/>
     <w:p>
       <w:pPr>
         <w:pStyle w:val="BodyText"/>
@@ -17625,6 +18071,9 @@
       </w:r>
       <m:oMath>
         <m:r>
+          <m:rPr>
+            <m:sty m:val="p"/>
+          </m:rPr>
           <m:t>F</m:t>
         </m:r>
       </m:oMath>
@@ -17687,6 +18136,9 @@
         <m:sSup>
           <m:e>
             <m:r>
+              <m:rPr>
+                <m:sty m:val="p"/>
+              </m:rPr>
               <m:t>F</m:t>
             </m:r>
           </m:e>
@@ -17724,7 +18176,7 @@
         <w:t xml:space="preserve">.</w:t>
       </w:r>
     </w:p>
-    <w:bookmarkEnd w:id="65"/>
+    <w:bookmarkEnd w:id="69"/>
     <w:p>
       <w:pPr>
         <w:pStyle w:val="BodyText"/>
@@ -18234,22 +18686,29 @@
                 <m:t>=</m:t>
               </m:r>
               <m:r>
+                <m:rPr>
+                  <m:sty m:val="p"/>
+                </m:rPr>
                 <m:t>F</m:t>
               </m:r>
               <m:r>
-                <m:rPr>
-                  <m:sty m:val="p"/>
-                </m:rPr>
-                <m:t>(</m:t>
-              </m:r>
-              <m:r>
-                <m:t>x</m:t>
-              </m:r>
-              <m:r>
-                <m:rPr>
-                  <m:sty m:val="p"/>
-                </m:rPr>
-                <m:t>)</m:t>
+                <m:t>​</m:t>
+              </m:r>
+              <m:d>
+                <m:dPr>
+                  <m:begChr m:val="("/>
+                  <m:sepChr m:val=""/>
+                  <m:endChr m:val=")"/>
+                  <m:grow/>
+                </m:dPr>
+                <m:e>
+                  <m:r>
+                    <m:t>x</m:t>
+                  </m:r>
+                </m:e>
+              </m:d>
+              <m:r>
+                <m:t>​</m:t>
               </m:r>
               <m:r>
                 <m:rPr>
@@ -18258,34 +18717,41 @@
                 <m:t>−</m:t>
               </m:r>
               <m:r>
+                <m:rPr>
+                  <m:sty m:val="p"/>
+                </m:rPr>
                 <m:t>F</m:t>
               </m:r>
               <m:r>
-                <m:rPr>
-                  <m:sty m:val="p"/>
-                </m:rPr>
-                <m:t>(</m:t>
-              </m:r>
-              <m:r>
-                <m:t>x</m:t>
-              </m:r>
-              <m:r>
-                <m:rPr>
-                  <m:sty m:val="p"/>
-                </m:rPr>
-                <m:t>−</m:t>
-              </m:r>
-              <m:r>
-                <m:rPr>
-                  <m:sty m:val="p"/>
-                </m:rPr>
-                <m:t>Δ</m:t>
-              </m:r>
-              <m:r>
-                <m:rPr>
-                  <m:sty m:val="p"/>
-                </m:rPr>
-                <m:t>)</m:t>
+                <m:t>​</m:t>
+              </m:r>
+              <m:d>
+                <m:dPr>
+                  <m:begChr m:val="("/>
+                  <m:sepChr m:val=""/>
+                  <m:endChr m:val=")"/>
+                  <m:grow/>
+                </m:dPr>
+                <m:e>
+                  <m:r>
+                    <m:t>x</m:t>
+                  </m:r>
+                  <m:r>
+                    <m:rPr>
+                      <m:sty m:val="p"/>
+                    </m:rPr>
+                    <m:t>−</m:t>
+                  </m:r>
+                  <m:r>
+                    <m:rPr>
+                      <m:sty m:val="p"/>
+                    </m:rPr>
+                    <m:t>Δ</m:t>
+                  </m:r>
+                </m:e>
+              </m:d>
+              <m:r>
+                <m:t>​</m:t>
               </m:r>
               <m:r>
                 <m:t>&amp;</m:t>
@@ -18317,22 +18783,29 @@
       </w:r>
       <m:oMath>
         <m:r>
+          <m:rPr>
+            <m:sty m:val="p"/>
+          </m:rPr>
           <m:t>F</m:t>
         </m:r>
         <m:r>
-          <m:rPr>
-            <m:sty m:val="p"/>
-          </m:rPr>
-          <m:t>(</m:t>
-        </m:r>
-        <m:r>
-          <m:t>x</m:t>
-        </m:r>
-        <m:r>
-          <m:rPr>
-            <m:sty m:val="p"/>
-          </m:rPr>
-          <m:t>)</m:t>
+          <m:t>​</m:t>
+        </m:r>
+        <m:d>
+          <m:dPr>
+            <m:begChr m:val="("/>
+            <m:sepChr m:val=""/>
+            <m:endChr m:val=")"/>
+            <m:grow/>
+          </m:dPr>
+          <m:e>
+            <m:r>
+              <m:t>x</m:t>
+            </m:r>
+          </m:e>
+        </m:d>
+        <m:r>
+          <m:t>​</m:t>
         </m:r>
         <m:r>
           <m:rPr>
@@ -18341,23 +18814,62 @@
           <m:t>−</m:t>
         </m:r>
         <m:r>
+          <m:rPr>
+            <m:sty m:val="p"/>
+          </m:rPr>
           <m:t>F</m:t>
         </m:r>
         <m:r>
-          <m:rPr>
-            <m:sty m:val="p"/>
-          </m:rPr>
-          <m:t>(</m:t>
-        </m:r>
-        <m:r>
-          <m:t>x</m:t>
-        </m:r>
-        <m:r>
-          <m:rPr>
-            <m:sty m:val="p"/>
-          </m:rPr>
-          <m:t>−</m:t>
-        </m:r>
+          <m:t>​</m:t>
+        </m:r>
+        <m:d>
+          <m:dPr>
+            <m:begChr m:val="("/>
+            <m:sepChr m:val=""/>
+            <m:endChr m:val=")"/>
+            <m:grow/>
+          </m:dPr>
+          <m:e>
+            <m:r>
+              <m:t>x</m:t>
+            </m:r>
+            <m:r>
+              <m:rPr>
+                <m:sty m:val="p"/>
+              </m:rPr>
+              <m:t>−</m:t>
+            </m:r>
+            <m:r>
+              <m:rPr>
+                <m:sty m:val="p"/>
+              </m:rPr>
+              <m:t>Δ</m:t>
+            </m:r>
+          </m:e>
+        </m:d>
+        <m:r>
+          <m:t>​</m:t>
+        </m:r>
+        <m:r>
+          <m:rPr>
+            <m:sty m:val="p"/>
+          </m:rPr>
+          <m:t>→</m:t>
+        </m:r>
+        <m:r>
+          <m:t>0</m:t>
+        </m:r>
+      </m:oMath>
+      <w:r>
+        <w:t xml:space="preserve"> </w:t>
+      </w:r>
+      <w:r>
+        <w:t xml:space="preserve">as</w:t>
+      </w:r>
+      <w:r>
+        <w:t xml:space="preserve"> </w:t>
+      </w:r>
+      <m:oMath>
         <m:r>
           <m:rPr>
             <m:sty m:val="p"/>
@@ -18368,45 +18880,13 @@
           <m:rPr>
             <m:sty m:val="p"/>
           </m:rPr>
-          <m:t>)</m:t>
-        </m:r>
-        <m:r>
-          <m:rPr>
-            <m:sty m:val="p"/>
-          </m:rPr>
-          <m:t>→</m:t>
+          <m:t>↓</m:t>
         </m:r>
         <m:r>
           <m:t>0</m:t>
         </m:r>
       </m:oMath>
       <w:r>
-        <w:t xml:space="preserve"> </w:t>
-      </w:r>
-      <w:r>
-        <w:t xml:space="preserve">as</w:t>
-      </w:r>
-      <w:r>
-        <w:t xml:space="preserve"> </w:t>
-      </w:r>
-      <m:oMath>
-        <m:r>
-          <m:rPr>
-            <m:sty m:val="p"/>
-          </m:rPr>
-          <m:t>Δ</m:t>
-        </m:r>
-        <m:r>
-          <m:rPr>
-            <m:sty m:val="p"/>
-          </m:rPr>
-          <m:t>↓</m:t>
-        </m:r>
-        <m:r>
-          <m:t>0</m:t>
-        </m:r>
-      </m:oMath>
-      <w:r>
         <w:t xml:space="preserve">, because</w:t>
       </w:r>
       <w:r>
@@ -18414,6 +18894,9 @@
       </w:r>
       <m:oMath>
         <m:r>
+          <m:rPr>
+            <m:sty m:val="p"/>
+          </m:rPr>
           <m:t>F</m:t>
         </m:r>
       </m:oMath>
@@ -18700,22 +19183,29 @@
                 <m:t>=</m:t>
               </m:r>
               <m:r>
+                <m:rPr>
+                  <m:sty m:val="p"/>
+                </m:rPr>
                 <m:t>F</m:t>
               </m:r>
               <m:r>
-                <m:rPr>
-                  <m:sty m:val="p"/>
-                </m:rPr>
-                <m:t>(</m:t>
-              </m:r>
-              <m:r>
-                <m:t>b</m:t>
-              </m:r>
-              <m:r>
-                <m:rPr>
-                  <m:sty m:val="p"/>
-                </m:rPr>
-                <m:t>)</m:t>
+                <m:t>​</m:t>
+              </m:r>
+              <m:d>
+                <m:dPr>
+                  <m:begChr m:val="("/>
+                  <m:sepChr m:val=""/>
+                  <m:endChr m:val=")"/>
+                  <m:grow/>
+                </m:dPr>
+                <m:e>
+                  <m:r>
+                    <m:t>b</m:t>
+                  </m:r>
+                </m:e>
+              </m:d>
+              <m:r>
+                <m:t>​</m:t>
               </m:r>
               <m:r>
                 <m:rPr>
@@ -18724,22 +19214,29 @@
                 <m:t>−</m:t>
               </m:r>
               <m:r>
+                <m:rPr>
+                  <m:sty m:val="p"/>
+                </m:rPr>
                 <m:t>F</m:t>
               </m:r>
               <m:r>
-                <m:rPr>
-                  <m:sty m:val="p"/>
-                </m:rPr>
-                <m:t>(</m:t>
-              </m:r>
-              <m:r>
-                <m:t>a</m:t>
-              </m:r>
-              <m:r>
-                <m:rPr>
-                  <m:sty m:val="p"/>
-                </m:rPr>
-                <m:t>)</m:t>
+                <m:t>​</m:t>
+              </m:r>
+              <m:d>
+                <m:dPr>
+                  <m:begChr m:val="("/>
+                  <m:sepChr m:val=""/>
+                  <m:endChr m:val=")"/>
+                  <m:grow/>
+                </m:dPr>
+                <m:e>
+                  <m:r>
+                    <m:t>a</m:t>
+                  </m:r>
+                </m:e>
+              </m:d>
+              <m:r>
+                <m:t>​</m:t>
               </m:r>
               <m:r>
                 <m:t>&amp;</m:t>
@@ -18786,6 +19283,9 @@
                   <m:sSup>
                     <m:e>
                       <m:r>
+                        <m:rPr>
+                          <m:sty m:val="p"/>
+                        </m:rPr>
                         <m:t>F</m:t>
                       </m:r>
                     </m:e>
@@ -18903,6 +19403,9 @@
         <m:sSup>
           <m:e>
             <m:r>
+              <m:rPr>
+                <m:sty m:val="p"/>
+              </m:rPr>
               <m:t>F</m:t>
             </m:r>
           </m:e>
@@ -18933,6 +19436,9 @@
       </w:r>
       <m:oMath>
         <m:r>
+          <m:rPr>
+            <m:sty m:val="p"/>
+          </m:rPr>
           <m:t>F</m:t>
         </m:r>
       </m:oMath>
@@ -18955,6 +19461,9 @@
         <m:sSup>
           <m:e>
             <m:r>
+              <m:rPr>
+                <m:sty m:val="p"/>
+              </m:rPr>
               <m:t>F</m:t>
             </m:r>
           </m:e>
@@ -18988,6 +19497,9 @@
       </w:r>
       <m:oMath>
         <m:r>
+          <m:rPr>
+            <m:sty m:val="p"/>
+          </m:rPr>
           <m:t>F</m:t>
         </m:r>
       </m:oMath>
@@ -19009,7 +19521,7 @@
         <w:t xml:space="preserve">).</w:t>
       </w:r>
     </w:p>
-    <w:bookmarkStart w:id="66" w:name="exm-cdf-derivative-density"/>
+    <w:bookmarkStart w:id="70" w:name="exm-cdf-derivative-density"/>
     <w:p>
       <w:pPr>
         <w:pStyle w:val="BodyText"/>
@@ -19046,14 +19558,50 @@
       </w:r>
       <m:oMath>
         <m:r>
+          <m:rPr>
+            <m:sty m:val="p"/>
+          </m:rPr>
           <m:t>F</m:t>
         </m:r>
         <m:r>
-          <m:rPr>
-            <m:sty m:val="p"/>
-          </m:rPr>
-          <m:t>(</m:t>
-        </m:r>
+          <m:t>​</m:t>
+        </m:r>
+        <m:d>
+          <m:dPr>
+            <m:begChr m:val="("/>
+            <m:sepChr m:val=""/>
+            <m:endChr m:val=")"/>
+            <m:grow/>
+          </m:dPr>
+          <m:e>
+            <m:r>
+              <m:t>t</m:t>
+            </m:r>
+          </m:e>
+        </m:d>
+        <m:r>
+          <m:t>​</m:t>
+        </m:r>
+        <m:r>
+          <m:rPr>
+            <m:sty m:val="p"/>
+          </m:rPr>
+          <m:t>=</m:t>
+        </m:r>
+        <m:r>
+          <m:t>0</m:t>
+        </m:r>
+      </m:oMath>
+      <w:r>
+        <w:t xml:space="preserve"> </w:t>
+      </w:r>
+      <w:r>
+        <w:t xml:space="preserve">for</w:t>
+      </w:r>
+      <w:r>
+        <w:t xml:space="preserve"> </w:t>
+      </w:r>
+      <m:oMath>
         <m:r>
           <m:t>t</m:t>
         </m:r>
@@ -19061,42 +19609,13 @@
           <m:rPr>
             <m:sty m:val="p"/>
           </m:rPr>
-          <m:t>)</m:t>
-        </m:r>
-        <m:r>
-          <m:rPr>
-            <m:sty m:val="p"/>
-          </m:rPr>
-          <m:t>=</m:t>
+          <m:t>&lt;</m:t>
         </m:r>
         <m:r>
           <m:t>0</m:t>
         </m:r>
       </m:oMath>
       <w:r>
-        <w:t xml:space="preserve"> </w:t>
-      </w:r>
-      <w:r>
-        <w:t xml:space="preserve">for</w:t>
-      </w:r>
-      <w:r>
-        <w:t xml:space="preserve"> </w:t>
-      </w:r>
-      <m:oMath>
-        <m:r>
-          <m:t>t</m:t>
-        </m:r>
-        <m:r>
-          <m:rPr>
-            <m:sty m:val="p"/>
-          </m:rPr>
-          <m:t>&lt;</m:t>
-        </m:r>
-        <m:r>
-          <m:t>0</m:t>
-        </m:r>
-      </m:oMath>
-      <w:r>
         <w:t xml:space="preserve">,</w:t>
       </w:r>
       <w:r>
@@ -19104,22 +19623,29 @@
       </w:r>
       <m:oMath>
         <m:r>
+          <m:rPr>
+            <m:sty m:val="p"/>
+          </m:rPr>
           <m:t>F</m:t>
         </m:r>
         <m:r>
-          <m:rPr>
-            <m:sty m:val="p"/>
-          </m:rPr>
-          <m:t>(</m:t>
-        </m:r>
-        <m:r>
-          <m:t>t</m:t>
-        </m:r>
-        <m:r>
-          <m:rPr>
-            <m:sty m:val="p"/>
-          </m:rPr>
-          <m:t>)</m:t>
+          <m:t>​</m:t>
+        </m:r>
+        <m:d>
+          <m:dPr>
+            <m:begChr m:val="("/>
+            <m:sepChr m:val=""/>
+            <m:endChr m:val=")"/>
+            <m:grow/>
+          </m:dPr>
+          <m:e>
+            <m:r>
+              <m:t>t</m:t>
+            </m:r>
+          </m:e>
+        </m:d>
+        <m:r>
+          <m:t>​</m:t>
         </m:r>
         <m:r>
           <m:rPr>
@@ -19186,14 +19712,50 @@
       </w:r>
       <m:oMath>
         <m:r>
+          <m:rPr>
+            <m:sty m:val="p"/>
+          </m:rPr>
           <m:t>F</m:t>
         </m:r>
         <m:r>
-          <m:rPr>
-            <m:sty m:val="p"/>
-          </m:rPr>
-          <m:t>(</m:t>
-        </m:r>
+          <m:t>​</m:t>
+        </m:r>
+        <m:d>
+          <m:dPr>
+            <m:begChr m:val="("/>
+            <m:sepChr m:val=""/>
+            <m:endChr m:val=")"/>
+            <m:grow/>
+          </m:dPr>
+          <m:e>
+            <m:r>
+              <m:t>t</m:t>
+            </m:r>
+          </m:e>
+        </m:d>
+        <m:r>
+          <m:t>​</m:t>
+        </m:r>
+        <m:r>
+          <m:rPr>
+            <m:sty m:val="p"/>
+          </m:rPr>
+          <m:t>=</m:t>
+        </m:r>
+        <m:r>
+          <m:t>1</m:t>
+        </m:r>
+      </m:oMath>
+      <w:r>
+        <w:t xml:space="preserve"> </w:t>
+      </w:r>
+      <w:r>
+        <w:t xml:space="preserve">for</w:t>
+      </w:r>
+      <w:r>
+        <w:t xml:space="preserve"> </w:t>
+      </w:r>
+      <m:oMath>
         <m:r>
           <m:t>t</m:t>
         </m:r>
@@ -19201,42 +19763,13 @@
           <m:rPr>
             <m:sty m:val="p"/>
           </m:rPr>
-          <m:t>)</m:t>
-        </m:r>
-        <m:r>
-          <m:rPr>
-            <m:sty m:val="p"/>
-          </m:rPr>
-          <m:t>=</m:t>
+          <m:t>&gt;</m:t>
         </m:r>
         <m:r>
           <m:t>1</m:t>
         </m:r>
       </m:oMath>
       <w:r>
-        <w:t xml:space="preserve"> </w:t>
-      </w:r>
-      <w:r>
-        <w:t xml:space="preserve">for</w:t>
-      </w:r>
-      <w:r>
-        <w:t xml:space="preserve"> </w:t>
-      </w:r>
-      <m:oMath>
-        <m:r>
-          <m:t>t</m:t>
-        </m:r>
-        <m:r>
-          <m:rPr>
-            <m:sty m:val="p"/>
-          </m:rPr>
-          <m:t>&gt;</m:t>
-        </m:r>
-        <m:r>
-          <m:t>1</m:t>
-        </m:r>
-      </m:oMath>
-      <w:r>
         <w:t xml:space="preserve">.</w:t>
       </w:r>
       <w:r>
@@ -19250,6 +19783,9 @@
       </w:r>
       <m:oMath>
         <m:r>
+          <m:rPr>
+            <m:sty m:val="p"/>
+          </m:rPr>
           <m:t>F</m:t>
         </m:r>
       </m:oMath>
@@ -19495,8 +20031,8 @@
         <w:t xml:space="preserve">.</w:t>
       </w:r>
     </w:p>
-    <w:bookmarkEnd w:id="66"/>
-    <w:bookmarkStart w:id="67" w:name="thm-density-limit"/>
+    <w:bookmarkEnd w:id="70"/>
+    <w:bookmarkStart w:id="71" w:name="thm-density-limit"/>
     <w:p>
       <w:pPr>
         <w:pStyle w:val="BodyText"/>
@@ -19772,7 +20308,7 @@
         </m:oMath>
       </m:oMathPara>
     </w:p>
-    <w:bookmarkEnd w:id="67"/>
+    <w:bookmarkEnd w:id="71"/>
     <w:p>
       <w:pPr>
         <w:pStyle w:val="FirstParagraph"/>
@@ -20100,34 +20636,41 @@
                 </m:fPr>
                 <m:num>
                   <m:r>
-                    <m:t>F</m:t>
-                  </m:r>
-                  <m:r>
                     <m:rPr>
                       <m:sty m:val="p"/>
                     </m:rPr>
-                    <m:t>(</m:t>
-                  </m:r>
-                  <m:r>
-                    <m:t>x</m:t>
-                  </m:r>
-                  <m:r>
-                    <m:rPr>
-                      <m:sty m:val="p"/>
-                    </m:rPr>
-                    <m:t>+</m:t>
-                  </m:r>
-                  <m:r>
-                    <m:rPr>
-                      <m:sty m:val="p"/>
-                    </m:rPr>
-                    <m:t>Δ</m:t>
-                  </m:r>
-                  <m:r>
-                    <m:rPr>
-                      <m:sty m:val="p"/>
-                    </m:rPr>
-                    <m:t>)</m:t>
+                    <m:t>F</m:t>
+                  </m:r>
+                  <m:r>
+                    <m:t>​</m:t>
+                  </m:r>
+                  <m:d>
+                    <m:dPr>
+                      <m:begChr m:val="("/>
+                      <m:sepChr m:val=""/>
+                      <m:endChr m:val=")"/>
+                      <m:grow/>
+                    </m:dPr>
+                    <m:e>
+                      <m:r>
+                        <m:t>x</m:t>
+                      </m:r>
+                      <m:r>
+                        <m:rPr>
+                          <m:sty m:val="p"/>
+                        </m:rPr>
+                        <m:t>+</m:t>
+                      </m:r>
+                      <m:r>
+                        <m:rPr>
+                          <m:sty m:val="p"/>
+                        </m:rPr>
+                        <m:t>Δ</m:t>
+                      </m:r>
+                    </m:e>
+                  </m:d>
+                  <m:r>
+                    <m:t>​</m:t>
                   </m:r>
                   <m:r>
                     <m:rPr>
@@ -20136,22 +20679,29 @@
                     <m:t>−</m:t>
                   </m:r>
                   <m:r>
-                    <m:t>F</m:t>
-                  </m:r>
-                  <m:r>
                     <m:rPr>
                       <m:sty m:val="p"/>
                     </m:rPr>
-                    <m:t>(</m:t>
-                  </m:r>
-                  <m:r>
-                    <m:t>x</m:t>
-                  </m:r>
-                  <m:r>
-                    <m:rPr>
-                      <m:sty m:val="p"/>
-                    </m:rPr>
-                    <m:t>)</m:t>
+                    <m:t>F</m:t>
+                  </m:r>
+                  <m:r>
+                    <m:t>​</m:t>
+                  </m:r>
+                  <m:d>
+                    <m:dPr>
+                      <m:begChr m:val="("/>
+                      <m:sepChr m:val=""/>
+                      <m:endChr m:val=")"/>
+                      <m:grow/>
+                    </m:dPr>
+                    <m:e>
+                      <m:r>
+                        <m:t>x</m:t>
+                      </m:r>
+                    </m:e>
+                  </m:d>
+                  <m:r>
+                    <m:t>​</m:t>
                   </m:r>
                 </m:num>
                 <m:den>
@@ -20207,6 +20757,9 @@
       </w:r>
       <m:oMath>
         <m:r>
+          <m:rPr>
+            <m:sty m:val="p"/>
+          </m:rPr>
           <m:t>F</m:t>
         </m:r>
       </m:oMath>
@@ -20237,6 +20790,9 @@
         <m:sSup>
           <m:e>
             <m:r>
+              <m:rPr>
+                <m:sty m:val="p"/>
+              </m:rPr>
               <m:t>F</m:t>
             </m:r>
           </m:e>
@@ -20530,7 +21086,7 @@
         <w:t xml:space="preserve">(Chapter 22, p. 535).</w:t>
       </w:r>
     </w:p>
-    <w:bookmarkStart w:id="68" w:name="exm-density-limit"/>
+    <w:bookmarkStart w:id="72" w:name="exm-density-limit"/>
     <w:p>
       <w:pPr>
         <w:pStyle w:val="BodyText"/>
@@ -20966,8 +21522,8 @@
         <w:t xml:space="preserve">.</w:t>
       </w:r>
     </w:p>
-    <w:bookmarkEnd w:id="68"/>
-    <w:bookmarkStart w:id="69" w:name="prp-density-limit-right-derivative"/>
+    <w:bookmarkEnd w:id="72"/>
+    <w:bookmarkStart w:id="73" w:name="prp-density-limit-right-derivative"/>
     <w:p>
       <w:pPr>
         <w:pStyle w:val="BodyText"/>
@@ -21004,6 +21560,9 @@
       </w:r>
       <m:oMath>
         <m:r>
+          <m:rPr>
+            <m:sty m:val="p"/>
+          </m:rPr>
           <m:t>F</m:t>
         </m:r>
       </m:oMath>
@@ -21169,34 +21728,41 @@
             </m:fPr>
             <m:num>
               <m:r>
+                <m:rPr>
+                  <m:sty m:val="p"/>
+                </m:rPr>
                 <m:t>F</m:t>
               </m:r>
               <m:r>
-                <m:rPr>
-                  <m:sty m:val="p"/>
-                </m:rPr>
-                <m:t>(</m:t>
-              </m:r>
-              <m:r>
-                <m:t>x</m:t>
-              </m:r>
-              <m:r>
-                <m:rPr>
-                  <m:sty m:val="p"/>
-                </m:rPr>
-                <m:t>+</m:t>
-              </m:r>
-              <m:r>
-                <m:rPr>
-                  <m:sty m:val="p"/>
-                </m:rPr>
-                <m:t>Δ</m:t>
-              </m:r>
-              <m:r>
-                <m:rPr>
-                  <m:sty m:val="p"/>
-                </m:rPr>
-                <m:t>)</m:t>
+                <m:t>​</m:t>
+              </m:r>
+              <m:d>
+                <m:dPr>
+                  <m:begChr m:val="("/>
+                  <m:sepChr m:val=""/>
+                  <m:endChr m:val=")"/>
+                  <m:grow/>
+                </m:dPr>
+                <m:e>
+                  <m:r>
+                    <m:t>x</m:t>
+                  </m:r>
+                  <m:r>
+                    <m:rPr>
+                      <m:sty m:val="p"/>
+                    </m:rPr>
+                    <m:t>+</m:t>
+                  </m:r>
+                  <m:r>
+                    <m:rPr>
+                      <m:sty m:val="p"/>
+                    </m:rPr>
+                    <m:t>Δ</m:t>
+                  </m:r>
+                </m:e>
+              </m:d>
+              <m:r>
+                <m:t>​</m:t>
               </m:r>
               <m:r>
                 <m:rPr>
@@ -21205,22 +21771,29 @@
                 <m:t>−</m:t>
               </m:r>
               <m:r>
+                <m:rPr>
+                  <m:sty m:val="p"/>
+                </m:rPr>
                 <m:t>F</m:t>
               </m:r>
               <m:r>
-                <m:rPr>
-                  <m:sty m:val="p"/>
-                </m:rPr>
-                <m:t>(</m:t>
-              </m:r>
-              <m:r>
-                <m:t>x</m:t>
-              </m:r>
-              <m:r>
-                <m:rPr>
-                  <m:sty m:val="p"/>
-                </m:rPr>
-                <m:t>)</m:t>
+                <m:t>​</m:t>
+              </m:r>
+              <m:d>
+                <m:dPr>
+                  <m:begChr m:val="("/>
+                  <m:sepChr m:val=""/>
+                  <m:endChr m:val=")"/>
+                  <m:grow/>
+                </m:dPr>
+                <m:e>
+                  <m:r>
+                    <m:t>x</m:t>
+                  </m:r>
+                </m:e>
+              </m:d>
+              <m:r>
+                <m:t>​</m:t>
               </m:r>
             </m:num>
             <m:den>
@@ -21253,6 +21826,9 @@
       </w:r>
       <m:oMath>
         <m:r>
+          <m:rPr>
+            <m:sty m:val="p"/>
+          </m:rPr>
           <m:t>F</m:t>
         </m:r>
       </m:oMath>
@@ -21274,7 +21850,7 @@
         <w:t xml:space="preserve">.</w:t>
       </w:r>
     </w:p>
-    <w:bookmarkEnd w:id="69"/>
+    <w:bookmarkEnd w:id="73"/>
     <w:p>
       <w:pPr>
         <w:pStyle w:val="BodyText"/>
@@ -21408,7 +21984,7 @@
         <w:t xml:space="preserve">or both have none.</w:t>
       </w:r>
     </w:p>
-    <w:bookmarkStart w:id="70" w:name="exm-density-limit-jump"/>
+    <w:bookmarkStart w:id="74" w:name="exm-density-limit-jump"/>
     <w:p>
       <w:pPr>
         <w:pStyle w:val="BodyText"/>
@@ -22235,6 +22811,9 @@
       </w:r>
       <m:oMath>
         <m:r>
+          <m:rPr>
+            <m:sty m:val="p"/>
+          </m:rPr>
           <m:t>F</m:t>
         </m:r>
       </m:oMath>
@@ -22265,8 +22844,8 @@
         <w:t xml:space="preserve">.</w:t>
       </w:r>
     </w:p>
-    <w:bookmarkEnd w:id="70"/>
-    <w:bookmarkStart w:id="71" w:name="thm-density-sums-to-one"/>
+    <w:bookmarkEnd w:id="74"/>
+    <w:bookmarkStart w:id="75" w:name="thm-density-sums-to-one"/>
     <w:p>
       <w:pPr>
         <w:pStyle w:val="BodyText"/>
@@ -22390,7 +22969,7 @@
         </m:oMath>
       </m:oMathPara>
     </w:p>
-    <w:bookmarkEnd w:id="71"/>
+    <w:bookmarkEnd w:id="75"/>
     <w:p>
       <w:pPr>
         <w:pStyle w:val="FirstParagraph"/>
@@ -22620,22 +23199,29 @@
                 </m:lim>
               </m:limLow>
               <m:r>
+                <m:rPr>
+                  <m:sty m:val="p"/>
+                </m:rPr>
                 <m:t>F</m:t>
               </m:r>
               <m:r>
-                <m:rPr>
-                  <m:sty m:val="p"/>
-                </m:rPr>
-                <m:t>(</m:t>
-              </m:r>
-              <m:r>
-                <m:t>b</m:t>
-              </m:r>
-              <m:r>
-                <m:rPr>
-                  <m:sty m:val="p"/>
-                </m:rPr>
-                <m:t>)</m:t>
+                <m:t>​</m:t>
+              </m:r>
+              <m:d>
+                <m:dPr>
+                  <m:begChr m:val="("/>
+                  <m:sepChr m:val=""/>
+                  <m:endChr m:val=")"/>
+                  <m:grow/>
+                </m:dPr>
+                <m:e>
+                  <m:r>
+                    <m:t>b</m:t>
+                  </m:r>
+                </m:e>
+              </m:d>
+              <m:r>
+                <m:t>​</m:t>
               </m:r>
               <m:r>
                 <m:t>&amp;</m:t>
@@ -22704,7 +23290,7 @@
         <w:t xml:space="preserve">.</w:t>
       </w:r>
     </w:p>
-    <w:bookmarkStart w:id="72" w:name="exm-density-sums-to-one"/>
+    <w:bookmarkStart w:id="76" w:name="exm-density-sums-to-one"/>
     <w:p>
       <w:pPr>
         <w:pStyle w:val="BodyText"/>
@@ -22921,8 +23507,8 @@
         </m:oMath>
       </m:oMathPara>
     </w:p>
-    <w:bookmarkEnd w:id="72"/>
-    <w:bookmarkStart w:id="73" w:name="def-jointly-distributed"/>
+    <w:bookmarkEnd w:id="76"/>
+    <w:bookmarkStart w:id="77" w:name="def-jointly-distributed"/>
     <w:p>
       <w:pPr>
         <w:pStyle w:val="FirstParagraph"/>
@@ -23151,7 +23737,7 @@
         <w:t xml:space="preserve">has a probability.</w:t>
       </w:r>
     </w:p>
-    <w:bookmarkEnd w:id="73"/>
+    <w:bookmarkEnd w:id="77"/>
     <w:p>
       <w:pPr>
         <w:pStyle w:val="BodyText"/>
@@ -23315,7 +23901,7 @@
         <w:t xml:space="preserve">and similarly for more variables.</w:t>
       </w:r>
     </w:p>
-    <w:bookmarkStart w:id="74" w:name="exm-jointly-distributed"/>
+    <w:bookmarkStart w:id="78" w:name="exm-jointly-distributed"/>
     <w:p>
       <w:pPr>
         <w:pStyle w:val="BodyText"/>
@@ -23740,8 +24326,8 @@
         </m:oMath>
       </m:oMathPara>
     </w:p>
-    <w:bookmarkEnd w:id="74"/>
-    <w:bookmarkStart w:id="76" w:name="def-joint-distribution"/>
+    <w:bookmarkEnd w:id="78"/>
+    <w:bookmarkStart w:id="80" w:name="def-joint-distribution"/>
     <w:p>
       <w:pPr>
         <w:pStyle w:val="FirstParagraph"/>
@@ -23970,7 +24556,7 @@
       <w:r>
         <w:t xml:space="preserve"> </w:t>
       </w:r>
-      <w:hyperlink r:id="rId75">
+      <w:hyperlink r:id="rId79">
         <w:r>
           <w:rPr>
             <w:rStyle w:val="Hyperlink"/>
@@ -24074,8 +24660,8 @@
         <w:t xml:space="preserve">.</w:t>
       </w:r>
     </w:p>
-    <w:bookmarkEnd w:id="76"/>
-    <w:bookmarkStart w:id="77" w:name="exm-joint-distribution"/>
+    <w:bookmarkEnd w:id="80"/>
+    <w:bookmarkStart w:id="81" w:name="exm-joint-distribution"/>
     <w:p>
       <w:pPr>
         <w:pStyle w:val="BodyText"/>
@@ -24476,8 +25062,8 @@
         <w:t xml:space="preserve">and each of those outcomes has at least one head.</w:t>
       </w:r>
     </w:p>
-    <w:bookmarkEnd w:id="77"/>
-    <w:bookmarkStart w:id="78" w:name="thm-joint-distribution-rectangles"/>
+    <w:bookmarkEnd w:id="81"/>
+    <w:bookmarkStart w:id="82" w:name="thm-joint-distribution-rectangles"/>
     <w:p>
       <w:pPr>
         <w:pStyle w:val="BodyText"/>
@@ -25046,7 +25632,7 @@
         <w:t xml:space="preserve">.</w:t>
       </w:r>
     </w:p>
-    <w:bookmarkEnd w:id="78"/>
+    <w:bookmarkEnd w:id="82"/>
     <w:p>
       <w:pPr>
         <w:pStyle w:val="BodyText"/>
@@ -25126,7 +25712,7 @@
       <w:r>
         <w:t xml:space="preserve"> </w:t>
       </w:r>
-      <w:hyperlink r:id="rId79">
+      <w:hyperlink r:id="rId83">
         <m:oMath>
           <m:r>
             <m:t>π</m:t>
@@ -25186,7 +25772,7 @@
         <w:t xml:space="preserve">.</w:t>
       </w:r>
     </w:p>
-    <w:bookmarkStart w:id="80" w:name="def-joint-pmf"/>
+    <w:bookmarkStart w:id="84" w:name="def-joint-pmf"/>
     <w:p>
       <w:pPr>
         <w:pStyle w:val="BodyText"/>
@@ -25514,8 +26100,8 @@
         </m:oMath>
       </m:oMathPara>
     </w:p>
-    <w:bookmarkEnd w:id="80"/>
-    <w:bookmarkStart w:id="81" w:name="exm-joint-pmf"/>
+    <w:bookmarkEnd w:id="84"/>
+    <w:bookmarkStart w:id="85" w:name="exm-joint-pmf"/>
     <w:p>
       <w:pPr>
         <w:pStyle w:val="FirstParagraph"/>
@@ -25989,8 +26575,8 @@
         </w:tc>
       </w:tr>
     </w:tbl>
-    <w:bookmarkEnd w:id="81"/>
-    <w:bookmarkStart w:id="82" w:name="def-marginal"/>
+    <w:bookmarkEnd w:id="85"/>
+    <w:bookmarkStart w:id="86" w:name="def-marginal"/>
     <w:p>
       <w:pPr>
         <w:pStyle w:val="BodyText"/>
@@ -26099,7 +26685,7 @@
         <w:t xml:space="preserve">.</w:t>
       </w:r>
     </w:p>
-    <w:bookmarkEnd w:id="82"/>
+    <w:bookmarkEnd w:id="86"/>
     <w:p>
       <w:pPr>
         <w:pStyle w:val="BodyText"/>
@@ -26161,7 +26747,7 @@
         <w:t xml:space="preserve">.</w:t>
       </w:r>
     </w:p>
-    <w:bookmarkStart w:id="83" w:name="exm-marginal"/>
+    <w:bookmarkStart w:id="87" w:name="exm-marginal"/>
     <w:p>
       <w:pPr>
         <w:pStyle w:val="BodyText"/>
@@ -26396,8 +26982,8 @@
         <w:t xml:space="preserve">.</w:t>
       </w:r>
     </w:p>
-    <w:bookmarkEnd w:id="83"/>
-    <w:bookmarkStart w:id="84" w:name="thm-marginal-pmf"/>
+    <w:bookmarkEnd w:id="87"/>
+    <w:bookmarkStart w:id="88" w:name="thm-marginal-pmf"/>
     <w:p>
       <w:pPr>
         <w:pStyle w:val="BodyText"/>
@@ -26608,7 +27194,7 @@
         </m:oMath>
       </m:oMathPara>
     </w:p>
-    <w:bookmarkEnd w:id="84"/>
+    <w:bookmarkEnd w:id="88"/>
     <w:p>
       <w:pPr>
         <w:pStyle w:val="FirstParagraph"/>
@@ -27267,7 +27853,7 @@
         </m:oMath>
       </m:oMathPara>
     </w:p>
-    <w:bookmarkStart w:id="85" w:name="exm-marginal-pmf"/>
+    <w:bookmarkStart w:id="89" w:name="exm-marginal-pmf"/>
     <w:p>
       <w:pPr>
         <w:pStyle w:val="FirstParagraph"/>
@@ -27781,8 +28367,8 @@
         <w:t xml:space="preserve">.</w:t>
       </w:r>
     </w:p>
-    <w:bookmarkEnd w:id="85"/>
-    <w:bookmarkStart w:id="86" w:name="def-joint-pdf"/>
+    <w:bookmarkEnd w:id="89"/>
+    <w:bookmarkStart w:id="90" w:name="def-joint-pdf"/>
     <w:p>
       <w:pPr>
         <w:pStyle w:val="BodyText"/>
@@ -28467,7 +29053,7 @@
         </m:oMath>
       </m:oMathPara>
     </w:p>
-    <w:bookmarkEnd w:id="86"/>
+    <w:bookmarkEnd w:id="90"/>
     <w:p>
       <w:pPr>
         <w:pStyle w:val="FirstParagraph"/>
@@ -28488,7 +29074,7 @@
       <w:r>
         <w:t xml:space="preserve"> </w:t>
       </w:r>
-      <w:hyperlink r:id="rId75">
+      <w:hyperlink r:id="rId79">
         <w:r>
           <w:rPr>
             <w:rStyle w:val="Hyperlink"/>
@@ -28520,7 +29106,7 @@
         <w:t xml:space="preserve">every region that arises in these notes is in it.</w:t>
       </w:r>
     </w:p>
-    <w:bookmarkStart w:id="87" w:name="exm-joint-pdf"/>
+    <w:bookmarkStart w:id="91" w:name="exm-joint-pdf"/>
     <w:p>
       <w:pPr>
         <w:pStyle w:val="BodyText"/>
@@ -29157,8 +29743,8 @@
         </m:oMath>
       </m:oMathPara>
     </w:p>
-    <w:bookmarkEnd w:id="87"/>
-    <w:bookmarkStart w:id="88" w:name="thm-no-joint-density-diagonal"/>
+    <w:bookmarkEnd w:id="91"/>
+    <w:bookmarkStart w:id="92" w:name="thm-no-joint-density-diagonal"/>
     <w:p>
       <w:pPr>
         <w:pStyle w:val="FirstParagraph"/>
@@ -29246,7 +29832,7 @@
         <w:t xml:space="preserve">.</w:t>
       </w:r>
     </w:p>
-    <w:bookmarkEnd w:id="88"/>
+    <w:bookmarkEnd w:id="92"/>
     <w:p>
       <w:pPr>
         <w:pStyle w:val="BodyText"/>
@@ -30313,7 +30899,7 @@
       <w:r>
         <w:t xml:space="preserve">(</w:t>
       </w:r>
-      <w:hyperlink r:id="rId89">
+      <w:hyperlink r:id="rId93">
         <w:r>
           <w:rPr>
             <w:rStyle w:val="Hyperlink"/>
@@ -30334,7 +30920,7 @@
         <w:t xml:space="preserve">, Theorem 18.3).</w:t>
       </w:r>
     </w:p>
-    <w:bookmarkStart w:id="90" w:name="thm-marginal-density"/>
+    <w:bookmarkStart w:id="94" w:name="thm-marginal-density"/>
     <w:p>
       <w:pPr>
         <w:pStyle w:val="BodyText"/>
@@ -30561,7 +31147,7 @@
         </m:oMath>
       </m:oMathPara>
     </w:p>
-    <w:bookmarkEnd w:id="90"/>
+    <w:bookmarkEnd w:id="94"/>
     <w:p>
       <w:pPr>
         <w:pStyle w:val="FirstParagraph"/>
@@ -31329,7 +31915,7 @@
       <w:r>
         <w:t xml:space="preserve">(</w:t>
       </w:r>
-      <w:hyperlink r:id="rId89">
+      <w:hyperlink r:id="rId93">
         <w:r>
           <w:rPr>
             <w:rStyle w:val="Hyperlink"/>
@@ -31393,7 +31979,7 @@
         <w:t xml:space="preserve">.</w:t>
       </w:r>
     </w:p>
-    <w:bookmarkStart w:id="91" w:name="exm-marginal-density"/>
+    <w:bookmarkStart w:id="95" w:name="exm-marginal-density"/>
     <w:p>
       <w:pPr>
         <w:pStyle w:val="BodyText"/>
@@ -32079,8 +32665,8 @@
         <w:t xml:space="preserve">.</w:t>
       </w:r>
     </w:p>
-    <w:bookmarkEnd w:id="91"/>
-    <w:bookmarkStart w:id="92" w:name="def-joint-density-mass"/>
+    <w:bookmarkEnd w:id="95"/>
+    <w:bookmarkStart w:id="96" w:name="def-joint-density-mass"/>
     <w:p>
       <w:pPr>
         <w:pStyle w:val="BodyText"/>
@@ -32548,7 +33134,7 @@
         </m:oMath>
       </m:oMathPara>
     </w:p>
-    <w:bookmarkEnd w:id="92"/>
+    <w:bookmarkEnd w:id="96"/>
     <w:p>
       <w:pPr>
         <w:pStyle w:val="FirstParagraph"/>
@@ -32740,7 +33326,7 @@
         <w:t xml:space="preserve">.</w:t>
       </w:r>
     </w:p>
-    <w:bookmarkStart w:id="93" w:name="cor-joint-density-mass-marginal"/>
+    <w:bookmarkStart w:id="97" w:name="cor-joint-density-mass-marginal"/>
     <w:p>
       <w:pPr>
         <w:pStyle w:val="BodyText"/>
@@ -33003,7 +33589,7 @@
         </m:oMath>
       </m:oMathPara>
     </w:p>
-    <w:bookmarkEnd w:id="93"/>
+    <w:bookmarkEnd w:id="97"/>
     <w:p>
       <w:pPr>
         <w:pStyle w:val="FirstParagraph"/>
@@ -33561,7 +34147,7 @@
         </m:oMath>
       </m:oMathPara>
     </w:p>
-    <w:bookmarkStart w:id="94" w:name="exm-joint-density-mass"/>
+    <w:bookmarkStart w:id="98" w:name="exm-joint-density-mass"/>
     <w:p>
       <w:pPr>
         <w:pStyle w:val="FirstParagraph"/>
@@ -34181,8 +34767,8 @@
         </m:oMath>
       </m:oMathPara>
     </w:p>
-    <w:bookmarkEnd w:id="94"/>
-    <w:bookmarkStart w:id="97" w:name="sec-joint-marginal"/>
+    <w:bookmarkEnd w:id="98"/>
+    <w:bookmarkStart w:id="101" w:name="sec-joint-marginal"/>
     <w:p>
       <w:pPr>
         <w:pStyle w:val="Heading3"/>
@@ -35213,7 +35799,7 @@
         <w:t xml:space="preserve">.</w:t>
       </w:r>
     </w:p>
-    <w:bookmarkStart w:id="96" w:name="exm-meteorite"/>
+    <w:bookmarkStart w:id="100" w:name="exm-meteorite"/>
     <w:p>
       <w:pPr>
         <w:pStyle w:val="BodyText"/>
@@ -35503,7 +36089,7 @@
       <w:tr>
         <w:tc>
           <w:tcPr/>
-          <w:bookmarkStart w:id="95" w:name="tbl-meteorite"/>
+          <w:bookmarkStart w:id="99" w:name="tbl-meteorite"/>
           <w:p>
             <w:pPr>
               <w:jc w:val="center"/>
@@ -35925,7 +36511,7 @@
               </w:tc>
             </w:tr>
           </w:tbl>
-          <w:bookmarkEnd w:id="95"/>
+          <w:bookmarkEnd w:id="99"/>
           <w:p/>
         </w:tc>
       </w:tr>
@@ -36444,9 +37030,9 @@
         <w:t xml:space="preserve">), so having one is very weak evidence that an astronomical rarity occurred.</w:t>
       </w:r>
     </w:p>
-    <w:bookmarkEnd w:id="96"/>
-    <w:bookmarkEnd w:id="97"/>
-    <w:bookmarkStart w:id="106" w:name="sec-continuous-distributions"/>
+    <w:bookmarkEnd w:id="100"/>
+    <w:bookmarkEnd w:id="101"/>
+    <w:bookmarkStart w:id="110" w:name="sec-continuous-distributions"/>
     <w:p>
       <w:pPr>
         <w:pStyle w:val="Heading3"/>
@@ -36871,7 +37457,7 @@
         </m:oMath>
       </m:oMathPara>
     </w:p>
-    <w:bookmarkStart w:id="98" w:name="thm-zero-point-prob"/>
+    <w:bookmarkStart w:id="102" w:name="thm-zero-point-prob"/>
     <w:p>
       <w:pPr>
         <w:pStyle w:val="FirstParagraph"/>
@@ -36965,7 +37551,7 @@
         </m:oMath>
       </m:oMathPara>
     </w:p>
-    <w:bookmarkEnd w:id="98"/>
+    <w:bookmarkEnd w:id="102"/>
     <w:p>
       <w:pPr>
         <w:pStyle w:val="FirstParagraph"/>
@@ -37608,18 +38194,18 @@
                 <wp:inline>
                   <wp:extent cx="152400" cy="152400"/>
                   <wp:effectExtent b="0" l="0" r="0" t="0"/>
-                  <wp:docPr descr="" title="" id="100" name="Picture"/>
+                  <wp:docPr descr="" title="" id="104" name="Picture"/>
                   <a:graphic>
                     <a:graphicData uri="http://schemas.openxmlformats.org/drawingml/2006/picture">
                       <pic:pic>
                         <pic:nvPicPr>
-                          <pic:cNvPr descr="/opt/quarto/share/formats/docx/tip.png" id="101" name="Picture"/>
+                          <pic:cNvPr descr="/opt/quarto/share/formats/docx/tip.png" id="105" name="Picture"/>
                           <pic:cNvPicPr>
                             <a:picLocks noChangeArrowheads="1" noChangeAspect="1"/>
                           </pic:cNvPicPr>
                         </pic:nvPicPr>
                         <pic:blipFill>
-                          <a:blip r:embed="rId99"/>
+                          <a:blip r:embed="rId103"/>
                           <a:stretch>
                             <a:fillRect/>
                           </a:stretch>
@@ -37681,7 +38267,7 @@
             <w:r>
               <w:t xml:space="preserve"> </w:t>
             </w:r>
-            <w:hyperlink r:id="rId102">
+            <w:hyperlink r:id="rId106">
               <w:r>
                 <w:rPr>
                   <w:rStyle w:val="Hyperlink"/>
@@ -37719,7 +38305,7 @@
             <w:r>
               <w:t xml:space="preserve"> </w:t>
             </w:r>
-            <w:hyperlink r:id="rId103">
+            <w:hyperlink r:id="rId107">
               <w:r>
                 <w:rPr>
                   <w:rStyle w:val="Hyperlink"/>
@@ -37745,7 +38331,7 @@
       <w:r>
         <w:t xml:space="preserve"> </w:t>
       </w:r>
-      <w:hyperlink r:id="rId104">
+      <w:hyperlink r:id="rId108">
         <w:r>
           <w:rPr>
             <w:rStyle w:val="Hyperlink"/>
@@ -37762,7 +38348,7 @@
       <w:r>
         <w:t xml:space="preserve"> </w:t>
       </w:r>
-      <w:hyperlink r:id="rId105">
+      <w:hyperlink r:id="rId109">
         <w:r>
           <w:rPr>
             <w:rStyle w:val="Hyperlink"/>
@@ -37792,9 +38378,9 @@
         <w:t xml:space="preserve">.</w:t>
       </w:r>
     </w:p>
-    <w:bookmarkEnd w:id="106"/>
-    <w:bookmarkEnd w:id="107"/>
-    <w:bookmarkStart w:id="127" w:name="sec-prob-haz"/>
+    <w:bookmarkEnd w:id="110"/>
+    <w:bookmarkEnd w:id="111"/>
+    <w:bookmarkStart w:id="131" w:name="sec-prob-haz"/>
     <w:p>
       <w:pPr>
         <w:pStyle w:val="Heading2"/>
@@ -37803,7 +38389,7 @@
         <w:t xml:space="preserve">3 Survival, hazard, and cumulative hazard functions</w:t>
       </w:r>
     </w:p>
-    <w:bookmarkStart w:id="108" w:name="def-surv-fn"/>
+    <w:bookmarkStart w:id="112" w:name="def-surv-fn"/>
     <w:p>
       <w:pPr>
         <w:pStyle w:val="FirstParagraph"/>
@@ -38016,7 +38602,7 @@
         </m:oMath>
       </m:oMathPara>
     </w:p>
-    <w:bookmarkEnd w:id="108"/>
+    <w:bookmarkEnd w:id="112"/>
     <w:p>
       <w:pPr>
         <w:pStyle w:val="FirstParagraph"/>
@@ -38110,7 +38696,7 @@
         <w:t xml:space="preserve">The definition itself applies to any random variable.</w:t>
       </w:r>
     </w:p>
-    <w:bookmarkStart w:id="109" w:name="thm-survival-expressions-1"/>
+    <w:bookmarkStart w:id="113" w:name="thm-survival-expressions-1"/>
     <w:p>
       <w:pPr>
         <w:pStyle w:val="BodyText"/>
@@ -38403,7 +38989,7 @@
         </m:oMath>
       </m:oMathPara>
     </w:p>
-    <w:bookmarkEnd w:id="109"/>
+    <w:bookmarkEnd w:id="113"/>
     <w:p>
       <w:pPr>
         <w:pStyle w:val="FirstParagraph"/>
@@ -39126,7 +39712,7 @@
         </m:oMath>
       </m:oMathPara>
     </w:p>
-    <w:bookmarkStart w:id="110" w:name="exm-exp-survfn"/>
+    <w:bookmarkStart w:id="114" w:name="exm-exp-survfn"/>
     <w:p>
       <w:pPr>
         <w:pStyle w:val="FirstParagraph"/>
@@ -40032,8 +40618,8 @@
         <w:t xml:space="preserve">.</w:t>
       </w:r>
     </w:p>
-    <w:bookmarkEnd w:id="110"/>
-    <w:bookmarkStart w:id="112" w:name="def-hazard"/>
+    <w:bookmarkEnd w:id="114"/>
+    <w:bookmarkStart w:id="116" w:name="def-hazard"/>
     <w:p>
       <w:pPr>
         <w:pStyle w:val="BodyText"/>
@@ -40250,7 +40836,7 @@
       <w:r>
         <w:t xml:space="preserve"> </w:t>
       </w:r>
-      <w:hyperlink r:id="rId111">
+      <w:hyperlink r:id="rId115">
         <w:r>
           <w:rPr>
             <w:rStyle w:val="Hyperlink"/>
@@ -40482,7 +41068,7 @@
         </m:oMath>
       </m:oMathPara>
     </w:p>
-    <w:bookmarkEnd w:id="112"/>
+    <w:bookmarkEnd w:id="116"/>
     <w:p>
       <w:pPr>
         <w:pStyle w:val="FirstParagraph"/>
@@ -41152,7 +41738,7 @@
         <w:t xml:space="preserve">The math is identical; only the name changes with the valence of the event.</w:t>
       </w:r>
     </w:p>
-    <w:bookmarkStart w:id="114" w:name="exm-hazard-exceeds-one"/>
+    <w:bookmarkStart w:id="118" w:name="exm-hazard-exceeds-one"/>
     <w:p>
       <w:pPr>
         <w:pStyle w:val="BodyText"/>
@@ -42660,7 +43246,7 @@
       <w:r>
         <w:t xml:space="preserve"> </w:t>
       </w:r>
-      <w:hyperlink r:id="rId113">
+      <w:hyperlink r:id="rId117">
         <w:r>
           <w:rPr>
             <w:rStyle w:val="Hyperlink"/>
@@ -43264,8 +43850,8 @@
         <w:t xml:space="preserve">a hazard is a rate, not a probability.</w:t>
       </w:r>
     </w:p>
-    <w:bookmarkEnd w:id="114"/>
-    <w:bookmarkStart w:id="115" w:name="def-discrete-hazard"/>
+    <w:bookmarkEnd w:id="118"/>
+    <w:bookmarkStart w:id="119" w:name="def-discrete-hazard"/>
     <w:p>
       <w:pPr>
         <w:pStyle w:val="BodyText"/>
@@ -43397,7 +43983,7 @@
       <w:r>
         <w:t xml:space="preserve"> </w:t>
       </w:r>
-      <w:hyperlink r:id="rId111">
+      <w:hyperlink r:id="rId115">
         <w:r>
           <w:rPr>
             <w:rStyle w:val="Hyperlink"/>
@@ -43517,8 +44103,8 @@
         </m:oMath>
       </m:oMathPara>
     </w:p>
-    <w:bookmarkEnd w:id="115"/>
-    <w:bookmarkStart w:id="116" w:name="exm-discrete-hazard"/>
+    <w:bookmarkEnd w:id="119"/>
+    <w:bookmarkStart w:id="120" w:name="exm-discrete-hazard"/>
     <w:p>
       <w:pPr>
         <w:pStyle w:val="FirstParagraph"/>
@@ -44262,8 +44848,8 @@
         <w:t xml:space="preserve">having gone without a six so far does not change the chance of a six on the next roll.</w:t>
       </w:r>
     </w:p>
-    <w:bookmarkEnd w:id="116"/>
-    <w:bookmarkStart w:id="117" w:name="cor-discrete-hazard-unit-interval"/>
+    <w:bookmarkEnd w:id="120"/>
+    <w:bookmarkStart w:id="121" w:name="cor-discrete-hazard-unit-interval"/>
     <w:p>
       <w:pPr>
         <w:pStyle w:val="BodyText"/>
@@ -44495,7 +45081,7 @@
         </m:oMath>
       </m:oMathPara>
     </w:p>
-    <w:bookmarkEnd w:id="117"/>
+    <w:bookmarkEnd w:id="121"/>
     <w:p>
       <w:pPr>
         <w:pStyle w:val="FirstParagraph"/>
@@ -45221,7 +45807,7 @@
         <w:t xml:space="preserve">the discrete-time hazard is a probability.</w:t>
       </w:r>
     </w:p>
-    <w:bookmarkStart w:id="118" w:name="thm-hazard-dens-surv"/>
+    <w:bookmarkStart w:id="122" w:name="thm-hazard-dens-surv"/>
     <w:p>
       <w:pPr>
         <w:pStyle w:val="BodyText"/>
@@ -45493,7 +46079,7 @@
         </m:oMath>
       </m:oMathPara>
     </w:p>
-    <w:bookmarkEnd w:id="118"/>
+    <w:bookmarkEnd w:id="122"/>
     <w:p>
       <w:pPr>
         <w:pStyle w:val="FirstParagraph"/>
@@ -45696,7 +46282,7 @@
       <w:r>
         <w:t xml:space="preserve"> </w:t>
       </w:r>
-      <w:hyperlink r:id="rId113">
+      <w:hyperlink r:id="rId117">
         <w:r>
           <w:rPr>
             <w:rStyle w:val="Hyperlink"/>
@@ -47056,7 +47642,7 @@
         </m:oMath>
       </m:oMathPara>
     </w:p>
-    <w:bookmarkStart w:id="119" w:name="exm-exp-haz"/>
+    <w:bookmarkStart w:id="123" w:name="exm-exp-haz"/>
     <w:p>
       <w:pPr>
         <w:pStyle w:val="FirstParagraph"/>
@@ -47776,8 +48362,8 @@
         <w:t xml:space="preserve">.</w:t>
       </w:r>
     </w:p>
-    <w:bookmarkEnd w:id="119"/>
-    <w:bookmarkStart w:id="120" w:name="def-cuhaz"/>
+    <w:bookmarkEnd w:id="123"/>
+    <w:bookmarkStart w:id="124" w:name="def-cuhaz"/>
     <w:p>
       <w:pPr>
         <w:pStyle w:val="BodyText"/>
@@ -48041,8 +48627,8 @@
         </m:oMath>
       </m:oMathPara>
     </w:p>
-    <w:bookmarkEnd w:id="120"/>
-    <w:bookmarkStart w:id="121" w:name="exm-exp-cumhaz"/>
+    <w:bookmarkEnd w:id="124"/>
+    <w:bookmarkStart w:id="125" w:name="exm-exp-cumhaz"/>
     <w:p>
       <w:pPr>
         <w:pStyle w:val="FirstParagraph"/>
@@ -48506,8 +49092,8 @@
         <w:t xml:space="preserve">.</w:t>
       </w:r>
     </w:p>
-    <w:bookmarkEnd w:id="121"/>
-    <w:bookmarkStart w:id="122" w:name="cor-cuhaz-nonneg"/>
+    <w:bookmarkEnd w:id="125"/>
+    <w:bookmarkStart w:id="126" w:name="cor-cuhaz-nonneg"/>
     <w:p>
       <w:pPr>
         <w:pStyle w:val="BodyText"/>
@@ -48745,7 +49331,7 @@
         </m:oMath>
       </m:oMathPara>
     </w:p>
-    <w:bookmarkEnd w:id="122"/>
+    <w:bookmarkEnd w:id="126"/>
     <w:p>
       <w:pPr>
         <w:pStyle w:val="FirstParagraph"/>
@@ -50418,7 +51004,7 @@
         <w:t xml:space="preserve">is the form most survival-analysis texts use.</w:t>
       </w:r>
     </w:p>
-    <w:bookmarkStart w:id="124" w:name="cor-surv-int-haz"/>
+    <w:bookmarkStart w:id="128" w:name="cor-surv-int-haz"/>
     <w:p>
       <w:pPr>
         <w:pStyle w:val="BodyText"/>
@@ -50629,7 +51215,7 @@
       <w:pPr>
         <w:pStyle w:val="BodyText"/>
       </w:pPr>
-      <w:bookmarkStart w:id="123" w:name="eq-surv-int-haz"/>
+      <w:bookmarkStart w:id="127" w:name="eq-surv-int-haz"/>
       <m:oMathPara>
         <m:oMathParaPr>
           <m:jc m:val="center"/>
@@ -50731,9 +51317,9 @@
           </m:r>
         </m:oMath>
       </m:oMathPara>
-      <w:bookmarkEnd w:id="123"/>
+      <w:bookmarkEnd w:id="127"/>
     </w:p>
-    <w:bookmarkEnd w:id="124"/>
+    <w:bookmarkEnd w:id="128"/>
     <w:p>
       <w:pPr>
         <w:pStyle w:val="FirstParagraph"/>
@@ -52309,7 +52895,7 @@
         <w:t xml:space="preserve">.</w:t>
       </w:r>
     </w:p>
-    <w:bookmarkStart w:id="125" w:name="exm-exp-surv-int-haz"/>
+    <w:bookmarkStart w:id="129" w:name="exm-exp-surv-int-haz"/>
     <w:p>
       <w:pPr>
         <w:pStyle w:val="BodyText"/>
@@ -52596,7 +53182,7 @@
         <w:t xml:space="preserve">.</w:t>
       </w:r>
     </w:p>
-    <w:bookmarkEnd w:id="125"/>
+    <w:bookmarkEnd w:id="129"/>
     <w:tbl>
       <w:tblPr>
         <w:tblStyle w:val="Table"/>
@@ -52610,7 +53196,7 @@
       <w:tr>
         <w:tc>
           <w:tcPr/>
-          <w:bookmarkStart w:id="126" w:name="tbl-prob-dist-fns"/>
+          <w:bookmarkStart w:id="130" w:name="tbl-prob-dist-fns"/>
           <w:p>
             <w:pPr>
               <w:jc w:val="center"/>
@@ -53581,7 +54167,7 @@
               </w:tc>
             </w:tr>
           </w:tbl>
-          <w:bookmarkEnd w:id="126"/>
+          <w:bookmarkEnd w:id="130"/>
           <w:p/>
         </w:tc>
       </w:tr>
@@ -54547,8 +55133,8 @@
         </m:oMath>
       </m:oMathPara>
     </w:p>
-    <w:bookmarkEnd w:id="127"/>
-    <w:bookmarkStart w:id="147" w:name="references"/>
+    <w:bookmarkEnd w:id="131"/>
+    <w:bookmarkStart w:id="151" w:name="references"/>
     <w:p>
       <w:pPr>
         <w:pStyle w:val="Heading2"/>
@@ -54557,8 +55143,8 @@
         <w:t xml:space="preserve">References</w:t>
       </w:r>
     </w:p>
-    <w:bookmarkStart w:id="146" w:name="refs"/>
-    <w:bookmarkStart w:id="129" w:name="ref-fiveminuteai_probstat"/>
+    <w:bookmarkStart w:id="150" w:name="refs"/>
+    <w:bookmarkStart w:id="133" w:name="ref-fiveminuteai_probstat"/>
     <w:p>
       <w:pPr>
         <w:pStyle w:val="Bibliography"/>
@@ -54582,7 +55168,7 @@
       <w:r>
         <w:t xml:space="preserve"> </w:t>
       </w:r>
-      <w:hyperlink r:id="rId128">
+      <w:hyperlink r:id="rId132">
         <w:r>
           <w:rPr>
             <w:rStyle w:val="Hyperlink"/>
@@ -54594,8 +55180,8 @@
         <w:t xml:space="preserve">.</w:t>
       </w:r>
     </w:p>
-    <w:bookmarkEnd w:id="129"/>
-    <w:bookmarkStart w:id="130" w:name="ref-billingsley1995probability"/>
+    <w:bookmarkEnd w:id="133"/>
+    <w:bookmarkStart w:id="134" w:name="ref-billingsley1995probability"/>
     <w:p>
       <w:pPr>
         <w:pStyle w:val="Bibliography"/>
@@ -54617,8 +55203,8 @@
         <w:t xml:space="preserve">. 3rd ed. Wiley Series in Probability and Mathematical Statistics. Wiley.</w:t>
       </w:r>
     </w:p>
-    <w:bookmarkEnd w:id="130"/>
-    <w:bookmarkStart w:id="132" w:name="ref-CaseBerg01"/>
+    <w:bookmarkEnd w:id="134"/>
+    <w:bookmarkStart w:id="136" w:name="ref-CaseBerg01"/>
     <w:p>
       <w:pPr>
         <w:pStyle w:val="Bibliography"/>
@@ -54642,7 +55228,7 @@
       <w:r>
         <w:t xml:space="preserve"> </w:t>
       </w:r>
-      <w:hyperlink r:id="rId131">
+      <w:hyperlink r:id="rId135">
         <w:r>
           <w:rPr>
             <w:rStyle w:val="Hyperlink"/>
@@ -54654,8 +55240,8 @@
         <w:t xml:space="preserve">.</w:t>
       </w:r>
     </w:p>
-    <w:bookmarkEnd w:id="132"/>
-    <w:bookmarkStart w:id="134" w:name="ref-dobson4e"/>
+    <w:bookmarkEnd w:id="136"/>
+    <w:bookmarkStart w:id="138" w:name="ref-dobson4e"/>
     <w:p>
       <w:pPr>
         <w:pStyle w:val="Bibliography"/>
@@ -54679,7 +55265,7 @@
       <w:r>
         <w:t xml:space="preserve"> </w:t>
       </w:r>
-      <w:hyperlink r:id="rId133">
+      <w:hyperlink r:id="rId137">
         <w:r>
           <w:rPr>
             <w:rStyle w:val="Hyperlink"/>
@@ -54691,8 +55277,8 @@
         <w:t xml:space="preserve">.</w:t>
       </w:r>
     </w:p>
-    <w:bookmarkEnd w:id="134"/>
-    <w:bookmarkStart w:id="135" w:name="ref-hutchinson2024data471"/>
+    <w:bookmarkEnd w:id="138"/>
+    <w:bookmarkStart w:id="139" w:name="ref-hutchinson2024data471"/>
     <w:p>
       <w:pPr>
         <w:pStyle w:val="Bibliography"/>
@@ -54728,8 +55314,8 @@
         <w:t xml:space="preserve">. Western Washington University.</w:t>
       </w:r>
     </w:p>
-    <w:bookmarkEnd w:id="135"/>
-    <w:bookmarkStart w:id="137" w:name="ref-hutchinson_wwu_ml_videos"/>
+    <w:bookmarkEnd w:id="139"/>
+    <w:bookmarkStart w:id="141" w:name="ref-hutchinson_wwu_ml_videos"/>
     <w:p>
       <w:pPr>
         <w:pStyle w:val="Bibliography"/>
@@ -54795,7 +55381,7 @@
       <w:r>
         <w:t xml:space="preserve"> </w:t>
       </w:r>
-      <w:hyperlink r:id="rId136">
+      <w:hyperlink r:id="rId140">
         <w:r>
           <w:rPr>
             <w:rStyle w:val="Hyperlink"/>
@@ -54807,8 +55393,8 @@
         <w:t xml:space="preserve">.</w:t>
       </w:r>
     </w:p>
-    <w:bookmarkEnd w:id="137"/>
-    <w:bookmarkStart w:id="138" w:name="ref-kalbfleisch2011statistical"/>
+    <w:bookmarkEnd w:id="141"/>
+    <w:bookmarkStart w:id="142" w:name="ref-kalbfleisch2011statistical"/>
     <w:p>
       <w:pPr>
         <w:pStyle w:val="Bibliography"/>
@@ -54830,8 +55416,8 @@
         <w:t xml:space="preserve">. John Wiley &amp; Sons.</w:t>
       </w:r>
     </w:p>
-    <w:bookmarkEnd w:id="138"/>
-    <w:bookmarkStart w:id="140" w:name="ref-klein2003survival"/>
+    <w:bookmarkEnd w:id="142"/>
+    <w:bookmarkStart w:id="144" w:name="ref-klein2003survival"/>
     <w:p>
       <w:pPr>
         <w:pStyle w:val="Bibliography"/>
@@ -54855,7 +55441,7 @@
       <w:r>
         <w:t xml:space="preserve"> </w:t>
       </w:r>
-      <w:hyperlink r:id="rId139">
+      <w:hyperlink r:id="rId143">
         <w:r>
           <w:rPr>
             <w:rStyle w:val="Hyperlink"/>
@@ -54867,8 +55453,8 @@
         <w:t xml:space="preserve">.</w:t>
       </w:r>
     </w:p>
-    <w:bookmarkEnd w:id="140"/>
-    <w:bookmarkStart w:id="142" w:name="ref-kleinbaum2012survival"/>
+    <w:bookmarkEnd w:id="144"/>
+    <w:bookmarkStart w:id="146" w:name="ref-kleinbaum2012survival"/>
     <w:p>
       <w:pPr>
         <w:pStyle w:val="Bibliography"/>
@@ -54892,7 +55478,7 @@
       <w:r>
         <w:t xml:space="preserve"> </w:t>
       </w:r>
-      <w:hyperlink r:id="rId141">
+      <w:hyperlink r:id="rId145">
         <w:r>
           <w:rPr>
             <w:rStyle w:val="Hyperlink"/>
@@ -54904,8 +55490,8 @@
         <w:t xml:space="preserve">.</w:t>
       </w:r>
     </w:p>
-    <w:bookmarkEnd w:id="142"/>
-    <w:bookmarkStart w:id="143" w:name="ref-me4"/>
+    <w:bookmarkEnd w:id="146"/>
+    <w:bookmarkStart w:id="147" w:name="ref-me4"/>
     <w:p>
       <w:pPr>
         <w:pStyle w:val="Bibliography"/>
@@ -54927,8 +55513,8 @@
         <w:t xml:space="preserve">. Fourth edition. Wolters Kluwer.</w:t>
       </w:r>
     </w:p>
-    <w:bookmarkEnd w:id="143"/>
-    <w:bookmarkStart w:id="145" w:name="ref-vittinghoff2e"/>
+    <w:bookmarkEnd w:id="147"/>
+    <w:bookmarkStart w:id="149" w:name="ref-vittinghoff2e"/>
     <w:p>
       <w:pPr>
         <w:pStyle w:val="Bibliography"/>
@@ -54952,7 +55538,7 @@
       <w:r>
         <w:t xml:space="preserve"> </w:t>
       </w:r>
-      <w:hyperlink r:id="rId144">
+      <w:hyperlink r:id="rId148">
         <w:r>
           <w:rPr>
             <w:rStyle w:val="Hyperlink"/>
@@ -54964,9 +55550,9 @@
         <w:t xml:space="preserve">.</w:t>
       </w:r>
     </w:p>
-    <w:bookmarkEnd w:id="145"/>
-    <w:bookmarkEnd w:id="146"/>
-    <w:bookmarkEnd w:id="147"/>
+    <w:bookmarkEnd w:id="149"/>
+    <w:bookmarkEnd w:id="150"/>
+    <w:bookmarkEnd w:id="151"/>
     <w:sectPr>
       <w:footnotePr>
         <w:numRestart w:val="eachSect"/>

</xml_diff>

<commit_message>
Deploying to gh-pages from @ Morrison-Lab/pds@71328e4fba50fb26e7d7275b99f296231806696c 🚀
</commit_message>
<xml_diff>
--- a/random-variables.docx
+++ b/random-variables.docx
@@ -15,10 +15,10 @@
         <w:pStyle w:val="Date"/>
       </w:pPr>
       <w:r>
-        <w:t xml:space="preserve">Last modified: 2026-10-23 10:51:13 (PDT)</w:t>
+        <w:t xml:space="preserve">Last modified: 2026-10-23 15:56:58 (PDT)</w:t>
       </w:r>
     </w:p>
-    <w:bookmarkStart w:id="24" w:name="sec-random-variables"/>
+    <w:bookmarkStart w:id="26" w:name="sec-random-variables"/>
     <w:p>
       <w:pPr>
         <w:pStyle w:val="Heading2"/>
@@ -4700,8 +4700,504 @@
       </w:r>
     </w:p>
     <w:bookmarkEnd w:id="23"/>
+    <w:bookmarkStart w:id="24" w:name="def-realization"/>
+    <w:p>
+      <w:pPr>
+        <w:pStyle w:val="BodyText"/>
+      </w:pPr>
+      <w:r>
+        <w:rPr>
+          <w:b/>
+          <w:bCs/>
+        </w:rPr>
+        <w:t xml:space="preserve">Definition 5 (Realization (observed value))</w:t>
+      </w:r>
+      <w:r>
+        <w:t xml:space="preserve"> </w:t>
+      </w:r>
+      <w:r>
+        <w:t xml:space="preserve">A</w:t>
+      </w:r>
+      <w:r>
+        <w:t xml:space="preserve"> </w:t>
+      </w:r>
+      <w:r>
+        <w:rPr>
+          <w:b/>
+          <w:bCs/>
+        </w:rPr>
+        <w:t xml:space="preserve">realization</w:t>
+      </w:r>
+      <w:r>
+        <w:t xml:space="preserve"> </w:t>
+      </w:r>
+      <w:r>
+        <w:t xml:space="preserve">of a</w:t>
+      </w:r>
+      <w:r>
+        <w:t xml:space="preserve"> </w:t>
+      </w:r>
+      <w:hyperlink w:anchor="def-random-variable">
+        <w:r>
+          <w:rPr>
+            <w:rStyle w:val="Hyperlink"/>
+          </w:rPr>
+          <w:t xml:space="preserve">random variable</w:t>
+        </w:r>
+      </w:hyperlink>
+      <w:r>
+        <w:t xml:space="preserve"> </w:t>
+      </w:r>
+      <m:oMath>
+        <m:r>
+          <m:t>X</m:t>
+        </m:r>
+      </m:oMath>
+      <w:r>
+        <w:t xml:space="preserve"> </w:t>
+      </w:r>
+      <w:r>
+        <w:t xml:space="preserve">is the value</w:t>
+      </w:r>
+      <w:r>
+        <w:t xml:space="preserve"> </w:t>
+      </w:r>
+      <m:oMath>
+        <m:r>
+          <m:t>x</m:t>
+        </m:r>
+        <m:r>
+          <m:rPr>
+            <m:sty m:val="p"/>
+          </m:rPr>
+          <m:t>=</m:t>
+        </m:r>
+        <m:r>
+          <m:t>X</m:t>
+        </m:r>
+        <m:r>
+          <m:rPr>
+            <m:sty m:val="p"/>
+          </m:rPr>
+          <m:t>(</m:t>
+        </m:r>
+        <m:r>
+          <m:t>ω</m:t>
+        </m:r>
+        <m:r>
+          <m:rPr>
+            <m:sty m:val="p"/>
+          </m:rPr>
+          <m:t>)</m:t>
+        </m:r>
+      </m:oMath>
+      <w:r>
+        <w:t xml:space="preserve"> </w:t>
+      </w:r>
+      <w:r>
+        <w:t xml:space="preserve">it takes</w:t>
+      </w:r>
+      <w:r>
+        <w:t xml:space="preserve"> </w:t>
+      </w:r>
+      <w:r>
+        <w:t xml:space="preserve">at the point</w:t>
+      </w:r>
+      <w:r>
+        <w:t xml:space="preserve"> </w:t>
+      </w:r>
+      <m:oMath>
+        <m:r>
+          <m:t>ω</m:t>
+        </m:r>
+      </m:oMath>
+      <w:r>
+        <w:t xml:space="preserve"> </w:t>
+      </w:r>
+      <w:r>
+        <w:t xml:space="preserve">of the</w:t>
+      </w:r>
+      <w:r>
+        <w:t xml:space="preserve"> </w:t>
+      </w:r>
+      <w:hyperlink r:id="rId10">
+        <w:r>
+          <w:rPr>
+            <w:rStyle w:val="Hyperlink"/>
+          </w:rPr>
+          <w:t xml:space="preserve">sample space</w:t>
+        </w:r>
+      </w:hyperlink>
+      <w:r>
+        <w:t xml:space="preserve"> </w:t>
+      </w:r>
+      <w:r>
+        <w:t xml:space="preserve">that the</w:t>
+      </w:r>
+      <w:r>
+        <w:t xml:space="preserve"> </w:t>
+      </w:r>
+      <w:hyperlink r:id="rId11">
+        <w:r>
+          <w:rPr>
+            <w:rStyle w:val="Hyperlink"/>
+          </w:rPr>
+          <w:t xml:space="preserve">random experiment</w:t>
+        </w:r>
+      </w:hyperlink>
+      <w:r>
+        <w:t xml:space="preserve"> </w:t>
+      </w:r>
+      <w:r>
+        <w:t xml:space="preserve">produced.</w:t>
+      </w:r>
+    </w:p>
     <w:bookmarkEnd w:id="24"/>
-    <w:bookmarkStart w:id="107" w:name="X07e058d1329d8fa48179146f153d016c4f9ff9a"/>
+    <w:p>
+      <w:pPr>
+        <w:pStyle w:val="BodyText"/>
+      </w:pPr>
+      <w:r>
+        <w:rPr>
+          <w:i/>
+          <w:iCs/>
+        </w:rPr>
+        <w:t xml:space="preserve">Remark</w:t>
+      </w:r>
+      <w:r>
+        <w:t xml:space="preserve">. </w:t>
+      </w:r>
+      <w:r>
+        <w:t xml:space="preserve">The</w:t>
+      </w:r>
+      <w:r>
+        <w:t xml:space="preserve"> </w:t>
+      </w:r>
+      <w:hyperlink w:anchor="def-random-variable">
+        <w:r>
+          <w:rPr>
+            <w:rStyle w:val="Hyperlink"/>
+          </w:rPr>
+          <w:t xml:space="preserve">random variable</w:t>
+        </w:r>
+      </w:hyperlink>
+      <w:r>
+        <w:t xml:space="preserve"> </w:t>
+      </w:r>
+      <m:oMath>
+        <m:r>
+          <m:t>X</m:t>
+        </m:r>
+      </m:oMath>
+      <w:r>
+        <w:t xml:space="preserve"> </w:t>
+      </w:r>
+      <w:r>
+        <w:t xml:space="preserve">is the rule, before the experiment is run;</w:t>
+      </w:r>
+      <w:r>
+        <w:t xml:space="preserve"> </w:t>
+      </w:r>
+      <w:r>
+        <w:t xml:space="preserve">the realization</w:t>
+      </w:r>
+      <w:r>
+        <w:t xml:space="preserve"> </w:t>
+      </w:r>
+      <m:oMath>
+        <m:r>
+          <m:t>x</m:t>
+        </m:r>
+      </m:oMath>
+      <w:r>
+        <w:t xml:space="preserve"> </w:t>
+      </w:r>
+      <w:r>
+        <w:t xml:space="preserve">is one number, after it is run.</w:t>
+      </w:r>
+      <w:r>
+        <w:t xml:space="preserve"> </w:t>
+      </w:r>
+      <w:r>
+        <w:t xml:space="preserve">Probabilities such as</w:t>
+      </w:r>
+      <w:r>
+        <w:t xml:space="preserve"> </w:t>
+      </w:r>
+      <m:oMath>
+        <m:r>
+          <m:rPr>
+            <m:sty m:val="p"/>
+          </m:rPr>
+          <m:t>Pr</m:t>
+        </m:r>
+        <m:r>
+          <m:rPr>
+            <m:sty m:val="p"/>
+          </m:rPr>
+          <m:t>(</m:t>
+        </m:r>
+        <m:r>
+          <m:t>X</m:t>
+        </m:r>
+        <m:r>
+          <m:rPr>
+            <m:sty m:val="p"/>
+          </m:rPr>
+          <m:t>=</m:t>
+        </m:r>
+        <m:r>
+          <m:t>x</m:t>
+        </m:r>
+        <m:r>
+          <m:rPr>
+            <m:sty m:val="p"/>
+          </m:rPr>
+          <m:t>)</m:t>
+        </m:r>
+      </m:oMath>
+      <w:r>
+        <w:t xml:space="preserve"> </w:t>
+      </w:r>
+      <w:r>
+        <w:t xml:space="preserve">describe the rule,</w:t>
+      </w:r>
+      <w:r>
+        <w:t xml:space="preserve"> </w:t>
+      </w:r>
+      <w:r>
+        <w:t xml:space="preserve">and a realization is a fixed number.</w:t>
+      </w:r>
+    </w:p>
+    <w:bookmarkStart w:id="25" w:name="exm-realization"/>
+    <w:p>
+      <w:pPr>
+        <w:pStyle w:val="BodyText"/>
+      </w:pPr>
+      <w:r>
+        <w:rPr>
+          <w:b/>
+          <w:bCs/>
+        </w:rPr>
+        <w:t xml:space="preserve">Example 6 (Realizations of the number of heads)</w:t>
+      </w:r>
+      <w:r>
+        <w:t xml:space="preserve"> </w:t>
+      </w:r>
+      <w:r>
+        <w:t xml:space="preserve">In</w:t>
+      </w:r>
+      <w:r>
+        <w:t xml:space="preserve"> </w:t>
+      </w:r>
+      <w:hyperlink w:anchor="exm-random-variable">
+        <w:r>
+          <w:rPr>
+            <w:rStyle w:val="Hyperlink"/>
+          </w:rPr>
+          <w:t xml:space="preserve">Example 1</w:t>
+        </w:r>
+      </w:hyperlink>
+      <w:r>
+        <w:t xml:space="preserve">, let</w:t>
+      </w:r>
+      <w:r>
+        <w:t xml:space="preserve"> </w:t>
+      </w:r>
+      <m:oMath>
+        <m:r>
+          <m:t>X</m:t>
+        </m:r>
+      </m:oMath>
+      <w:r>
+        <w:t xml:space="preserve"> </w:t>
+      </w:r>
+      <w:r>
+        <w:t xml:space="preserve">be the number of heads in two fair coin flips.</w:t>
+      </w:r>
+      <w:r>
+        <w:t xml:space="preserve"> </w:t>
+      </w:r>
+      <w:r>
+        <w:t xml:space="preserve">Run the experiment once and suppose it produces</w:t>
+      </w:r>
+      <w:r>
+        <w:t xml:space="preserve"> </w:t>
+      </w:r>
+      <m:oMath>
+        <m:r>
+          <m:t>ω</m:t>
+        </m:r>
+        <m:r>
+          <m:rPr>
+            <m:sty m:val="p"/>
+          </m:rPr>
+          <m:t>=</m:t>
+        </m:r>
+        <m:r>
+          <m:t>H</m:t>
+        </m:r>
+        <m:r>
+          <m:t>T</m:t>
+        </m:r>
+      </m:oMath>
+      <w:r>
+        <w:t xml:space="preserve">.</w:t>
+      </w:r>
+      <w:r>
+        <w:t xml:space="preserve"> </w:t>
+      </w:r>
+      <w:r>
+        <w:t xml:space="preserve">Then the</w:t>
+      </w:r>
+      <w:r>
+        <w:t xml:space="preserve"> </w:t>
+      </w:r>
+      <w:hyperlink w:anchor="def-realization">
+        <w:r>
+          <w:rPr>
+            <w:rStyle w:val="Hyperlink"/>
+          </w:rPr>
+          <w:t xml:space="preserve">realization</w:t>
+        </w:r>
+      </w:hyperlink>
+      <w:r>
+        <w:t xml:space="preserve"> </w:t>
+      </w:r>
+      <w:r>
+        <w:t xml:space="preserve">of</w:t>
+      </w:r>
+      <w:r>
+        <w:t xml:space="preserve"> </w:t>
+      </w:r>
+      <m:oMath>
+        <m:r>
+          <m:t>X</m:t>
+        </m:r>
+      </m:oMath>
+      <w:r>
+        <w:t xml:space="preserve"> </w:t>
+      </w:r>
+      <w:r>
+        <w:t xml:space="preserve">is</w:t>
+      </w:r>
+      <w:r>
+        <w:t xml:space="preserve"> </w:t>
+      </w:r>
+      <m:oMath>
+        <m:r>
+          <m:t>x</m:t>
+        </m:r>
+        <m:r>
+          <m:rPr>
+            <m:sty m:val="p"/>
+          </m:rPr>
+          <m:t>=</m:t>
+        </m:r>
+        <m:r>
+          <m:t>X</m:t>
+        </m:r>
+        <m:r>
+          <m:rPr>
+            <m:sty m:val="p"/>
+          </m:rPr>
+          <m:t>(</m:t>
+        </m:r>
+        <m:r>
+          <m:t>H</m:t>
+        </m:r>
+        <m:r>
+          <m:t>T</m:t>
+        </m:r>
+        <m:r>
+          <m:rPr>
+            <m:sty m:val="p"/>
+          </m:rPr>
+          <m:t>)</m:t>
+        </m:r>
+        <m:r>
+          <m:rPr>
+            <m:sty m:val="p"/>
+          </m:rPr>
+          <m:t>=</m:t>
+        </m:r>
+        <m:r>
+          <m:t>1</m:t>
+        </m:r>
+      </m:oMath>
+      <w:r>
+        <w:t xml:space="preserve">.</w:t>
+      </w:r>
+      <w:r>
+        <w:t xml:space="preserve"> </w:t>
+      </w:r>
+      <w:r>
+        <w:t xml:space="preserve">Running the experiment again might produce</w:t>
+      </w:r>
+      <w:r>
+        <w:t xml:space="preserve"> </w:t>
+      </w:r>
+      <m:oMath>
+        <m:r>
+          <m:t>T</m:t>
+        </m:r>
+        <m:r>
+          <m:t>T</m:t>
+        </m:r>
+      </m:oMath>
+      <w:r>
+        <w:t xml:space="preserve">, with realization</w:t>
+      </w:r>
+      <w:r>
+        <w:t xml:space="preserve"> </w:t>
+      </w:r>
+      <m:oMath>
+        <m:r>
+          <m:t>x</m:t>
+        </m:r>
+        <m:r>
+          <m:rPr>
+            <m:sty m:val="p"/>
+          </m:rPr>
+          <m:t>=</m:t>
+        </m:r>
+        <m:r>
+          <m:t>0</m:t>
+        </m:r>
+      </m:oMath>
+      <w:r>
+        <w:t xml:space="preserve">.</w:t>
+      </w:r>
+      <w:r>
+        <w:t xml:space="preserve"> </w:t>
+      </w:r>
+      <w:r>
+        <w:t xml:space="preserve">The variable</w:t>
+      </w:r>
+      <w:r>
+        <w:t xml:space="preserve"> </w:t>
+      </w:r>
+      <m:oMath>
+        <m:r>
+          <m:t>X</m:t>
+        </m:r>
+      </m:oMath>
+      <w:r>
+        <w:t xml:space="preserve"> </w:t>
+      </w:r>
+      <w:r>
+        <w:t xml:space="preserve">is the same both times;</w:t>
+      </w:r>
+      <w:r>
+        <w:t xml:space="preserve"> </w:t>
+      </w:r>
+      <w:r>
+        <w:t xml:space="preserve">only its realization changes.</w:t>
+      </w:r>
+    </w:p>
+    <w:bookmarkEnd w:id="25"/>
+    <w:bookmarkEnd w:id="26"/>
+    <w:bookmarkStart w:id="109" w:name="X07e058d1329d8fa48179146f153d016c4f9ff9a"/>
     <w:p>
       <w:pPr>
         <w:pStyle w:val="Heading2"/>
@@ -4710,7 +5206,7 @@
         <w:t xml:space="preserve">2 Characteristics of probability distributions</w:t>
       </w:r>
     </w:p>
-    <w:bookmarkStart w:id="25" w:name="def-pmf"/>
+    <w:bookmarkStart w:id="27" w:name="def-pmf"/>
     <w:p>
       <w:pPr>
         <w:pStyle w:val="FirstParagraph"/>
@@ -4720,7 +5216,7 @@
           <w:b/>
           <w:bCs/>
         </w:rPr>
-        <w:t xml:space="preserve">Definition 5 (Probability mass function (PMF))</w:t>
+        <w:t xml:space="preserve">Definition 6 (Probability mass function (PMF))</w:t>
       </w:r>
       <w:r>
         <w:t xml:space="preserve"> </w:t>
@@ -5120,8 +5616,8 @@
         </m:oMath>
       </m:oMathPara>
     </w:p>
-    <w:bookmarkEnd w:id="25"/>
-    <w:bookmarkStart w:id="26" w:name="exm-pmf"/>
+    <w:bookmarkEnd w:id="27"/>
+    <w:bookmarkStart w:id="28" w:name="exm-pmf"/>
     <w:p>
       <w:pPr>
         <w:pStyle w:val="FirstParagraph"/>
@@ -5131,7 +5627,7 @@
           <w:b/>
           <w:bCs/>
         </w:rPr>
-        <w:t xml:space="preserve">Example 6 (PMF of the number of heads)</w:t>
+        <w:t xml:space="preserve">Example 7 (PMF of the number of heads)</w:t>
       </w:r>
       <w:r>
         <w:t xml:space="preserve"> </w:t>
@@ -5357,8 +5853,8 @@
         </m:oMath>
       </m:oMathPara>
     </w:p>
-    <w:bookmarkEnd w:id="26"/>
-    <w:bookmarkStart w:id="27" w:name="def-bernoulli"/>
+    <w:bookmarkEnd w:id="28"/>
+    <w:bookmarkStart w:id="29" w:name="def-bernoulli"/>
     <w:p>
       <w:pPr>
         <w:pStyle w:val="FirstParagraph"/>
@@ -5368,7 +5864,7 @@
           <w:b/>
           <w:bCs/>
         </w:rPr>
-        <w:t xml:space="preserve">Definition 6 (Bernoulli distribution)</w:t>
+        <w:t xml:space="preserve">Definition 7 (Bernoulli distribution)</w:t>
       </w:r>
       <w:r>
         <w:t xml:space="preserve"> </w:t>
@@ -5797,8 +6293,8 @@
         </m:oMath>
       </m:oMathPara>
     </w:p>
-    <w:bookmarkEnd w:id="27"/>
-    <w:bookmarkStart w:id="28" w:name="exm-bernoulli-pmf"/>
+    <w:bookmarkEnd w:id="29"/>
+    <w:bookmarkStart w:id="30" w:name="exm-bernoulli-pmf"/>
     <w:p>
       <w:pPr>
         <w:pStyle w:val="FirstParagraph"/>
@@ -5808,7 +6304,7 @@
           <w:b/>
           <w:bCs/>
         </w:rPr>
-        <w:t xml:space="preserve">Example 7 (The first of two coin flips)</w:t>
+        <w:t xml:space="preserve">Example 8 (The first of two coin flips)</w:t>
       </w:r>
       <w:r>
         <w:t xml:space="preserve"> </w:t>
@@ -6444,8 +6940,8 @@
         <w:t xml:space="preserve">.</w:t>
       </w:r>
     </w:p>
-    <w:bookmarkEnd w:id="28"/>
-    <w:bookmarkStart w:id="30" w:name="def-pdf"/>
+    <w:bookmarkEnd w:id="30"/>
+    <w:bookmarkStart w:id="32" w:name="def-pdf"/>
     <w:p>
       <w:pPr>
         <w:pStyle w:val="BodyText"/>
@@ -6455,7 +6951,7 @@
           <w:b/>
           <w:bCs/>
         </w:rPr>
-        <w:t xml:space="preserve">Definition 7 (Probability density function (PDF))</w:t>
+        <w:t xml:space="preserve">Definition 8 (Probability density function (PDF))</w:t>
       </w:r>
       <w:r>
         <w:t xml:space="preserve"> </w:t>
@@ -6815,7 +7311,7 @@
       <w:r>
         <w:t xml:space="preserve"> </w:t>
       </w:r>
-      <w:hyperlink r:id="rId29">
+      <w:hyperlink r:id="rId31">
         <w:r>
           <w:rPr>
             <w:rStyle w:val="Hyperlink"/>
@@ -6970,8 +7466,8 @@
         </m:oMath>
       </m:oMathPara>
     </w:p>
-    <w:bookmarkEnd w:id="30"/>
-    <w:bookmarkStart w:id="32" w:name="def-uniform-set"/>
+    <w:bookmarkEnd w:id="32"/>
+    <w:bookmarkStart w:id="34" w:name="def-uniform-set"/>
     <w:p>
       <w:pPr>
         <w:pStyle w:val="FirstParagraph"/>
@@ -6981,7 +7477,7 @@
           <w:b/>
           <w:bCs/>
         </w:rPr>
-        <w:t xml:space="preserve">Definition 8 (Uniform distribution on a set)</w:t>
+        <w:t xml:space="preserve">Definition 9 (Uniform distribution on a set)</w:t>
       </w:r>
       <w:r>
         <w:t xml:space="preserve"> </w:t>
@@ -7006,7 +7502,7 @@
       <w:r>
         <w:t xml:space="preserve"> </w:t>
       </w:r>
-      <w:hyperlink r:id="rId31">
+      <w:hyperlink r:id="rId33">
         <w:r>
           <w:rPr>
             <w:rStyle w:val="Hyperlink"/>
@@ -7114,7 +7610,7 @@
       <w:r>
         <w:t xml:space="preserve"> </w:t>
       </w:r>
-      <w:hyperlink r:id="rId29">
+      <w:hyperlink r:id="rId31">
         <w:r>
           <w:rPr>
             <w:rStyle w:val="Hyperlink"/>
@@ -7247,8 +7743,8 @@
         </m:oMath>
       </m:oMathPara>
     </w:p>
-    <w:bookmarkEnd w:id="32"/>
-    <w:bookmarkStart w:id="33" w:name="def-uniform"/>
+    <w:bookmarkEnd w:id="34"/>
+    <w:bookmarkStart w:id="35" w:name="def-uniform"/>
     <w:p>
       <w:pPr>
         <w:pStyle w:val="FirstParagraph"/>
@@ -7258,7 +7754,7 @@
           <w:b/>
           <w:bCs/>
         </w:rPr>
-        <w:t xml:space="preserve">Definition 9 (Uniform distribution on an interval)</w:t>
+        <w:t xml:space="preserve">Definition 10 (Uniform distribution on an interval)</w:t>
       </w:r>
       <w:r>
         <w:t xml:space="preserve"> </w:t>
@@ -7322,7 +7818,7 @@
           <w:rPr>
             <w:rStyle w:val="Hyperlink"/>
           </w:rPr>
-          <w:t xml:space="preserve">Definition 8</w:t>
+          <w:t xml:space="preserve">Definition 9</w:t>
         </w:r>
       </w:hyperlink>
       <w:r>
@@ -7627,8 +8123,8 @@
         </m:oMath>
       </m:oMathPara>
     </w:p>
-    <w:bookmarkEnd w:id="33"/>
-    <w:bookmarkStart w:id="34" w:name="exm-pdf"/>
+    <w:bookmarkEnd w:id="35"/>
+    <w:bookmarkStart w:id="36" w:name="exm-pdf"/>
     <w:p>
       <w:pPr>
         <w:pStyle w:val="FirstParagraph"/>
@@ -7638,7 +8134,7 @@
           <w:b/>
           <w:bCs/>
         </w:rPr>
-        <w:t xml:space="preserve">Example 8 (Subinterval probabilities of a uniform random variable)</w:t>
+        <w:t xml:space="preserve">Example 9 (Subinterval probabilities of a uniform random variable)</w:t>
       </w:r>
       <w:r>
         <w:t xml:space="preserve"> </w:t>
@@ -7702,7 +8198,7 @@
           <w:rPr>
             <w:rStyle w:val="Hyperlink"/>
           </w:rPr>
-          <w:t xml:space="preserve">Definition 9</w:t>
+          <w:t xml:space="preserve">Definition 10</w:t>
         </w:r>
       </w:hyperlink>
       <w:r>
@@ -8530,8 +9026,8 @@
         <w:t xml:space="preserve">there.</w:t>
       </w:r>
     </w:p>
-    <w:bookmarkEnd w:id="34"/>
-    <w:bookmarkStart w:id="35" w:name="thm-density-not-unique"/>
+    <w:bookmarkEnd w:id="36"/>
+    <w:bookmarkStart w:id="37" w:name="thm-density-not-unique"/>
     <w:p>
       <w:pPr>
         <w:pStyle w:val="BodyText"/>
@@ -8666,7 +9162,7 @@
         <w:t xml:space="preserve">.</w:t>
       </w:r>
     </w:p>
-    <w:bookmarkEnd w:id="35"/>
+    <w:bookmarkEnd w:id="37"/>
     <w:p>
       <w:pPr>
         <w:pStyle w:val="BodyText"/>
@@ -9171,7 +9667,7 @@
           <w:rPr>
             <w:rStyle w:val="Hyperlink"/>
           </w:rPr>
-          <w:t xml:space="preserve">Definition 7</w:t>
+          <w:t xml:space="preserve">Definition 8</w:t>
         </w:r>
       </w:hyperlink>
       <w:r>
@@ -9216,7 +9712,7 @@
         <w:t xml:space="preserve">These notes use the version that is continuous wherever possible.</w:t>
       </w:r>
     </w:p>
-    <w:bookmarkStart w:id="36" w:name="thm-continuous-no-density"/>
+    <w:bookmarkStart w:id="38" w:name="thm-continuous-no-density"/>
     <w:p>
       <w:pPr>
         <w:pStyle w:val="BodyText"/>
@@ -9255,7 +9751,7 @@
         <w:t xml:space="preserve">.</w:t>
       </w:r>
     </w:p>
-    <w:bookmarkEnd w:id="36"/>
+    <w:bookmarkEnd w:id="38"/>
     <w:p>
       <w:pPr>
         <w:pStyle w:val="BodyText"/>
@@ -9282,7 +9778,7 @@
       <w:r>
         <w:t xml:space="preserve"> </w:t>
       </w:r>
-      <w:hyperlink r:id="rId37">
+      <w:hyperlink r:id="rId39">
         <w:r>
           <w:rPr>
             <w:rStyle w:val="Hyperlink"/>
@@ -9346,7 +9842,7 @@
         <w:t xml:space="preserve">do not arise in applications.</w:t>
       </w:r>
     </w:p>
-    <w:bookmarkStart w:id="38" w:name="def-normal"/>
+    <w:bookmarkStart w:id="40" w:name="def-normal"/>
     <w:p>
       <w:pPr>
         <w:pStyle w:val="BodyText"/>
@@ -9356,7 +9852,7 @@
           <w:b/>
           <w:bCs/>
         </w:rPr>
-        <w:t xml:space="preserve">Definition 10 (Normal distribution (Gaussian distribution))</w:t>
+        <w:t xml:space="preserve">Definition 11 (Normal distribution (Gaussian distribution))</w:t>
       </w:r>
       <w:r>
         <w:t xml:space="preserve"> </w:t>
@@ -9767,8 +10263,8 @@
         </m:oMath>
       </m:oMathPara>
     </w:p>
-    <w:bookmarkEnd w:id="38"/>
-    <w:bookmarkStart w:id="39" w:name="exm-normal"/>
+    <w:bookmarkEnd w:id="40"/>
+    <w:bookmarkStart w:id="41" w:name="exm-normal"/>
     <w:p>
       <w:pPr>
         <w:pStyle w:val="FirstParagraph"/>
@@ -9778,7 +10274,7 @@
           <w:b/>
           <w:bCs/>
         </w:rPr>
-        <w:t xml:space="preserve">Example 9 (Normal densities at their centers)</w:t>
+        <w:t xml:space="preserve">Example 10 (Normal densities at their centers)</w:t>
       </w:r>
       <w:r>
         <w:t xml:space="preserve"> </w:t>
@@ -10357,7 +10853,7 @@
         <w:t xml:space="preserve">a density greater than 1.</w:t>
       </w:r>
     </w:p>
-    <w:bookmarkEnd w:id="39"/>
+    <w:bookmarkEnd w:id="41"/>
     <w:p>
       <w:pPr>
         <w:pStyle w:val="BodyText"/>
@@ -10389,7 +10885,7 @@
           <w:rPr>
             <w:rStyle w:val="Hyperlink"/>
           </w:rPr>
-          <w:t xml:space="preserve">Example 9</w:t>
+          <w:t xml:space="preserve">Example 10</w:t>
         </w:r>
       </w:hyperlink>
       <w:r>
@@ -10399,7 +10895,7 @@
         <w:t xml:space="preserve">does.</w:t>
       </w:r>
     </w:p>
-    <w:bookmarkStart w:id="40" w:name="thm-normal-density"/>
+    <w:bookmarkStart w:id="42" w:name="thm-normal-density"/>
     <w:p>
       <w:pPr>
         <w:pStyle w:val="BodyText"/>
@@ -10485,7 +10981,7 @@
           <w:rPr>
             <w:rStyle w:val="Hyperlink"/>
           </w:rPr>
-          <w:t xml:space="preserve">Definition 10</w:t>
+          <w:t xml:space="preserve">Definition 11</w:t>
         </w:r>
       </w:hyperlink>
       <w:r>
@@ -10659,8 +11155,8 @@
         </m:oMath>
       </m:oMathPara>
     </w:p>
-    <w:bookmarkEnd w:id="40"/>
-    <w:bookmarkStart w:id="43" w:name="thm-normal-moments"/>
+    <w:bookmarkEnd w:id="42"/>
+    <w:bookmarkStart w:id="45" w:name="thm-normal-moments"/>
     <w:p>
       <w:pPr>
         <w:pStyle w:val="FirstParagraph"/>
@@ -10746,7 +11242,7 @@
           <w:rPr>
             <w:rStyle w:val="Hyperlink"/>
           </w:rPr>
-          <w:t xml:space="preserve">Definition 10</w:t>
+          <w:t xml:space="preserve">Definition 11</w:t>
         </w:r>
       </w:hyperlink>
       <w:r>
@@ -10775,7 +11271,7 @@
       <w:r>
         <w:t xml:space="preserve"> </w:t>
       </w:r>
-      <w:hyperlink r:id="rId41">
+      <w:hyperlink r:id="rId43">
         <w:r>
           <w:rPr>
             <w:rStyle w:val="Hyperlink"/>
@@ -10832,7 +11328,7 @@
       <w:r>
         <w:t xml:space="preserve"> </w:t>
       </w:r>
-      <w:hyperlink r:id="rId42">
+      <w:hyperlink r:id="rId44">
         <w:r>
           <w:rPr>
             <w:rStyle w:val="Hyperlink"/>
@@ -10892,7 +11388,7 @@
         <w:t xml:space="preserve">.</w:t>
       </w:r>
     </w:p>
-    <w:bookmarkEnd w:id="43"/>
+    <w:bookmarkEnd w:id="45"/>
     <w:p>
       <w:pPr>
         <w:pStyle w:val="BodyText"/>
@@ -10944,7 +11440,7 @@
         <w:t xml:space="preserve">These facts are where the parameters’ names come from.</w:t>
       </w:r>
     </w:p>
-    <w:bookmarkStart w:id="44" w:name="def-std-normal"/>
+    <w:bookmarkStart w:id="46" w:name="def-std-normal"/>
     <w:p>
       <w:pPr>
         <w:pStyle w:val="BodyText"/>
@@ -10954,7 +11450,7 @@
           <w:b/>
           <w:bCs/>
         </w:rPr>
-        <w:t xml:space="preserve">Definition 11 (Standard normal distribution)</w:t>
+        <w:t xml:space="preserve">Definition 12 (Standard normal distribution)</w:t>
       </w:r>
       <w:r>
         <w:t xml:space="preserve"> </w:t>
@@ -11038,8 +11534,8 @@
         <w:t xml:space="preserve">.</w:t>
       </w:r>
     </w:p>
-    <w:bookmarkEnd w:id="44"/>
-    <w:bookmarkStart w:id="45" w:name="exm-std-normal"/>
+    <w:bookmarkEnd w:id="46"/>
+    <w:bookmarkStart w:id="47" w:name="exm-std-normal"/>
     <w:p>
       <w:pPr>
         <w:pStyle w:val="BodyText"/>
@@ -11049,7 +11545,7 @@
           <w:b/>
           <w:bCs/>
         </w:rPr>
-        <w:t xml:space="preserve">Example 10 (Half of a standard normal lies below 0)</w:t>
+        <w:t xml:space="preserve">Example 11 (Half of a standard normal lies below 0)</w:t>
       </w:r>
       <w:r>
         <w:t xml:space="preserve"> </w:t>
@@ -11398,8 +11894,8 @@
         <w:t xml:space="preserve">.</w:t>
       </w:r>
     </w:p>
-    <w:bookmarkEnd w:id="45"/>
-    <w:bookmarkStart w:id="46" w:name="def-exponential"/>
+    <w:bookmarkEnd w:id="47"/>
+    <w:bookmarkStart w:id="48" w:name="def-exponential"/>
     <w:p>
       <w:pPr>
         <w:pStyle w:val="BodyText"/>
@@ -11409,7 +11905,7 @@
           <w:b/>
           <w:bCs/>
         </w:rPr>
-        <w:t xml:space="preserve">Definition 12 (Exponential distribution)</w:t>
+        <w:t xml:space="preserve">Definition 13 (Exponential distribution)</w:t>
       </w:r>
       <w:r>
         <w:t xml:space="preserve"> </w:t>
@@ -11663,8 +12159,8 @@
         </m:oMath>
       </m:oMathPara>
     </w:p>
-    <w:bookmarkEnd w:id="46"/>
-    <w:bookmarkStart w:id="47" w:name="exm-exponential"/>
+    <w:bookmarkEnd w:id="48"/>
+    <w:bookmarkStart w:id="49" w:name="exm-exponential"/>
     <w:p>
       <w:pPr>
         <w:pStyle w:val="FirstParagraph"/>
@@ -11674,7 +12170,7 @@
           <w:b/>
           <w:bCs/>
         </w:rPr>
-        <w:t xml:space="preserve">Example 11 (Probability of an event within one time unit)</w:t>
+        <w:t xml:space="preserve">Example 12 (Probability of an event within one time unit)</w:t>
       </w:r>
       <w:r>
         <w:t xml:space="preserve"> </w:t>
@@ -12202,8 +12698,8 @@
         <w:t xml:space="preserve">.</w:t>
       </w:r>
     </w:p>
-    <w:bookmarkEnd w:id="47"/>
-    <w:bookmarkStart w:id="48" w:name="def-cdf"/>
+    <w:bookmarkEnd w:id="49"/>
+    <w:bookmarkStart w:id="50" w:name="def-cdf"/>
     <w:p>
       <w:pPr>
         <w:pStyle w:val="BodyText"/>
@@ -12213,7 +12709,7 @@
           <w:b/>
           <w:bCs/>
         </w:rPr>
-        <w:t xml:space="preserve">Definition 13 (Cumulative distribution function (CDF))</w:t>
+        <w:t xml:space="preserve">Definition 14 (Cumulative distribution function (CDF))</w:t>
       </w:r>
       <w:r>
         <w:t xml:space="preserve"> </w:t>
@@ -12381,7 +12877,7 @@
         </m:oMath>
       </m:oMathPara>
     </w:p>
-    <w:bookmarkEnd w:id="48"/>
+    <w:bookmarkEnd w:id="50"/>
     <w:p>
       <w:pPr>
         <w:pStyle w:val="FirstParagraph"/>
@@ -12414,7 +12910,7 @@
         <w:t xml:space="preserve">is discrete or continuous.</w:t>
       </w:r>
     </w:p>
-    <w:bookmarkStart w:id="49" w:name="exm-cdf"/>
+    <w:bookmarkStart w:id="51" w:name="exm-cdf"/>
     <w:p>
       <w:pPr>
         <w:pStyle w:val="BodyText"/>
@@ -12424,7 +12920,7 @@
           <w:b/>
           <w:bCs/>
         </w:rPr>
-        <w:t xml:space="preserve">Example 12 (CDF of the number of heads)</w:t>
+        <w:t xml:space="preserve">Example 13 (CDF of the number of heads)</w:t>
       </w:r>
       <w:r>
         <w:t xml:space="preserve"> </w:t>
@@ -12440,7 +12936,7 @@
           <w:rPr>
             <w:rStyle w:val="Hyperlink"/>
           </w:rPr>
-          <w:t xml:space="preserve">Example 6</w:t>
+          <w:t xml:space="preserve">Example 7</w:t>
         </w:r>
       </w:hyperlink>
       <w:r>
@@ -12684,8 +13180,8 @@
         </m:oMath>
       </m:oMathPara>
     </w:p>
-    <w:bookmarkEnd w:id="49"/>
-    <w:bookmarkStart w:id="50" w:name="thm-cdf-properties"/>
+    <w:bookmarkEnd w:id="51"/>
+    <w:bookmarkStart w:id="52" w:name="thm-cdf-properties"/>
     <w:p>
       <w:pPr>
         <w:pStyle w:val="FirstParagraph"/>
@@ -12901,7 +13397,7 @@
         </m:oMath>
       </m:oMathPara>
     </w:p>
-    <w:bookmarkEnd w:id="50"/>
+    <w:bookmarkEnd w:id="52"/>
     <w:p>
       <w:pPr>
         <w:pStyle w:val="FirstParagraph"/>
@@ -13069,7 +13565,7 @@
       <w:r>
         <w:t xml:space="preserve"> </w:t>
       </w:r>
-      <w:hyperlink r:id="rId51">
+      <w:hyperlink r:id="rId53">
         <w:r>
           <w:rPr>
             <w:rStyle w:val="Hyperlink"/>
@@ -13587,7 +14083,7 @@
       <w:r>
         <w:t xml:space="preserve"> </w:t>
       </w:r>
-      <w:hyperlink r:id="rId52">
+      <w:hyperlink r:id="rId54">
         <w:r>
           <w:rPr>
             <w:rStyle w:val="Hyperlink"/>
@@ -14532,7 +15028,7 @@
         <w:t xml:space="preserve">.</w:t>
       </w:r>
     </w:p>
-    <w:bookmarkStart w:id="54" w:name="thm-cdf-characterizes"/>
+    <w:bookmarkStart w:id="56" w:name="thm-cdf-characterizes"/>
     <w:p>
       <w:pPr>
         <w:pStyle w:val="BodyText"/>
@@ -14678,7 +15174,7 @@
       <w:r>
         <w:t xml:space="preserve"> </w:t>
       </w:r>
-      <w:hyperlink r:id="rId53">
+      <w:hyperlink r:id="rId55">
         <w:r>
           <w:rPr>
             <w:rStyle w:val="Hyperlink"/>
@@ -14723,7 +15219,7 @@
         <w:t xml:space="preserve">and every set built from intervals by countably many unions, intersections, and complements.</w:t>
       </w:r>
     </w:p>
-    <w:bookmarkEnd w:id="54"/>
+    <w:bookmarkEnd w:id="56"/>
     <w:p>
       <w:pPr>
         <w:pStyle w:val="BodyText"/>
@@ -14751,7 +15247,7 @@
         <w:t xml:space="preserve">.</w:t>
       </w:r>
     </w:p>
-    <w:bookmarkStart w:id="55" w:name="def-quantile-function"/>
+    <w:bookmarkStart w:id="57" w:name="def-quantile-function"/>
     <w:p>
       <w:pPr>
         <w:pStyle w:val="BodyText"/>
@@ -14761,7 +15257,7 @@
           <w:b/>
           <w:bCs/>
         </w:rPr>
-        <w:t xml:space="preserve">Definition 14 (Quantile function (population inverse CDF))</w:t>
+        <w:t xml:space="preserve">Definition 15 (Quantile function (population inverse CDF))</w:t>
       </w:r>
       <w:r>
         <w:t xml:space="preserve"> </w:t>
@@ -15029,7 +15525,7 @@
         </m:oMath>
       </m:oMathPara>
     </w:p>
-    <w:bookmarkEnd w:id="55"/>
+    <w:bookmarkEnd w:id="57"/>
     <w:p>
       <w:pPr>
         <w:pStyle w:val="FirstParagraph"/>
@@ -15320,7 +15816,7 @@
         <w:t xml:space="preserve">.</w:t>
       </w:r>
     </w:p>
-    <w:bookmarkStart w:id="56" w:name="exm-quantile-function"/>
+    <w:bookmarkStart w:id="58" w:name="exm-quantile-function"/>
     <w:p>
       <w:pPr>
         <w:pStyle w:val="BodyText"/>
@@ -15330,7 +15826,7 @@
           <w:b/>
           <w:bCs/>
         </w:rPr>
-        <w:t xml:space="preserve">Example 13 (Median of the number of heads)</w:t>
+        <w:t xml:space="preserve">Example 14 (Median of the number of heads)</w:t>
       </w:r>
       <w:r>
         <w:t xml:space="preserve"> </w:t>
@@ -15346,7 +15842,7 @@
           <w:rPr>
             <w:rStyle w:val="Hyperlink"/>
           </w:rPr>
-          <w:t xml:space="preserve">Example 12</w:t>
+          <w:t xml:space="preserve">Example 13</w:t>
         </w:r>
       </w:hyperlink>
       <w:r>
@@ -15466,7 +15962,7 @@
         <w:t xml:space="preserve">.</w:t>
       </w:r>
     </w:p>
-    <w:bookmarkEnd w:id="56"/>
+    <w:bookmarkEnd w:id="58"/>
     <w:p>
       <w:pPr>
         <w:pStyle w:val="BodyText"/>
@@ -15521,7 +16017,7 @@
       <w:tr>
         <w:tc>
           <w:tcPr/>
-          <w:bookmarkStart w:id="60" w:name="fig-pmf-cdf-quantile"/>
+          <w:bookmarkStart w:id="62" w:name="fig-pmf-cdf-quantile"/>
           <w:p>
             <w:pPr>
               <w:jc w:val="center"/>
@@ -15531,18 +16027,18 @@
                 <wp:inline>
                   <wp:extent cx="5334000" cy="2963333"/>
                   <wp:effectExtent b="0" l="0" r="0" t="0"/>
-                  <wp:docPr descr="" title="" id="58" name="Picture"/>
+                  <wp:docPr descr="" title="" id="60" name="Picture"/>
                   <a:graphic>
                     <a:graphicData uri="http://schemas.openxmlformats.org/drawingml/2006/picture">
                       <pic:pic>
                         <pic:nvPicPr>
-                          <pic:cNvPr descr="random-variables_files/figure-docx/pmf-cdf-quantile-plot-1.png" id="59" name="Picture"/>
+                          <pic:cNvPr descr="random-variables_files/figure-docx/pmf-cdf-quantile-plot-1.png" id="61" name="Picture"/>
                           <pic:cNvPicPr>
                             <a:picLocks noChangeArrowheads="1" noChangeAspect="1"/>
                           </pic:cNvPicPr>
                         </pic:nvPicPr>
                         <pic:blipFill>
-                          <a:blip r:embed="rId57"/>
+                          <a:blip r:embed="rId59"/>
                           <a:stretch>
                             <a:fillRect/>
                           </a:stretch>
@@ -15624,11 +16120,11 @@
               <w:t xml:space="preserve">its axes are the CDF’s, swapped.</w:t>
             </w:r>
           </w:p>
-          <w:bookmarkEnd w:id="60"/>
+          <w:bookmarkEnd w:id="62"/>
         </w:tc>
       </w:tr>
     </w:tbl>
-    <w:bookmarkStart w:id="61" w:name="thm-density-vs-CDF"/>
+    <w:bookmarkStart w:id="63" w:name="thm-density-vs-CDF"/>
     <w:p>
       <w:pPr>
         <w:pStyle w:val="BodyText"/>
@@ -15805,7 +16301,7 @@
         </m:oMath>
       </m:oMathPara>
     </w:p>
-    <w:bookmarkEnd w:id="61"/>
+    <w:bookmarkEnd w:id="63"/>
     <w:p>
       <w:pPr>
         <w:pStyle w:val="FirstParagraph"/>
@@ -16605,7 +17101,7 @@
         <w:t xml:space="preserve">.</w:t>
       </w:r>
     </w:p>
-    <w:bookmarkStart w:id="62" w:name="thm-cdf-derivative-is-density"/>
+    <w:bookmarkStart w:id="64" w:name="thm-cdf-derivative-is-density"/>
     <w:p>
       <w:pPr>
         <w:pStyle w:val="BodyText"/>
@@ -16785,7 +17281,7 @@
         </m:oMath>
       </m:oMathPara>
     </w:p>
-    <w:bookmarkEnd w:id="62"/>
+    <w:bookmarkEnd w:id="64"/>
     <w:p>
       <w:pPr>
         <w:pStyle w:val="FirstParagraph"/>
@@ -17062,7 +17558,7 @@
         <w:t xml:space="preserve">is continuous.</w:t>
       </w:r>
     </w:p>
-    <w:bookmarkStart w:id="63" w:name="cor-cdf-derivative-density-ae"/>
+    <w:bookmarkStart w:id="65" w:name="cor-cdf-derivative-density-ae"/>
     <w:p>
       <w:pPr>
         <w:pStyle w:val="BodyText"/>
@@ -17187,7 +17683,7 @@
         <w:t xml:space="preserve">at all but finitely many points.</w:t>
       </w:r>
     </w:p>
-    <w:bookmarkEnd w:id="63"/>
+    <w:bookmarkEnd w:id="65"/>
     <w:p>
       <w:pPr>
         <w:pStyle w:val="BodyText"/>
@@ -17363,7 +17859,7 @@
         <w:t xml:space="preserve">applies to each of them.</w:t>
       </w:r>
     </w:p>
-    <w:bookmarkStart w:id="64" w:name="exm-density-vs-CDF"/>
+    <w:bookmarkStart w:id="66" w:name="exm-density-vs-CDF"/>
     <w:p>
       <w:pPr>
         <w:pStyle w:val="BodyText"/>
@@ -17373,7 +17869,7 @@
           <w:b/>
           <w:bCs/>
         </w:rPr>
-        <w:t xml:space="preserve">Example 14 (CDF and density of a uniform random variable)</w:t>
+        <w:t xml:space="preserve">Example 15 (CDF and density of a uniform random variable)</w:t>
       </w:r>
       <w:r>
         <w:t xml:space="preserve"> </w:t>
@@ -17454,7 +17950,7 @@
           <w:rPr>
             <w:rStyle w:val="Hyperlink"/>
           </w:rPr>
-          <w:t xml:space="preserve">Definition 9</w:t>
+          <w:t xml:space="preserve">Definition 10</w:t>
         </w:r>
       </w:hyperlink>
       <w:r>
@@ -18007,8 +18503,8 @@
         <w:t xml:space="preserve">its slope is 1 on the left and 0 on the right.</w:t>
       </w:r>
     </w:p>
-    <w:bookmarkEnd w:id="64"/>
-    <w:bookmarkStart w:id="65" w:name="thm-cdf-derivative-density"/>
+    <w:bookmarkEnd w:id="66"/>
+    <w:bookmarkStart w:id="67" w:name="thm-cdf-derivative-density"/>
     <w:p>
       <w:pPr>
         <w:pStyle w:val="BodyText"/>
@@ -18136,7 +18632,7 @@
         <w:t xml:space="preserve">.</w:t>
       </w:r>
     </w:p>
-    <w:bookmarkEnd w:id="65"/>
+    <w:bookmarkEnd w:id="67"/>
     <w:p>
       <w:pPr>
         <w:pStyle w:val="BodyText"/>
@@ -19481,7 +19977,7 @@
         <w:t xml:space="preserve">).</w:t>
       </w:r>
     </w:p>
-    <w:bookmarkStart w:id="66" w:name="exm-cdf-derivative-density"/>
+    <w:bookmarkStart w:id="68" w:name="exm-cdf-derivative-density"/>
     <w:p>
       <w:pPr>
         <w:pStyle w:val="BodyText"/>
@@ -19491,7 +19987,7 @@
           <w:b/>
           <w:bCs/>
         </w:rPr>
-        <w:t xml:space="preserve">Example 15 (A density from a CDF with a corner)</w:t>
+        <w:t xml:space="preserve">Example 16 (A density from a CDF with a corner)</w:t>
       </w:r>
       <w:r>
         <w:t xml:space="preserve"> </w:t>
@@ -19991,8 +20487,8 @@
         <w:t xml:space="preserve">.</w:t>
       </w:r>
     </w:p>
-    <w:bookmarkEnd w:id="66"/>
-    <w:bookmarkStart w:id="67" w:name="thm-density-limit"/>
+    <w:bookmarkEnd w:id="68"/>
+    <w:bookmarkStart w:id="69" w:name="thm-density-limit"/>
     <w:p>
       <w:pPr>
         <w:pStyle w:val="BodyText"/>
@@ -20268,7 +20764,7 @@
         </m:oMath>
       </m:oMathPara>
     </w:p>
-    <w:bookmarkEnd w:id="67"/>
+    <w:bookmarkEnd w:id="69"/>
     <w:p>
       <w:pPr>
         <w:pStyle w:val="FirstParagraph"/>
@@ -21046,7 +21542,7 @@
         <w:t xml:space="preserve">(Chapter 22, p. 535).</w:t>
       </w:r>
     </w:p>
-    <w:bookmarkStart w:id="68" w:name="exm-density-limit"/>
+    <w:bookmarkStart w:id="70" w:name="exm-density-limit"/>
     <w:p>
       <w:pPr>
         <w:pStyle w:val="BodyText"/>
@@ -21056,7 +21552,7 @@
           <w:b/>
           <w:bCs/>
         </w:rPr>
-        <w:t xml:space="preserve">Example 16 (The uniform density as a limit)</w:t>
+        <w:t xml:space="preserve">Example 17 (The uniform density as a limit)</w:t>
       </w:r>
       <w:r>
         <w:t xml:space="preserve"> </w:t>
@@ -21475,15 +21971,15 @@
           <w:rPr>
             <w:rStyle w:val="Hyperlink"/>
           </w:rPr>
-          <w:t xml:space="preserve">Definition 9</w:t>
+          <w:t xml:space="preserve">Definition 10</w:t>
         </w:r>
       </w:hyperlink>
       <w:r>
         <w:t xml:space="preserve">.</w:t>
       </w:r>
     </w:p>
-    <w:bookmarkEnd w:id="68"/>
-    <w:bookmarkStart w:id="69" w:name="prp-density-limit-right-derivative"/>
+    <w:bookmarkEnd w:id="70"/>
+    <w:bookmarkStart w:id="71" w:name="prp-density-limit-right-derivative"/>
     <w:p>
       <w:pPr>
         <w:pStyle w:val="BodyText"/>
@@ -21810,7 +22306,7 @@
         <w:t xml:space="preserve">.</w:t>
       </w:r>
     </w:p>
-    <w:bookmarkEnd w:id="69"/>
+    <w:bookmarkEnd w:id="71"/>
     <w:p>
       <w:pPr>
         <w:pStyle w:val="BodyText"/>
@@ -21944,7 +22440,7 @@
         <w:t xml:space="preserve">or both have none.</w:t>
       </w:r>
     </w:p>
-    <w:bookmarkStart w:id="70" w:name="exm-density-limit-jump"/>
+    <w:bookmarkStart w:id="72" w:name="exm-density-limit-jump"/>
     <w:p>
       <w:pPr>
         <w:pStyle w:val="BodyText"/>
@@ -21954,7 +22450,7 @@
           <w:b/>
           <w:bCs/>
         </w:rPr>
-        <w:t xml:space="preserve">Example 17 (The density limit at a jump)</w:t>
+        <w:t xml:space="preserve">Example 18 (The density limit at a jump)</w:t>
       </w:r>
       <w:r>
         <w:t xml:space="preserve"> </w:t>
@@ -22087,7 +22583,7 @@
           <w:rPr>
             <w:rStyle w:val="Hyperlink"/>
           </w:rPr>
-          <w:t xml:space="preserve">Definition 9</w:t>
+          <w:t xml:space="preserve">Definition 10</w:t>
         </w:r>
       </w:hyperlink>
       <w:r>
@@ -22797,15 +23293,15 @@
           <w:rPr>
             <w:rStyle w:val="Hyperlink"/>
           </w:rPr>
-          <w:t xml:space="preserve">Example 14</w:t>
+          <w:t xml:space="preserve">Example 15</w:t>
         </w:r>
       </w:hyperlink>
       <w:r>
         <w:t xml:space="preserve">.</w:t>
       </w:r>
     </w:p>
-    <w:bookmarkEnd w:id="70"/>
-    <w:bookmarkStart w:id="71" w:name="thm-density-sums-to-one"/>
+    <w:bookmarkEnd w:id="72"/>
+    <w:bookmarkStart w:id="73" w:name="thm-density-sums-to-one"/>
     <w:p>
       <w:pPr>
         <w:pStyle w:val="BodyText"/>
@@ -22929,7 +23425,7 @@
         </m:oMath>
       </m:oMathPara>
     </w:p>
-    <w:bookmarkEnd w:id="71"/>
+    <w:bookmarkEnd w:id="73"/>
     <w:p>
       <w:pPr>
         <w:pStyle w:val="FirstParagraph"/>
@@ -23250,7 +23746,7 @@
         <w:t xml:space="preserve">.</w:t>
       </w:r>
     </w:p>
-    <w:bookmarkStart w:id="72" w:name="exm-density-sums-to-one"/>
+    <w:bookmarkStart w:id="74" w:name="exm-density-sums-to-one"/>
     <w:p>
       <w:pPr>
         <w:pStyle w:val="BodyText"/>
@@ -23260,7 +23756,7 @@
           <w:b/>
           <w:bCs/>
         </w:rPr>
-        <w:t xml:space="preserve">Example 18 (The uniform density integrates to 1)</w:t>
+        <w:t xml:space="preserve">Example 19 (The uniform density integrates to 1)</w:t>
       </w:r>
       <w:r>
         <w:t xml:space="preserve"> </w:t>
@@ -23324,7 +23820,7 @@
           <w:rPr>
             <w:rStyle w:val="Hyperlink"/>
           </w:rPr>
-          <w:t xml:space="preserve">Definition 9</w:t>
+          <w:t xml:space="preserve">Definition 10</w:t>
         </w:r>
       </w:hyperlink>
       <w:r>
@@ -23467,8 +23963,8 @@
         </m:oMath>
       </m:oMathPara>
     </w:p>
-    <w:bookmarkEnd w:id="72"/>
-    <w:bookmarkStart w:id="73" w:name="def-jointly-distributed"/>
+    <w:bookmarkEnd w:id="74"/>
+    <w:bookmarkStart w:id="75" w:name="def-jointly-distributed"/>
     <w:p>
       <w:pPr>
         <w:pStyle w:val="FirstParagraph"/>
@@ -23478,7 +23974,7 @@
           <w:b/>
           <w:bCs/>
         </w:rPr>
-        <w:t xml:space="preserve">Definition 15 (Jointly distributed random variables)</w:t>
+        <w:t xml:space="preserve">Definition 16 (Jointly distributed random variables)</w:t>
       </w:r>
       <w:r>
         <w:t xml:space="preserve"> </w:t>
@@ -23697,7 +24193,7 @@
         <w:t xml:space="preserve">has a probability.</w:t>
       </w:r>
     </w:p>
-    <w:bookmarkEnd w:id="73"/>
+    <w:bookmarkEnd w:id="75"/>
     <w:p>
       <w:pPr>
         <w:pStyle w:val="BodyText"/>
@@ -23861,7 +24357,7 @@
         <w:t xml:space="preserve">and similarly for more variables.</w:t>
       </w:r>
     </w:p>
-    <w:bookmarkStart w:id="74" w:name="exm-jointly-distributed"/>
+    <w:bookmarkStart w:id="76" w:name="exm-jointly-distributed"/>
     <w:p>
       <w:pPr>
         <w:pStyle w:val="BodyText"/>
@@ -23871,7 +24367,7 @@
           <w:b/>
           <w:bCs/>
         </w:rPr>
-        <w:t xml:space="preserve">Example 19 (The first flip and the total)</w:t>
+        <w:t xml:space="preserve">Example 20 (The first flip and the total)</w:t>
       </w:r>
       <w:r>
         <w:t xml:space="preserve"> </w:t>
@@ -23930,7 +24426,7 @@
           <w:rPr>
             <w:rStyle w:val="Hyperlink"/>
           </w:rPr>
-          <w:t xml:space="preserve">Example 7</w:t>
+          <w:t xml:space="preserve">Example 8</w:t>
         </w:r>
       </w:hyperlink>
       <w:r>
@@ -24286,8 +24782,8 @@
         </m:oMath>
       </m:oMathPara>
     </w:p>
-    <w:bookmarkEnd w:id="74"/>
-    <w:bookmarkStart w:id="76" w:name="def-joint-distribution"/>
+    <w:bookmarkEnd w:id="76"/>
+    <w:bookmarkStart w:id="78" w:name="def-joint-distribution"/>
     <w:p>
       <w:pPr>
         <w:pStyle w:val="FirstParagraph"/>
@@ -24297,7 +24793,7 @@
           <w:b/>
           <w:bCs/>
         </w:rPr>
-        <w:t xml:space="preserve">Definition 16 (Joint distribution)</w:t>
+        <w:t xml:space="preserve">Definition 17 (Joint distribution)</w:t>
       </w:r>
       <w:r>
         <w:t xml:space="preserve"> </w:t>
@@ -24516,7 +25012,7 @@
       <w:r>
         <w:t xml:space="preserve"> </w:t>
       </w:r>
-      <w:hyperlink r:id="rId75">
+      <w:hyperlink r:id="rId77">
         <w:r>
           <w:rPr>
             <w:rStyle w:val="Hyperlink"/>
@@ -24626,8 +25122,8 @@
         <w:t xml:space="preserve">.</w:t>
       </w:r>
     </w:p>
-    <w:bookmarkEnd w:id="76"/>
-    <w:bookmarkStart w:id="77" w:name="exm-joint-distribution"/>
+    <w:bookmarkEnd w:id="78"/>
+    <w:bookmarkStart w:id="79" w:name="exm-joint-distribution"/>
     <w:p>
       <w:pPr>
         <w:pStyle w:val="BodyText"/>
@@ -24637,7 +25133,7 @@
           <w:b/>
           <w:bCs/>
         </w:rPr>
-        <w:t xml:space="preserve">Example 20 (Joint distribution of the first flip and the total)</w:t>
+        <w:t xml:space="preserve">Example 21 (Joint distribution of the first flip and the total)</w:t>
       </w:r>
       <w:r>
         <w:t xml:space="preserve"> </w:t>
@@ -24653,7 +25149,7 @@
           <w:rPr>
             <w:rStyle w:val="Hyperlink"/>
           </w:rPr>
-          <w:t xml:space="preserve">Example 19</w:t>
+          <w:t xml:space="preserve">Example 20</w:t>
         </w:r>
       </w:hyperlink>
       <w:r>
@@ -25028,8 +25524,8 @@
         <w:t xml:space="preserve">and each of those outcomes has at least one head.</w:t>
       </w:r>
     </w:p>
-    <w:bookmarkEnd w:id="77"/>
-    <w:bookmarkStart w:id="78" w:name="thm-joint-distribution-rectangles"/>
+    <w:bookmarkEnd w:id="79"/>
+    <w:bookmarkStart w:id="80" w:name="thm-joint-distribution-rectangles"/>
     <w:p>
       <w:pPr>
         <w:pStyle w:val="BodyText"/>
@@ -25598,7 +26094,7 @@
         <w:t xml:space="preserve">.</w:t>
       </w:r>
     </w:p>
-    <w:bookmarkEnd w:id="78"/>
+    <w:bookmarkEnd w:id="80"/>
     <w:p>
       <w:pPr>
         <w:pStyle w:val="BodyText"/>
@@ -25678,7 +26174,7 @@
       <w:r>
         <w:t xml:space="preserve"> </w:t>
       </w:r>
-      <w:hyperlink r:id="rId79">
+      <w:hyperlink r:id="rId81">
         <m:oMath>
           <m:r>
             <m:t>π</m:t>
@@ -25738,7 +26234,7 @@
         <w:t xml:space="preserve">.</w:t>
       </w:r>
     </w:p>
-    <w:bookmarkStart w:id="80" w:name="def-joint-pmf"/>
+    <w:bookmarkStart w:id="82" w:name="def-joint-pmf"/>
     <w:p>
       <w:pPr>
         <w:pStyle w:val="BodyText"/>
@@ -25748,7 +26244,7 @@
           <w:b/>
           <w:bCs/>
         </w:rPr>
-        <w:t xml:space="preserve">Definition 17 (Joint probability mass function (joint PMF))</w:t>
+        <w:t xml:space="preserve">Definition 18 (Joint probability mass function (joint PMF))</w:t>
       </w:r>
       <w:r>
         <w:t xml:space="preserve"> </w:t>
@@ -26067,8 +26563,8 @@
         </m:oMath>
       </m:oMathPara>
     </w:p>
-    <w:bookmarkEnd w:id="80"/>
-    <w:bookmarkStart w:id="81" w:name="exm-joint-pmf"/>
+    <w:bookmarkEnd w:id="82"/>
+    <w:bookmarkStart w:id="83" w:name="exm-joint-pmf"/>
     <w:p>
       <w:pPr>
         <w:pStyle w:val="FirstParagraph"/>
@@ -26078,7 +26574,7 @@
           <w:b/>
           <w:bCs/>
         </w:rPr>
-        <w:t xml:space="preserve">Example 21 (Joint PMF of the first flip and the total)</w:t>
+        <w:t xml:space="preserve">Example 22 (Joint PMF of the first flip and the total)</w:t>
       </w:r>
       <w:r>
         <w:t xml:space="preserve"> </w:t>
@@ -26094,7 +26590,7 @@
           <w:rPr>
             <w:rStyle w:val="Hyperlink"/>
           </w:rPr>
-          <w:t xml:space="preserve">Example 19</w:t>
+          <w:t xml:space="preserve">Example 20</w:t>
         </w:r>
       </w:hyperlink>
       <w:r>
@@ -26542,8 +27038,8 @@
         </w:tc>
       </w:tr>
     </w:tbl>
-    <w:bookmarkEnd w:id="81"/>
-    <w:bookmarkStart w:id="82" w:name="def-marginal"/>
+    <w:bookmarkEnd w:id="83"/>
+    <w:bookmarkStart w:id="84" w:name="def-marginal"/>
     <w:p>
       <w:pPr>
         <w:pStyle w:val="BodyText"/>
@@ -26553,7 +27049,7 @@
           <w:b/>
           <w:bCs/>
         </w:rPr>
-        <w:t xml:space="preserve">Definition 18 (Marginal distribution)</w:t>
+        <w:t xml:space="preserve">Definition 19 (Marginal distribution)</w:t>
       </w:r>
       <w:r>
         <w:t xml:space="preserve"> </w:t>
@@ -26658,7 +27154,7 @@
         <w:t xml:space="preserve">.</w:t>
       </w:r>
     </w:p>
-    <w:bookmarkEnd w:id="82"/>
+    <w:bookmarkEnd w:id="84"/>
     <w:p>
       <w:pPr>
         <w:pStyle w:val="BodyText"/>
@@ -26720,7 +27216,7 @@
         <w:t xml:space="preserve">.</w:t>
       </w:r>
     </w:p>
-    <w:bookmarkStart w:id="83" w:name="exm-marginal"/>
+    <w:bookmarkStart w:id="85" w:name="exm-marginal"/>
     <w:p>
       <w:pPr>
         <w:pStyle w:val="BodyText"/>
@@ -26730,7 +27226,7 @@
           <w:b/>
           <w:bCs/>
         </w:rPr>
-        <w:t xml:space="preserve">Example 22 (Marginal distribution of the total)</w:t>
+        <w:t xml:space="preserve">Example 23 (Marginal distribution of the total)</w:t>
       </w:r>
       <w:r>
         <w:t xml:space="preserve"> </w:t>
@@ -26746,7 +27242,7 @@
           <w:rPr>
             <w:rStyle w:val="Hyperlink"/>
           </w:rPr>
-          <w:t xml:space="preserve">Example 21</w:t>
+          <w:t xml:space="preserve">Example 22</w:t>
         </w:r>
       </w:hyperlink>
       <w:r>
@@ -26780,7 +27276,7 @@
           <w:rPr>
             <w:rStyle w:val="Hyperlink"/>
           </w:rPr>
-          <w:t xml:space="preserve">Example 6</w:t>
+          <w:t xml:space="preserve">Example 7</w:t>
         </w:r>
       </w:hyperlink>
       <w:r>
@@ -26958,8 +27454,8 @@
         <w:t xml:space="preserve">.</w:t>
       </w:r>
     </w:p>
-    <w:bookmarkEnd w:id="83"/>
-    <w:bookmarkStart w:id="84" w:name="thm-marginal-pmf"/>
+    <w:bookmarkEnd w:id="85"/>
+    <w:bookmarkStart w:id="86" w:name="thm-marginal-pmf"/>
     <w:p>
       <w:pPr>
         <w:pStyle w:val="BodyText"/>
@@ -27172,7 +27668,7 @@
         </m:oMath>
       </m:oMathPara>
     </w:p>
-    <w:bookmarkEnd w:id="84"/>
+    <w:bookmarkEnd w:id="86"/>
     <w:p>
       <w:pPr>
         <w:pStyle w:val="FirstParagraph"/>
@@ -27833,7 +28329,7 @@
         </m:oMath>
       </m:oMathPara>
     </w:p>
-    <w:bookmarkStart w:id="85" w:name="exm-marginal-pmf"/>
+    <w:bookmarkStart w:id="87" w:name="exm-marginal-pmf"/>
     <w:p>
       <w:pPr>
         <w:pStyle w:val="FirstParagraph"/>
@@ -27843,7 +28339,7 @@
           <w:b/>
           <w:bCs/>
         </w:rPr>
-        <w:t xml:space="preserve">Example 23 (Summing a row of the joint PMF)</w:t>
+        <w:t xml:space="preserve">Example 24 (Summing a row of the joint PMF)</w:t>
       </w:r>
       <w:r>
         <w:t xml:space="preserve"> </w:t>
@@ -27859,7 +28355,7 @@
           <w:rPr>
             <w:rStyle w:val="Hyperlink"/>
           </w:rPr>
-          <w:t xml:space="preserve">Example 21</w:t>
+          <w:t xml:space="preserve">Example 22</w:t>
         </w:r>
       </w:hyperlink>
       <w:r>
@@ -28344,15 +28840,15 @@
           <w:rPr>
             <w:rStyle w:val="Hyperlink"/>
           </w:rPr>
-          <w:t xml:space="preserve">Example 7</w:t>
+          <w:t xml:space="preserve">Example 8</w:t>
         </w:r>
       </w:hyperlink>
       <w:r>
         <w:t xml:space="preserve">.</w:t>
       </w:r>
     </w:p>
-    <w:bookmarkEnd w:id="85"/>
-    <w:bookmarkStart w:id="86" w:name="def-joint-pdf"/>
+    <w:bookmarkEnd w:id="87"/>
+    <w:bookmarkStart w:id="88" w:name="def-joint-pdf"/>
     <w:p>
       <w:pPr>
         <w:pStyle w:val="BodyText"/>
@@ -28362,7 +28858,7 @@
           <w:b/>
           <w:bCs/>
         </w:rPr>
-        <w:t xml:space="preserve">Definition 19 (Joint probability density function (joint density))</w:t>
+        <w:t xml:space="preserve">Definition 20 (Joint probability density function (joint density))</w:t>
       </w:r>
       <w:r>
         <w:t xml:space="preserve"> </w:t>
@@ -29037,7 +29533,7 @@
         </m:oMath>
       </m:oMathPara>
     </w:p>
-    <w:bookmarkEnd w:id="86"/>
+    <w:bookmarkEnd w:id="88"/>
     <w:p>
       <w:pPr>
         <w:pStyle w:val="FirstParagraph"/>
@@ -29058,7 +29554,7 @@
       <w:r>
         <w:t xml:space="preserve"> </w:t>
       </w:r>
-      <w:hyperlink r:id="rId75">
+      <w:hyperlink r:id="rId77">
         <w:r>
           <w:rPr>
             <w:rStyle w:val="Hyperlink"/>
@@ -29090,7 +29586,7 @@
         <w:t xml:space="preserve">every region that arises in these notes is in it.</w:t>
       </w:r>
     </w:p>
-    <w:bookmarkStart w:id="87" w:name="exm-joint-pdf"/>
+    <w:bookmarkStart w:id="89" w:name="exm-joint-pdf"/>
     <w:p>
       <w:pPr>
         <w:pStyle w:val="BodyText"/>
@@ -29100,7 +29596,7 @@
           <w:b/>
           <w:bCs/>
         </w:rPr>
-        <w:t xml:space="preserve">Example 24 (A joint density on a triangle)</w:t>
+        <w:t xml:space="preserve">Example 25 (A joint density on a triangle)</w:t>
       </w:r>
       <w:r>
         <w:t xml:space="preserve"> </w:t>
@@ -29727,8 +30223,8 @@
         </m:oMath>
       </m:oMathPara>
     </w:p>
-    <w:bookmarkEnd w:id="87"/>
-    <w:bookmarkStart w:id="88" w:name="thm-no-joint-density-diagonal"/>
+    <w:bookmarkEnd w:id="89"/>
+    <w:bookmarkStart w:id="90" w:name="thm-no-joint-density-diagonal"/>
     <w:p>
       <w:pPr>
         <w:pStyle w:val="FirstParagraph"/>
@@ -29816,7 +30312,7 @@
         <w:t xml:space="preserve">.</w:t>
       </w:r>
     </w:p>
-    <w:bookmarkEnd w:id="88"/>
+    <w:bookmarkEnd w:id="90"/>
     <w:p>
       <w:pPr>
         <w:pStyle w:val="BodyText"/>
@@ -30883,7 +31379,7 @@
       <w:r>
         <w:t xml:space="preserve">(</w:t>
       </w:r>
-      <w:hyperlink r:id="rId89">
+      <w:hyperlink r:id="rId91">
         <w:r>
           <w:rPr>
             <w:rStyle w:val="Hyperlink"/>
@@ -30904,7 +31400,7 @@
         <w:t xml:space="preserve">, Theorem 18.3).</w:t>
       </w:r>
     </w:p>
-    <w:bookmarkStart w:id="90" w:name="thm-marginal-density"/>
+    <w:bookmarkStart w:id="92" w:name="thm-marginal-density"/>
     <w:p>
       <w:pPr>
         <w:pStyle w:val="BodyText"/>
@@ -31131,7 +31627,7 @@
         </m:oMath>
       </m:oMathPara>
     </w:p>
-    <w:bookmarkEnd w:id="90"/>
+    <w:bookmarkEnd w:id="92"/>
     <w:p>
       <w:pPr>
         <w:pStyle w:val="FirstParagraph"/>
@@ -31899,7 +32395,7 @@
       <w:r>
         <w:t xml:space="preserve">(</w:t>
       </w:r>
-      <w:hyperlink r:id="rId89">
+      <w:hyperlink r:id="rId91">
         <w:r>
           <w:rPr>
             <w:rStyle w:val="Hyperlink"/>
@@ -31956,14 +32452,14 @@
           <w:rPr>
             <w:rStyle w:val="Hyperlink"/>
           </w:rPr>
-          <w:t xml:space="preserve">Definition 7</w:t>
+          <w:t xml:space="preserve">Definition 8</w:t>
         </w:r>
       </w:hyperlink>
       <w:r>
         <w:t xml:space="preserve">.</w:t>
       </w:r>
     </w:p>
-    <w:bookmarkStart w:id="91" w:name="exm-marginal-density"/>
+    <w:bookmarkStart w:id="93" w:name="exm-marginal-density"/>
     <w:p>
       <w:pPr>
         <w:pStyle w:val="BodyText"/>
@@ -31973,7 +32469,7 @@
           <w:b/>
           <w:bCs/>
         </w:rPr>
-        <w:t xml:space="preserve">Example 25 (Marginal densities on the triangle)</w:t>
+        <w:t xml:space="preserve">Example 26 (Marginal densities on the triangle)</w:t>
       </w:r>
       <w:r>
         <w:t xml:space="preserve"> </w:t>
@@ -31989,7 +32485,7 @@
           <w:rPr>
             <w:rStyle w:val="Hyperlink"/>
           </w:rPr>
-          <w:t xml:space="preserve">Example 24</w:t>
+          <w:t xml:space="preserve">Example 25</w:t>
         </w:r>
       </w:hyperlink>
       <w:r>
@@ -32649,8 +33145,8 @@
         <w:t xml:space="preserve">.</w:t>
       </w:r>
     </w:p>
-    <w:bookmarkEnd w:id="91"/>
-    <w:bookmarkStart w:id="92" w:name="def-joint-density-mass"/>
+    <w:bookmarkEnd w:id="93"/>
+    <w:bookmarkStart w:id="94" w:name="def-joint-density-mass"/>
     <w:p>
       <w:pPr>
         <w:pStyle w:val="BodyText"/>
@@ -32660,7 +33156,7 @@
           <w:b/>
           <w:bCs/>
         </w:rPr>
-        <w:t xml:space="preserve">Definition 20 (Joint density-mass function)</w:t>
+        <w:t xml:space="preserve">Definition 21 (Joint density-mass function)</w:t>
       </w:r>
       <w:r>
         <w:t xml:space="preserve"> </w:t>
@@ -33118,7 +33614,7 @@
         </m:oMath>
       </m:oMathPara>
     </w:p>
-    <w:bookmarkEnd w:id="92"/>
+    <w:bookmarkEnd w:id="94"/>
     <w:p>
       <w:pPr>
         <w:pStyle w:val="FirstParagraph"/>
@@ -33310,7 +33806,7 @@
         <w:t xml:space="preserve">.</w:t>
       </w:r>
     </w:p>
-    <w:bookmarkStart w:id="93" w:name="cor-joint-density-mass-marginal"/>
+    <w:bookmarkStart w:id="95" w:name="cor-joint-density-mass-marginal"/>
     <w:p>
       <w:pPr>
         <w:pStyle w:val="BodyText"/>
@@ -33574,7 +34070,7 @@
         </m:oMath>
       </m:oMathPara>
     </w:p>
-    <w:bookmarkEnd w:id="93"/>
+    <w:bookmarkEnd w:id="95"/>
     <w:p>
       <w:pPr>
         <w:pStyle w:val="FirstParagraph"/>
@@ -34133,7 +34629,7 @@
         </m:oMath>
       </m:oMathPara>
     </w:p>
-    <w:bookmarkStart w:id="94" w:name="exm-joint-density-mass"/>
+    <w:bookmarkStart w:id="96" w:name="exm-joint-density-mass"/>
     <w:p>
       <w:pPr>
         <w:pStyle w:val="FirstParagraph"/>
@@ -34143,7 +34639,7 @@
           <w:b/>
           <w:bCs/>
         </w:rPr>
-        <w:t xml:space="preserve">Example 26 (A coin flip and a waiting time)</w:t>
+        <w:t xml:space="preserve">Example 27 (A coin flip and a waiting time)</w:t>
       </w:r>
       <w:r>
         <w:t xml:space="preserve"> </w:t>
@@ -34755,8 +35251,8 @@
         </m:oMath>
       </m:oMathPara>
     </w:p>
-    <w:bookmarkEnd w:id="94"/>
-    <w:bookmarkStart w:id="97" w:name="sec-joint-marginal"/>
+    <w:bookmarkEnd w:id="96"/>
+    <w:bookmarkStart w:id="99" w:name="sec-joint-marginal"/>
     <w:p>
       <w:pPr>
         <w:pStyle w:val="Heading3"/>
@@ -35799,7 +36295,7 @@
         <w:t xml:space="preserve">.</w:t>
       </w:r>
     </w:p>
-    <w:bookmarkStart w:id="96" w:name="exm-meteorite"/>
+    <w:bookmarkStart w:id="98" w:name="exm-meteorite"/>
     <w:p>
       <w:pPr>
         <w:pStyle w:val="BodyText"/>
@@ -35809,7 +36305,7 @@
           <w:b/>
           <w:bCs/>
         </w:rPr>
-        <w:t xml:space="preserve">Example 27 (Joint probabilities and marginalization)</w:t>
+        <w:t xml:space="preserve">Example 28 (Joint probabilities and marginalization)</w:t>
       </w:r>
       <w:r>
         <w:t xml:space="preserve"> </w:t>
@@ -36091,7 +36587,7 @@
       <w:tr>
         <w:tc>
           <w:tcPr/>
-          <w:bookmarkStart w:id="95" w:name="tbl-meteorite"/>
+          <w:bookmarkStart w:id="97" w:name="tbl-meteorite"/>
           <w:p>
             <w:pPr>
               <w:jc w:val="center"/>
@@ -36515,7 +37011,7 @@
               </w:tc>
             </w:tr>
           </w:tbl>
-          <w:bookmarkEnd w:id="95"/>
+          <w:bookmarkEnd w:id="97"/>
           <w:p/>
         </w:tc>
       </w:tr>
@@ -37041,9 +37537,9 @@
         <w:t xml:space="preserve">), so having one is very weak evidence that an astronomical rarity occurred.</w:t>
       </w:r>
     </w:p>
-    <w:bookmarkEnd w:id="96"/>
-    <w:bookmarkEnd w:id="97"/>
-    <w:bookmarkStart w:id="106" w:name="sec-continuous-distributions"/>
+    <w:bookmarkEnd w:id="98"/>
+    <w:bookmarkEnd w:id="99"/>
+    <w:bookmarkStart w:id="108" w:name="sec-continuous-distributions"/>
     <w:p>
       <w:pPr>
         <w:pStyle w:val="Heading3"/>
@@ -37468,7 +37964,7 @@
         </m:oMath>
       </m:oMathPara>
     </w:p>
-    <w:bookmarkStart w:id="98" w:name="thm-zero-point-prob"/>
+    <w:bookmarkStart w:id="100" w:name="thm-zero-point-prob"/>
     <w:p>
       <w:pPr>
         <w:pStyle w:val="FirstParagraph"/>
@@ -37562,7 +38058,7 @@
         </m:oMath>
       </m:oMathPara>
     </w:p>
-    <w:bookmarkEnd w:id="98"/>
+    <w:bookmarkEnd w:id="100"/>
     <w:p>
       <w:pPr>
         <w:pStyle w:val="FirstParagraph"/>
@@ -38205,18 +38701,18 @@
                 <wp:inline>
                   <wp:extent cx="152400" cy="152400"/>
                   <wp:effectExtent b="0" l="0" r="0" t="0"/>
-                  <wp:docPr descr="" title="" id="100" name="Picture"/>
+                  <wp:docPr descr="" title="" id="102" name="Picture"/>
                   <a:graphic>
                     <a:graphicData uri="http://schemas.openxmlformats.org/drawingml/2006/picture">
                       <pic:pic>
                         <pic:nvPicPr>
-                          <pic:cNvPr descr="/opt/quarto/share/formats/docx/tip.png" id="101" name="Picture"/>
+                          <pic:cNvPr descr="/opt/quarto/share/formats/docx/tip.png" id="103" name="Picture"/>
                           <pic:cNvPicPr>
                             <a:picLocks noChangeArrowheads="1" noChangeAspect="1"/>
                           </pic:cNvPicPr>
                         </pic:nvPicPr>
                         <pic:blipFill>
-                          <a:blip r:embed="rId99"/>
+                          <a:blip r:embed="rId101"/>
                           <a:stretch>
                             <a:fillRect/>
                           </a:stretch>
@@ -38278,7 +38774,7 @@
             <w:r>
               <w:t xml:space="preserve"> </w:t>
             </w:r>
-            <w:hyperlink r:id="rId102">
+            <w:hyperlink r:id="rId104">
               <w:r>
                 <w:rPr>
                   <w:rStyle w:val="Hyperlink"/>
@@ -38316,7 +38812,7 @@
             <w:r>
               <w:t xml:space="preserve"> </w:t>
             </w:r>
-            <w:hyperlink r:id="rId103">
+            <w:hyperlink r:id="rId105">
               <w:r>
                 <w:rPr>
                   <w:rStyle w:val="Hyperlink"/>
@@ -38342,7 +38838,7 @@
       <w:r>
         <w:t xml:space="preserve"> </w:t>
       </w:r>
-      <w:hyperlink r:id="rId104">
+      <w:hyperlink r:id="rId106">
         <w:r>
           <w:rPr>
             <w:rStyle w:val="Hyperlink"/>
@@ -38359,7 +38855,7 @@
       <w:r>
         <w:t xml:space="preserve"> </w:t>
       </w:r>
-      <w:hyperlink r:id="rId105">
+      <w:hyperlink r:id="rId107">
         <w:r>
           <w:rPr>
             <w:rStyle w:val="Hyperlink"/>
@@ -38389,9 +38885,9 @@
         <w:t xml:space="preserve">.</w:t>
       </w:r>
     </w:p>
-    <w:bookmarkEnd w:id="106"/>
-    <w:bookmarkEnd w:id="107"/>
-    <w:bookmarkStart w:id="127" w:name="sec-prob-haz"/>
+    <w:bookmarkEnd w:id="108"/>
+    <w:bookmarkEnd w:id="109"/>
+    <w:bookmarkStart w:id="129" w:name="sec-prob-haz"/>
     <w:p>
       <w:pPr>
         <w:pStyle w:val="Heading2"/>
@@ -38400,7 +38896,7 @@
         <w:t xml:space="preserve">3 Survival, hazard, and cumulative hazard functions</w:t>
       </w:r>
     </w:p>
-    <w:bookmarkStart w:id="108" w:name="def-surv-fn"/>
+    <w:bookmarkStart w:id="110" w:name="def-surv-fn"/>
     <w:p>
       <w:pPr>
         <w:pStyle w:val="FirstParagraph"/>
@@ -38410,7 +38906,7 @@
           <w:b/>
           <w:bCs/>
         </w:rPr>
-        <w:t xml:space="preserve">Definition 21 (Survival function (survivor function))</w:t>
+        <w:t xml:space="preserve">Definition 22 (Survival function (survivor function))</w:t>
       </w:r>
       <w:r>
         <w:t xml:space="preserve"> </w:t>
@@ -38619,7 +39115,7 @@
         </m:oMath>
       </m:oMathPara>
     </w:p>
-    <w:bookmarkEnd w:id="108"/>
+    <w:bookmarkEnd w:id="110"/>
     <w:p>
       <w:pPr>
         <w:pStyle w:val="FirstParagraph"/>
@@ -38713,7 +39209,7 @@
         <w:t xml:space="preserve">The definition itself applies to any random variable.</w:t>
       </w:r>
     </w:p>
-    <w:bookmarkStart w:id="109" w:name="thm-survival-expressions-1"/>
+    <w:bookmarkStart w:id="111" w:name="thm-survival-expressions-1"/>
     <w:p>
       <w:pPr>
         <w:pStyle w:val="BodyText"/>
@@ -39006,7 +39502,7 @@
         </m:oMath>
       </m:oMathPara>
     </w:p>
-    <w:bookmarkEnd w:id="109"/>
+    <w:bookmarkEnd w:id="111"/>
     <w:p>
       <w:pPr>
         <w:pStyle w:val="FirstParagraph"/>
@@ -39729,7 +40225,7 @@
         </m:oMath>
       </m:oMathPara>
     </w:p>
-    <w:bookmarkStart w:id="110" w:name="exm-exp-survfn"/>
+    <w:bookmarkStart w:id="112" w:name="exm-exp-survfn"/>
     <w:p>
       <w:pPr>
         <w:pStyle w:val="FirstParagraph"/>
@@ -39739,7 +40235,7 @@
           <w:b/>
           <w:bCs/>
         </w:rPr>
-        <w:t xml:space="preserve">Example 28 (Survival function of an exponential distribution)</w:t>
+        <w:t xml:space="preserve">Example 29 (Survival function of an exponential distribution)</w:t>
       </w:r>
       <w:r>
         <w:t xml:space="preserve"> </w:t>
@@ -39789,7 +40285,7 @@
           <w:rPr>
             <w:rStyle w:val="Hyperlink"/>
           </w:rPr>
-          <w:t xml:space="preserve">Definition 12</w:t>
+          <w:t xml:space="preserve">Definition 13</w:t>
         </w:r>
       </w:hyperlink>
       <w:r>
@@ -40635,8 +41131,8 @@
         <w:t xml:space="preserve">.</w:t>
       </w:r>
     </w:p>
-    <w:bookmarkEnd w:id="110"/>
-    <w:bookmarkStart w:id="112" w:name="def-hazard"/>
+    <w:bookmarkEnd w:id="112"/>
+    <w:bookmarkStart w:id="114" w:name="def-hazard"/>
     <w:p>
       <w:pPr>
         <w:pStyle w:val="BodyText"/>
@@ -40646,7 +41142,7 @@
           <w:b/>
           <w:bCs/>
         </w:rPr>
-        <w:t xml:space="preserve">Definition 22 (Hazard function (hazard rate, hazard rate function))</w:t>
+        <w:t xml:space="preserve">Definition 23 (Hazard function (hazard rate, hazard rate function))</w:t>
       </w:r>
       <w:r>
         <w:t xml:space="preserve"> </w:t>
@@ -40853,7 +41349,7 @@
       <w:r>
         <w:t xml:space="preserve"> </w:t>
       </w:r>
-      <w:hyperlink r:id="rId111">
+      <w:hyperlink r:id="rId113">
         <w:r>
           <w:rPr>
             <w:rStyle w:val="Hyperlink"/>
@@ -41094,7 +41590,7 @@
         </m:oMath>
       </m:oMathPara>
     </w:p>
-    <w:bookmarkEnd w:id="112"/>
+    <w:bookmarkEnd w:id="114"/>
     <w:p>
       <w:pPr>
         <w:pStyle w:val="FirstParagraph"/>
@@ -41581,7 +42077,7 @@
           <w:rPr>
             <w:rStyle w:val="Hyperlink"/>
           </w:rPr>
-          <w:t xml:space="preserve">Definition 22</w:t>
+          <w:t xml:space="preserve">Definition 23</w:t>
         </w:r>
       </w:hyperlink>
       <w:r>
@@ -41764,7 +42260,7 @@
         <w:t xml:space="preserve">The math is identical; only the name changes with the valence of the event.</w:t>
       </w:r>
     </w:p>
-    <w:bookmarkStart w:id="114" w:name="exm-hazard-exceeds-one"/>
+    <w:bookmarkStart w:id="116" w:name="exm-hazard-exceeds-one"/>
     <w:p>
       <w:pPr>
         <w:pStyle w:val="BodyText"/>
@@ -41774,7 +42270,7 @@
           <w:b/>
           <w:bCs/>
         </w:rPr>
-        <w:t xml:space="preserve">Example 29 (A hazard greater than 1)</w:t>
+        <w:t xml:space="preserve">Example 30 (A hazard greater than 1)</w:t>
       </w:r>
       <w:r>
         <w:t xml:space="preserve"> </w:t>
@@ -41787,7 +42283,7 @@
           <w:rPr>
             <w:rStyle w:val="Hyperlink"/>
           </w:rPr>
-          <w:t xml:space="preserve">Example 9</w:t>
+          <w:t xml:space="preserve">Example 10</w:t>
         </w:r>
       </w:hyperlink>
       <w:r>
@@ -41947,7 +42443,7 @@
           <w:rPr>
             <w:rStyle w:val="Hyperlink"/>
           </w:rPr>
-          <w:t xml:space="preserve">Example 28</w:t>
+          <w:t xml:space="preserve">Example 29</w:t>
         </w:r>
       </w:hyperlink>
       <w:r>
@@ -43272,7 +43768,7 @@
       <w:r>
         <w:t xml:space="preserve"> </w:t>
       </w:r>
-      <w:hyperlink r:id="rId113">
+      <w:hyperlink r:id="rId115">
         <w:r>
           <w:rPr>
             <w:rStyle w:val="Hyperlink"/>
@@ -43876,8 +44372,8 @@
         <w:t xml:space="preserve">a hazard is a rate, not a probability.</w:t>
       </w:r>
     </w:p>
-    <w:bookmarkEnd w:id="114"/>
-    <w:bookmarkStart w:id="115" w:name="def-discrete-hazard"/>
+    <w:bookmarkEnd w:id="116"/>
+    <w:bookmarkStart w:id="117" w:name="def-discrete-hazard"/>
     <w:p>
       <w:pPr>
         <w:pStyle w:val="BodyText"/>
@@ -43887,7 +44383,7 @@
           <w:b/>
           <w:bCs/>
         </w:rPr>
-        <w:t xml:space="preserve">Definition 23 (Discrete-time hazard)</w:t>
+        <w:t xml:space="preserve">Definition 24 (Discrete-time hazard)</w:t>
       </w:r>
       <w:r>
         <w:t xml:space="preserve"> </w:t>
@@ -44009,7 +44505,7 @@
       <w:r>
         <w:t xml:space="preserve"> </w:t>
       </w:r>
-      <w:hyperlink r:id="rId111">
+      <w:hyperlink r:id="rId113">
         <w:r>
           <w:rPr>
             <w:rStyle w:val="Hyperlink"/>
@@ -44129,8 +44625,8 @@
         </m:oMath>
       </m:oMathPara>
     </w:p>
-    <w:bookmarkEnd w:id="115"/>
-    <w:bookmarkStart w:id="116" w:name="exm-discrete-hazard"/>
+    <w:bookmarkEnd w:id="117"/>
+    <w:bookmarkStart w:id="118" w:name="exm-discrete-hazard"/>
     <w:p>
       <w:pPr>
         <w:pStyle w:val="FirstParagraph"/>
@@ -44140,7 +44636,7 @@
           <w:b/>
           <w:bCs/>
         </w:rPr>
-        <w:t xml:space="preserve">Example 30 (Rolling until the first six)</w:t>
+        <w:t xml:space="preserve">Example 31 (Rolling until the first six)</w:t>
       </w:r>
       <w:r>
         <w:t xml:space="preserve"> </w:t>
@@ -44874,8 +45370,8 @@
         <w:t xml:space="preserve">having gone without a six so far does not change the chance of a six on the next roll.</w:t>
       </w:r>
     </w:p>
-    <w:bookmarkEnd w:id="116"/>
-    <w:bookmarkStart w:id="117" w:name="cor-discrete-hazard-unit-interval"/>
+    <w:bookmarkEnd w:id="118"/>
+    <w:bookmarkStart w:id="119" w:name="cor-discrete-hazard-unit-interval"/>
     <w:p>
       <w:pPr>
         <w:pStyle w:val="BodyText"/>
@@ -45107,7 +45603,7 @@
         </m:oMath>
       </m:oMathPara>
     </w:p>
-    <w:bookmarkEnd w:id="117"/>
+    <w:bookmarkEnd w:id="119"/>
     <w:p>
       <w:pPr>
         <w:pStyle w:val="FirstParagraph"/>
@@ -45820,7 +46316,7 @@
           <w:rPr>
             <w:rStyle w:val="Hyperlink"/>
           </w:rPr>
-          <w:t xml:space="preserve">Example 29</w:t>
+          <w:t xml:space="preserve">Example 30</w:t>
         </w:r>
       </w:hyperlink>
       <w:r>
@@ -45833,7 +46329,7 @@
         <w:t xml:space="preserve">the discrete-time hazard is a probability.</w:t>
       </w:r>
     </w:p>
-    <w:bookmarkStart w:id="118" w:name="thm-hazard-dens-surv"/>
+    <w:bookmarkStart w:id="120" w:name="thm-hazard-dens-surv"/>
     <w:p>
       <w:pPr>
         <w:pStyle w:val="BodyText"/>
@@ -46105,7 +46601,7 @@
         </m:oMath>
       </m:oMathPara>
     </w:p>
-    <w:bookmarkEnd w:id="118"/>
+    <w:bookmarkEnd w:id="120"/>
     <w:p>
       <w:pPr>
         <w:pStyle w:val="FirstParagraph"/>
@@ -46308,7 +46804,7 @@
       <w:r>
         <w:t xml:space="preserve"> </w:t>
       </w:r>
-      <w:hyperlink r:id="rId113">
+      <w:hyperlink r:id="rId115">
         <w:r>
           <w:rPr>
             <w:rStyle w:val="Hyperlink"/>
@@ -47668,7 +48164,7 @@
         </m:oMath>
       </m:oMathPara>
     </w:p>
-    <w:bookmarkStart w:id="119" w:name="exm-exp-haz"/>
+    <w:bookmarkStart w:id="121" w:name="exm-exp-haz"/>
     <w:p>
       <w:pPr>
         <w:pStyle w:val="FirstParagraph"/>
@@ -47678,7 +48174,7 @@
           <w:b/>
           <w:bCs/>
         </w:rPr>
-        <w:t xml:space="preserve">Example 31 (Hazard function of an exponential distribution)</w:t>
+        <w:t xml:space="preserve">Example 32 (Hazard function of an exponential distribution)</w:t>
       </w:r>
       <w:r>
         <w:t xml:space="preserve"> </w:t>
@@ -47694,7 +48190,7 @@
           <w:rPr>
             <w:rStyle w:val="Hyperlink"/>
           </w:rPr>
-          <w:t xml:space="preserve">Example 28</w:t>
+          <w:t xml:space="preserve">Example 29</w:t>
         </w:r>
       </w:hyperlink>
       <w:r>
@@ -48064,7 +48560,7 @@
           <w:rPr>
             <w:rStyle w:val="Hyperlink"/>
           </w:rPr>
-          <w:t xml:space="preserve">Definition 22</w:t>
+          <w:t xml:space="preserve">Definition 23</w:t>
         </w:r>
       </w:hyperlink>
       <w:r>
@@ -48388,8 +48884,8 @@
         <w:t xml:space="preserve">.</w:t>
       </w:r>
     </w:p>
-    <w:bookmarkEnd w:id="119"/>
-    <w:bookmarkStart w:id="120" w:name="def-cuhaz"/>
+    <w:bookmarkEnd w:id="121"/>
+    <w:bookmarkStart w:id="122" w:name="def-cuhaz"/>
     <w:p>
       <w:pPr>
         <w:pStyle w:val="BodyText"/>
@@ -48399,7 +48895,7 @@
           <w:b/>
           <w:bCs/>
         </w:rPr>
-        <w:t xml:space="preserve">Definition 24 (Cumulative hazard function)</w:t>
+        <w:t xml:space="preserve">Definition 25 (Cumulative hazard function)</w:t>
       </w:r>
       <w:r>
         <w:t xml:space="preserve"> </w:t>
@@ -48653,8 +49149,8 @@
         </m:oMath>
       </m:oMathPara>
     </w:p>
-    <w:bookmarkEnd w:id="120"/>
-    <w:bookmarkStart w:id="121" w:name="exm-exp-cumhaz"/>
+    <w:bookmarkEnd w:id="122"/>
+    <w:bookmarkStart w:id="123" w:name="exm-exp-cumhaz"/>
     <w:p>
       <w:pPr>
         <w:pStyle w:val="FirstParagraph"/>
@@ -48664,7 +49160,7 @@
           <w:b/>
           <w:bCs/>
         </w:rPr>
-        <w:t xml:space="preserve">Example 32 (Cumulative hazard function of an exponential distribution)</w:t>
+        <w:t xml:space="preserve">Example 33 (Cumulative hazard function of an exponential distribution)</w:t>
       </w:r>
       <w:r>
         <w:t xml:space="preserve"> </w:t>
@@ -48680,7 +49176,7 @@
           <w:rPr>
             <w:rStyle w:val="Hyperlink"/>
           </w:rPr>
-          <w:t xml:space="preserve">Example 31</w:t>
+          <w:t xml:space="preserve">Example 32</w:t>
         </w:r>
       </w:hyperlink>
       <w:r>
@@ -49118,8 +49614,8 @@
         <w:t xml:space="preserve">.</w:t>
       </w:r>
     </w:p>
-    <w:bookmarkEnd w:id="121"/>
-    <w:bookmarkStart w:id="122" w:name="cor-cuhaz-nonneg"/>
+    <w:bookmarkEnd w:id="123"/>
+    <w:bookmarkStart w:id="124" w:name="cor-cuhaz-nonneg"/>
     <w:p>
       <w:pPr>
         <w:pStyle w:val="BodyText"/>
@@ -49357,7 +49853,7 @@
         </m:oMath>
       </m:oMathPara>
     </w:p>
-    <w:bookmarkEnd w:id="122"/>
+    <w:bookmarkEnd w:id="124"/>
     <w:p>
       <w:pPr>
         <w:pStyle w:val="FirstParagraph"/>
@@ -51030,7 +51526,7 @@
         <w:t xml:space="preserve">is the form most survival-analysis texts use.</w:t>
       </w:r>
     </w:p>
-    <w:bookmarkStart w:id="124" w:name="cor-surv-int-haz"/>
+    <w:bookmarkStart w:id="126" w:name="cor-surv-int-haz"/>
     <w:p>
       <w:pPr>
         <w:pStyle w:val="BodyText"/>
@@ -51241,7 +51737,7 @@
       <w:pPr>
         <w:pStyle w:val="BodyText"/>
       </w:pPr>
-      <w:bookmarkStart w:id="123" w:name="eq-surv-int-haz"/>
+      <w:bookmarkStart w:id="125" w:name="eq-surv-int-haz"/>
       <m:oMathPara>
         <m:oMathParaPr>
           <m:jc m:val="center"/>
@@ -51343,9 +51839,9 @@
           </m:r>
         </m:oMath>
       </m:oMathPara>
-      <w:bookmarkEnd w:id="123"/>
+      <w:bookmarkEnd w:id="125"/>
     </w:p>
-    <w:bookmarkEnd w:id="124"/>
+    <w:bookmarkEnd w:id="126"/>
     <w:p>
       <w:pPr>
         <w:pStyle w:val="FirstParagraph"/>
@@ -52921,7 +53417,7 @@
         <w:t xml:space="preserve">.</w:t>
       </w:r>
     </w:p>
-    <w:bookmarkStart w:id="125" w:name="exm-exp-surv-int-haz"/>
+    <w:bookmarkStart w:id="127" w:name="exm-exp-surv-int-haz"/>
     <w:p>
       <w:pPr>
         <w:pStyle w:val="BodyText"/>
@@ -52931,7 +53427,7 @@
           <w:b/>
           <w:bCs/>
         </w:rPr>
-        <w:t xml:space="preserve">Example 33 (Recovering the exponential survival function from its cumulative hazard)</w:t>
+        <w:t xml:space="preserve">Example 34 (Recovering the exponential survival function from its cumulative hazard)</w:t>
       </w:r>
       <w:r>
         <w:t xml:space="preserve"> </w:t>
@@ -52947,7 +53443,7 @@
           <w:rPr>
             <w:rStyle w:val="Hyperlink"/>
           </w:rPr>
-          <w:t xml:space="preserve">Example 32</w:t>
+          <w:t xml:space="preserve">Example 33</w:t>
         </w:r>
       </w:hyperlink>
       <w:r>
@@ -53201,14 +53697,14 @@
           <w:rPr>
             <w:rStyle w:val="Hyperlink"/>
           </w:rPr>
-          <w:t xml:space="preserve">Example 28</w:t>
+          <w:t xml:space="preserve">Example 29</w:t>
         </w:r>
       </w:hyperlink>
       <w:r>
         <w:t xml:space="preserve">.</w:t>
       </w:r>
     </w:p>
-    <w:bookmarkEnd w:id="125"/>
+    <w:bookmarkEnd w:id="127"/>
     <w:tbl>
       <w:tblPr>
         <w:tblStyle w:val="Table"/>
@@ -53222,7 +53718,7 @@
       <w:tr>
         <w:tc>
           <w:tcPr/>
-          <w:bookmarkStart w:id="126" w:name="tbl-prob-dist-fns"/>
+          <w:bookmarkStart w:id="128" w:name="tbl-prob-dist-fns"/>
           <w:p>
             <w:pPr>
               <w:jc w:val="center"/>
@@ -54193,7 +54689,7 @@
               </w:tc>
             </w:tr>
           </w:tbl>
-          <w:bookmarkEnd w:id="126"/>
+          <w:bookmarkEnd w:id="128"/>
           <w:p/>
         </w:tc>
       </w:tr>
@@ -55159,8 +55655,8 @@
         </m:oMath>
       </m:oMathPara>
     </w:p>
-    <w:bookmarkEnd w:id="127"/>
-    <w:bookmarkStart w:id="173" w:name="references"/>
+    <w:bookmarkEnd w:id="129"/>
+    <w:bookmarkStart w:id="175" w:name="references"/>
     <w:p>
       <w:pPr>
         <w:pStyle w:val="Heading2"/>
@@ -55169,8 +55665,8 @@
         <w:t xml:space="preserve">References</w:t>
       </w:r>
     </w:p>
-    <w:bookmarkStart w:id="172" w:name="refs"/>
-    <w:bookmarkStart w:id="129" w:name="ref-wikipedia_random_variable"/>
+    <w:bookmarkStart w:id="174" w:name="refs"/>
+    <w:bookmarkStart w:id="131" w:name="ref-wikipedia_random_variable"/>
     <w:p>
       <w:pPr>
         <w:pStyle w:val="Bibliography"/>
@@ -55217,7 +55713,7 @@
       <w:r>
         <w:t xml:space="preserve"> </w:t>
       </w:r>
-      <w:hyperlink r:id="rId128">
+      <w:hyperlink r:id="rId130">
         <w:r>
           <w:rPr>
             <w:rStyle w:val="Hyperlink"/>
@@ -55226,8 +55722,8 @@
         </w:r>
       </w:hyperlink>
     </w:p>
-    <w:bookmarkEnd w:id="129"/>
-    <w:bookmarkStart w:id="131" w:name="ref-wikipedia_probability_mass_function"/>
+    <w:bookmarkEnd w:id="131"/>
+    <w:bookmarkStart w:id="133" w:name="ref-wikipedia_probability_mass_function"/>
     <w:p>
       <w:pPr>
         <w:pStyle w:val="Bibliography"/>
@@ -55274,7 +55770,7 @@
       <w:r>
         <w:t xml:space="preserve"> </w:t>
       </w:r>
-      <w:hyperlink r:id="rId130">
+      <w:hyperlink r:id="rId132">
         <w:r>
           <w:rPr>
             <w:rStyle w:val="Hyperlink"/>
@@ -55283,8 +55779,8 @@
         </w:r>
       </w:hyperlink>
     </w:p>
-    <w:bookmarkEnd w:id="131"/>
-    <w:bookmarkStart w:id="133" w:name="ref-wikipedia_bernoulli_distribution"/>
+    <w:bookmarkEnd w:id="133"/>
+    <w:bookmarkStart w:id="135" w:name="ref-wikipedia_bernoulli_distribution"/>
     <w:p>
       <w:pPr>
         <w:pStyle w:val="Bibliography"/>
@@ -55331,7 +55827,7 @@
       <w:r>
         <w:t xml:space="preserve"> </w:t>
       </w:r>
-      <w:hyperlink r:id="rId132">
+      <w:hyperlink r:id="rId134">
         <w:r>
           <w:rPr>
             <w:rStyle w:val="Hyperlink"/>
@@ -55340,8 +55836,8 @@
         </w:r>
       </w:hyperlink>
     </w:p>
-    <w:bookmarkEnd w:id="133"/>
-    <w:bookmarkStart w:id="135" w:name="X284569a1076713b35b76605781ea41e303e6132"/>
+    <w:bookmarkEnd w:id="135"/>
+    <w:bookmarkStart w:id="137" w:name="X284569a1076713b35b76605781ea41e303e6132"/>
     <w:p>
       <w:pPr>
         <w:pStyle w:val="Bibliography"/>
@@ -55388,7 +55884,7 @@
       <w:r>
         <w:t xml:space="preserve"> </w:t>
       </w:r>
-      <w:hyperlink r:id="rId134">
+      <w:hyperlink r:id="rId136">
         <w:r>
           <w:rPr>
             <w:rStyle w:val="Hyperlink"/>
@@ -55397,8 +55893,8 @@
         </w:r>
       </w:hyperlink>
     </w:p>
-    <w:bookmarkEnd w:id="135"/>
-    <w:bookmarkStart w:id="137" w:name="X8e40b323e1cebef129773974979d417183cf94f"/>
+    <w:bookmarkEnd w:id="137"/>
+    <w:bookmarkStart w:id="139" w:name="X8e40b323e1cebef129773974979d417183cf94f"/>
     <w:p>
       <w:pPr>
         <w:pStyle w:val="Bibliography"/>
@@ -55445,7 +55941,7 @@
       <w:r>
         <w:t xml:space="preserve"> </w:t>
       </w:r>
-      <w:hyperlink r:id="rId136">
+      <w:hyperlink r:id="rId138">
         <w:r>
           <w:rPr>
             <w:rStyle w:val="Hyperlink"/>
@@ -55454,8 +55950,8 @@
         </w:r>
       </w:hyperlink>
     </w:p>
-    <w:bookmarkEnd w:id="137"/>
-    <w:bookmarkStart w:id="139" w:name="ref-wikipedia_normal_distribution"/>
+    <w:bookmarkEnd w:id="139"/>
+    <w:bookmarkStart w:id="141" w:name="ref-wikipedia_normal_distribution"/>
     <w:p>
       <w:pPr>
         <w:pStyle w:val="Bibliography"/>
@@ -55502,7 +55998,7 @@
       <w:r>
         <w:t xml:space="preserve"> </w:t>
       </w:r>
-      <w:hyperlink r:id="rId138">
+      <w:hyperlink r:id="rId140">
         <w:r>
           <w:rPr>
             <w:rStyle w:val="Hyperlink"/>
@@ -55511,8 +56007,8 @@
         </w:r>
       </w:hyperlink>
     </w:p>
-    <w:bookmarkEnd w:id="139"/>
-    <w:bookmarkStart w:id="141" w:name="ref-CaseBerg01"/>
+    <w:bookmarkEnd w:id="141"/>
+    <w:bookmarkStart w:id="143" w:name="ref-CaseBerg01"/>
     <w:p>
       <w:pPr>
         <w:pStyle w:val="Bibliography"/>
@@ -55545,7 +56041,7 @@
       <w:r>
         <w:t xml:space="preserve"> </w:t>
       </w:r>
-      <w:hyperlink r:id="rId140">
+      <w:hyperlink r:id="rId142">
         <w:r>
           <w:rPr>
             <w:rStyle w:val="Hyperlink"/>
@@ -55554,8 +56050,8 @@
         </w:r>
       </w:hyperlink>
     </w:p>
-    <w:bookmarkEnd w:id="141"/>
-    <w:bookmarkStart w:id="143" w:name="ref-wikipedia_exponential_distribution"/>
+    <w:bookmarkEnd w:id="143"/>
+    <w:bookmarkStart w:id="145" w:name="ref-wikipedia_exponential_distribution"/>
     <w:p>
       <w:pPr>
         <w:pStyle w:val="Bibliography"/>
@@ -55602,7 +56098,7 @@
       <w:r>
         <w:t xml:space="preserve"> </w:t>
       </w:r>
-      <w:hyperlink r:id="rId142">
+      <w:hyperlink r:id="rId144">
         <w:r>
           <w:rPr>
             <w:rStyle w:val="Hyperlink"/>
@@ -55611,8 +56107,8 @@
         </w:r>
       </w:hyperlink>
     </w:p>
-    <w:bookmarkEnd w:id="143"/>
-    <w:bookmarkStart w:id="145" w:name="X94f7c881ef14f58a67183d1131099bc3b3af124"/>
+    <w:bookmarkEnd w:id="145"/>
+    <w:bookmarkStart w:id="147" w:name="X94f7c881ef14f58a67183d1131099bc3b3af124"/>
     <w:p>
       <w:pPr>
         <w:pStyle w:val="Bibliography"/>
@@ -55659,7 +56155,7 @@
       <w:r>
         <w:t xml:space="preserve"> </w:t>
       </w:r>
-      <w:hyperlink r:id="rId144">
+      <w:hyperlink r:id="rId146">
         <w:r>
           <w:rPr>
             <w:rStyle w:val="Hyperlink"/>
@@ -55668,8 +56164,8 @@
         </w:r>
       </w:hyperlink>
     </w:p>
-    <w:bookmarkEnd w:id="145"/>
-    <w:bookmarkStart w:id="146" w:name="ref-billingsley1995probability"/>
+    <w:bookmarkEnd w:id="147"/>
+    <w:bookmarkStart w:id="148" w:name="ref-billingsley1995probability"/>
     <w:p>
       <w:pPr>
         <w:pStyle w:val="Bibliography"/>
@@ -55700,8 +56196,8 @@
         <w:t xml:space="preserve">, 3rd ed. in Wiley series in probability and mathematical statistics. New York: Wiley, 1995.</w:t>
       </w:r>
     </w:p>
-    <w:bookmarkEnd w:id="146"/>
-    <w:bookmarkStart w:id="148" w:name="ref-wikipedia_quantile_function"/>
+    <w:bookmarkEnd w:id="148"/>
+    <w:bookmarkStart w:id="150" w:name="ref-wikipedia_quantile_function"/>
     <w:p>
       <w:pPr>
         <w:pStyle w:val="Bibliography"/>
@@ -55748,7 +56244,7 @@
       <w:r>
         <w:t xml:space="preserve"> </w:t>
       </w:r>
-      <w:hyperlink r:id="rId147">
+      <w:hyperlink r:id="rId149">
         <w:r>
           <w:rPr>
             <w:rStyle w:val="Hyperlink"/>
@@ -55757,8 +56253,8 @@
         </w:r>
       </w:hyperlink>
     </w:p>
-    <w:bookmarkEnd w:id="148"/>
-    <w:bookmarkStart w:id="149" w:name="ref-me4"/>
+    <w:bookmarkEnd w:id="150"/>
+    <w:bookmarkStart w:id="151" w:name="ref-me4"/>
     <w:p>
       <w:pPr>
         <w:pStyle w:val="Bibliography"/>
@@ -55789,8 +56285,8 @@
         <w:t xml:space="preserve">, Fourth edition. Philadelphia: Wolters Kluwer, 2021.</w:t>
       </w:r>
     </w:p>
-    <w:bookmarkEnd w:id="149"/>
-    <w:bookmarkStart w:id="151" w:name="Xaf27294aed242081dab0bdcf1e3d8373c0fed17"/>
+    <w:bookmarkEnd w:id="151"/>
+    <w:bookmarkStart w:id="153" w:name="Xaf27294aed242081dab0bdcf1e3d8373c0fed17"/>
     <w:p>
       <w:pPr>
         <w:pStyle w:val="Bibliography"/>
@@ -55837,7 +56333,7 @@
       <w:r>
         <w:t xml:space="preserve"> </w:t>
       </w:r>
-      <w:hyperlink r:id="rId150">
+      <w:hyperlink r:id="rId152">
         <w:r>
           <w:rPr>
             <w:rStyle w:val="Hyperlink"/>
@@ -55846,8 +56342,8 @@
         </w:r>
       </w:hyperlink>
     </w:p>
-    <w:bookmarkEnd w:id="151"/>
-    <w:bookmarkStart w:id="153" w:name="ref-wikipedia_marginal_distribution"/>
+    <w:bookmarkEnd w:id="153"/>
+    <w:bookmarkStart w:id="155" w:name="ref-wikipedia_marginal_distribution"/>
     <w:p>
       <w:pPr>
         <w:pStyle w:val="Bibliography"/>
@@ -55894,7 +56390,7 @@
       <w:r>
         <w:t xml:space="preserve"> </w:t>
       </w:r>
-      <w:hyperlink r:id="rId152">
+      <w:hyperlink r:id="rId154">
         <w:r>
           <w:rPr>
             <w:rStyle w:val="Hyperlink"/>
@@ -55903,8 +56399,8 @@
         </w:r>
       </w:hyperlink>
     </w:p>
-    <w:bookmarkEnd w:id="153"/>
-    <w:bookmarkStart w:id="154" w:name="ref-hutchinson2024data471"/>
+    <w:bookmarkEnd w:id="155"/>
+    <w:bookmarkStart w:id="156" w:name="ref-hutchinson2024data471"/>
     <w:p>
       <w:pPr>
         <w:pStyle w:val="Bibliography"/>
@@ -55943,8 +56439,8 @@
         <w:t xml:space="preserve">Western Washington University, 2024.</w:t>
       </w:r>
     </w:p>
-    <w:bookmarkEnd w:id="154"/>
-    <w:bookmarkStart w:id="156" w:name="ref-hutchinson_wwu_ml_videos"/>
+    <w:bookmarkEnd w:id="156"/>
+    <w:bookmarkStart w:id="158" w:name="ref-hutchinson_wwu_ml_videos"/>
     <w:p>
       <w:pPr>
         <w:pStyle w:val="Bibliography"/>
@@ -55997,7 +56493,7 @@
       <w:r>
         <w:t xml:space="preserve"> </w:t>
       </w:r>
-      <w:hyperlink r:id="rId155">
+      <w:hyperlink r:id="rId157">
         <w:r>
           <w:rPr>
             <w:rStyle w:val="Hyperlink"/>
@@ -56006,8 +56502,8 @@
         </w:r>
       </w:hyperlink>
     </w:p>
-    <w:bookmarkEnd w:id="156"/>
-    <w:bookmarkStart w:id="158" w:name="ref-fiveminuteai_probstat"/>
+    <w:bookmarkEnd w:id="158"/>
+    <w:bookmarkStart w:id="160" w:name="ref-fiveminuteai_probstat"/>
     <w:p>
       <w:pPr>
         <w:pStyle w:val="Bibliography"/>
@@ -56039,7 +56535,7 @@
       <w:r>
         <w:t xml:space="preserve"> </w:t>
       </w:r>
-      <w:hyperlink r:id="rId157">
+      <w:hyperlink r:id="rId159">
         <w:r>
           <w:rPr>
             <w:rStyle w:val="Hyperlink"/>
@@ -56048,8 +56544,8 @@
         </w:r>
       </w:hyperlink>
     </w:p>
-    <w:bookmarkEnd w:id="158"/>
-    <w:bookmarkStart w:id="160" w:name="ref-wikipedia_survival_function"/>
+    <w:bookmarkEnd w:id="160"/>
+    <w:bookmarkStart w:id="162" w:name="ref-wikipedia_survival_function"/>
     <w:p>
       <w:pPr>
         <w:pStyle w:val="Bibliography"/>
@@ -56096,7 +56592,7 @@
       <w:r>
         <w:t xml:space="preserve"> </w:t>
       </w:r>
-      <w:hyperlink r:id="rId159">
+      <w:hyperlink r:id="rId161">
         <w:r>
           <w:rPr>
             <w:rStyle w:val="Hyperlink"/>
@@ -56105,8 +56601,8 @@
         </w:r>
       </w:hyperlink>
     </w:p>
-    <w:bookmarkEnd w:id="160"/>
-    <w:bookmarkStart w:id="162" w:name="ref-wikipedia_failure_rate"/>
+    <w:bookmarkEnd w:id="162"/>
+    <w:bookmarkStart w:id="164" w:name="ref-wikipedia_failure_rate"/>
     <w:p>
       <w:pPr>
         <w:pStyle w:val="Bibliography"/>
@@ -56153,7 +56649,7 @@
       <w:r>
         <w:t xml:space="preserve"> </w:t>
       </w:r>
-      <w:hyperlink r:id="rId161">
+      <w:hyperlink r:id="rId163">
         <w:r>
           <w:rPr>
             <w:rStyle w:val="Hyperlink"/>
@@ -56162,8 +56658,8 @@
         </w:r>
       </w:hyperlink>
     </w:p>
-    <w:bookmarkEnd w:id="162"/>
-    <w:bookmarkStart w:id="164" w:name="ref-dobson4e"/>
+    <w:bookmarkEnd w:id="164"/>
+    <w:bookmarkStart w:id="166" w:name="ref-dobson4e"/>
     <w:p>
       <w:pPr>
         <w:pStyle w:val="Bibliography"/>
@@ -56196,7 +56692,7 @@
       <w:r>
         <w:t xml:space="preserve"> </w:t>
       </w:r>
-      <w:hyperlink r:id="rId163">
+      <w:hyperlink r:id="rId165">
         <w:r>
           <w:rPr>
             <w:rStyle w:val="Hyperlink"/>
@@ -56208,8 +56704,8 @@
         <w:t xml:space="preserve">.</w:t>
       </w:r>
     </w:p>
-    <w:bookmarkEnd w:id="164"/>
-    <w:bookmarkStart w:id="166" w:name="ref-vittinghoff2e"/>
+    <w:bookmarkEnd w:id="166"/>
+    <w:bookmarkStart w:id="168" w:name="ref-vittinghoff2e"/>
     <w:p>
       <w:pPr>
         <w:pStyle w:val="Bibliography"/>
@@ -56242,7 +56738,7 @@
       <w:r>
         <w:t xml:space="preserve"> </w:t>
       </w:r>
-      <w:hyperlink r:id="rId165">
+      <w:hyperlink r:id="rId167">
         <w:r>
           <w:rPr>
             <w:rStyle w:val="Hyperlink"/>
@@ -56254,8 +56750,8 @@
         <w:t xml:space="preserve">.</w:t>
       </w:r>
     </w:p>
-    <w:bookmarkEnd w:id="166"/>
-    <w:bookmarkStart w:id="168" w:name="ref-klein2003survival"/>
+    <w:bookmarkEnd w:id="168"/>
+    <w:bookmarkStart w:id="170" w:name="ref-klein2003survival"/>
     <w:p>
       <w:pPr>
         <w:pStyle w:val="Bibliography"/>
@@ -56288,7 +56784,7 @@
       <w:r>
         <w:t xml:space="preserve"> </w:t>
       </w:r>
-      <w:hyperlink r:id="rId167">
+      <w:hyperlink r:id="rId169">
         <w:r>
           <w:rPr>
             <w:rStyle w:val="Hyperlink"/>
@@ -56297,8 +56793,8 @@
         </w:r>
       </w:hyperlink>
     </w:p>
-    <w:bookmarkEnd w:id="168"/>
-    <w:bookmarkStart w:id="170" w:name="ref-kleinbaum2012survival"/>
+    <w:bookmarkEnd w:id="170"/>
+    <w:bookmarkStart w:id="172" w:name="ref-kleinbaum2012survival"/>
     <w:p>
       <w:pPr>
         <w:pStyle w:val="Bibliography"/>
@@ -56331,7 +56827,7 @@
       <w:r>
         <w:t xml:space="preserve"> </w:t>
       </w:r>
-      <w:hyperlink r:id="rId169">
+      <w:hyperlink r:id="rId171">
         <w:r>
           <w:rPr>
             <w:rStyle w:val="Hyperlink"/>
@@ -56340,8 +56836,8 @@
         </w:r>
       </w:hyperlink>
     </w:p>
-    <w:bookmarkEnd w:id="170"/>
-    <w:bookmarkStart w:id="171" w:name="ref-kalbfleisch2011statistical"/>
+    <w:bookmarkEnd w:id="172"/>
+    <w:bookmarkStart w:id="173" w:name="ref-kalbfleisch2011statistical"/>
     <w:p>
       <w:pPr>
         <w:pStyle w:val="Bibliography"/>
@@ -56372,9 +56868,9 @@
         <w:t xml:space="preserve">. John Wiley &amp; Sons, 2011.</w:t>
       </w:r>
     </w:p>
-    <w:bookmarkEnd w:id="171"/>
-    <w:bookmarkEnd w:id="172"/>
     <w:bookmarkEnd w:id="173"/>
+    <w:bookmarkEnd w:id="174"/>
+    <w:bookmarkEnd w:id="175"/>
     <w:sectPr>
       <w:footnotePr>
         <w:numRestart w:val="eachSect"/>

</xml_diff>

<commit_message>
Deploying to gh-pages from @ Morrison-Lab/pds@b8a9f9e19e9ba9634c30b3ae18115468dd8f9c53 🚀
</commit_message>
<xml_diff>
--- a/random-variables.docx
+++ b/random-variables.docx
@@ -15,7 +15,7 @@
         <w:pStyle w:val="Date"/>
       </w:pPr>
       <w:r>
-        <w:t xml:space="preserve">Last modified: 2026-10-29 13:56:59 (PDT)</w:t>
+        <w:t xml:space="preserve">Last modified: 2026-10-29 14:22:58 (PDT)</w:t>
       </w:r>
     </w:p>
     <w:bookmarkStart w:id="26" w:name="sec-random-variables"/>
@@ -5197,7 +5197,7 @@
     </w:p>
     <w:bookmarkEnd w:id="25"/>
     <w:bookmarkEnd w:id="26"/>
-    <w:bookmarkStart w:id="109" w:name="X07e058d1329d8fa48179146f153d016c4f9ff9a"/>
+    <w:bookmarkStart w:id="115" w:name="X07e058d1329d8fa48179146f153d016c4f9ff9a"/>
     <w:p>
       <w:pPr>
         <w:pStyle w:val="Heading2"/>
@@ -37539,7 +37539,7 @@
     </w:p>
     <w:bookmarkEnd w:id="98"/>
     <w:bookmarkEnd w:id="99"/>
-    <w:bookmarkStart w:id="108" w:name="sec-continuous-distributions"/>
+    <w:bookmarkStart w:id="114" w:name="sec-continuous-distributions"/>
     <w:p>
       <w:pPr>
         <w:pStyle w:val="Heading3"/>
@@ -38660,6 +38660,2622 @@
         </m:oMath>
       </m:oMathPara>
     </w:p>
+    <w:bookmarkStart w:id="101" w:name="def-kernel"/>
+    <w:p>
+      <w:pPr>
+        <w:pStyle w:val="FirstParagraph"/>
+      </w:pPr>
+      <w:r>
+        <w:rPr>
+          <w:b/>
+          <w:bCs/>
+        </w:rPr>
+        <w:t xml:space="preserve">Definition 22 (Kernel of a density)</w:t>
+      </w:r>
+      <w:r>
+        <w:t xml:space="preserve"> </w:t>
+      </w:r>
+      <w:r>
+        <w:t xml:space="preserve">A</w:t>
+      </w:r>
+      <w:r>
+        <w:t xml:space="preserve"> </w:t>
+      </w:r>
+      <w:r>
+        <w:rPr>
+          <w:b/>
+          <w:bCs/>
+        </w:rPr>
+        <w:t xml:space="preserve">kernel</w:t>
+      </w:r>
+      <w:r>
+        <w:t xml:space="preserve"> </w:t>
+      </w:r>
+      <w:r>
+        <w:t xml:space="preserve">of a</w:t>
+      </w:r>
+      <w:r>
+        <w:t xml:space="preserve"> </w:t>
+      </w:r>
+      <w:hyperlink w:anchor="def-pdf">
+        <w:r>
+          <w:rPr>
+            <w:rStyle w:val="Hyperlink"/>
+          </w:rPr>
+          <w:t xml:space="preserve">density</w:t>
+        </w:r>
+      </w:hyperlink>
+      <w:r>
+        <w:t xml:space="preserve"> </w:t>
+      </w:r>
+      <m:oMath>
+        <m:r>
+          <m:t>f</m:t>
+        </m:r>
+      </m:oMath>
+      <w:r>
+        <w:t xml:space="preserve"> </w:t>
+      </w:r>
+      <w:r>
+        <w:t xml:space="preserve">is a</w:t>
+      </w:r>
+      <w:r>
+        <w:t xml:space="preserve"> </w:t>
+      </w:r>
+      <w:hyperlink r:id="rId9">
+        <w:r>
+          <w:rPr>
+            <w:rStyle w:val="Hyperlink"/>
+          </w:rPr>
+          <w:t xml:space="preserve">function</w:t>
+        </w:r>
+      </w:hyperlink>
+      <w:r>
+        <w:t xml:space="preserve"> </w:t>
+      </w:r>
+      <m:oMath>
+        <m:r>
+          <m:t>g</m:t>
+        </m:r>
+        <m:r>
+          <m:rPr>
+            <m:sty m:val="p"/>
+          </m:rPr>
+          <m:t>≥</m:t>
+        </m:r>
+        <m:r>
+          <m:t>0</m:t>
+        </m:r>
+      </m:oMath>
+      <w:r>
+        <w:t xml:space="preserve"> </w:t>
+      </w:r>
+      <w:r>
+        <w:t xml:space="preserve">such that</w:t>
+      </w:r>
+      <w:r>
+        <w:t xml:space="preserve"> </w:t>
+      </w:r>
+      <m:oMath>
+        <m:r>
+          <m:t>f</m:t>
+        </m:r>
+        <m:r>
+          <m:rPr>
+            <m:sty m:val="p"/>
+          </m:rPr>
+          <m:t>(</m:t>
+        </m:r>
+        <m:r>
+          <m:t>x</m:t>
+        </m:r>
+        <m:r>
+          <m:rPr>
+            <m:sty m:val="p"/>
+          </m:rPr>
+          <m:t>)</m:t>
+        </m:r>
+        <m:r>
+          <m:rPr>
+            <m:sty m:val="p"/>
+          </m:rPr>
+          <m:t>=</m:t>
+        </m:r>
+        <m:r>
+          <m:t>c</m:t>
+        </m:r>
+        <m:r>
+          <m:t> </m:t>
+        </m:r>
+        <m:r>
+          <m:t>g</m:t>
+        </m:r>
+        <m:r>
+          <m:rPr>
+            <m:sty m:val="p"/>
+          </m:rPr>
+          <m:t>(</m:t>
+        </m:r>
+        <m:r>
+          <m:t>x</m:t>
+        </m:r>
+        <m:r>
+          <m:rPr>
+            <m:sty m:val="p"/>
+          </m:rPr>
+          <m:t>)</m:t>
+        </m:r>
+      </m:oMath>
+      <w:r>
+        <w:t xml:space="preserve"> </w:t>
+      </w:r>
+      <w:r>
+        <w:t xml:space="preserve">for every</w:t>
+      </w:r>
+      <w:r>
+        <w:t xml:space="preserve"> </w:t>
+      </w:r>
+      <m:oMath>
+        <m:r>
+          <m:t>x</m:t>
+        </m:r>
+      </m:oMath>
+      <w:r>
+        <w:t xml:space="preserve">,</w:t>
+      </w:r>
+      <w:r>
+        <w:t xml:space="preserve"> </w:t>
+      </w:r>
+      <w:r>
+        <w:t xml:space="preserve">for some constant</w:t>
+      </w:r>
+      <w:r>
+        <w:t xml:space="preserve"> </w:t>
+      </w:r>
+      <m:oMath>
+        <m:r>
+          <m:t>c</m:t>
+        </m:r>
+        <m:r>
+          <m:rPr>
+            <m:sty m:val="p"/>
+          </m:rPr>
+          <m:t>&gt;</m:t>
+        </m:r>
+        <m:r>
+          <m:t>0</m:t>
+        </m:r>
+      </m:oMath>
+      <w:r>
+        <w:t xml:space="preserve"> </w:t>
+      </w:r>
+      <w:r>
+        <w:t xml:space="preserve">that does not depend on</w:t>
+      </w:r>
+      <w:r>
+        <w:t xml:space="preserve"> </w:t>
+      </w:r>
+      <m:oMath>
+        <m:r>
+          <m:t>x</m:t>
+        </m:r>
+      </m:oMath>
+      <w:r>
+        <w:t xml:space="preserve">.</w:t>
+      </w:r>
+    </w:p>
+    <w:bookmarkEnd w:id="101"/>
+    <w:bookmarkStart w:id="102" w:name="def-normalizing-constant"/>
+    <w:p>
+      <w:pPr>
+        <w:pStyle w:val="BodyText"/>
+      </w:pPr>
+      <w:r>
+        <w:rPr>
+          <w:b/>
+          <w:bCs/>
+        </w:rPr>
+        <w:t xml:space="preserve">Definition 23 (Normalizing constant of a density)</w:t>
+      </w:r>
+      <w:r>
+        <w:t xml:space="preserve"> </w:t>
+      </w:r>
+      <w:r>
+        <w:t xml:space="preserve">Let</w:t>
+      </w:r>
+      <w:r>
+        <w:t xml:space="preserve"> </w:t>
+      </w:r>
+      <m:oMath>
+        <m:r>
+          <m:t>g</m:t>
+        </m:r>
+      </m:oMath>
+      <w:r>
+        <w:t xml:space="preserve"> </w:t>
+      </w:r>
+      <w:r>
+        <w:t xml:space="preserve">be a</w:t>
+      </w:r>
+      <w:r>
+        <w:t xml:space="preserve"> </w:t>
+      </w:r>
+      <w:hyperlink w:anchor="def-kernel">
+        <w:r>
+          <w:rPr>
+            <w:rStyle w:val="Hyperlink"/>
+          </w:rPr>
+          <w:t xml:space="preserve">kernel of a density</w:t>
+        </w:r>
+      </w:hyperlink>
+      <w:r>
+        <w:t xml:space="preserve"> </w:t>
+      </w:r>
+      <m:oMath>
+        <m:r>
+          <m:t>f</m:t>
+        </m:r>
+      </m:oMath>
+      <w:r>
+        <w:t xml:space="preserve">.</w:t>
+      </w:r>
+      <w:r>
+        <w:t xml:space="preserve"> </w:t>
+      </w:r>
+      <w:r>
+        <w:t xml:space="preserve">The</w:t>
+      </w:r>
+      <w:r>
+        <w:t xml:space="preserve"> </w:t>
+      </w:r>
+      <w:r>
+        <w:rPr>
+          <w:b/>
+          <w:bCs/>
+        </w:rPr>
+        <w:t xml:space="preserve">normalizing constant</w:t>
+      </w:r>
+      <w:r>
+        <w:t xml:space="preserve"> </w:t>
+      </w:r>
+      <w:r>
+        <w:t xml:space="preserve">of</w:t>
+      </w:r>
+      <w:r>
+        <w:t xml:space="preserve"> </w:t>
+      </w:r>
+      <m:oMath>
+        <m:r>
+          <m:t>g</m:t>
+        </m:r>
+      </m:oMath>
+      <w:r>
+        <w:t xml:space="preserve"> </w:t>
+      </w:r>
+      <w:r>
+        <w:t xml:space="preserve">is the constant</w:t>
+      </w:r>
+      <w:r>
+        <w:t xml:space="preserve"> </w:t>
+      </w:r>
+      <m:oMath>
+        <m:r>
+          <m:t>c</m:t>
+        </m:r>
+        <m:r>
+          <m:rPr>
+            <m:sty m:val="p"/>
+          </m:rPr>
+          <m:t>&gt;</m:t>
+        </m:r>
+        <m:r>
+          <m:t>0</m:t>
+        </m:r>
+      </m:oMath>
+      <w:r>
+        <w:t xml:space="preserve"> </w:t>
+      </w:r>
+      <w:r>
+        <w:t xml:space="preserve">with</w:t>
+      </w:r>
+    </w:p>
+    <w:p>
+      <w:pPr>
+        <w:pStyle w:val="BodyText"/>
+      </w:pPr>
+      <m:oMathPara>
+        <m:oMathParaPr>
+          <m:jc m:val="center"/>
+        </m:oMathParaPr>
+        <m:oMath>
+          <m:r>
+            <m:t>f</m:t>
+          </m:r>
+          <m:r>
+            <m:rPr>
+              <m:sty m:val="p"/>
+            </m:rPr>
+            <m:t>(</m:t>
+          </m:r>
+          <m:r>
+            <m:t>x</m:t>
+          </m:r>
+          <m:r>
+            <m:rPr>
+              <m:sty m:val="p"/>
+            </m:rPr>
+            <m:t>)</m:t>
+          </m:r>
+          <m:r>
+            <m:rPr>
+              <m:sty m:val="p"/>
+            </m:rPr>
+            <m:t>=</m:t>
+          </m:r>
+          <m:r>
+            <m:t>c</m:t>
+          </m:r>
+          <m:r>
+            <m:t> </m:t>
+          </m:r>
+          <m:r>
+            <m:t>g</m:t>
+          </m:r>
+          <m:r>
+            <m:rPr>
+              <m:sty m:val="p"/>
+            </m:rPr>
+            <m:t>(</m:t>
+          </m:r>
+          <m:r>
+            <m:t>x</m:t>
+          </m:r>
+          <m:r>
+            <m:rPr>
+              <m:sty m:val="p"/>
+            </m:rPr>
+            <m:t>)</m:t>
+          </m:r>
+          <m:r>
+            <m:t> </m:t>
+          </m:r>
+          <m:r>
+            <m:rPr>
+              <m:nor/>
+              <m:sty m:val="p"/>
+            </m:rPr>
+            <m:t>for every </m:t>
+          </m:r>
+          <m:r>
+            <m:t>x</m:t>
+          </m:r>
+          <m:r>
+            <m:rPr>
+              <m:sty m:val="p"/>
+            </m:rPr>
+            <m:t>.</m:t>
+          </m:r>
+        </m:oMath>
+      </m:oMathPara>
+    </w:p>
+    <w:bookmarkEnd w:id="102"/>
+    <w:bookmarkStart w:id="103" w:name="thm-normalizing-constant-formula"/>
+    <w:p>
+      <w:pPr>
+        <w:pStyle w:val="FirstParagraph"/>
+      </w:pPr>
+      <w:r>
+        <w:rPr>
+          <w:b/>
+          <w:bCs/>
+        </w:rPr>
+        <w:t xml:space="preserve">Theorem 17 (The normalizing constant makes the density integrate to 1)</w:t>
+      </w:r>
+      <w:r>
+        <w:t xml:space="preserve"> </w:t>
+      </w:r>
+      <w:r>
+        <w:t xml:space="preserve">If</w:t>
+      </w:r>
+      <w:r>
+        <w:t xml:space="preserve"> </w:t>
+      </w:r>
+      <m:oMath>
+        <m:r>
+          <m:t>g</m:t>
+        </m:r>
+      </m:oMath>
+      <w:r>
+        <w:t xml:space="preserve"> </w:t>
+      </w:r>
+      <w:r>
+        <w:t xml:space="preserve">is a</w:t>
+      </w:r>
+      <w:r>
+        <w:t xml:space="preserve"> </w:t>
+      </w:r>
+      <w:hyperlink w:anchor="def-kernel">
+        <w:r>
+          <w:rPr>
+            <w:rStyle w:val="Hyperlink"/>
+          </w:rPr>
+          <w:t xml:space="preserve">kernel of a density</w:t>
+        </w:r>
+      </w:hyperlink>
+      <w:r>
+        <w:t xml:space="preserve"> </w:t>
+      </w:r>
+      <m:oMath>
+        <m:r>
+          <m:t>f</m:t>
+        </m:r>
+      </m:oMath>
+      <w:r>
+        <w:t xml:space="preserve">,</w:t>
+      </w:r>
+      <w:r>
+        <w:t xml:space="preserve"> </w:t>
+      </w:r>
+      <w:r>
+        <w:t xml:space="preserve">its</w:t>
+      </w:r>
+      <w:r>
+        <w:t xml:space="preserve"> </w:t>
+      </w:r>
+      <w:hyperlink w:anchor="def-normalizing-constant">
+        <w:r>
+          <w:rPr>
+            <w:rStyle w:val="Hyperlink"/>
+          </w:rPr>
+          <w:t xml:space="preserve">normalizing constant</w:t>
+        </w:r>
+      </w:hyperlink>
+      <w:r>
+        <w:t xml:space="preserve"> </w:t>
+      </w:r>
+      <w:r>
+        <w:t xml:space="preserve">is</w:t>
+      </w:r>
+    </w:p>
+    <w:p>
+      <w:pPr>
+        <w:pStyle w:val="BodyText"/>
+      </w:pPr>
+      <m:oMathPara>
+        <m:oMathParaPr>
+          <m:jc m:val="center"/>
+        </m:oMathParaPr>
+        <m:oMath>
+          <m:r>
+            <m:t>c</m:t>
+          </m:r>
+          <m:r>
+            <m:rPr>
+              <m:sty m:val="p"/>
+            </m:rPr>
+            <m:t>=</m:t>
+          </m:r>
+          <m:f>
+            <m:fPr>
+              <m:type m:val="bar"/>
+            </m:fPr>
+            <m:num>
+              <m:r>
+                <m:t>1</m:t>
+              </m:r>
+            </m:num>
+            <m:den>
+              <m:nary>
+                <m:naryPr>
+                  <m:chr m:val="∫"/>
+                  <m:limLoc m:val="subSup"/>
+                  <m:subHide m:val="off"/>
+                  <m:supHide m:val="off"/>
+                </m:naryPr>
+                <m:sub>
+                  <m:r>
+                    <m:rPr>
+                      <m:sty m:val="p"/>
+                    </m:rPr>
+                    <m:t>−</m:t>
+                  </m:r>
+                  <m:r>
+                    <m:rPr>
+                      <m:sty m:val="p"/>
+                    </m:rPr>
+                    <m:t>∞</m:t>
+                  </m:r>
+                </m:sub>
+                <m:sup>
+                  <m:r>
+                    <m:rPr>
+                      <m:sty m:val="p"/>
+                    </m:rPr>
+                    <m:t>∞</m:t>
+                  </m:r>
+                </m:sup>
+                <m:e>
+                  <m:r>
+                    <m:t>g</m:t>
+                  </m:r>
+                </m:e>
+              </m:nary>
+              <m:r>
+                <m:rPr>
+                  <m:sty m:val="p"/>
+                </m:rPr>
+                <m:t>(</m:t>
+              </m:r>
+              <m:r>
+                <m:t>x</m:t>
+              </m:r>
+              <m:r>
+                <m:rPr>
+                  <m:sty m:val="p"/>
+                </m:rPr>
+                <m:t>)</m:t>
+              </m:r>
+              <m:r>
+                <m:t> </m:t>
+              </m:r>
+              <m:r>
+                <m:t>d</m:t>
+              </m:r>
+              <m:r>
+                <m:t>x</m:t>
+              </m:r>
+            </m:den>
+          </m:f>
+          <m:r>
+            <m:rPr>
+              <m:sty m:val="p"/>
+            </m:rPr>
+            <m:t>.</m:t>
+          </m:r>
+        </m:oMath>
+      </m:oMathPara>
+    </w:p>
+    <w:bookmarkEnd w:id="103"/>
+    <w:p>
+      <w:pPr>
+        <w:pStyle w:val="FirstParagraph"/>
+      </w:pPr>
+      <w:r>
+        <w:rPr>
+          <w:i/>
+          <w:iCs/>
+        </w:rPr>
+        <w:t xml:space="preserve">Proof</w:t>
+      </w:r>
+      <w:r>
+        <w:t xml:space="preserve">. </w:t>
+      </w:r>
+      <w:r>
+        <w:t xml:space="preserve">A</w:t>
+      </w:r>
+      <w:r>
+        <w:t xml:space="preserve"> </w:t>
+      </w:r>
+      <w:hyperlink w:anchor="def-pdf">
+        <w:r>
+          <w:rPr>
+            <w:rStyle w:val="Hyperlink"/>
+          </w:rPr>
+          <w:t xml:space="preserve">density</w:t>
+        </w:r>
+      </w:hyperlink>
+      <w:r>
+        <w:t xml:space="preserve"> </w:t>
+      </w:r>
+      <w:r>
+        <w:t xml:space="preserve">integrates to 1 over the whole line, so</w:t>
+      </w:r>
+    </w:p>
+    <w:p>
+      <w:pPr>
+        <w:pStyle w:val="BodyText"/>
+      </w:pPr>
+      <m:oMathPara>
+        <m:oMathParaPr>
+          <m:jc m:val="center"/>
+        </m:oMathParaPr>
+        <m:oMath>
+          <m:eqArr>
+            <m:e>
+              <m:r>
+                <m:t>1</m:t>
+              </m:r>
+              <m:r>
+                <m:t>&amp;</m:t>
+              </m:r>
+              <m:r>
+                <m:rPr>
+                  <m:sty m:val="p"/>
+                </m:rPr>
+                <m:t>=</m:t>
+              </m:r>
+              <m:nary>
+                <m:naryPr>
+                  <m:chr m:val="∫"/>
+                  <m:limLoc m:val="subSup"/>
+                  <m:subHide m:val="off"/>
+                  <m:supHide m:val="off"/>
+                </m:naryPr>
+                <m:sub>
+                  <m:r>
+                    <m:rPr>
+                      <m:sty m:val="p"/>
+                    </m:rPr>
+                    <m:t>−</m:t>
+                  </m:r>
+                  <m:r>
+                    <m:rPr>
+                      <m:sty m:val="p"/>
+                    </m:rPr>
+                    <m:t>∞</m:t>
+                  </m:r>
+                </m:sub>
+                <m:sup>
+                  <m:r>
+                    <m:rPr>
+                      <m:sty m:val="p"/>
+                    </m:rPr>
+                    <m:t>∞</m:t>
+                  </m:r>
+                </m:sup>
+                <m:e>
+                  <m:r>
+                    <m:t>f</m:t>
+                  </m:r>
+                </m:e>
+              </m:nary>
+              <m:r>
+                <m:rPr>
+                  <m:sty m:val="p"/>
+                </m:rPr>
+                <m:t>(</m:t>
+              </m:r>
+              <m:r>
+                <m:t>x</m:t>
+              </m:r>
+              <m:r>
+                <m:rPr>
+                  <m:sty m:val="p"/>
+                </m:rPr>
+                <m:t>)</m:t>
+              </m:r>
+              <m:r>
+                <m:t> </m:t>
+              </m:r>
+              <m:r>
+                <m:t>d</m:t>
+              </m:r>
+              <m:r>
+                <m:t>x</m:t>
+              </m:r>
+              <m:r>
+                <m:t>&amp;</m:t>
+              </m:r>
+              <m:r>
+                <m:t>&amp;</m:t>
+              </m:r>
+              <m:r>
+                <m:rPr>
+                  <m:nor/>
+                  <m:sty m:val="p"/>
+                </m:rPr>
+                <m:t>(a density integrates to 1)</m:t>
+              </m:r>
+            </m:e>
+            <m:e>
+              <m:r>
+                <m:t>&amp;</m:t>
+              </m:r>
+              <m:r>
+                <m:rPr>
+                  <m:sty m:val="p"/>
+                </m:rPr>
+                <m:t>=</m:t>
+              </m:r>
+              <m:nary>
+                <m:naryPr>
+                  <m:chr m:val="∫"/>
+                  <m:limLoc m:val="subSup"/>
+                  <m:subHide m:val="off"/>
+                  <m:supHide m:val="off"/>
+                </m:naryPr>
+                <m:sub>
+                  <m:r>
+                    <m:rPr>
+                      <m:sty m:val="p"/>
+                    </m:rPr>
+                    <m:t>−</m:t>
+                  </m:r>
+                  <m:r>
+                    <m:rPr>
+                      <m:sty m:val="p"/>
+                    </m:rPr>
+                    <m:t>∞</m:t>
+                  </m:r>
+                </m:sub>
+                <m:sup>
+                  <m:r>
+                    <m:rPr>
+                      <m:sty m:val="p"/>
+                    </m:rPr>
+                    <m:t>∞</m:t>
+                  </m:r>
+                </m:sup>
+                <m:e>
+                  <m:r>
+                    <m:t>c</m:t>
+                  </m:r>
+                </m:e>
+              </m:nary>
+              <m:r>
+                <m:t> </m:t>
+              </m:r>
+              <m:r>
+                <m:t>g</m:t>
+              </m:r>
+              <m:r>
+                <m:rPr>
+                  <m:sty m:val="p"/>
+                </m:rPr>
+                <m:t>(</m:t>
+              </m:r>
+              <m:r>
+                <m:t>x</m:t>
+              </m:r>
+              <m:r>
+                <m:rPr>
+                  <m:sty m:val="p"/>
+                </m:rPr>
+                <m:t>)</m:t>
+              </m:r>
+              <m:r>
+                <m:t> </m:t>
+              </m:r>
+              <m:r>
+                <m:t>d</m:t>
+              </m:r>
+              <m:r>
+                <m:t>x</m:t>
+              </m:r>
+              <m:r>
+                <m:t>&amp;</m:t>
+              </m:r>
+              <m:r>
+                <m:t>&amp;</m:t>
+              </m:r>
+              <m:r>
+                <m:rPr>
+                  <m:nor/>
+                  <m:sty m:val="p"/>
+                </m:rPr>
+                <m:t>(@def-normalizing-constant)</m:t>
+              </m:r>
+            </m:e>
+            <m:e>
+              <m:r>
+                <m:t>&amp;</m:t>
+              </m:r>
+              <m:r>
+                <m:rPr>
+                  <m:sty m:val="p"/>
+                </m:rPr>
+                <m:t>=</m:t>
+              </m:r>
+              <m:r>
+                <m:t>c</m:t>
+              </m:r>
+              <m:nary>
+                <m:naryPr>
+                  <m:chr m:val="∫"/>
+                  <m:limLoc m:val="subSup"/>
+                  <m:subHide m:val="off"/>
+                  <m:supHide m:val="off"/>
+                </m:naryPr>
+                <m:sub>
+                  <m:r>
+                    <m:rPr>
+                      <m:sty m:val="p"/>
+                    </m:rPr>
+                    <m:t>−</m:t>
+                  </m:r>
+                  <m:r>
+                    <m:rPr>
+                      <m:sty m:val="p"/>
+                    </m:rPr>
+                    <m:t>∞</m:t>
+                  </m:r>
+                </m:sub>
+                <m:sup>
+                  <m:r>
+                    <m:rPr>
+                      <m:sty m:val="p"/>
+                    </m:rPr>
+                    <m:t>∞</m:t>
+                  </m:r>
+                </m:sup>
+                <m:e>
+                  <m:r>
+                    <m:t>g</m:t>
+                  </m:r>
+                </m:e>
+              </m:nary>
+              <m:r>
+                <m:rPr>
+                  <m:sty m:val="p"/>
+                </m:rPr>
+                <m:t>(</m:t>
+              </m:r>
+              <m:r>
+                <m:t>x</m:t>
+              </m:r>
+              <m:r>
+                <m:rPr>
+                  <m:sty m:val="p"/>
+                </m:rPr>
+                <m:t>)</m:t>
+              </m:r>
+              <m:r>
+                <m:t> </m:t>
+              </m:r>
+              <m:r>
+                <m:t>d</m:t>
+              </m:r>
+              <m:r>
+                <m:t>x</m:t>
+              </m:r>
+              <m:r>
+                <m:rPr>
+                  <m:sty m:val="p"/>
+                </m:rPr>
+                <m:t>.</m:t>
+              </m:r>
+              <m:r>
+                <m:t>&amp;</m:t>
+              </m:r>
+              <m:r>
+                <m:t>&amp;</m:t>
+              </m:r>
+              <m:r>
+                <m:rPr>
+                  <m:nor/>
+                  <m:sty m:val="p"/>
+                </m:rPr>
+                <m:t>(constant factor out of the integral)</m:t>
+              </m:r>
+            </m:e>
+          </m:eqArr>
+        </m:oMath>
+      </m:oMathPara>
+    </w:p>
+    <w:p>
+      <w:pPr>
+        <w:pStyle w:val="FirstParagraph"/>
+      </w:pPr>
+      <w:r>
+        <w:t xml:space="preserve">Dividing by</w:t>
+      </w:r>
+      <w:r>
+        <w:t xml:space="preserve"> </w:t>
+      </w:r>
+      <m:oMath>
+        <m:r>
+          <m:rPr>
+            <m:sty m:val="p"/>
+          </m:rPr>
+          <m:t>∫</m:t>
+        </m:r>
+        <m:r>
+          <m:t>g</m:t>
+        </m:r>
+        <m:r>
+          <m:rPr>
+            <m:sty m:val="p"/>
+          </m:rPr>
+          <m:t>(</m:t>
+        </m:r>
+        <m:r>
+          <m:t>x</m:t>
+        </m:r>
+        <m:r>
+          <m:rPr>
+            <m:sty m:val="p"/>
+          </m:rPr>
+          <m:t>)</m:t>
+        </m:r>
+        <m:r>
+          <m:t> </m:t>
+        </m:r>
+        <m:r>
+          <m:t>d</m:t>
+        </m:r>
+        <m:r>
+          <m:t>x</m:t>
+        </m:r>
+      </m:oMath>
+      <w:r>
+        <w:t xml:space="preserve"> </w:t>
+      </w:r>
+      <w:r>
+        <w:t xml:space="preserve">gives the formula.</w:t>
+      </w:r>
+    </w:p>
+    <w:bookmarkStart w:id="104" w:name="def-mode"/>
+    <w:p>
+      <w:pPr>
+        <w:pStyle w:val="BodyText"/>
+      </w:pPr>
+      <w:r>
+        <w:rPr>
+          <w:b/>
+          <w:bCs/>
+        </w:rPr>
+        <w:t xml:space="preserve">Definition 24 (Mode of a density or mass function)</w:t>
+      </w:r>
+      <w:r>
+        <w:t xml:space="preserve"> </w:t>
+      </w:r>
+      <w:r>
+        <w:t xml:space="preserve">A</w:t>
+      </w:r>
+      <w:r>
+        <w:t xml:space="preserve"> </w:t>
+      </w:r>
+      <w:r>
+        <w:rPr>
+          <w:b/>
+          <w:bCs/>
+        </w:rPr>
+        <w:t xml:space="preserve">mode</w:t>
+      </w:r>
+      <w:r>
+        <w:t xml:space="preserve"> </w:t>
+      </w:r>
+      <w:r>
+        <w:t xml:space="preserve">of a</w:t>
+      </w:r>
+      <w:r>
+        <w:t xml:space="preserve"> </w:t>
+      </w:r>
+      <w:hyperlink w:anchor="def-pdf">
+        <w:r>
+          <w:rPr>
+            <w:rStyle w:val="Hyperlink"/>
+          </w:rPr>
+          <w:t xml:space="preserve">density</w:t>
+        </w:r>
+      </w:hyperlink>
+      <w:r>
+        <w:t xml:space="preserve"> </w:t>
+      </w:r>
+      <w:r>
+        <w:t xml:space="preserve">or</w:t>
+      </w:r>
+      <w:r>
+        <w:t xml:space="preserve"> </w:t>
+      </w:r>
+      <w:hyperlink w:anchor="def-pmf">
+        <w:r>
+          <w:rPr>
+            <w:rStyle w:val="Hyperlink"/>
+          </w:rPr>
+          <w:t xml:space="preserve">mass function</w:t>
+        </w:r>
+      </w:hyperlink>
+      <w:r>
+        <w:t xml:space="preserve"> </w:t>
+      </w:r>
+      <m:oMath>
+        <m:r>
+          <m:t>f</m:t>
+        </m:r>
+      </m:oMath>
+      <w:r>
+        <w:t xml:space="preserve"> </w:t>
+      </w:r>
+      <w:r>
+        <w:t xml:space="preserve">is a value</w:t>
+      </w:r>
+      <w:r>
+        <w:t xml:space="preserve"> </w:t>
+      </w:r>
+      <m:oMath>
+        <m:sSup>
+          <m:e>
+            <m:r>
+              <m:t>x</m:t>
+            </m:r>
+          </m:e>
+          <m:sup>
+            <m:r>
+              <m:rPr>
+                <m:sty m:val="p"/>
+              </m:rPr>
+              <m:t>*</m:t>
+            </m:r>
+          </m:sup>
+        </m:sSup>
+      </m:oMath>
+      <w:r>
+        <w:t xml:space="preserve"> </w:t>
+      </w:r>
+      <w:r>
+        <w:t xml:space="preserve">at which</w:t>
+      </w:r>
+      <w:r>
+        <w:t xml:space="preserve"> </w:t>
+      </w:r>
+      <m:oMath>
+        <m:r>
+          <m:t>f</m:t>
+        </m:r>
+      </m:oMath>
+      <w:r>
+        <w:t xml:space="preserve"> </w:t>
+      </w:r>
+      <w:r>
+        <w:t xml:space="preserve">is largest:</w:t>
+      </w:r>
+      <w:r>
+        <w:t xml:space="preserve"> </w:t>
+      </w:r>
+      <m:oMath>
+        <m:r>
+          <m:t>f</m:t>
+        </m:r>
+        <m:r>
+          <m:rPr>
+            <m:sty m:val="p"/>
+          </m:rPr>
+          <m:t>(</m:t>
+        </m:r>
+        <m:sSup>
+          <m:e>
+            <m:r>
+              <m:t>x</m:t>
+            </m:r>
+          </m:e>
+          <m:sup>
+            <m:r>
+              <m:rPr>
+                <m:sty m:val="p"/>
+              </m:rPr>
+              <m:t>*</m:t>
+            </m:r>
+          </m:sup>
+        </m:sSup>
+        <m:r>
+          <m:rPr>
+            <m:sty m:val="p"/>
+          </m:rPr>
+          <m:t>)</m:t>
+        </m:r>
+        <m:r>
+          <m:rPr>
+            <m:sty m:val="p"/>
+          </m:rPr>
+          <m:t>≥</m:t>
+        </m:r>
+        <m:r>
+          <m:t>f</m:t>
+        </m:r>
+        <m:r>
+          <m:rPr>
+            <m:sty m:val="p"/>
+          </m:rPr>
+          <m:t>(</m:t>
+        </m:r>
+        <m:r>
+          <m:t>x</m:t>
+        </m:r>
+        <m:r>
+          <m:rPr>
+            <m:sty m:val="p"/>
+          </m:rPr>
+          <m:t>)</m:t>
+        </m:r>
+      </m:oMath>
+      <w:r>
+        <w:t xml:space="preserve"> </w:t>
+      </w:r>
+      <w:r>
+        <w:t xml:space="preserve">for every</w:t>
+      </w:r>
+      <w:r>
+        <w:t xml:space="preserve"> </w:t>
+      </w:r>
+      <m:oMath>
+        <m:r>
+          <m:t>x</m:t>
+        </m:r>
+      </m:oMath>
+      <w:r>
+        <w:t xml:space="preserve">.</w:t>
+      </w:r>
+    </w:p>
+    <w:bookmarkEnd w:id="104"/>
+    <w:bookmarkStart w:id="105" w:name="thm-kernel-same-mode"/>
+    <w:p>
+      <w:pPr>
+        <w:pStyle w:val="BodyText"/>
+      </w:pPr>
+      <w:r>
+        <w:rPr>
+          <w:b/>
+          <w:bCs/>
+        </w:rPr>
+        <w:t xml:space="preserve">Theorem 18 (A density and its kernel have the same modes)</w:t>
+      </w:r>
+      <w:r>
+        <w:t xml:space="preserve"> </w:t>
+      </w:r>
+      <w:r>
+        <w:t xml:space="preserve">If</w:t>
+      </w:r>
+      <w:r>
+        <w:t xml:space="preserve"> </w:t>
+      </w:r>
+      <m:oMath>
+        <m:r>
+          <m:t>g</m:t>
+        </m:r>
+      </m:oMath>
+      <w:r>
+        <w:t xml:space="preserve"> </w:t>
+      </w:r>
+      <w:r>
+        <w:t xml:space="preserve">is a</w:t>
+      </w:r>
+      <w:r>
+        <w:t xml:space="preserve"> </w:t>
+      </w:r>
+      <w:hyperlink w:anchor="def-kernel">
+        <w:r>
+          <w:rPr>
+            <w:rStyle w:val="Hyperlink"/>
+          </w:rPr>
+          <w:t xml:space="preserve">kernel of a density</w:t>
+        </w:r>
+      </w:hyperlink>
+      <w:r>
+        <w:t xml:space="preserve"> </w:t>
+      </w:r>
+      <m:oMath>
+        <m:r>
+          <m:t>f</m:t>
+        </m:r>
+      </m:oMath>
+      <w:r>
+        <w:t xml:space="preserve">,</w:t>
+      </w:r>
+      <w:r>
+        <w:t xml:space="preserve"> </w:t>
+      </w:r>
+      <w:r>
+        <w:t xml:space="preserve">then</w:t>
+      </w:r>
+      <w:r>
+        <w:t xml:space="preserve"> </w:t>
+      </w:r>
+      <m:oMath>
+        <m:sSup>
+          <m:e>
+            <m:r>
+              <m:t>x</m:t>
+            </m:r>
+          </m:e>
+          <m:sup>
+            <m:r>
+              <m:rPr>
+                <m:sty m:val="p"/>
+              </m:rPr>
+              <m:t>*</m:t>
+            </m:r>
+          </m:sup>
+        </m:sSup>
+      </m:oMath>
+      <w:r>
+        <w:t xml:space="preserve"> </w:t>
+      </w:r>
+      <w:r>
+        <w:t xml:space="preserve">is a</w:t>
+      </w:r>
+      <w:r>
+        <w:t xml:space="preserve"> </w:t>
+      </w:r>
+      <w:hyperlink w:anchor="def-mode">
+        <w:r>
+          <w:rPr>
+            <w:rStyle w:val="Hyperlink"/>
+          </w:rPr>
+          <w:t xml:space="preserve">mode</w:t>
+        </w:r>
+      </w:hyperlink>
+      <w:r>
+        <w:t xml:space="preserve"> </w:t>
+      </w:r>
+      <w:r>
+        <w:t xml:space="preserve">of</w:t>
+      </w:r>
+      <w:r>
+        <w:t xml:space="preserve"> </w:t>
+      </w:r>
+      <m:oMath>
+        <m:r>
+          <m:t>f</m:t>
+        </m:r>
+      </m:oMath>
+      <w:r>
+        <w:t xml:space="preserve"> </w:t>
+      </w:r>
+      <w:r>
+        <w:t xml:space="preserve">if and only if</w:t>
+      </w:r>
+      <w:r>
+        <w:t xml:space="preserve"> </w:t>
+      </w:r>
+      <m:oMath>
+        <m:r>
+          <m:t>g</m:t>
+        </m:r>
+        <m:r>
+          <m:rPr>
+            <m:sty m:val="p"/>
+          </m:rPr>
+          <m:t>(</m:t>
+        </m:r>
+        <m:sSup>
+          <m:e>
+            <m:r>
+              <m:t>x</m:t>
+            </m:r>
+          </m:e>
+          <m:sup>
+            <m:r>
+              <m:rPr>
+                <m:sty m:val="p"/>
+              </m:rPr>
+              <m:t>*</m:t>
+            </m:r>
+          </m:sup>
+        </m:sSup>
+        <m:r>
+          <m:rPr>
+            <m:sty m:val="p"/>
+          </m:rPr>
+          <m:t>)</m:t>
+        </m:r>
+        <m:r>
+          <m:rPr>
+            <m:sty m:val="p"/>
+          </m:rPr>
+          <m:t>≥</m:t>
+        </m:r>
+        <m:r>
+          <m:t>g</m:t>
+        </m:r>
+        <m:r>
+          <m:rPr>
+            <m:sty m:val="p"/>
+          </m:rPr>
+          <m:t>(</m:t>
+        </m:r>
+        <m:r>
+          <m:t>x</m:t>
+        </m:r>
+        <m:r>
+          <m:rPr>
+            <m:sty m:val="p"/>
+          </m:rPr>
+          <m:t>)</m:t>
+        </m:r>
+      </m:oMath>
+      <w:r>
+        <w:t xml:space="preserve"> </w:t>
+      </w:r>
+      <w:r>
+        <w:t xml:space="preserve">for every</w:t>
+      </w:r>
+      <w:r>
+        <w:t xml:space="preserve"> </w:t>
+      </w:r>
+      <m:oMath>
+        <m:r>
+          <m:t>x</m:t>
+        </m:r>
+      </m:oMath>
+      <w:r>
+        <w:t xml:space="preserve">.</w:t>
+      </w:r>
+    </w:p>
+    <w:bookmarkEnd w:id="105"/>
+    <w:p>
+      <w:pPr>
+        <w:pStyle w:val="BodyText"/>
+      </w:pPr>
+      <w:r>
+        <w:rPr>
+          <w:i/>
+          <w:iCs/>
+        </w:rPr>
+        <w:t xml:space="preserve">Proof</w:t>
+      </w:r>
+      <w:r>
+        <w:t xml:space="preserve">. </w:t>
+      </w:r>
+      <w:r>
+        <w:t xml:space="preserve">Write</w:t>
+      </w:r>
+      <w:r>
+        <w:t xml:space="preserve"> </w:t>
+      </w:r>
+      <m:oMath>
+        <m:r>
+          <m:t>f</m:t>
+        </m:r>
+        <m:r>
+          <m:rPr>
+            <m:sty m:val="p"/>
+          </m:rPr>
+          <m:t>(</m:t>
+        </m:r>
+        <m:r>
+          <m:t>x</m:t>
+        </m:r>
+        <m:r>
+          <m:rPr>
+            <m:sty m:val="p"/>
+          </m:rPr>
+          <m:t>)</m:t>
+        </m:r>
+        <m:r>
+          <m:rPr>
+            <m:sty m:val="p"/>
+          </m:rPr>
+          <m:t>=</m:t>
+        </m:r>
+        <m:r>
+          <m:t>c</m:t>
+        </m:r>
+        <m:r>
+          <m:t> </m:t>
+        </m:r>
+        <m:r>
+          <m:t>g</m:t>
+        </m:r>
+        <m:r>
+          <m:rPr>
+            <m:sty m:val="p"/>
+          </m:rPr>
+          <m:t>(</m:t>
+        </m:r>
+        <m:r>
+          <m:t>x</m:t>
+        </m:r>
+        <m:r>
+          <m:rPr>
+            <m:sty m:val="p"/>
+          </m:rPr>
+          <m:t>)</m:t>
+        </m:r>
+      </m:oMath>
+      <w:r>
+        <w:t xml:space="preserve"> </w:t>
+      </w:r>
+      <w:r>
+        <w:t xml:space="preserve">with</w:t>
+      </w:r>
+      <w:r>
+        <w:t xml:space="preserve"> </w:t>
+      </w:r>
+      <m:oMath>
+        <m:r>
+          <m:t>c</m:t>
+        </m:r>
+        <m:r>
+          <m:rPr>
+            <m:sty m:val="p"/>
+          </m:rPr>
+          <m:t>&gt;</m:t>
+        </m:r>
+        <m:r>
+          <m:t>0</m:t>
+        </m:r>
+      </m:oMath>
+      <w:r>
+        <w:t xml:space="preserve"> </w:t>
+      </w:r>
+      <w:r>
+        <w:t xml:space="preserve">(</w:t>
+      </w:r>
+      <w:hyperlink w:anchor="def-kernel">
+        <w:r>
+          <w:rPr>
+            <w:rStyle w:val="Hyperlink"/>
+          </w:rPr>
+          <w:t xml:space="preserve">Definition 22</w:t>
+        </w:r>
+      </w:hyperlink>
+      <w:r>
+        <w:t xml:space="preserve">).</w:t>
+      </w:r>
+      <w:r>
+        <w:t xml:space="preserve"> </w:t>
+      </w:r>
+      <w:r>
+        <w:t xml:space="preserve">For any</w:t>
+      </w:r>
+      <w:r>
+        <w:t xml:space="preserve"> </w:t>
+      </w:r>
+      <m:oMath>
+        <m:r>
+          <m:t>x</m:t>
+        </m:r>
+      </m:oMath>
+      <w:r>
+        <w:t xml:space="preserve">, multiplying both sides of</w:t>
+      </w:r>
+      <w:r>
+        <w:t xml:space="preserve"> </w:t>
+      </w:r>
+      <m:oMath>
+        <m:r>
+          <m:t>g</m:t>
+        </m:r>
+        <m:r>
+          <m:rPr>
+            <m:sty m:val="p"/>
+          </m:rPr>
+          <m:t>(</m:t>
+        </m:r>
+        <m:sSup>
+          <m:e>
+            <m:r>
+              <m:t>x</m:t>
+            </m:r>
+          </m:e>
+          <m:sup>
+            <m:r>
+              <m:rPr>
+                <m:sty m:val="p"/>
+              </m:rPr>
+              <m:t>*</m:t>
+            </m:r>
+          </m:sup>
+        </m:sSup>
+        <m:r>
+          <m:rPr>
+            <m:sty m:val="p"/>
+          </m:rPr>
+          <m:t>)</m:t>
+        </m:r>
+        <m:r>
+          <m:rPr>
+            <m:sty m:val="p"/>
+          </m:rPr>
+          <m:t>≥</m:t>
+        </m:r>
+        <m:r>
+          <m:t>g</m:t>
+        </m:r>
+        <m:r>
+          <m:rPr>
+            <m:sty m:val="p"/>
+          </m:rPr>
+          <m:t>(</m:t>
+        </m:r>
+        <m:r>
+          <m:t>x</m:t>
+        </m:r>
+        <m:r>
+          <m:rPr>
+            <m:sty m:val="p"/>
+          </m:rPr>
+          <m:t>)</m:t>
+        </m:r>
+      </m:oMath>
+      <w:r>
+        <w:t xml:space="preserve"> </w:t>
+      </w:r>
+      <w:r>
+        <w:t xml:space="preserve">by</w:t>
+      </w:r>
+      <w:r>
+        <w:t xml:space="preserve"> </w:t>
+      </w:r>
+      <m:oMath>
+        <m:r>
+          <m:t>c</m:t>
+        </m:r>
+        <m:r>
+          <m:rPr>
+            <m:sty m:val="p"/>
+          </m:rPr>
+          <m:t>&gt;</m:t>
+        </m:r>
+        <m:r>
+          <m:t>0</m:t>
+        </m:r>
+      </m:oMath>
+      <w:r>
+        <w:t xml:space="preserve"> </w:t>
+      </w:r>
+      <w:r>
+        <w:t xml:space="preserve">gives</w:t>
+      </w:r>
+      <w:r>
+        <w:t xml:space="preserve"> </w:t>
+      </w:r>
+      <m:oMath>
+        <m:r>
+          <m:t>f</m:t>
+        </m:r>
+        <m:r>
+          <m:rPr>
+            <m:sty m:val="p"/>
+          </m:rPr>
+          <m:t>(</m:t>
+        </m:r>
+        <m:sSup>
+          <m:e>
+            <m:r>
+              <m:t>x</m:t>
+            </m:r>
+          </m:e>
+          <m:sup>
+            <m:r>
+              <m:rPr>
+                <m:sty m:val="p"/>
+              </m:rPr>
+              <m:t>*</m:t>
+            </m:r>
+          </m:sup>
+        </m:sSup>
+        <m:r>
+          <m:rPr>
+            <m:sty m:val="p"/>
+          </m:rPr>
+          <m:t>)</m:t>
+        </m:r>
+        <m:r>
+          <m:rPr>
+            <m:sty m:val="p"/>
+          </m:rPr>
+          <m:t>≥</m:t>
+        </m:r>
+        <m:r>
+          <m:t>f</m:t>
+        </m:r>
+        <m:r>
+          <m:rPr>
+            <m:sty m:val="p"/>
+          </m:rPr>
+          <m:t>(</m:t>
+        </m:r>
+        <m:r>
+          <m:t>x</m:t>
+        </m:r>
+        <m:r>
+          <m:rPr>
+            <m:sty m:val="p"/>
+          </m:rPr>
+          <m:t>)</m:t>
+        </m:r>
+      </m:oMath>
+      <w:r>
+        <w:t xml:space="preserve">,</w:t>
+      </w:r>
+      <w:r>
+        <w:t xml:space="preserve"> </w:t>
+      </w:r>
+      <w:r>
+        <w:t xml:space="preserve">and dividing by</w:t>
+      </w:r>
+      <w:r>
+        <w:t xml:space="preserve"> </w:t>
+      </w:r>
+      <m:oMath>
+        <m:r>
+          <m:t>c</m:t>
+        </m:r>
+      </m:oMath>
+      <w:r>
+        <w:t xml:space="preserve"> </w:t>
+      </w:r>
+      <w:r>
+        <w:t xml:space="preserve">reverses this.</w:t>
+      </w:r>
+      <w:r>
+        <w:t xml:space="preserve"> </w:t>
+      </w:r>
+      <w:r>
+        <w:t xml:space="preserve">So</w:t>
+      </w:r>
+      <w:r>
+        <w:t xml:space="preserve"> </w:t>
+      </w:r>
+      <m:oMath>
+        <m:r>
+          <m:t>f</m:t>
+        </m:r>
+        <m:r>
+          <m:rPr>
+            <m:sty m:val="p"/>
+          </m:rPr>
+          <m:t>(</m:t>
+        </m:r>
+        <m:sSup>
+          <m:e>
+            <m:r>
+              <m:t>x</m:t>
+            </m:r>
+          </m:e>
+          <m:sup>
+            <m:r>
+              <m:rPr>
+                <m:sty m:val="p"/>
+              </m:rPr>
+              <m:t>*</m:t>
+            </m:r>
+          </m:sup>
+        </m:sSup>
+        <m:r>
+          <m:rPr>
+            <m:sty m:val="p"/>
+          </m:rPr>
+          <m:t>)</m:t>
+        </m:r>
+        <m:r>
+          <m:rPr>
+            <m:sty m:val="p"/>
+          </m:rPr>
+          <m:t>≥</m:t>
+        </m:r>
+        <m:r>
+          <m:t>f</m:t>
+        </m:r>
+        <m:r>
+          <m:rPr>
+            <m:sty m:val="p"/>
+          </m:rPr>
+          <m:t>(</m:t>
+        </m:r>
+        <m:r>
+          <m:t>x</m:t>
+        </m:r>
+        <m:r>
+          <m:rPr>
+            <m:sty m:val="p"/>
+          </m:rPr>
+          <m:t>)</m:t>
+        </m:r>
+      </m:oMath>
+      <w:r>
+        <w:t xml:space="preserve"> </w:t>
+      </w:r>
+      <w:r>
+        <w:t xml:space="preserve">for every</w:t>
+      </w:r>
+      <w:r>
+        <w:t xml:space="preserve"> </w:t>
+      </w:r>
+      <m:oMath>
+        <m:r>
+          <m:t>x</m:t>
+        </m:r>
+      </m:oMath>
+      <w:r>
+        <w:t xml:space="preserve"> </w:t>
+      </w:r>
+      <w:r>
+        <w:t xml:space="preserve">exactly when</w:t>
+      </w:r>
+      <w:r>
+        <w:t xml:space="preserve"> </w:t>
+      </w:r>
+      <m:oMath>
+        <m:r>
+          <m:t>g</m:t>
+        </m:r>
+        <m:r>
+          <m:rPr>
+            <m:sty m:val="p"/>
+          </m:rPr>
+          <m:t>(</m:t>
+        </m:r>
+        <m:sSup>
+          <m:e>
+            <m:r>
+              <m:t>x</m:t>
+            </m:r>
+          </m:e>
+          <m:sup>
+            <m:r>
+              <m:rPr>
+                <m:sty m:val="p"/>
+              </m:rPr>
+              <m:t>*</m:t>
+            </m:r>
+          </m:sup>
+        </m:sSup>
+        <m:r>
+          <m:rPr>
+            <m:sty m:val="p"/>
+          </m:rPr>
+          <m:t>)</m:t>
+        </m:r>
+        <m:r>
+          <m:rPr>
+            <m:sty m:val="p"/>
+          </m:rPr>
+          <m:t>≥</m:t>
+        </m:r>
+        <m:r>
+          <m:t>g</m:t>
+        </m:r>
+        <m:r>
+          <m:rPr>
+            <m:sty m:val="p"/>
+          </m:rPr>
+          <m:t>(</m:t>
+        </m:r>
+        <m:r>
+          <m:t>x</m:t>
+        </m:r>
+        <m:r>
+          <m:rPr>
+            <m:sty m:val="p"/>
+          </m:rPr>
+          <m:t>)</m:t>
+        </m:r>
+      </m:oMath>
+      <w:r>
+        <w:t xml:space="preserve"> </w:t>
+      </w:r>
+      <w:r>
+        <w:t xml:space="preserve">for every</w:t>
+      </w:r>
+      <w:r>
+        <w:t xml:space="preserve"> </w:t>
+      </w:r>
+      <m:oMath>
+        <m:r>
+          <m:t>x</m:t>
+        </m:r>
+      </m:oMath>
+      <w:r>
+        <w:t xml:space="preserve">.</w:t>
+      </w:r>
+    </w:p>
+    <w:bookmarkStart w:id="106" w:name="exm-kernel-exponential"/>
+    <w:p>
+      <w:pPr>
+        <w:pStyle w:val="BodyText"/>
+      </w:pPr>
+      <w:r>
+        <w:rPr>
+          <w:b/>
+          <w:bCs/>
+        </w:rPr>
+        <w:t xml:space="preserve">Example 29 (The kernel, normalizing constant, and mode of an exponential density)</w:t>
+      </w:r>
+      <w:r>
+        <w:t xml:space="preserve"> </w:t>
+      </w:r>
+      <w:r>
+        <w:t xml:space="preserve">The</w:t>
+      </w:r>
+      <w:r>
+        <w:t xml:space="preserve"> </w:t>
+      </w:r>
+      <w:hyperlink w:anchor="def-exponential">
+        <w:r>
+          <w:rPr>
+            <w:rStyle w:val="Hyperlink"/>
+          </w:rPr>
+          <w:t xml:space="preserve">exponential density</w:t>
+        </w:r>
+      </w:hyperlink>
+      <w:r>
+        <w:t xml:space="preserve"> </w:t>
+      </w:r>
+      <w:r>
+        <w:t xml:space="preserve">with rate</w:t>
+      </w:r>
+      <w:r>
+        <w:t xml:space="preserve"> </w:t>
+      </w:r>
+      <m:oMath>
+        <m:r>
+          <m:t>λ</m:t>
+        </m:r>
+      </m:oMath>
+      <w:r>
+        <w:t xml:space="preserve"> </w:t>
+      </w:r>
+      <w:r>
+        <w:t xml:space="preserve">is</w:t>
+      </w:r>
+      <w:r>
+        <w:t xml:space="preserve"> </w:t>
+      </w:r>
+      <m:oMath>
+        <m:r>
+          <m:t>f</m:t>
+        </m:r>
+        <m:r>
+          <m:rPr>
+            <m:sty m:val="p"/>
+          </m:rPr>
+          <m:t>(</m:t>
+        </m:r>
+        <m:r>
+          <m:t>t</m:t>
+        </m:r>
+        <m:r>
+          <m:rPr>
+            <m:sty m:val="p"/>
+          </m:rPr>
+          <m:t>)</m:t>
+        </m:r>
+        <m:r>
+          <m:rPr>
+            <m:sty m:val="p"/>
+          </m:rPr>
+          <m:t>=</m:t>
+        </m:r>
+        <m:r>
+          <m:t>λ</m:t>
+        </m:r>
+        <m:sSup>
+          <m:e>
+            <m:r>
+              <m:rPr>
+                <m:nor/>
+                <m:sty m:val="p"/>
+              </m:rPr>
+              <m:t>e</m:t>
+            </m:r>
+          </m:e>
+          <m:sup>
+            <m:r>
+              <m:rPr>
+                <m:sty m:val="p"/>
+              </m:rPr>
+              <m:t>−</m:t>
+            </m:r>
+            <m:r>
+              <m:t>λ</m:t>
+            </m:r>
+            <m:r>
+              <m:t>t</m:t>
+            </m:r>
+          </m:sup>
+        </m:sSup>
+      </m:oMath>
+      <w:r>
+        <w:t xml:space="preserve"> </w:t>
+      </w:r>
+      <w:r>
+        <w:t xml:space="preserve">for</w:t>
+      </w:r>
+      <w:r>
+        <w:t xml:space="preserve"> </w:t>
+      </w:r>
+      <m:oMath>
+        <m:r>
+          <m:t>t</m:t>
+        </m:r>
+        <m:r>
+          <m:rPr>
+            <m:sty m:val="p"/>
+          </m:rPr>
+          <m:t>≥</m:t>
+        </m:r>
+        <m:r>
+          <m:t>0</m:t>
+        </m:r>
+      </m:oMath>
+      <w:r>
+        <w:t xml:space="preserve">, and</w:t>
+      </w:r>
+      <w:r>
+        <w:t xml:space="preserve"> </w:t>
+      </w:r>
+      <m:oMath>
+        <m:r>
+          <m:t>f</m:t>
+        </m:r>
+        <m:r>
+          <m:rPr>
+            <m:sty m:val="p"/>
+          </m:rPr>
+          <m:t>(</m:t>
+        </m:r>
+        <m:r>
+          <m:t>t</m:t>
+        </m:r>
+        <m:r>
+          <m:rPr>
+            <m:sty m:val="p"/>
+          </m:rPr>
+          <m:t>)</m:t>
+        </m:r>
+        <m:r>
+          <m:rPr>
+            <m:sty m:val="p"/>
+          </m:rPr>
+          <m:t>=</m:t>
+        </m:r>
+        <m:r>
+          <m:t>0</m:t>
+        </m:r>
+      </m:oMath>
+      <w:r>
+        <w:t xml:space="preserve"> </w:t>
+      </w:r>
+      <w:r>
+        <w:t xml:space="preserve">for</w:t>
+      </w:r>
+      <w:r>
+        <w:t xml:space="preserve"> </w:t>
+      </w:r>
+      <m:oMath>
+        <m:r>
+          <m:t>t</m:t>
+        </m:r>
+        <m:r>
+          <m:rPr>
+            <m:sty m:val="p"/>
+          </m:rPr>
+          <m:t>&lt;</m:t>
+        </m:r>
+        <m:r>
+          <m:t>0</m:t>
+        </m:r>
+      </m:oMath>
+      <w:r>
+        <w:t xml:space="preserve">.</w:t>
+      </w:r>
+      <w:r>
+        <w:t xml:space="preserve"> </w:t>
+      </w:r>
+      <w:r>
+        <w:t xml:space="preserve">Its</w:t>
+      </w:r>
+      <w:r>
+        <w:t xml:space="preserve"> </w:t>
+      </w:r>
+      <w:hyperlink w:anchor="def-kernel">
+        <w:r>
+          <w:rPr>
+            <w:rStyle w:val="Hyperlink"/>
+          </w:rPr>
+          <w:t xml:space="preserve">kernel</w:t>
+        </w:r>
+      </w:hyperlink>
+      <w:r>
+        <w:t xml:space="preserve"> </w:t>
+      </w:r>
+      <w:r>
+        <w:t xml:space="preserve">is</w:t>
+      </w:r>
+      <w:r>
+        <w:t xml:space="preserve"> </w:t>
+      </w:r>
+      <m:oMath>
+        <m:r>
+          <m:t>g</m:t>
+        </m:r>
+        <m:r>
+          <m:rPr>
+            <m:sty m:val="p"/>
+          </m:rPr>
+          <m:t>(</m:t>
+        </m:r>
+        <m:r>
+          <m:t>t</m:t>
+        </m:r>
+        <m:r>
+          <m:rPr>
+            <m:sty m:val="p"/>
+          </m:rPr>
+          <m:t>)</m:t>
+        </m:r>
+        <m:r>
+          <m:rPr>
+            <m:sty m:val="p"/>
+          </m:rPr>
+          <m:t>=</m:t>
+        </m:r>
+        <m:sSup>
+          <m:e>
+            <m:r>
+              <m:rPr>
+                <m:nor/>
+                <m:sty m:val="p"/>
+              </m:rPr>
+              <m:t>e</m:t>
+            </m:r>
+          </m:e>
+          <m:sup>
+            <m:r>
+              <m:rPr>
+                <m:sty m:val="p"/>
+              </m:rPr>
+              <m:t>−</m:t>
+            </m:r>
+            <m:r>
+              <m:t>λ</m:t>
+            </m:r>
+            <m:r>
+              <m:t>t</m:t>
+            </m:r>
+          </m:sup>
+        </m:sSup>
+      </m:oMath>
+      <w:r>
+        <w:t xml:space="preserve"> </w:t>
+      </w:r>
+      <w:r>
+        <w:t xml:space="preserve">for</w:t>
+      </w:r>
+      <w:r>
+        <w:t xml:space="preserve"> </w:t>
+      </w:r>
+      <m:oMath>
+        <m:r>
+          <m:t>t</m:t>
+        </m:r>
+        <m:r>
+          <m:rPr>
+            <m:sty m:val="p"/>
+          </m:rPr>
+          <m:t>≥</m:t>
+        </m:r>
+        <m:r>
+          <m:t>0</m:t>
+        </m:r>
+      </m:oMath>
+      <w:r>
+        <w:t xml:space="preserve">, and</w:t>
+      </w:r>
+      <w:r>
+        <w:t xml:space="preserve"> </w:t>
+      </w:r>
+      <m:oMath>
+        <m:r>
+          <m:t>g</m:t>
+        </m:r>
+        <m:r>
+          <m:rPr>
+            <m:sty m:val="p"/>
+          </m:rPr>
+          <m:t>(</m:t>
+        </m:r>
+        <m:r>
+          <m:t>t</m:t>
+        </m:r>
+        <m:r>
+          <m:rPr>
+            <m:sty m:val="p"/>
+          </m:rPr>
+          <m:t>)</m:t>
+        </m:r>
+        <m:r>
+          <m:rPr>
+            <m:sty m:val="p"/>
+          </m:rPr>
+          <m:t>=</m:t>
+        </m:r>
+        <m:r>
+          <m:t>0</m:t>
+        </m:r>
+      </m:oMath>
+      <w:r>
+        <w:t xml:space="preserve"> </w:t>
+      </w:r>
+      <w:r>
+        <w:t xml:space="preserve">for</w:t>
+      </w:r>
+      <w:r>
+        <w:t xml:space="preserve"> </w:t>
+      </w:r>
+      <m:oMath>
+        <m:r>
+          <m:t>t</m:t>
+        </m:r>
+        <m:r>
+          <m:rPr>
+            <m:sty m:val="p"/>
+          </m:rPr>
+          <m:t>&lt;</m:t>
+        </m:r>
+        <m:r>
+          <m:t>0</m:t>
+        </m:r>
+      </m:oMath>
+      <w:r>
+        <w:t xml:space="preserve">,</w:t>
+      </w:r>
+      <w:r>
+        <w:t xml:space="preserve"> </w:t>
+      </w:r>
+      <w:r>
+        <w:t xml:space="preserve">and the</w:t>
+      </w:r>
+      <w:r>
+        <w:t xml:space="preserve"> </w:t>
+      </w:r>
+      <w:hyperlink w:anchor="def-normalizing-constant">
+        <w:r>
+          <w:rPr>
+            <w:rStyle w:val="Hyperlink"/>
+          </w:rPr>
+          <w:t xml:space="preserve">normalizing constant</w:t>
+        </w:r>
+      </w:hyperlink>
+      <w:r>
+        <w:t xml:space="preserve"> </w:t>
+      </w:r>
+      <w:r>
+        <w:t xml:space="preserve">is</w:t>
+      </w:r>
+    </w:p>
+    <w:p>
+      <w:pPr>
+        <w:pStyle w:val="BodyText"/>
+      </w:pPr>
+      <m:oMathPara>
+        <m:oMathParaPr>
+          <m:jc m:val="center"/>
+        </m:oMathParaPr>
+        <m:oMath>
+          <m:eqArr>
+            <m:e>
+              <m:r>
+                <m:t>c</m:t>
+              </m:r>
+              <m:r>
+                <m:t>&amp;</m:t>
+              </m:r>
+              <m:r>
+                <m:rPr>
+                  <m:sty m:val="p"/>
+                </m:rPr>
+                <m:t>=</m:t>
+              </m:r>
+              <m:f>
+                <m:fPr>
+                  <m:type m:val="bar"/>
+                </m:fPr>
+                <m:num>
+                  <m:r>
+                    <m:t>1</m:t>
+                  </m:r>
+                </m:num>
+                <m:den>
+                  <m:nary>
+                    <m:naryPr>
+                      <m:chr m:val="∫"/>
+                      <m:limLoc m:val="subSup"/>
+                      <m:subHide m:val="off"/>
+                      <m:supHide m:val="off"/>
+                    </m:naryPr>
+                    <m:sub>
+                      <m:r>
+                        <m:t>0</m:t>
+                      </m:r>
+                    </m:sub>
+                    <m:sup>
+                      <m:r>
+                        <m:rPr>
+                          <m:sty m:val="p"/>
+                        </m:rPr>
+                        <m:t>∞</m:t>
+                      </m:r>
+                    </m:sup>
+                    <m:e>
+                      <m:sSup>
+                        <m:e>
+                          <m:r>
+                            <m:rPr>
+                              <m:nor/>
+                              <m:sty m:val="p"/>
+                            </m:rPr>
+                            <m:t>e</m:t>
+                          </m:r>
+                        </m:e>
+                        <m:sup>
+                          <m:r>
+                            <m:rPr>
+                              <m:sty m:val="p"/>
+                            </m:rPr>
+                            <m:t>−</m:t>
+                          </m:r>
+                          <m:r>
+                            <m:t>λ</m:t>
+                          </m:r>
+                          <m:r>
+                            <m:t>t</m:t>
+                          </m:r>
+                        </m:sup>
+                      </m:sSup>
+                    </m:e>
+                  </m:nary>
+                  <m:r>
+                    <m:t> </m:t>
+                  </m:r>
+                  <m:r>
+                    <m:t>d</m:t>
+                  </m:r>
+                  <m:r>
+                    <m:t>t</m:t>
+                  </m:r>
+                </m:den>
+              </m:f>
+              <m:r>
+                <m:t>&amp;</m:t>
+              </m:r>
+              <m:r>
+                <m:t>&amp;</m:t>
+              </m:r>
+              <m:r>
+                <m:rPr>
+                  <m:nor/>
+                  <m:sty m:val="p"/>
+                </m:rPr>
+                <m:t>(@thm-normalizing-constant-formula)</m:t>
+              </m:r>
+            </m:e>
+            <m:e>
+              <m:r>
+                <m:t>&amp;</m:t>
+              </m:r>
+              <m:r>
+                <m:rPr>
+                  <m:sty m:val="p"/>
+                </m:rPr>
+                <m:t>=</m:t>
+              </m:r>
+              <m:f>
+                <m:fPr>
+                  <m:type m:val="bar"/>
+                </m:fPr>
+                <m:num>
+                  <m:r>
+                    <m:t>1</m:t>
+                  </m:r>
+                </m:num>
+                <m:den>
+                  <m:r>
+                    <m:t>​</m:t>
+                  </m:r>
+                  <m:d>
+                    <m:dPr>
+                      <m:begChr m:val="["/>
+                      <m:sepChr m:val=""/>
+                      <m:endChr m:val="]"/>
+                      <m:grow/>
+                    </m:dPr>
+                    <m:e>
+                      <m:r>
+                        <m:rPr>
+                          <m:sty m:val="p"/>
+                        </m:rPr>
+                        <m:t>−</m:t>
+                      </m:r>
+                      <m:sSup>
+                        <m:e>
+                          <m:r>
+                            <m:rPr>
+                              <m:nor/>
+                              <m:sty m:val="p"/>
+                            </m:rPr>
+                            <m:t>e</m:t>
+                          </m:r>
+                        </m:e>
+                        <m:sup>
+                          <m:r>
+                            <m:rPr>
+                              <m:sty m:val="p"/>
+                            </m:rPr>
+                            <m:t>−</m:t>
+                          </m:r>
+                          <m:r>
+                            <m:t>λ</m:t>
+                          </m:r>
+                          <m:r>
+                            <m:t>t</m:t>
+                          </m:r>
+                        </m:sup>
+                      </m:sSup>
+                      <m:r>
+                        <m:rPr>
+                          <m:sty m:val="p"/>
+                        </m:rPr>
+                        <m:t>/</m:t>
+                      </m:r>
+                      <m:r>
+                        <m:t>λ</m:t>
+                      </m:r>
+                    </m:e>
+                  </m:d>
+                  <m:sSubSup>
+                    <m:e>
+                      <m:r>
+                        <m:t>​</m:t>
+                      </m:r>
+                    </m:e>
+                    <m:sub>
+                      <m:r>
+                        <m:t>0</m:t>
+                      </m:r>
+                    </m:sub>
+                    <m:sup>
+                      <m:r>
+                        <m:rPr>
+                          <m:sty m:val="p"/>
+                        </m:rPr>
+                        <m:t>∞</m:t>
+                      </m:r>
+                    </m:sup>
+                  </m:sSubSup>
+                </m:den>
+              </m:f>
+              <m:r>
+                <m:t>&amp;</m:t>
+              </m:r>
+              <m:r>
+                <m:t>&amp;</m:t>
+              </m:r>
+              <m:r>
+                <m:rPr>
+                  <m:nor/>
+                  <m:sty m:val="p"/>
+                </m:rPr>
+                <m:t>(antiderivative of </m:t>
+              </m:r>
+              <m:sSup>
+                <m:e>
+                  <m:r>
+                    <m:rPr>
+                      <m:nor/>
+                      <m:sty m:val="p"/>
+                    </m:rPr>
+                    <m:t>e</m:t>
+                  </m:r>
+                </m:e>
+                <m:sup>
+                  <m:r>
+                    <m:rPr>
+                      <m:sty m:val="p"/>
+                    </m:rPr>
+                    <m:t>−</m:t>
+                  </m:r>
+                  <m:r>
+                    <m:t>λ</m:t>
+                  </m:r>
+                  <m:r>
+                    <m:t>t</m:t>
+                  </m:r>
+                </m:sup>
+              </m:sSup>
+              <m:r>
+                <m:rPr>
+                  <m:nor/>
+                  <m:sty m:val="p"/>
+                </m:rPr>
+                <m:t>)</m:t>
+              </m:r>
+            </m:e>
+            <m:e>
+              <m:r>
+                <m:t>&amp;</m:t>
+              </m:r>
+              <m:r>
+                <m:rPr>
+                  <m:sty m:val="p"/>
+                </m:rPr>
+                <m:t>=</m:t>
+              </m:r>
+              <m:f>
+                <m:fPr>
+                  <m:type m:val="bar"/>
+                </m:fPr>
+                <m:num>
+                  <m:r>
+                    <m:t>1</m:t>
+                  </m:r>
+                </m:num>
+                <m:den>
+                  <m:r>
+                    <m:t>1</m:t>
+                  </m:r>
+                  <m:r>
+                    <m:rPr>
+                      <m:sty m:val="p"/>
+                    </m:rPr>
+                    <m:t>/</m:t>
+                  </m:r>
+                  <m:r>
+                    <m:t>λ</m:t>
+                  </m:r>
+                </m:den>
+              </m:f>
+              <m:r>
+                <m:t>&amp;</m:t>
+              </m:r>
+              <m:r>
+                <m:t>&amp;</m:t>
+              </m:r>
+              <m:r>
+                <m:rPr>
+                  <m:nor/>
+                  <m:sty m:val="p"/>
+                </m:rPr>
+                <m:t>(evaluate at </m:t>
+              </m:r>
+              <m:r>
+                <m:rPr>
+                  <m:sty m:val="p"/>
+                </m:rPr>
+                <m:t>∞</m:t>
+              </m:r>
+              <m:r>
+                <m:rPr>
+                  <m:nor/>
+                  <m:sty m:val="p"/>
+                </m:rPr>
+                <m:t> and </m:t>
+              </m:r>
+              <m:r>
+                <m:t>0</m:t>
+              </m:r>
+              <m:r>
+                <m:rPr>
+                  <m:nor/>
+                  <m:sty m:val="p"/>
+                </m:rPr>
+                <m:t>)</m:t>
+              </m:r>
+            </m:e>
+            <m:e>
+              <m:r>
+                <m:t>&amp;</m:t>
+              </m:r>
+              <m:r>
+                <m:rPr>
+                  <m:sty m:val="p"/>
+                </m:rPr>
+                <m:t>=</m:t>
+              </m:r>
+              <m:r>
+                <m:t>λ</m:t>
+              </m:r>
+              <m:r>
+                <m:rPr>
+                  <m:sty m:val="p"/>
+                </m:rPr>
+                <m:t>.</m:t>
+              </m:r>
+              <m:r>
+                <m:t>&amp;</m:t>
+              </m:r>
+              <m:r>
+                <m:t>&amp;</m:t>
+              </m:r>
+              <m:r>
+                <m:rPr>
+                  <m:nor/>
+                  <m:sty m:val="p"/>
+                </m:rPr>
+                <m:t>(simplify)</m:t>
+              </m:r>
+            </m:e>
+          </m:eqArr>
+        </m:oMath>
+      </m:oMathPara>
+    </w:p>
+    <w:p>
+      <w:pPr>
+        <w:pStyle w:val="FirstParagraph"/>
+      </w:pPr>
+      <w:r>
+        <w:t xml:space="preserve">The kernel is largest at</w:t>
+      </w:r>
+      <w:r>
+        <w:t xml:space="preserve"> </w:t>
+      </w:r>
+      <m:oMath>
+        <m:r>
+          <m:t>t</m:t>
+        </m:r>
+        <m:r>
+          <m:rPr>
+            <m:sty m:val="p"/>
+          </m:rPr>
+          <m:t>=</m:t>
+        </m:r>
+        <m:r>
+          <m:t>0</m:t>
+        </m:r>
+      </m:oMath>
+      <w:r>
+        <w:t xml:space="preserve">,</w:t>
+      </w:r>
+      <w:r>
+        <w:t xml:space="preserve"> </w:t>
+      </w:r>
+      <w:r>
+        <w:t xml:space="preserve">so by</w:t>
+      </w:r>
+      <w:r>
+        <w:t xml:space="preserve"> </w:t>
+      </w:r>
+      <w:hyperlink w:anchor="thm-kernel-same-mode">
+        <w:r>
+          <w:rPr>
+            <w:rStyle w:val="Hyperlink"/>
+          </w:rPr>
+          <w:t xml:space="preserve">Theorem 18</w:t>
+        </w:r>
+      </w:hyperlink>
+      <w:r>
+        <w:t xml:space="preserve"> </w:t>
+      </w:r>
+      <w:r>
+        <w:t xml:space="preserve">the</w:t>
+      </w:r>
+      <w:r>
+        <w:t xml:space="preserve"> </w:t>
+      </w:r>
+      <w:hyperlink w:anchor="def-mode">
+        <w:r>
+          <w:rPr>
+            <w:rStyle w:val="Hyperlink"/>
+          </w:rPr>
+          <w:t xml:space="preserve">mode</w:t>
+        </w:r>
+      </w:hyperlink>
+      <w:r>
+        <w:t xml:space="preserve"> </w:t>
+      </w:r>
+      <w:r>
+        <w:t xml:space="preserve">of</w:t>
+      </w:r>
+      <w:r>
+        <w:t xml:space="preserve"> </w:t>
+      </w:r>
+      <m:oMath>
+        <m:r>
+          <m:t>f</m:t>
+        </m:r>
+      </m:oMath>
+      <w:r>
+        <w:t xml:space="preserve"> </w:t>
+      </w:r>
+      <w:r>
+        <w:t xml:space="preserve">is</w:t>
+      </w:r>
+      <w:r>
+        <w:t xml:space="preserve"> </w:t>
+      </w:r>
+      <m:oMath>
+        <m:r>
+          <m:t>0</m:t>
+        </m:r>
+      </m:oMath>
+      <w:r>
+        <w:t xml:space="preserve">.</w:t>
+      </w:r>
+    </w:p>
+    <w:bookmarkEnd w:id="106"/>
     <w:tbl>
       <w:tblPr>
         <w:tblStyle w:val="Table"/>
@@ -38690,7 +41306,7 @@
           </w:tcPr>
           <w:p>
             <w:pPr>
-              <w:pStyle w:val="FirstParagraph"/>
+              <w:pStyle w:val="BodyText"/>
             </w:pPr>
             <w:pPr>
               <w:spacing w:before="0" w:after="0"/>
@@ -38701,18 +41317,18 @@
                 <wp:inline>
                   <wp:extent cx="152400" cy="152400"/>
                   <wp:effectExtent b="0" l="0" r="0" t="0"/>
-                  <wp:docPr descr="" title="" id="102" name="Picture"/>
+                  <wp:docPr descr="" title="" id="108" name="Picture"/>
                   <a:graphic>
                     <a:graphicData uri="http://schemas.openxmlformats.org/drawingml/2006/picture">
                       <pic:pic>
                         <pic:nvPicPr>
-                          <pic:cNvPr descr="/opt/quarto/share/formats/docx/tip.png" id="103" name="Picture"/>
+                          <pic:cNvPr descr="/opt/quarto/share/formats/docx/tip.png" id="109" name="Picture"/>
                           <pic:cNvPicPr>
                             <a:picLocks noChangeArrowheads="1" noChangeAspect="1"/>
                           </pic:cNvPicPr>
                         </pic:nvPicPr>
                         <pic:blipFill>
-                          <a:blip r:embed="rId101"/>
+                          <a:blip r:embed="rId107"/>
                           <a:stretch>
                             <a:fillRect/>
                           </a:stretch>
@@ -38774,7 +41390,7 @@
             <w:r>
               <w:t xml:space="preserve"> </w:t>
             </w:r>
-            <w:hyperlink r:id="rId104">
+            <w:hyperlink r:id="rId110">
               <w:r>
                 <w:rPr>
                   <w:rStyle w:val="Hyperlink"/>
@@ -38812,7 +41428,7 @@
             <w:r>
               <w:t xml:space="preserve"> </w:t>
             </w:r>
-            <w:hyperlink r:id="rId105">
+            <w:hyperlink r:id="rId111">
               <w:r>
                 <w:rPr>
                   <w:rStyle w:val="Hyperlink"/>
@@ -38838,7 +41454,7 @@
       <w:r>
         <w:t xml:space="preserve"> </w:t>
       </w:r>
-      <w:hyperlink r:id="rId106">
+      <w:hyperlink r:id="rId112">
         <w:r>
           <w:rPr>
             <w:rStyle w:val="Hyperlink"/>
@@ -38855,7 +41471,7 @@
       <w:r>
         <w:t xml:space="preserve"> </w:t>
       </w:r>
-      <w:hyperlink r:id="rId107">
+      <w:hyperlink r:id="rId113">
         <w:r>
           <w:rPr>
             <w:rStyle w:val="Hyperlink"/>
@@ -38885,9 +41501,9 @@
         <w:t xml:space="preserve">.</w:t>
       </w:r>
     </w:p>
-    <w:bookmarkEnd w:id="108"/>
-    <w:bookmarkEnd w:id="109"/>
-    <w:bookmarkStart w:id="129" w:name="sec-prob-haz"/>
+    <w:bookmarkEnd w:id="114"/>
+    <w:bookmarkEnd w:id="115"/>
+    <w:bookmarkStart w:id="135" w:name="sec-prob-haz"/>
     <w:p>
       <w:pPr>
         <w:pStyle w:val="Heading2"/>
@@ -38896,7 +41512,7 @@
         <w:t xml:space="preserve">3 Survival, hazard, and cumulative hazard functions</w:t>
       </w:r>
     </w:p>
-    <w:bookmarkStart w:id="110" w:name="def-surv-fn"/>
+    <w:bookmarkStart w:id="116" w:name="def-surv-fn"/>
     <w:p>
       <w:pPr>
         <w:pStyle w:val="FirstParagraph"/>
@@ -38906,7 +41522,7 @@
           <w:b/>
           <w:bCs/>
         </w:rPr>
-        <w:t xml:space="preserve">Definition 22 (Survival function (survivor function))</w:t>
+        <w:t xml:space="preserve">Definition 25 (Survival function (survivor function))</w:t>
       </w:r>
       <w:r>
         <w:t xml:space="preserve"> </w:t>
@@ -39115,7 +41731,7 @@
         </m:oMath>
       </m:oMathPara>
     </w:p>
-    <w:bookmarkEnd w:id="110"/>
+    <w:bookmarkEnd w:id="116"/>
     <w:p>
       <w:pPr>
         <w:pStyle w:val="FirstParagraph"/>
@@ -39209,7 +41825,7 @@
         <w:t xml:space="preserve">The definition itself applies to any random variable.</w:t>
       </w:r>
     </w:p>
-    <w:bookmarkStart w:id="111" w:name="thm-survival-expressions-1"/>
+    <w:bookmarkStart w:id="117" w:name="thm-survival-expressions-1"/>
     <w:p>
       <w:pPr>
         <w:pStyle w:val="BodyText"/>
@@ -39219,7 +41835,7 @@
           <w:b/>
           <w:bCs/>
         </w:rPr>
-        <w:t xml:space="preserve">Theorem 17 (Survival function and CDF)</w:t>
+        <w:t xml:space="preserve">Theorem 19 (Survival function and CDF)</w:t>
       </w:r>
       <w:r>
         <w:t xml:space="preserve"> </w:t>
@@ -39502,7 +42118,7 @@
         </m:oMath>
       </m:oMathPara>
     </w:p>
-    <w:bookmarkEnd w:id="111"/>
+    <w:bookmarkEnd w:id="117"/>
     <w:p>
       <w:pPr>
         <w:pStyle w:val="FirstParagraph"/>
@@ -40225,7 +42841,7 @@
         </m:oMath>
       </m:oMathPara>
     </w:p>
-    <w:bookmarkStart w:id="112" w:name="exm-exp-survfn"/>
+    <w:bookmarkStart w:id="118" w:name="exm-exp-survfn"/>
     <w:p>
       <w:pPr>
         <w:pStyle w:val="FirstParagraph"/>
@@ -40235,7 +42851,7 @@
           <w:b/>
           <w:bCs/>
         </w:rPr>
-        <w:t xml:space="preserve">Example 29 (Survival function of an exponential distribution)</w:t>
+        <w:t xml:space="preserve">Example 30 (Survival function of an exponential distribution)</w:t>
       </w:r>
       <w:r>
         <w:t xml:space="preserve"> </w:t>
@@ -40428,7 +43044,7 @@
           <w:rPr>
             <w:rStyle w:val="Hyperlink"/>
           </w:rPr>
-          <w:t xml:space="preserve">Theorem 17</w:t>
+          <w:t xml:space="preserve">Theorem 19</w:t>
         </w:r>
       </w:hyperlink>
       <w:r>
@@ -41131,8 +43747,8 @@
         <w:t xml:space="preserve">.</w:t>
       </w:r>
     </w:p>
-    <w:bookmarkEnd w:id="112"/>
-    <w:bookmarkStart w:id="114" w:name="def-hazard"/>
+    <w:bookmarkEnd w:id="118"/>
+    <w:bookmarkStart w:id="120" w:name="def-hazard"/>
     <w:p>
       <w:pPr>
         <w:pStyle w:val="BodyText"/>
@@ -41142,7 +43758,7 @@
           <w:b/>
           <w:bCs/>
         </w:rPr>
-        <w:t xml:space="preserve">Definition 23 (Hazard function (hazard rate, hazard rate function))</w:t>
+        <w:t xml:space="preserve">Definition 26 (Hazard function (hazard rate, hazard rate function))</w:t>
       </w:r>
       <w:r>
         <w:t xml:space="preserve"> </w:t>
@@ -41349,7 +43965,7 @@
       <w:r>
         <w:t xml:space="preserve"> </w:t>
       </w:r>
-      <w:hyperlink r:id="rId113">
+      <w:hyperlink r:id="rId119">
         <w:r>
           <w:rPr>
             <w:rStyle w:val="Hyperlink"/>
@@ -41590,7 +44206,7 @@
         </m:oMath>
       </m:oMathPara>
     </w:p>
-    <w:bookmarkEnd w:id="114"/>
+    <w:bookmarkEnd w:id="120"/>
     <w:p>
       <w:pPr>
         <w:pStyle w:val="FirstParagraph"/>
@@ -42077,7 +44693,7 @@
           <w:rPr>
             <w:rStyle w:val="Hyperlink"/>
           </w:rPr>
-          <w:t xml:space="preserve">Definition 23</w:t>
+          <w:t xml:space="preserve">Definition 26</w:t>
         </w:r>
       </w:hyperlink>
       <w:r>
@@ -42260,7 +44876,7 @@
         <w:t xml:space="preserve">The math is identical; only the name changes with the valence of the event.</w:t>
       </w:r>
     </w:p>
-    <w:bookmarkStart w:id="116" w:name="exm-hazard-exceeds-one"/>
+    <w:bookmarkStart w:id="122" w:name="exm-hazard-exceeds-one"/>
     <w:p>
       <w:pPr>
         <w:pStyle w:val="BodyText"/>
@@ -42270,7 +44886,7 @@
           <w:b/>
           <w:bCs/>
         </w:rPr>
-        <w:t xml:space="preserve">Example 30 (A hazard greater than 1)</w:t>
+        <w:t xml:space="preserve">Example 31 (A hazard greater than 1)</w:t>
       </w:r>
       <w:r>
         <w:t xml:space="preserve"> </w:t>
@@ -42443,7 +45059,7 @@
           <w:rPr>
             <w:rStyle w:val="Hyperlink"/>
           </w:rPr>
-          <w:t xml:space="preserve">Example 29</w:t>
+          <w:t xml:space="preserve">Example 30</w:t>
         </w:r>
       </w:hyperlink>
       <w:r>
@@ -43768,7 +46384,7 @@
       <w:r>
         <w:t xml:space="preserve"> </w:t>
       </w:r>
-      <w:hyperlink r:id="rId115">
+      <w:hyperlink r:id="rId121">
         <w:r>
           <w:rPr>
             <w:rStyle w:val="Hyperlink"/>
@@ -44372,8 +46988,8 @@
         <w:t xml:space="preserve">a hazard is a rate, not a probability.</w:t>
       </w:r>
     </w:p>
-    <w:bookmarkEnd w:id="116"/>
-    <w:bookmarkStart w:id="117" w:name="def-discrete-hazard"/>
+    <w:bookmarkEnd w:id="122"/>
+    <w:bookmarkStart w:id="123" w:name="def-discrete-hazard"/>
     <w:p>
       <w:pPr>
         <w:pStyle w:val="BodyText"/>
@@ -44383,7 +46999,7 @@
           <w:b/>
           <w:bCs/>
         </w:rPr>
-        <w:t xml:space="preserve">Definition 24 (Discrete-time hazard)</w:t>
+        <w:t xml:space="preserve">Definition 27 (Discrete-time hazard)</w:t>
       </w:r>
       <w:r>
         <w:t xml:space="preserve"> </w:t>
@@ -44505,7 +47121,7 @@
       <w:r>
         <w:t xml:space="preserve"> </w:t>
       </w:r>
-      <w:hyperlink r:id="rId113">
+      <w:hyperlink r:id="rId119">
         <w:r>
           <w:rPr>
             <w:rStyle w:val="Hyperlink"/>
@@ -44625,8 +47241,8 @@
         </m:oMath>
       </m:oMathPara>
     </w:p>
-    <w:bookmarkEnd w:id="117"/>
-    <w:bookmarkStart w:id="118" w:name="exm-discrete-hazard"/>
+    <w:bookmarkEnd w:id="123"/>
+    <w:bookmarkStart w:id="124" w:name="exm-discrete-hazard"/>
     <w:p>
       <w:pPr>
         <w:pStyle w:val="FirstParagraph"/>
@@ -44636,7 +47252,7 @@
           <w:b/>
           <w:bCs/>
         </w:rPr>
-        <w:t xml:space="preserve">Example 31 (Rolling until the first six)</w:t>
+        <w:t xml:space="preserve">Example 32 (Rolling until the first six)</w:t>
       </w:r>
       <w:r>
         <w:t xml:space="preserve"> </w:t>
@@ -45370,8 +47986,8 @@
         <w:t xml:space="preserve">having gone without a six so far does not change the chance of a six on the next roll.</w:t>
       </w:r>
     </w:p>
-    <w:bookmarkEnd w:id="118"/>
-    <w:bookmarkStart w:id="119" w:name="cor-discrete-hazard-unit-interval"/>
+    <w:bookmarkEnd w:id="124"/>
+    <w:bookmarkStart w:id="125" w:name="cor-discrete-hazard-unit-interval"/>
     <w:p>
       <w:pPr>
         <w:pStyle w:val="BodyText"/>
@@ -45603,7 +48219,7 @@
         </m:oMath>
       </m:oMathPara>
     </w:p>
-    <w:bookmarkEnd w:id="119"/>
+    <w:bookmarkEnd w:id="125"/>
     <w:p>
       <w:pPr>
         <w:pStyle w:val="FirstParagraph"/>
@@ -46316,7 +48932,7 @@
           <w:rPr>
             <w:rStyle w:val="Hyperlink"/>
           </w:rPr>
-          <w:t xml:space="preserve">Example 30</w:t>
+          <w:t xml:space="preserve">Example 31</w:t>
         </w:r>
       </w:hyperlink>
       <w:r>
@@ -46329,7 +48945,7 @@
         <w:t xml:space="preserve">the discrete-time hazard is a probability.</w:t>
       </w:r>
     </w:p>
-    <w:bookmarkStart w:id="120" w:name="thm-hazard-dens-surv"/>
+    <w:bookmarkStart w:id="126" w:name="thm-hazard-dens-surv"/>
     <w:p>
       <w:pPr>
         <w:pStyle w:val="BodyText"/>
@@ -46339,7 +48955,7 @@
           <w:b/>
           <w:bCs/>
         </w:rPr>
-        <w:t xml:space="preserve">Theorem 18 (Hazard equals density over survival)</w:t>
+        <w:t xml:space="preserve">Theorem 20 (Hazard equals density over survival)</w:t>
       </w:r>
       <w:r>
         <w:t xml:space="preserve"> </w:t>
@@ -46601,7 +49217,7 @@
         </m:oMath>
       </m:oMathPara>
     </w:p>
-    <w:bookmarkEnd w:id="120"/>
+    <w:bookmarkEnd w:id="126"/>
     <w:p>
       <w:pPr>
         <w:pStyle w:val="FirstParagraph"/>
@@ -46804,7 +49420,7 @@
       <w:r>
         <w:t xml:space="preserve"> </w:t>
       </w:r>
-      <w:hyperlink r:id="rId115">
+      <w:hyperlink r:id="rId121">
         <w:r>
           <w:rPr>
             <w:rStyle w:val="Hyperlink"/>
@@ -48164,7 +50780,7 @@
         </m:oMath>
       </m:oMathPara>
     </w:p>
-    <w:bookmarkStart w:id="121" w:name="exm-exp-haz"/>
+    <w:bookmarkStart w:id="127" w:name="exm-exp-haz"/>
     <w:p>
       <w:pPr>
         <w:pStyle w:val="FirstParagraph"/>
@@ -48174,7 +50790,7 @@
           <w:b/>
           <w:bCs/>
         </w:rPr>
-        <w:t xml:space="preserve">Example 32 (Hazard function of an exponential distribution)</w:t>
+        <w:t xml:space="preserve">Example 33 (Hazard function of an exponential distribution)</w:t>
       </w:r>
       <w:r>
         <w:t xml:space="preserve"> </w:t>
@@ -48190,7 +50806,7 @@
           <w:rPr>
             <w:rStyle w:val="Hyperlink"/>
           </w:rPr>
-          <w:t xml:space="preserve">Example 29</w:t>
+          <w:t xml:space="preserve">Example 30</w:t>
         </w:r>
       </w:hyperlink>
       <w:r>
@@ -48560,7 +51176,7 @@
           <w:rPr>
             <w:rStyle w:val="Hyperlink"/>
           </w:rPr>
-          <w:t xml:space="preserve">Definition 23</w:t>
+          <w:t xml:space="preserve">Definition 26</w:t>
         </w:r>
       </w:hyperlink>
       <w:r>
@@ -48884,8 +51500,8 @@
         <w:t xml:space="preserve">.</w:t>
       </w:r>
     </w:p>
-    <w:bookmarkEnd w:id="121"/>
-    <w:bookmarkStart w:id="122" w:name="def-cuhaz"/>
+    <w:bookmarkEnd w:id="127"/>
+    <w:bookmarkStart w:id="128" w:name="def-cuhaz"/>
     <w:p>
       <w:pPr>
         <w:pStyle w:val="BodyText"/>
@@ -48895,7 +51511,7 @@
           <w:b/>
           <w:bCs/>
         </w:rPr>
-        <w:t xml:space="preserve">Definition 25 (Cumulative hazard function)</w:t>
+        <w:t xml:space="preserve">Definition 28 (Cumulative hazard function)</w:t>
       </w:r>
       <w:r>
         <w:t xml:space="preserve"> </w:t>
@@ -49149,8 +51765,8 @@
         </m:oMath>
       </m:oMathPara>
     </w:p>
-    <w:bookmarkEnd w:id="122"/>
-    <w:bookmarkStart w:id="123" w:name="exm-exp-cumhaz"/>
+    <w:bookmarkEnd w:id="128"/>
+    <w:bookmarkStart w:id="129" w:name="exm-exp-cumhaz"/>
     <w:p>
       <w:pPr>
         <w:pStyle w:val="FirstParagraph"/>
@@ -49160,7 +51776,7 @@
           <w:b/>
           <w:bCs/>
         </w:rPr>
-        <w:t xml:space="preserve">Example 33 (Cumulative hazard function of an exponential distribution)</w:t>
+        <w:t xml:space="preserve">Example 34 (Cumulative hazard function of an exponential distribution)</w:t>
       </w:r>
       <w:r>
         <w:t xml:space="preserve"> </w:t>
@@ -49176,7 +51792,7 @@
           <w:rPr>
             <w:rStyle w:val="Hyperlink"/>
           </w:rPr>
-          <w:t xml:space="preserve">Example 32</w:t>
+          <w:t xml:space="preserve">Example 33</w:t>
         </w:r>
       </w:hyperlink>
       <w:r>
@@ -49614,8 +52230,8 @@
         <w:t xml:space="preserve">.</w:t>
       </w:r>
     </w:p>
-    <w:bookmarkEnd w:id="123"/>
-    <w:bookmarkStart w:id="124" w:name="cor-cuhaz-nonneg"/>
+    <w:bookmarkEnd w:id="129"/>
+    <w:bookmarkStart w:id="130" w:name="cor-cuhaz-nonneg"/>
     <w:p>
       <w:pPr>
         <w:pStyle w:val="BodyText"/>
@@ -49853,7 +52469,7 @@
         </m:oMath>
       </m:oMathPara>
     </w:p>
-    <w:bookmarkEnd w:id="124"/>
+    <w:bookmarkEnd w:id="130"/>
     <w:p>
       <w:pPr>
         <w:pStyle w:val="FirstParagraph"/>
@@ -51526,7 +54142,7 @@
         <w:t xml:space="preserve">is the form most survival-analysis texts use.</w:t>
       </w:r>
     </w:p>
-    <w:bookmarkStart w:id="126" w:name="cor-surv-int-haz"/>
+    <w:bookmarkStart w:id="132" w:name="cor-surv-int-haz"/>
     <w:p>
       <w:pPr>
         <w:pStyle w:val="BodyText"/>
@@ -51737,7 +54353,7 @@
       <w:pPr>
         <w:pStyle w:val="BodyText"/>
       </w:pPr>
-      <w:bookmarkStart w:id="125" w:name="eq-surv-int-haz"/>
+      <w:bookmarkStart w:id="131" w:name="eq-surv-int-haz"/>
       <m:oMathPara>
         <m:oMathParaPr>
           <m:jc m:val="center"/>
@@ -51839,9 +54455,9 @@
           </m:r>
         </m:oMath>
       </m:oMathPara>
-      <w:bookmarkEnd w:id="125"/>
+      <w:bookmarkEnd w:id="131"/>
     </w:p>
-    <w:bookmarkEnd w:id="126"/>
+    <w:bookmarkEnd w:id="132"/>
     <w:p>
       <w:pPr>
         <w:pStyle w:val="FirstParagraph"/>
@@ -51929,7 +54545,7 @@
           <w:rPr>
             <w:rStyle w:val="Hyperlink"/>
           </w:rPr>
-          <w:t xml:space="preserve">Theorem 17</w:t>
+          <w:t xml:space="preserve">Theorem 19</w:t>
         </w:r>
       </w:hyperlink>
       <w:r>
@@ -53417,7 +56033,7 @@
         <w:t xml:space="preserve">.</w:t>
       </w:r>
     </w:p>
-    <w:bookmarkStart w:id="127" w:name="exm-exp-surv-int-haz"/>
+    <w:bookmarkStart w:id="133" w:name="exm-exp-surv-int-haz"/>
     <w:p>
       <w:pPr>
         <w:pStyle w:val="BodyText"/>
@@ -53427,7 +56043,7 @@
           <w:b/>
           <w:bCs/>
         </w:rPr>
-        <w:t xml:space="preserve">Example 34 (Recovering the exponential survival function from its cumulative hazard)</w:t>
+        <w:t xml:space="preserve">Example 35 (Recovering the exponential survival function from its cumulative hazard)</w:t>
       </w:r>
       <w:r>
         <w:t xml:space="preserve"> </w:t>
@@ -53443,7 +56059,7 @@
           <w:rPr>
             <w:rStyle w:val="Hyperlink"/>
           </w:rPr>
-          <w:t xml:space="preserve">Example 33</w:t>
+          <w:t xml:space="preserve">Example 34</w:t>
         </w:r>
       </w:hyperlink>
       <w:r>
@@ -53697,14 +56313,14 @@
           <w:rPr>
             <w:rStyle w:val="Hyperlink"/>
           </w:rPr>
-          <w:t xml:space="preserve">Example 29</w:t>
+          <w:t xml:space="preserve">Example 30</w:t>
         </w:r>
       </w:hyperlink>
       <w:r>
         <w:t xml:space="preserve">.</w:t>
       </w:r>
     </w:p>
-    <w:bookmarkEnd w:id="127"/>
+    <w:bookmarkEnd w:id="133"/>
     <w:tbl>
       <w:tblPr>
         <w:tblStyle w:val="Table"/>
@@ -53718,7 +56334,7 @@
       <w:tr>
         <w:tc>
           <w:tcPr/>
-          <w:bookmarkStart w:id="128" w:name="tbl-prob-dist-fns"/>
+          <w:bookmarkStart w:id="134" w:name="tbl-prob-dist-fns"/>
           <w:p>
             <w:pPr>
               <w:jc w:val="center"/>
@@ -54689,7 +57305,7 @@
               </w:tc>
             </w:tr>
           </w:tbl>
-          <w:bookmarkEnd w:id="128"/>
+          <w:bookmarkEnd w:id="134"/>
           <w:p/>
         </w:tc>
       </w:tr>
@@ -54768,7 +57384,7 @@
           <w:rPr>
             <w:rStyle w:val="Hyperlink"/>
           </w:rPr>
-          <w:t xml:space="preserve">Theorem 17</w:t>
+          <w:t xml:space="preserve">Theorem 19</w:t>
         </w:r>
       </w:hyperlink>
     </w:p>
@@ -54785,7 +57401,7 @@
           <w:rPr>
             <w:rStyle w:val="Hyperlink"/>
           </w:rPr>
-          <w:t xml:space="preserve">Theorem 18</w:t>
+          <w:t xml:space="preserve">Theorem 20</w:t>
         </w:r>
       </w:hyperlink>
     </w:p>
@@ -55655,8 +58271,8 @@
         </m:oMath>
       </m:oMathPara>
     </w:p>
-    <w:bookmarkEnd w:id="129"/>
-    <w:bookmarkStart w:id="175" w:name="references"/>
+    <w:bookmarkEnd w:id="135"/>
+    <w:bookmarkStart w:id="181" w:name="references"/>
     <w:p>
       <w:pPr>
         <w:pStyle w:val="Heading2"/>
@@ -55665,8 +58281,8 @@
         <w:t xml:space="preserve">References</w:t>
       </w:r>
     </w:p>
-    <w:bookmarkStart w:id="174" w:name="refs"/>
-    <w:bookmarkStart w:id="131" w:name="ref-wikipedia_random_variable"/>
+    <w:bookmarkStart w:id="180" w:name="refs"/>
+    <w:bookmarkStart w:id="137" w:name="ref-wikipedia_random_variable"/>
     <w:p>
       <w:pPr>
         <w:pStyle w:val="Bibliography"/>
@@ -55713,7 +58329,7 @@
       <w:r>
         <w:t xml:space="preserve"> </w:t>
       </w:r>
-      <w:hyperlink r:id="rId130">
+      <w:hyperlink r:id="rId136">
         <w:r>
           <w:rPr>
             <w:rStyle w:val="Hyperlink"/>
@@ -55722,8 +58338,8 @@
         </w:r>
       </w:hyperlink>
     </w:p>
-    <w:bookmarkEnd w:id="131"/>
-    <w:bookmarkStart w:id="133" w:name="ref-wikipedia_probability_mass_function"/>
+    <w:bookmarkEnd w:id="137"/>
+    <w:bookmarkStart w:id="139" w:name="ref-wikipedia_probability_mass_function"/>
     <w:p>
       <w:pPr>
         <w:pStyle w:val="Bibliography"/>
@@ -55770,7 +58386,7 @@
       <w:r>
         <w:t xml:space="preserve"> </w:t>
       </w:r>
-      <w:hyperlink r:id="rId132">
+      <w:hyperlink r:id="rId138">
         <w:r>
           <w:rPr>
             <w:rStyle w:val="Hyperlink"/>
@@ -55779,8 +58395,8 @@
         </w:r>
       </w:hyperlink>
     </w:p>
-    <w:bookmarkEnd w:id="133"/>
-    <w:bookmarkStart w:id="135" w:name="ref-wikipedia_bernoulli_distribution"/>
+    <w:bookmarkEnd w:id="139"/>
+    <w:bookmarkStart w:id="141" w:name="ref-wikipedia_bernoulli_distribution"/>
     <w:p>
       <w:pPr>
         <w:pStyle w:val="Bibliography"/>
@@ -55827,7 +58443,7 @@
       <w:r>
         <w:t xml:space="preserve"> </w:t>
       </w:r>
-      <w:hyperlink r:id="rId134">
+      <w:hyperlink r:id="rId140">
         <w:r>
           <w:rPr>
             <w:rStyle w:val="Hyperlink"/>
@@ -55836,8 +58452,8 @@
         </w:r>
       </w:hyperlink>
     </w:p>
-    <w:bookmarkEnd w:id="135"/>
-    <w:bookmarkStart w:id="137" w:name="X284569a1076713b35b76605781ea41e303e6132"/>
+    <w:bookmarkEnd w:id="141"/>
+    <w:bookmarkStart w:id="143" w:name="X284569a1076713b35b76605781ea41e303e6132"/>
     <w:p>
       <w:pPr>
         <w:pStyle w:val="Bibliography"/>
@@ -55884,7 +58500,7 @@
       <w:r>
         <w:t xml:space="preserve"> </w:t>
       </w:r>
-      <w:hyperlink r:id="rId136">
+      <w:hyperlink r:id="rId142">
         <w:r>
           <w:rPr>
             <w:rStyle w:val="Hyperlink"/>
@@ -55893,8 +58509,8 @@
         </w:r>
       </w:hyperlink>
     </w:p>
-    <w:bookmarkEnd w:id="137"/>
-    <w:bookmarkStart w:id="139" w:name="X8e40b323e1cebef129773974979d417183cf94f"/>
+    <w:bookmarkEnd w:id="143"/>
+    <w:bookmarkStart w:id="145" w:name="X8e40b323e1cebef129773974979d417183cf94f"/>
     <w:p>
       <w:pPr>
         <w:pStyle w:val="Bibliography"/>
@@ -55941,7 +58557,7 @@
       <w:r>
         <w:t xml:space="preserve"> </w:t>
       </w:r>
-      <w:hyperlink r:id="rId138">
+      <w:hyperlink r:id="rId144">
         <w:r>
           <w:rPr>
             <w:rStyle w:val="Hyperlink"/>
@@ -55950,8 +58566,8 @@
         </w:r>
       </w:hyperlink>
     </w:p>
-    <w:bookmarkEnd w:id="139"/>
-    <w:bookmarkStart w:id="141" w:name="ref-wikipedia_normal_distribution"/>
+    <w:bookmarkEnd w:id="145"/>
+    <w:bookmarkStart w:id="147" w:name="ref-wikipedia_normal_distribution"/>
     <w:p>
       <w:pPr>
         <w:pStyle w:val="Bibliography"/>
@@ -55998,7 +58614,7 @@
       <w:r>
         <w:t xml:space="preserve"> </w:t>
       </w:r>
-      <w:hyperlink r:id="rId140">
+      <w:hyperlink r:id="rId146">
         <w:r>
           <w:rPr>
             <w:rStyle w:val="Hyperlink"/>
@@ -56007,8 +58623,8 @@
         </w:r>
       </w:hyperlink>
     </w:p>
-    <w:bookmarkEnd w:id="141"/>
-    <w:bookmarkStart w:id="143" w:name="ref-CaseBerg01"/>
+    <w:bookmarkEnd w:id="147"/>
+    <w:bookmarkStart w:id="149" w:name="ref-CaseBerg01"/>
     <w:p>
       <w:pPr>
         <w:pStyle w:val="Bibliography"/>
@@ -56041,7 +58657,7 @@
       <w:r>
         <w:t xml:space="preserve"> </w:t>
       </w:r>
-      <w:hyperlink r:id="rId142">
+      <w:hyperlink r:id="rId148">
         <w:r>
           <w:rPr>
             <w:rStyle w:val="Hyperlink"/>
@@ -56050,8 +58666,8 @@
         </w:r>
       </w:hyperlink>
     </w:p>
-    <w:bookmarkEnd w:id="143"/>
-    <w:bookmarkStart w:id="145" w:name="ref-wikipedia_exponential_distribution"/>
+    <w:bookmarkEnd w:id="149"/>
+    <w:bookmarkStart w:id="151" w:name="ref-wikipedia_exponential_distribution"/>
     <w:p>
       <w:pPr>
         <w:pStyle w:val="Bibliography"/>
@@ -56098,7 +58714,7 @@
       <w:r>
         <w:t xml:space="preserve"> </w:t>
       </w:r>
-      <w:hyperlink r:id="rId144">
+      <w:hyperlink r:id="rId150">
         <w:r>
           <w:rPr>
             <w:rStyle w:val="Hyperlink"/>
@@ -56107,8 +58723,8 @@
         </w:r>
       </w:hyperlink>
     </w:p>
-    <w:bookmarkEnd w:id="145"/>
-    <w:bookmarkStart w:id="147" w:name="X94f7c881ef14f58a67183d1131099bc3b3af124"/>
+    <w:bookmarkEnd w:id="151"/>
+    <w:bookmarkStart w:id="153" w:name="X94f7c881ef14f58a67183d1131099bc3b3af124"/>
     <w:p>
       <w:pPr>
         <w:pStyle w:val="Bibliography"/>
@@ -56155,7 +58771,7 @@
       <w:r>
         <w:t xml:space="preserve"> </w:t>
       </w:r>
-      <w:hyperlink r:id="rId146">
+      <w:hyperlink r:id="rId152">
         <w:r>
           <w:rPr>
             <w:rStyle w:val="Hyperlink"/>
@@ -56164,8 +58780,8 @@
         </w:r>
       </w:hyperlink>
     </w:p>
-    <w:bookmarkEnd w:id="147"/>
-    <w:bookmarkStart w:id="148" w:name="ref-billingsley1995probability"/>
+    <w:bookmarkEnd w:id="153"/>
+    <w:bookmarkStart w:id="154" w:name="ref-billingsley1995probability"/>
     <w:p>
       <w:pPr>
         <w:pStyle w:val="Bibliography"/>
@@ -56196,8 +58812,8 @@
         <w:t xml:space="preserve">, 3rd ed. in Wiley series in probability and mathematical statistics. New York: Wiley, 1995.</w:t>
       </w:r>
     </w:p>
-    <w:bookmarkEnd w:id="148"/>
-    <w:bookmarkStart w:id="150" w:name="ref-wikipedia_quantile_function"/>
+    <w:bookmarkEnd w:id="154"/>
+    <w:bookmarkStart w:id="156" w:name="ref-wikipedia_quantile_function"/>
     <w:p>
       <w:pPr>
         <w:pStyle w:val="Bibliography"/>
@@ -56244,7 +58860,7 @@
       <w:r>
         <w:t xml:space="preserve"> </w:t>
       </w:r>
-      <w:hyperlink r:id="rId149">
+      <w:hyperlink r:id="rId155">
         <w:r>
           <w:rPr>
             <w:rStyle w:val="Hyperlink"/>
@@ -56253,8 +58869,8 @@
         </w:r>
       </w:hyperlink>
     </w:p>
-    <w:bookmarkEnd w:id="150"/>
-    <w:bookmarkStart w:id="151" w:name="ref-me4"/>
+    <w:bookmarkEnd w:id="156"/>
+    <w:bookmarkStart w:id="157" w:name="ref-me4"/>
     <w:p>
       <w:pPr>
         <w:pStyle w:val="Bibliography"/>
@@ -56285,8 +58901,8 @@
         <w:t xml:space="preserve">, Fourth edition. Philadelphia: Wolters Kluwer, 2021.</w:t>
       </w:r>
     </w:p>
-    <w:bookmarkEnd w:id="151"/>
-    <w:bookmarkStart w:id="153" w:name="Xaf27294aed242081dab0bdcf1e3d8373c0fed17"/>
+    <w:bookmarkEnd w:id="157"/>
+    <w:bookmarkStart w:id="159" w:name="Xaf27294aed242081dab0bdcf1e3d8373c0fed17"/>
     <w:p>
       <w:pPr>
         <w:pStyle w:val="Bibliography"/>
@@ -56333,7 +58949,7 @@
       <w:r>
         <w:t xml:space="preserve"> </w:t>
       </w:r>
-      <w:hyperlink r:id="rId152">
+      <w:hyperlink r:id="rId158">
         <w:r>
           <w:rPr>
             <w:rStyle w:val="Hyperlink"/>
@@ -56342,8 +58958,8 @@
         </w:r>
       </w:hyperlink>
     </w:p>
-    <w:bookmarkEnd w:id="153"/>
-    <w:bookmarkStart w:id="155" w:name="ref-wikipedia_marginal_distribution"/>
+    <w:bookmarkEnd w:id="159"/>
+    <w:bookmarkStart w:id="161" w:name="ref-wikipedia_marginal_distribution"/>
     <w:p>
       <w:pPr>
         <w:pStyle w:val="Bibliography"/>
@@ -56390,7 +59006,7 @@
       <w:r>
         <w:t xml:space="preserve"> </w:t>
       </w:r>
-      <w:hyperlink r:id="rId154">
+      <w:hyperlink r:id="rId160">
         <w:r>
           <w:rPr>
             <w:rStyle w:val="Hyperlink"/>
@@ -56399,8 +59015,8 @@
         </w:r>
       </w:hyperlink>
     </w:p>
-    <w:bookmarkEnd w:id="155"/>
-    <w:bookmarkStart w:id="156" w:name="ref-hutchinson2024data471"/>
+    <w:bookmarkEnd w:id="161"/>
+    <w:bookmarkStart w:id="162" w:name="ref-hutchinson2024data471"/>
     <w:p>
       <w:pPr>
         <w:pStyle w:val="Bibliography"/>
@@ -56439,8 +59055,8 @@
         <w:t xml:space="preserve">Western Washington University, 2024.</w:t>
       </w:r>
     </w:p>
-    <w:bookmarkEnd w:id="156"/>
-    <w:bookmarkStart w:id="158" w:name="ref-hutchinson_wwu_ml_videos"/>
+    <w:bookmarkEnd w:id="162"/>
+    <w:bookmarkStart w:id="164" w:name="ref-hutchinson_wwu_ml_videos"/>
     <w:p>
       <w:pPr>
         <w:pStyle w:val="Bibliography"/>
@@ -56493,7 +59109,7 @@
       <w:r>
         <w:t xml:space="preserve"> </w:t>
       </w:r>
-      <w:hyperlink r:id="rId157">
+      <w:hyperlink r:id="rId163">
         <w:r>
           <w:rPr>
             <w:rStyle w:val="Hyperlink"/>
@@ -56502,8 +59118,8 @@
         </w:r>
       </w:hyperlink>
     </w:p>
-    <w:bookmarkEnd w:id="158"/>
-    <w:bookmarkStart w:id="160" w:name="ref-fiveminuteai_probstat"/>
+    <w:bookmarkEnd w:id="164"/>
+    <w:bookmarkStart w:id="166" w:name="ref-fiveminuteai_probstat"/>
     <w:p>
       <w:pPr>
         <w:pStyle w:val="Bibliography"/>
@@ -56535,7 +59151,7 @@
       <w:r>
         <w:t xml:space="preserve"> </w:t>
       </w:r>
-      <w:hyperlink r:id="rId159">
+      <w:hyperlink r:id="rId165">
         <w:r>
           <w:rPr>
             <w:rStyle w:val="Hyperlink"/>
@@ -56544,8 +59160,8 @@
         </w:r>
       </w:hyperlink>
     </w:p>
-    <w:bookmarkEnd w:id="160"/>
-    <w:bookmarkStart w:id="162" w:name="ref-wikipedia_survival_function"/>
+    <w:bookmarkEnd w:id="166"/>
+    <w:bookmarkStart w:id="168" w:name="ref-wikipedia_survival_function"/>
     <w:p>
       <w:pPr>
         <w:pStyle w:val="Bibliography"/>
@@ -56592,7 +59208,7 @@
       <w:r>
         <w:t xml:space="preserve"> </w:t>
       </w:r>
-      <w:hyperlink r:id="rId161">
+      <w:hyperlink r:id="rId167">
         <w:r>
           <w:rPr>
             <w:rStyle w:val="Hyperlink"/>
@@ -56601,8 +59217,8 @@
         </w:r>
       </w:hyperlink>
     </w:p>
-    <w:bookmarkEnd w:id="162"/>
-    <w:bookmarkStart w:id="164" w:name="ref-wikipedia_failure_rate"/>
+    <w:bookmarkEnd w:id="168"/>
+    <w:bookmarkStart w:id="170" w:name="ref-wikipedia_failure_rate"/>
     <w:p>
       <w:pPr>
         <w:pStyle w:val="Bibliography"/>
@@ -56649,7 +59265,7 @@
       <w:r>
         <w:t xml:space="preserve"> </w:t>
       </w:r>
-      <w:hyperlink r:id="rId163">
+      <w:hyperlink r:id="rId169">
         <w:r>
           <w:rPr>
             <w:rStyle w:val="Hyperlink"/>
@@ -56658,8 +59274,8 @@
         </w:r>
       </w:hyperlink>
     </w:p>
-    <w:bookmarkEnd w:id="164"/>
-    <w:bookmarkStart w:id="166" w:name="ref-dobson4e"/>
+    <w:bookmarkEnd w:id="170"/>
+    <w:bookmarkStart w:id="172" w:name="ref-dobson4e"/>
     <w:p>
       <w:pPr>
         <w:pStyle w:val="Bibliography"/>
@@ -56692,7 +59308,7 @@
       <w:r>
         <w:t xml:space="preserve"> </w:t>
       </w:r>
-      <w:hyperlink r:id="rId165">
+      <w:hyperlink r:id="rId171">
         <w:r>
           <w:rPr>
             <w:rStyle w:val="Hyperlink"/>
@@ -56704,8 +59320,8 @@
         <w:t xml:space="preserve">.</w:t>
       </w:r>
     </w:p>
-    <w:bookmarkEnd w:id="166"/>
-    <w:bookmarkStart w:id="168" w:name="ref-vittinghoff2e"/>
+    <w:bookmarkEnd w:id="172"/>
+    <w:bookmarkStart w:id="174" w:name="ref-vittinghoff2e"/>
     <w:p>
       <w:pPr>
         <w:pStyle w:val="Bibliography"/>
@@ -56738,7 +59354,7 @@
       <w:r>
         <w:t xml:space="preserve"> </w:t>
       </w:r>
-      <w:hyperlink r:id="rId167">
+      <w:hyperlink r:id="rId173">
         <w:r>
           <w:rPr>
             <w:rStyle w:val="Hyperlink"/>
@@ -56750,8 +59366,8 @@
         <w:t xml:space="preserve">.</w:t>
       </w:r>
     </w:p>
-    <w:bookmarkEnd w:id="168"/>
-    <w:bookmarkStart w:id="170" w:name="ref-klein2003survival"/>
+    <w:bookmarkEnd w:id="174"/>
+    <w:bookmarkStart w:id="176" w:name="ref-klein2003survival"/>
     <w:p>
       <w:pPr>
         <w:pStyle w:val="Bibliography"/>
@@ -56784,7 +59400,7 @@
       <w:r>
         <w:t xml:space="preserve"> </w:t>
       </w:r>
-      <w:hyperlink r:id="rId169">
+      <w:hyperlink r:id="rId175">
         <w:r>
           <w:rPr>
             <w:rStyle w:val="Hyperlink"/>
@@ -56793,8 +59409,8 @@
         </w:r>
       </w:hyperlink>
     </w:p>
-    <w:bookmarkEnd w:id="170"/>
-    <w:bookmarkStart w:id="172" w:name="ref-kleinbaum2012survival"/>
+    <w:bookmarkEnd w:id="176"/>
+    <w:bookmarkStart w:id="178" w:name="ref-kleinbaum2012survival"/>
     <w:p>
       <w:pPr>
         <w:pStyle w:val="Bibliography"/>
@@ -56827,7 +59443,7 @@
       <w:r>
         <w:t xml:space="preserve"> </w:t>
       </w:r>
-      <w:hyperlink r:id="rId171">
+      <w:hyperlink r:id="rId177">
         <w:r>
           <w:rPr>
             <w:rStyle w:val="Hyperlink"/>
@@ -56836,8 +59452,8 @@
         </w:r>
       </w:hyperlink>
     </w:p>
-    <w:bookmarkEnd w:id="172"/>
-    <w:bookmarkStart w:id="173" w:name="ref-kalbfleisch2011statistical"/>
+    <w:bookmarkEnd w:id="178"/>
+    <w:bookmarkStart w:id="179" w:name="ref-kalbfleisch2011statistical"/>
     <w:p>
       <w:pPr>
         <w:pStyle w:val="Bibliography"/>
@@ -56868,9 +59484,9 @@
         <w:t xml:space="preserve">. John Wiley &amp; Sons, 2011.</w:t>
       </w:r>
     </w:p>
-    <w:bookmarkEnd w:id="173"/>
-    <w:bookmarkEnd w:id="174"/>
-    <w:bookmarkEnd w:id="175"/>
+    <w:bookmarkEnd w:id="179"/>
+    <w:bookmarkEnd w:id="180"/>
+    <w:bookmarkEnd w:id="181"/>
     <w:sectPr>
       <w:footnotePr>
         <w:numRestart w:val="eachSect"/>

</xml_diff>

<commit_message>
Deploying to gh-pages from @ Morrison-Lab/pds@a001b95d22496838760541740ec91f00317f795a 🚀
</commit_message>
<xml_diff>
--- a/random-variables.docx
+++ b/random-variables.docx
@@ -15,7 +15,7 @@
         <w:pStyle w:val="Date"/>
       </w:pPr>
       <w:r>
-        <w:t xml:space="preserve">Last modified: 2026-10-29 15:25:58 (PDT)</w:t>
+        <w:t xml:space="preserve">Last modified: 2026-10-29 17:09:23 (PDT)</w:t>
       </w:r>
     </w:p>
     <w:bookmarkStart w:id="26" w:name="sec-random-variables"/>
@@ -5197,7 +5197,7 @@
     </w:p>
     <w:bookmarkEnd w:id="25"/>
     <w:bookmarkEnd w:id="26"/>
-    <w:bookmarkStart w:id="115" w:name="X07e058d1329d8fa48179146f153d016c4f9ff9a"/>
+    <w:bookmarkStart w:id="116" w:name="X07e058d1329d8fa48179146f153d016c4f9ff9a"/>
     <w:p>
       <w:pPr>
         <w:pStyle w:val="Heading2"/>
@@ -37539,7 +37539,7 @@
     </w:p>
     <w:bookmarkEnd w:id="98"/>
     <w:bookmarkEnd w:id="99"/>
-    <w:bookmarkStart w:id="114" w:name="sec-continuous-distributions"/>
+    <w:bookmarkStart w:id="115" w:name="sec-continuous-distributions"/>
     <w:p>
       <w:pPr>
         <w:pStyle w:val="Heading3"/>
@@ -39604,7 +39604,7 @@
         <w:t xml:space="preserve">gives the formula.</w:t>
       </w:r>
     </w:p>
-    <w:bookmarkStart w:id="104" w:name="def-mode"/>
+    <w:bookmarkStart w:id="105" w:name="def-mode"/>
     <w:p>
       <w:pPr>
         <w:pStyle w:val="BodyText"/>
@@ -39620,23 +39620,38 @@
         <w:t xml:space="preserve"> </w:t>
       </w:r>
       <w:r>
-        <w:t xml:space="preserve">A</w:t>
-      </w:r>
-      <w:r>
-        <w:t xml:space="preserve"> </w:t>
-      </w:r>
-      <w:r>
-        <w:rPr>
-          <w:b/>
-          <w:bCs/>
-        </w:rPr>
-        <w:t xml:space="preserve">mode</w:t>
-      </w:r>
-      <w:r>
-        <w:t xml:space="preserve"> </w:t>
-      </w:r>
-      <w:r>
-        <w:t xml:space="preserve">of a</w:t>
+        <w:t xml:space="preserve">Let</w:t>
+      </w:r>
+      <w:r>
+        <w:t xml:space="preserve"> </w:t>
+      </w:r>
+      <m:oMath>
+        <m:r>
+          <m:t>X</m:t>
+        </m:r>
+      </m:oMath>
+      <w:r>
+        <w:t xml:space="preserve"> </w:t>
+      </w:r>
+      <w:r>
+        <w:t xml:space="preserve">be a</w:t>
+      </w:r>
+      <w:r>
+        <w:t xml:space="preserve"> </w:t>
+      </w:r>
+      <w:hyperlink w:anchor="def-random-variable">
+        <w:r>
+          <w:rPr>
+            <w:rStyle w:val="Hyperlink"/>
+          </w:rPr>
+          <w:t xml:space="preserve">random variable</w:t>
+        </w:r>
+      </w:hyperlink>
+      <w:r>
+        <w:t xml:space="preserve"> </w:t>
+      </w:r>
+      <w:r>
+        <w:t xml:space="preserve">with</w:t>
       </w:r>
       <w:r>
         <w:t xml:space="preserve"> </w:t>
@@ -39675,15 +39690,725 @@
         </m:r>
       </m:oMath>
       <w:r>
-        <w:t xml:space="preserve"> </w:t>
-      </w:r>
-      <w:r>
-        <w:t xml:space="preserve">is a value</w:t>
-      </w:r>
-      <w:r>
-        <w:t xml:space="preserve"> </w:t>
-      </w:r>
-      <m:oMath>
+        <w:t xml:space="preserve">.</w:t>
+      </w:r>
+      <w:r>
+        <w:t xml:space="preserve"> </w:t>
+      </w:r>
+      <w:r>
+        <w:t xml:space="preserve">The</w:t>
+      </w:r>
+      <w:r>
+        <w:t xml:space="preserve"> </w:t>
+      </w:r>
+      <w:r>
+        <w:rPr>
+          <w:b/>
+          <w:bCs/>
+        </w:rPr>
+        <w:t xml:space="preserve">modes</w:t>
+      </w:r>
+      <w:r>
+        <w:t xml:space="preserve"> </w:t>
+      </w:r>
+      <w:r>
+        <w:t xml:space="preserve">of</w:t>
+      </w:r>
+      <w:r>
+        <w:t xml:space="preserve"> </w:t>
+      </w:r>
+      <m:oMath>
+        <m:r>
+          <m:t>f</m:t>
+        </m:r>
+      </m:oMath>
+      <w:r>
+        <w:t xml:space="preserve"> </w:t>
+      </w:r>
+      <w:r>
+        <w:t xml:space="preserve">are the elements of the</w:t>
+      </w:r>
+      <w:r>
+        <w:t xml:space="preserve"> </w:t>
+      </w:r>
+      <w:hyperlink r:id="rId104">
+        <w:r>
+          <w:rPr>
+            <w:rStyle w:val="Hyperlink"/>
+          </w:rPr>
+          <w:t xml:space="preserve">argmax</w:t>
+        </w:r>
+      </w:hyperlink>
+      <w:r>
+        <w:t xml:space="preserve"> </w:t>
+      </w:r>
+      <w:r>
+        <w:t xml:space="preserve">of</w:t>
+      </w:r>
+      <w:r>
+        <w:t xml:space="preserve"> </w:t>
+      </w:r>
+      <m:oMath>
+        <m:r>
+          <m:t>f</m:t>
+        </m:r>
+      </m:oMath>
+      <w:r>
+        <w:t xml:space="preserve"> </w:t>
+      </w:r>
+      <w:r>
+        <w:t xml:space="preserve">over the</w:t>
+      </w:r>
+      <w:r>
+        <w:t xml:space="preserve"> </w:t>
+      </w:r>
+      <w:hyperlink w:anchor="def-range">
+        <w:r>
+          <w:rPr>
+            <w:rStyle w:val="Hyperlink"/>
+          </w:rPr>
+          <w:t xml:space="preserve">range</w:t>
+        </w:r>
+      </w:hyperlink>
+      <w:r>
+        <w:t xml:space="preserve"> </w:t>
+      </w:r>
+      <w:r>
+        <w:t xml:space="preserve">of</w:t>
+      </w:r>
+      <w:r>
+        <w:t xml:space="preserve"> </w:t>
+      </w:r>
+      <m:oMath>
+        <m:r>
+          <m:t>X</m:t>
+        </m:r>
+      </m:oMath>
+      <w:r>
+        <w:t xml:space="preserve">:</w:t>
+      </w:r>
+    </w:p>
+    <w:p>
+      <w:pPr>
+        <w:pStyle w:val="BodyText"/>
+      </w:pPr>
+      <m:oMathPara>
+        <m:oMathParaPr>
+          <m:jc m:val="center"/>
+        </m:oMathParaPr>
+        <m:oMath>
+          <m:r>
+            <m:rPr>
+              <m:sty m:val="p"/>
+            </m:rPr>
+            <m:t>mode</m:t>
+          </m:r>
+          <m:r>
+            <m:t>​</m:t>
+          </m:r>
+          <m:d>
+            <m:dPr>
+              <m:begChr m:val="("/>
+              <m:sepChr m:val=""/>
+              <m:endChr m:val=")"/>
+              <m:grow/>
+            </m:dPr>
+            <m:e>
+              <m:r>
+                <m:t>f</m:t>
+              </m:r>
+            </m:e>
+          </m:d>
+          <m:r>
+            <m:t>​</m:t>
+          </m:r>
+          <m:r>
+            <m:rPr>
+              <m:sty m:val="p"/>
+            </m:rPr>
+            <m:t>=</m:t>
+          </m:r>
+          <m:r>
+            <m:rPr>
+              <m:sty m:val="p"/>
+            </m:rPr>
+            <m:t>arg</m:t>
+          </m:r>
+          <m:limLow>
+            <m:e>
+              <m:r>
+                <m:rPr>
+                  <m:sty m:val="p"/>
+                </m:rPr>
+                <m:t>max</m:t>
+              </m:r>
+            </m:e>
+            <m:lim>
+              <m:r>
+                <m:t>x</m:t>
+              </m:r>
+              <m:r>
+                <m:rPr>
+                  <m:sty m:val="p"/>
+                </m:rPr>
+                <m:t>∈</m:t>
+              </m:r>
+              <m:r>
+                <m:rPr>
+                  <m:scr m:val="script"/>
+                  <m:sty m:val="p"/>
+                </m:rPr>
+                <m:t>R</m:t>
+              </m:r>
+              <m:r>
+                <m:rPr>
+                  <m:sty m:val="p"/>
+                </m:rPr>
+                <m:t>(</m:t>
+              </m:r>
+              <m:r>
+                <m:t>X</m:t>
+              </m:r>
+              <m:r>
+                <m:rPr>
+                  <m:sty m:val="p"/>
+                </m:rPr>
+                <m:t>)</m:t>
+              </m:r>
+            </m:lim>
+          </m:limLow>
+          <m:r>
+            <m:t>f</m:t>
+          </m:r>
+          <m:r>
+            <m:rPr>
+              <m:sty m:val="p"/>
+            </m:rPr>
+            <m:t>(</m:t>
+          </m:r>
+          <m:r>
+            <m:t>x</m:t>
+          </m:r>
+          <m:r>
+            <m:rPr>
+              <m:sty m:val="p"/>
+            </m:rPr>
+            <m:t>)</m:t>
+          </m:r>
+          <m:r>
+            <m:rPr>
+              <m:sty m:val="p"/>
+            </m:rPr>
+            <m:t>.</m:t>
+          </m:r>
+        </m:oMath>
+      </m:oMathPara>
+    </w:p>
+    <w:p>
+      <w:pPr>
+        <w:pStyle w:val="FirstParagraph"/>
+      </w:pPr>
+      <w:r>
+        <w:t xml:space="preserve">A</w:t>
+      </w:r>
+      <w:r>
+        <w:t xml:space="preserve"> </w:t>
+      </w:r>
+      <w:r>
+        <w:rPr>
+          <w:b/>
+          <w:bCs/>
+        </w:rPr>
+        <w:t xml:space="preserve">mode</w:t>
+      </w:r>
+      <w:r>
+        <w:t xml:space="preserve"> </w:t>
+      </w:r>
+      <w:r>
+        <w:t xml:space="preserve">of</w:t>
+      </w:r>
+      <w:r>
+        <w:t xml:space="preserve"> </w:t>
+      </w:r>
+      <m:oMath>
+        <m:r>
+          <m:t>f</m:t>
+        </m:r>
+      </m:oMath>
+      <w:r>
+        <w:t xml:space="preserve"> </w:t>
+      </w:r>
+      <w:r>
+        <w:t xml:space="preserve">is an element of</w:t>
+      </w:r>
+      <w:r>
+        <w:t xml:space="preserve"> </w:t>
+      </w:r>
+      <m:oMath>
+        <m:r>
+          <m:rPr>
+            <m:sty m:val="p"/>
+          </m:rPr>
+          <m:t>mode</m:t>
+        </m:r>
+        <m:r>
+          <m:t>​</m:t>
+        </m:r>
+        <m:d>
+          <m:dPr>
+            <m:begChr m:val="("/>
+            <m:sepChr m:val=""/>
+            <m:endChr m:val=")"/>
+            <m:grow/>
+          </m:dPr>
+          <m:e>
+            <m:r>
+              <m:t>f</m:t>
+            </m:r>
+          </m:e>
+        </m:d>
+        <m:r>
+          <m:t>​</m:t>
+        </m:r>
+      </m:oMath>
+      <w:r>
+        <w:t xml:space="preserve">.</w:t>
+      </w:r>
+    </w:p>
+    <w:bookmarkEnd w:id="105"/>
+    <w:bookmarkStart w:id="106" w:name="thm-kernel-same-mode"/>
+    <w:p>
+      <w:pPr>
+        <w:pStyle w:val="BodyText"/>
+      </w:pPr>
+      <w:r>
+        <w:rPr>
+          <w:b/>
+          <w:bCs/>
+        </w:rPr>
+        <w:t xml:space="preserve">Theorem 18 (A density and its kernel have the same modes)</w:t>
+      </w:r>
+      <w:r>
+        <w:t xml:space="preserve"> </w:t>
+      </w:r>
+      <w:r>
+        <w:t xml:space="preserve">If</w:t>
+      </w:r>
+      <w:r>
+        <w:t xml:space="preserve"> </w:t>
+      </w:r>
+      <m:oMath>
+        <m:r>
+          <m:t>g</m:t>
+        </m:r>
+      </m:oMath>
+      <w:r>
+        <w:t xml:space="preserve"> </w:t>
+      </w:r>
+      <w:r>
+        <w:t xml:space="preserve">is a</w:t>
+      </w:r>
+      <w:r>
+        <w:t xml:space="preserve"> </w:t>
+      </w:r>
+      <w:hyperlink w:anchor="def-kernel">
+        <w:r>
+          <w:rPr>
+            <w:rStyle w:val="Hyperlink"/>
+          </w:rPr>
+          <w:t xml:space="preserve">kernel of the density</w:t>
+        </w:r>
+      </w:hyperlink>
+      <w:r>
+        <w:t xml:space="preserve"> </w:t>
+      </w:r>
+      <m:oMath>
+        <m:r>
+          <m:t>f</m:t>
+        </m:r>
+      </m:oMath>
+      <w:r>
+        <w:t xml:space="preserve"> </w:t>
+      </w:r>
+      <w:r>
+        <w:t xml:space="preserve">of a</w:t>
+      </w:r>
+      <w:r>
+        <w:t xml:space="preserve"> </w:t>
+      </w:r>
+      <w:hyperlink w:anchor="def-random-variable">
+        <w:r>
+          <w:rPr>
+            <w:rStyle w:val="Hyperlink"/>
+          </w:rPr>
+          <w:t xml:space="preserve">random variable</w:t>
+        </w:r>
+      </w:hyperlink>
+      <w:r>
+        <w:t xml:space="preserve"> </w:t>
+      </w:r>
+      <m:oMath>
+        <m:r>
+          <m:t>X</m:t>
+        </m:r>
+      </m:oMath>
+      <w:r>
+        <w:t xml:space="preserve">,</w:t>
+      </w:r>
+      <w:r>
+        <w:t xml:space="preserve"> </w:t>
+      </w:r>
+      <w:r>
+        <w:t xml:space="preserve">then the</w:t>
+      </w:r>
+      <w:r>
+        <w:t xml:space="preserve"> </w:t>
+      </w:r>
+      <w:hyperlink w:anchor="def-mode">
+        <w:r>
+          <w:rPr>
+            <w:rStyle w:val="Hyperlink"/>
+          </w:rPr>
+          <w:t xml:space="preserve">modes</w:t>
+        </w:r>
+      </w:hyperlink>
+      <w:r>
+        <w:t xml:space="preserve"> </w:t>
+      </w:r>
+      <w:r>
+        <w:t xml:space="preserve">of</w:t>
+      </w:r>
+      <w:r>
+        <w:t xml:space="preserve"> </w:t>
+      </w:r>
+      <m:oMath>
+        <m:r>
+          <m:t>f</m:t>
+        </m:r>
+      </m:oMath>
+      <w:r>
+        <w:t xml:space="preserve"> </w:t>
+      </w:r>
+      <w:r>
+        <w:t xml:space="preserve">are the elements of the</w:t>
+      </w:r>
+      <w:r>
+        <w:t xml:space="preserve"> </w:t>
+      </w:r>
+      <w:hyperlink r:id="rId104">
+        <w:r>
+          <w:rPr>
+            <w:rStyle w:val="Hyperlink"/>
+          </w:rPr>
+          <w:t xml:space="preserve">argmax</w:t>
+        </w:r>
+      </w:hyperlink>
+      <w:r>
+        <w:t xml:space="preserve"> </w:t>
+      </w:r>
+      <w:r>
+        <w:t xml:space="preserve">of</w:t>
+      </w:r>
+      <w:r>
+        <w:t xml:space="preserve"> </w:t>
+      </w:r>
+      <m:oMath>
+        <m:r>
+          <m:t>g</m:t>
+        </m:r>
+      </m:oMath>
+      <w:r>
+        <w:t xml:space="preserve"> </w:t>
+      </w:r>
+      <w:r>
+        <w:t xml:space="preserve">over the</w:t>
+      </w:r>
+      <w:r>
+        <w:t xml:space="preserve"> </w:t>
+      </w:r>
+      <w:hyperlink w:anchor="def-range">
+        <w:r>
+          <w:rPr>
+            <w:rStyle w:val="Hyperlink"/>
+          </w:rPr>
+          <w:t xml:space="preserve">range</w:t>
+        </w:r>
+      </w:hyperlink>
+      <w:r>
+        <w:t xml:space="preserve"> </w:t>
+      </w:r>
+      <w:r>
+        <w:t xml:space="preserve">of</w:t>
+      </w:r>
+      <w:r>
+        <w:t xml:space="preserve"> </w:t>
+      </w:r>
+      <m:oMath>
+        <m:r>
+          <m:t>X</m:t>
+        </m:r>
+      </m:oMath>
+      <w:r>
+        <w:t xml:space="preserve">:</w:t>
+      </w:r>
+    </w:p>
+    <w:p>
+      <w:pPr>
+        <w:pStyle w:val="BodyText"/>
+      </w:pPr>
+      <m:oMathPara>
+        <m:oMathParaPr>
+          <m:jc m:val="center"/>
+        </m:oMathParaPr>
+        <m:oMath>
+          <m:r>
+            <m:rPr>
+              <m:sty m:val="p"/>
+            </m:rPr>
+            <m:t>mode</m:t>
+          </m:r>
+          <m:r>
+            <m:t>​</m:t>
+          </m:r>
+          <m:d>
+            <m:dPr>
+              <m:begChr m:val="("/>
+              <m:sepChr m:val=""/>
+              <m:endChr m:val=")"/>
+              <m:grow/>
+            </m:dPr>
+            <m:e>
+              <m:r>
+                <m:t>f</m:t>
+              </m:r>
+            </m:e>
+          </m:d>
+          <m:r>
+            <m:t>​</m:t>
+          </m:r>
+          <m:r>
+            <m:rPr>
+              <m:sty m:val="p"/>
+            </m:rPr>
+            <m:t>=</m:t>
+          </m:r>
+          <m:r>
+            <m:rPr>
+              <m:sty m:val="p"/>
+            </m:rPr>
+            <m:t>arg</m:t>
+          </m:r>
+          <m:limLow>
+            <m:e>
+              <m:r>
+                <m:rPr>
+                  <m:sty m:val="p"/>
+                </m:rPr>
+                <m:t>max</m:t>
+              </m:r>
+            </m:e>
+            <m:lim>
+              <m:r>
+                <m:t>x</m:t>
+              </m:r>
+              <m:r>
+                <m:rPr>
+                  <m:sty m:val="p"/>
+                </m:rPr>
+                <m:t>∈</m:t>
+              </m:r>
+              <m:r>
+                <m:rPr>
+                  <m:scr m:val="script"/>
+                  <m:sty m:val="p"/>
+                </m:rPr>
+                <m:t>R</m:t>
+              </m:r>
+              <m:r>
+                <m:rPr>
+                  <m:sty m:val="p"/>
+                </m:rPr>
+                <m:t>(</m:t>
+              </m:r>
+              <m:r>
+                <m:t>X</m:t>
+              </m:r>
+              <m:r>
+                <m:rPr>
+                  <m:sty m:val="p"/>
+                </m:rPr>
+                <m:t>)</m:t>
+              </m:r>
+            </m:lim>
+          </m:limLow>
+          <m:r>
+            <m:t>g</m:t>
+          </m:r>
+          <m:r>
+            <m:rPr>
+              <m:sty m:val="p"/>
+            </m:rPr>
+            <m:t>(</m:t>
+          </m:r>
+          <m:r>
+            <m:t>x</m:t>
+          </m:r>
+          <m:r>
+            <m:rPr>
+              <m:sty m:val="p"/>
+            </m:rPr>
+            <m:t>)</m:t>
+          </m:r>
+          <m:r>
+            <m:rPr>
+              <m:sty m:val="p"/>
+            </m:rPr>
+            <m:t>.</m:t>
+          </m:r>
+        </m:oMath>
+      </m:oMathPara>
+    </w:p>
+    <w:bookmarkEnd w:id="106"/>
+    <w:p>
+      <w:pPr>
+        <w:pStyle w:val="FirstParagraph"/>
+      </w:pPr>
+      <w:r>
+        <w:rPr>
+          <w:i/>
+          <w:iCs/>
+        </w:rPr>
+        <w:t xml:space="preserve">Proof</w:t>
+      </w:r>
+      <w:r>
+        <w:t xml:space="preserve">. </w:t>
+      </w:r>
+      <w:r>
+        <w:t xml:space="preserve">Write</w:t>
+      </w:r>
+      <w:r>
+        <w:t xml:space="preserve"> </w:t>
+      </w:r>
+      <m:oMath>
+        <m:r>
+          <m:t>f</m:t>
+        </m:r>
+        <m:r>
+          <m:rPr>
+            <m:sty m:val="p"/>
+          </m:rPr>
+          <m:t>(</m:t>
+        </m:r>
+        <m:r>
+          <m:t>x</m:t>
+        </m:r>
+        <m:r>
+          <m:rPr>
+            <m:sty m:val="p"/>
+          </m:rPr>
+          <m:t>)</m:t>
+        </m:r>
+        <m:r>
+          <m:rPr>
+            <m:sty m:val="p"/>
+          </m:rPr>
+          <m:t>=</m:t>
+        </m:r>
+        <m:r>
+          <m:t>c</m:t>
+        </m:r>
+        <m:r>
+          <m:t> </m:t>
+        </m:r>
+        <m:r>
+          <m:t>g</m:t>
+        </m:r>
+        <m:r>
+          <m:rPr>
+            <m:sty m:val="p"/>
+          </m:rPr>
+          <m:t>(</m:t>
+        </m:r>
+        <m:r>
+          <m:t>x</m:t>
+        </m:r>
+        <m:r>
+          <m:rPr>
+            <m:sty m:val="p"/>
+          </m:rPr>
+          <m:t>)</m:t>
+        </m:r>
+      </m:oMath>
+      <w:r>
+        <w:t xml:space="preserve"> </w:t>
+      </w:r>
+      <w:r>
+        <w:t xml:space="preserve">with</w:t>
+      </w:r>
+      <w:r>
+        <w:t xml:space="preserve"> </w:t>
+      </w:r>
+      <m:oMath>
+        <m:r>
+          <m:t>c</m:t>
+        </m:r>
+        <m:r>
+          <m:rPr>
+            <m:sty m:val="p"/>
+          </m:rPr>
+          <m:t>&gt;</m:t>
+        </m:r>
+        <m:r>
+          <m:t>0</m:t>
+        </m:r>
+      </m:oMath>
+      <w:r>
+        <w:t xml:space="preserve"> </w:t>
+      </w:r>
+      <w:r>
+        <w:t xml:space="preserve">(</w:t>
+      </w:r>
+      <w:hyperlink w:anchor="def-kernel">
+        <w:r>
+          <w:rPr>
+            <w:rStyle w:val="Hyperlink"/>
+          </w:rPr>
+          <w:t xml:space="preserve">Definition 22</w:t>
+        </w:r>
+      </w:hyperlink>
+      <w:r>
+        <w:t xml:space="preserve">).</w:t>
+      </w:r>
+      <w:r>
+        <w:t xml:space="preserve"> </w:t>
+      </w:r>
+      <w:r>
+        <w:t xml:space="preserve">For any</w:t>
+      </w:r>
+      <w:r>
+        <w:t xml:space="preserve"> </w:t>
+      </w:r>
+      <m:oMath>
+        <m:r>
+          <m:t>x</m:t>
+        </m:r>
+      </m:oMath>
+      <w:r>
+        <w:t xml:space="preserve">, multiplying both sides of</w:t>
+      </w:r>
+      <w:r>
+        <w:t xml:space="preserve"> </w:t>
+      </w:r>
+      <m:oMath>
+        <m:r>
+          <m:t>g</m:t>
+        </m:r>
+        <m:r>
+          <m:rPr>
+            <m:sty m:val="p"/>
+          </m:rPr>
+          <m:t>(</m:t>
+        </m:r>
         <m:sSup>
           <m:e>
             <m:r>
@@ -39699,26 +40424,65 @@
             </m:r>
           </m:sup>
         </m:sSup>
-      </m:oMath>
-      <w:r>
-        <w:t xml:space="preserve"> </w:t>
-      </w:r>
-      <w:r>
-        <w:t xml:space="preserve">at which</w:t>
-      </w:r>
-      <w:r>
-        <w:t xml:space="preserve"> </w:t>
-      </w:r>
-      <m:oMath>
-        <m:r>
-          <m:t>f</m:t>
-        </m:r>
-      </m:oMath>
-      <w:r>
-        <w:t xml:space="preserve"> </w:t>
-      </w:r>
-      <w:r>
-        <w:t xml:space="preserve">is largest:</w:t>
+        <m:r>
+          <m:rPr>
+            <m:sty m:val="p"/>
+          </m:rPr>
+          <m:t>)</m:t>
+        </m:r>
+        <m:r>
+          <m:rPr>
+            <m:sty m:val="p"/>
+          </m:rPr>
+          <m:t>≥</m:t>
+        </m:r>
+        <m:r>
+          <m:t>g</m:t>
+        </m:r>
+        <m:r>
+          <m:rPr>
+            <m:sty m:val="p"/>
+          </m:rPr>
+          <m:t>(</m:t>
+        </m:r>
+        <m:r>
+          <m:t>x</m:t>
+        </m:r>
+        <m:r>
+          <m:rPr>
+            <m:sty m:val="p"/>
+          </m:rPr>
+          <m:t>)</m:t>
+        </m:r>
+      </m:oMath>
+      <w:r>
+        <w:t xml:space="preserve"> </w:t>
+      </w:r>
+      <w:r>
+        <w:t xml:space="preserve">by</w:t>
+      </w:r>
+      <w:r>
+        <w:t xml:space="preserve"> </w:t>
+      </w:r>
+      <m:oMath>
+        <m:r>
+          <m:t>c</m:t>
+        </m:r>
+        <m:r>
+          <m:rPr>
+            <m:sty m:val="p"/>
+          </m:rPr>
+          <m:t>&gt;</m:t>
+        </m:r>
+        <m:r>
+          <m:t>0</m:t>
+        </m:r>
+      </m:oMath>
+      <w:r>
+        <w:t xml:space="preserve"> </w:t>
+      </w:r>
+      <w:r>
+        <w:t xml:space="preserve">gives</w:t>
       </w:r>
       <w:r>
         <w:t xml:space="preserve"> </w:t>
@@ -39780,67 +40544,34 @@
         </m:r>
       </m:oMath>
       <w:r>
-        <w:t xml:space="preserve"> </w:t>
-      </w:r>
-      <w:r>
-        <w:t xml:space="preserve">for every</w:t>
-      </w:r>
-      <w:r>
-        <w:t xml:space="preserve"> </w:t>
-      </w:r>
-      <m:oMath>
-        <m:r>
-          <m:t>x</m:t>
-        </m:r>
-      </m:oMath>
-      <w:r>
-        <w:t xml:space="preserve">.</w:t>
-      </w:r>
-    </w:p>
-    <w:bookmarkEnd w:id="104"/>
-    <w:bookmarkStart w:id="105" w:name="thm-kernel-same-mode"/>
-    <w:p>
-      <w:pPr>
-        <w:pStyle w:val="BodyText"/>
-      </w:pPr>
-      <w:r>
-        <w:rPr>
-          <w:b/>
-          <w:bCs/>
-        </w:rPr>
-        <w:t xml:space="preserve">Theorem 18 (A density and its kernel have the same modes)</w:t>
-      </w:r>
-      <w:r>
-        <w:t xml:space="preserve"> </w:t>
-      </w:r>
-      <w:r>
-        <w:t xml:space="preserve">If</w:t>
-      </w:r>
-      <w:r>
-        <w:t xml:space="preserve"> </w:t>
-      </w:r>
-      <m:oMath>
-        <m:r>
-          <m:t>g</m:t>
-        </m:r>
-      </m:oMath>
-      <w:r>
-        <w:t xml:space="preserve"> </w:t>
-      </w:r>
-      <w:r>
-        <w:t xml:space="preserve">is a</w:t>
-      </w:r>
-      <w:r>
-        <w:t xml:space="preserve"> </w:t>
-      </w:r>
-      <w:hyperlink w:anchor="def-kernel">
-        <w:r>
-          <w:rPr>
-            <w:rStyle w:val="Hyperlink"/>
-          </w:rPr>
-          <w:t xml:space="preserve">kernel of a density</w:t>
-        </w:r>
-      </w:hyperlink>
+        <w:t xml:space="preserve">,</w:t>
+      </w:r>
+      <w:r>
+        <w:t xml:space="preserve"> </w:t>
+      </w:r>
+      <w:r>
+        <w:t xml:space="preserve">and dividing by</w:t>
+      </w:r>
+      <w:r>
+        <w:t xml:space="preserve"> </w:t>
+      </w:r>
+      <m:oMath>
+        <m:r>
+          <m:t>c</m:t>
+        </m:r>
+      </m:oMath>
+      <w:r>
+        <w:t xml:space="preserve"> </w:t>
+      </w:r>
+      <w:r>
+        <w:t xml:space="preserve">reverses this.</w:t>
+      </w:r>
+      <w:r>
+        <w:t xml:space="preserve"> </w:t>
+      </w:r>
+      <w:r>
+        <w:t xml:space="preserve">So</w:t>
+      </w:r>
       <w:r>
         <w:t xml:space="preserve"> </w:t>
       </w:r>
@@ -39848,20 +40579,12 @@
         <m:r>
           <m:t>f</m:t>
         </m:r>
-      </m:oMath>
-      <w:r>
-        <w:t xml:space="preserve">,</w:t>
-      </w:r>
-      <w:r>
-        <w:t xml:space="preserve"> </w:t>
-      </w:r>
-      <w:r>
-        <w:t xml:space="preserve">then</w:t>
-      </w:r>
-      <w:r>
-        <w:t xml:space="preserve"> </w:t>
-      </w:r>
-      <m:oMath>
+        <m:r>
+          <m:rPr>
+            <m:sty m:val="p"/>
+          </m:rPr>
+          <m:t>(</m:t>
+        </m:r>
         <m:sSup>
           <m:e>
             <m:r>
@@ -39877,43 +40600,56 @@
             </m:r>
           </m:sup>
         </m:sSup>
-      </m:oMath>
-      <w:r>
-        <w:t xml:space="preserve"> </w:t>
-      </w:r>
-      <w:r>
-        <w:t xml:space="preserve">is a</w:t>
-      </w:r>
-      <w:r>
-        <w:t xml:space="preserve"> </w:t>
-      </w:r>
-      <w:hyperlink w:anchor="def-mode">
-        <w:r>
-          <w:rPr>
-            <w:rStyle w:val="Hyperlink"/>
-          </w:rPr>
-          <w:t xml:space="preserve">mode</w:t>
-        </w:r>
-      </w:hyperlink>
-      <w:r>
-        <w:t xml:space="preserve"> </w:t>
-      </w:r>
-      <w:r>
-        <w:t xml:space="preserve">of</w:t>
-      </w:r>
-      <w:r>
-        <w:t xml:space="preserve"> </w:t>
-      </w:r>
-      <m:oMath>
+        <m:r>
+          <m:rPr>
+            <m:sty m:val="p"/>
+          </m:rPr>
+          <m:t>)</m:t>
+        </m:r>
+        <m:r>
+          <m:rPr>
+            <m:sty m:val="p"/>
+          </m:rPr>
+          <m:t>≥</m:t>
+        </m:r>
         <m:r>
           <m:t>f</m:t>
         </m:r>
-      </m:oMath>
-      <w:r>
-        <w:t xml:space="preserve"> </w:t>
-      </w:r>
-      <w:r>
-        <w:t xml:space="preserve">if and only if</w:t>
+        <m:r>
+          <m:rPr>
+            <m:sty m:val="p"/>
+          </m:rPr>
+          <m:t>(</m:t>
+        </m:r>
+        <m:r>
+          <m:t>x</m:t>
+        </m:r>
+        <m:r>
+          <m:rPr>
+            <m:sty m:val="p"/>
+          </m:rPr>
+          <m:t>)</m:t>
+        </m:r>
+      </m:oMath>
+      <w:r>
+        <w:t xml:space="preserve"> </w:t>
+      </w:r>
+      <w:r>
+        <w:t xml:space="preserve">for every</w:t>
+      </w:r>
+      <w:r>
+        <w:t xml:space="preserve"> </w:t>
+      </w:r>
+      <m:oMath>
+        <m:r>
+          <m:t>x</m:t>
+        </m:r>
+      </m:oMath>
+      <w:r>
+        <w:t xml:space="preserve"> </w:t>
+      </w:r>
+      <w:r>
+        <w:t xml:space="preserve">exactly when</w:t>
       </w:r>
       <w:r>
         <w:t xml:space="preserve"> </w:t>
@@ -39991,148 +40727,36 @@
       <w:r>
         <w:t xml:space="preserve">.</w:t>
       </w:r>
-    </w:p>
-    <w:bookmarkEnd w:id="105"/>
-    <w:p>
-      <w:pPr>
-        <w:pStyle w:val="BodyText"/>
-      </w:pPr>
-      <w:r>
-        <w:rPr>
-          <w:i/>
-          <w:iCs/>
-        </w:rPr>
-        <w:t xml:space="preserve">Proof</w:t>
-      </w:r>
-      <w:r>
-        <w:t xml:space="preserve">. </w:t>
-      </w:r>
-      <w:r>
-        <w:t xml:space="preserve">Write</w:t>
-      </w:r>
-      <w:r>
-        <w:t xml:space="preserve"> </w:t>
-      </w:r>
-      <m:oMath>
-        <m:r>
-          <m:t>f</m:t>
-        </m:r>
-        <m:r>
-          <m:rPr>
-            <m:sty m:val="p"/>
-          </m:rPr>
-          <m:t>(</m:t>
-        </m:r>
-        <m:r>
-          <m:t>x</m:t>
-        </m:r>
-        <m:r>
-          <m:rPr>
-            <m:sty m:val="p"/>
-          </m:rPr>
-          <m:t>)</m:t>
-        </m:r>
-        <m:r>
-          <m:rPr>
-            <m:sty m:val="p"/>
-          </m:rPr>
-          <m:t>=</m:t>
-        </m:r>
-        <m:r>
-          <m:t>c</m:t>
-        </m:r>
-        <m:r>
-          <m:t> </m:t>
-        </m:r>
-        <m:r>
-          <m:t>g</m:t>
-        </m:r>
-        <m:r>
-          <m:rPr>
-            <m:sty m:val="p"/>
-          </m:rPr>
-          <m:t>(</m:t>
-        </m:r>
-        <m:r>
-          <m:t>x</m:t>
-        </m:r>
-        <m:r>
-          <m:rPr>
-            <m:sty m:val="p"/>
-          </m:rPr>
-          <m:t>)</m:t>
-        </m:r>
-      </m:oMath>
-      <w:r>
-        <w:t xml:space="preserve"> </w:t>
-      </w:r>
-      <w:r>
-        <w:t xml:space="preserve">with</w:t>
-      </w:r>
-      <w:r>
-        <w:t xml:space="preserve"> </w:t>
-      </w:r>
-      <m:oMath>
-        <m:r>
-          <m:t>c</m:t>
-        </m:r>
-        <m:r>
-          <m:rPr>
-            <m:sty m:val="p"/>
-          </m:rPr>
-          <m:t>&gt;</m:t>
-        </m:r>
-        <m:r>
-          <m:t>0</m:t>
-        </m:r>
-      </m:oMath>
-      <w:r>
-        <w:t xml:space="preserve"> </w:t>
-      </w:r>
-      <w:r>
-        <w:t xml:space="preserve">(</w:t>
-      </w:r>
-      <w:hyperlink w:anchor="def-kernel">
+      <w:r>
+        <w:t xml:space="preserve"> </w:t>
+      </w:r>
+      <w:r>
+        <w:t xml:space="preserve">By the definition of the</w:t>
+      </w:r>
+      <w:r>
+        <w:t xml:space="preserve"> </w:t>
+      </w:r>
+      <w:hyperlink r:id="rId104">
         <w:r>
           <w:rPr>
             <w:rStyle w:val="Hyperlink"/>
           </w:rPr>
-          <w:t xml:space="preserve">Definition 22</w:t>
+          <w:t xml:space="preserve">argmax</w:t>
         </w:r>
       </w:hyperlink>
       <w:r>
-        <w:t xml:space="preserve">).</w:t>
-      </w:r>
-      <w:r>
-        <w:t xml:space="preserve"> </w:t>
-      </w:r>
-      <w:r>
-        <w:t xml:space="preserve">For any</w:t>
-      </w:r>
-      <w:r>
-        <w:t xml:space="preserve"> </w:t>
-      </w:r>
-      <m:oMath>
-        <m:r>
-          <m:t>x</m:t>
-        </m:r>
-      </m:oMath>
-      <w:r>
-        <w:t xml:space="preserve">, multiplying both sides of</w:t>
-      </w:r>
-      <w:r>
-        <w:t xml:space="preserve"> </w:t>
-      </w:r>
-      <m:oMath>
-        <m:r>
-          <m:t>g</m:t>
-        </m:r>
-        <m:r>
-          <m:rPr>
-            <m:sty m:val="p"/>
-          </m:rPr>
-          <m:t>(</m:t>
-        </m:r>
+        <w:t xml:space="preserve">,</w:t>
+      </w:r>
+      <w:r>
+        <w:t xml:space="preserve"> </w:t>
+      </w:r>
+      <w:r>
+        <w:t xml:space="preserve">these are the conditions</w:t>
+      </w:r>
+      <w:r>
+        <w:t xml:space="preserve"> </w:t>
+      </w:r>
+      <m:oMath>
         <m:sSup>
           <m:e>
             <m:r>
@@ -40152,75 +40776,86 @@
           <m:rPr>
             <m:sty m:val="p"/>
           </m:rPr>
+          <m:t>∈</m:t>
+        </m:r>
+        <m:r>
+          <m:rPr>
+            <m:sty m:val="p"/>
+          </m:rPr>
+          <m:t>arg</m:t>
+        </m:r>
+        <m:sSub>
+          <m:e>
+            <m:r>
+              <m:rPr>
+                <m:sty m:val="p"/>
+              </m:rPr>
+              <m:t>max</m:t>
+            </m:r>
+          </m:e>
+          <m:sub>
+            <m:r>
+              <m:t>x</m:t>
+            </m:r>
+            <m:r>
+              <m:rPr>
+                <m:sty m:val="p"/>
+              </m:rPr>
+              <m:t>∈</m:t>
+            </m:r>
+            <m:r>
+              <m:rPr>
+                <m:scr m:val="script"/>
+                <m:sty m:val="p"/>
+              </m:rPr>
+              <m:t>R</m:t>
+            </m:r>
+            <m:r>
+              <m:rPr>
+                <m:sty m:val="p"/>
+              </m:rPr>
+              <m:t>(</m:t>
+            </m:r>
+            <m:r>
+              <m:t>X</m:t>
+            </m:r>
+            <m:r>
+              <m:rPr>
+                <m:sty m:val="p"/>
+              </m:rPr>
+              <m:t>)</m:t>
+            </m:r>
+          </m:sub>
+        </m:sSub>
+        <m:r>
+          <m:t>f</m:t>
+        </m:r>
+        <m:r>
+          <m:rPr>
+            <m:sty m:val="p"/>
+          </m:rPr>
+          <m:t>(</m:t>
+        </m:r>
+        <m:r>
+          <m:t>x</m:t>
+        </m:r>
+        <m:r>
+          <m:rPr>
+            <m:sty m:val="p"/>
+          </m:rPr>
           <m:t>)</m:t>
         </m:r>
-        <m:r>
-          <m:rPr>
-            <m:sty m:val="p"/>
-          </m:rPr>
-          <m:t>≥</m:t>
-        </m:r>
-        <m:r>
-          <m:t>g</m:t>
-        </m:r>
-        <m:r>
-          <m:rPr>
-            <m:sty m:val="p"/>
-          </m:rPr>
-          <m:t>(</m:t>
-        </m:r>
-        <m:r>
-          <m:t>x</m:t>
-        </m:r>
-        <m:r>
-          <m:rPr>
-            <m:sty m:val="p"/>
-          </m:rPr>
-          <m:t>)</m:t>
-        </m:r>
-      </m:oMath>
-      <w:r>
-        <w:t xml:space="preserve"> </w:t>
-      </w:r>
-      <w:r>
-        <w:t xml:space="preserve">by</w:t>
-      </w:r>
-      <w:r>
-        <w:t xml:space="preserve"> </w:t>
-      </w:r>
-      <m:oMath>
-        <m:r>
-          <m:t>c</m:t>
-        </m:r>
-        <m:r>
-          <m:rPr>
-            <m:sty m:val="p"/>
-          </m:rPr>
-          <m:t>&gt;</m:t>
-        </m:r>
-        <m:r>
-          <m:t>0</m:t>
-        </m:r>
-      </m:oMath>
-      <w:r>
-        <w:t xml:space="preserve"> </w:t>
-      </w:r>
-      <w:r>
-        <w:t xml:space="preserve">gives</w:t>
-      </w:r>
-      <w:r>
-        <w:t xml:space="preserve"> </w:t>
-      </w:r>
-      <m:oMath>
-        <m:r>
-          <m:t>f</m:t>
-        </m:r>
-        <m:r>
-          <m:rPr>
-            <m:sty m:val="p"/>
-          </m:rPr>
-          <m:t>(</m:t>
-        </m:r>
+      </m:oMath>
+      <w:r>
+        <w:t xml:space="preserve"> </w:t>
+      </w:r>
+      <w:r>
+        <w:t xml:space="preserve">and</w:t>
+      </w:r>
+      <w:r>
+        <w:t xml:space="preserve"> </w:t>
+      </w:r>
+      <m:oMath>
         <m:sSup>
           <m:e>
             <m:r>
@@ -40240,219 +40875,81 @@
           <m:rPr>
             <m:sty m:val="p"/>
           </m:rPr>
-          <m:t>)</m:t>
-        </m:r>
-        <m:r>
-          <m:rPr>
-            <m:sty m:val="p"/>
-          </m:rPr>
-          <m:t>≥</m:t>
-        </m:r>
-        <m:r>
-          <m:t>f</m:t>
-        </m:r>
-        <m:r>
-          <m:rPr>
-            <m:sty m:val="p"/>
-          </m:rPr>
-          <m:t>(</m:t>
-        </m:r>
-        <m:r>
-          <m:t>x</m:t>
-        </m:r>
-        <m:r>
-          <m:rPr>
-            <m:sty m:val="p"/>
-          </m:rPr>
-          <m:t>)</m:t>
-        </m:r>
-      </m:oMath>
-      <w:r>
-        <w:t xml:space="preserve">,</w:t>
-      </w:r>
-      <w:r>
-        <w:t xml:space="preserve"> </w:t>
-      </w:r>
-      <w:r>
-        <w:t xml:space="preserve">and dividing by</w:t>
-      </w:r>
-      <w:r>
-        <w:t xml:space="preserve"> </w:t>
-      </w:r>
-      <m:oMath>
-        <m:r>
-          <m:t>c</m:t>
-        </m:r>
-      </m:oMath>
-      <w:r>
-        <w:t xml:space="preserve"> </w:t>
-      </w:r>
-      <w:r>
-        <w:t xml:space="preserve">reverses this.</w:t>
-      </w:r>
-      <w:r>
-        <w:t xml:space="preserve"> </w:t>
-      </w:r>
-      <w:r>
-        <w:t xml:space="preserve">So</w:t>
-      </w:r>
-      <w:r>
-        <w:t xml:space="preserve"> </w:t>
-      </w:r>
-      <m:oMath>
-        <m:r>
-          <m:t>f</m:t>
-        </m:r>
-        <m:r>
-          <m:rPr>
-            <m:sty m:val="p"/>
-          </m:rPr>
-          <m:t>(</m:t>
-        </m:r>
-        <m:sSup>
+          <m:t>∈</m:t>
+        </m:r>
+        <m:r>
+          <m:rPr>
+            <m:sty m:val="p"/>
+          </m:rPr>
+          <m:t>arg</m:t>
+        </m:r>
+        <m:sSub>
           <m:e>
-            <m:r>
-              <m:t>x</m:t>
-            </m:r>
-          </m:e>
-          <m:sup>
             <m:r>
               <m:rPr>
                 <m:sty m:val="p"/>
               </m:rPr>
-              <m:t>*</m:t>
+              <m:t>max</m:t>
             </m:r>
-          </m:sup>
-        </m:sSup>
-        <m:r>
-          <m:rPr>
-            <m:sty m:val="p"/>
-          </m:rPr>
-          <m:t>)</m:t>
-        </m:r>
-        <m:r>
-          <m:rPr>
-            <m:sty m:val="p"/>
-          </m:rPr>
-          <m:t>≥</m:t>
-        </m:r>
-        <m:r>
-          <m:t>f</m:t>
-        </m:r>
-        <m:r>
-          <m:rPr>
-            <m:sty m:val="p"/>
-          </m:rPr>
-          <m:t>(</m:t>
-        </m:r>
-        <m:r>
-          <m:t>x</m:t>
-        </m:r>
-        <m:r>
-          <m:rPr>
-            <m:sty m:val="p"/>
-          </m:rPr>
-          <m:t>)</m:t>
-        </m:r>
-      </m:oMath>
-      <w:r>
-        <w:t xml:space="preserve"> </w:t>
-      </w:r>
-      <w:r>
-        <w:t xml:space="preserve">for every</w:t>
-      </w:r>
-      <w:r>
-        <w:t xml:space="preserve"> </w:t>
-      </w:r>
-      <m:oMath>
-        <m:r>
-          <m:t>x</m:t>
-        </m:r>
-      </m:oMath>
-      <w:r>
-        <w:t xml:space="preserve"> </w:t>
-      </w:r>
-      <w:r>
-        <w:t xml:space="preserve">exactly when</w:t>
-      </w:r>
-      <w:r>
-        <w:t xml:space="preserve"> </w:t>
-      </w:r>
-      <m:oMath>
-        <m:r>
-          <m:t>g</m:t>
-        </m:r>
-        <m:r>
-          <m:rPr>
-            <m:sty m:val="p"/>
-          </m:rPr>
-          <m:t>(</m:t>
-        </m:r>
-        <m:sSup>
-          <m:e>
+          </m:e>
+          <m:sub>
             <m:r>
               <m:t>x</m:t>
             </m:r>
-          </m:e>
-          <m:sup>
             <m:r>
               <m:rPr>
                 <m:sty m:val="p"/>
               </m:rPr>
-              <m:t>*</m:t>
+              <m:t>∈</m:t>
             </m:r>
-          </m:sup>
-        </m:sSup>
+            <m:r>
+              <m:rPr>
+                <m:scr m:val="script"/>
+                <m:sty m:val="p"/>
+              </m:rPr>
+              <m:t>R</m:t>
+            </m:r>
+            <m:r>
+              <m:rPr>
+                <m:sty m:val="p"/>
+              </m:rPr>
+              <m:t>(</m:t>
+            </m:r>
+            <m:r>
+              <m:t>X</m:t>
+            </m:r>
+            <m:r>
+              <m:rPr>
+                <m:sty m:val="p"/>
+              </m:rPr>
+              <m:t>)</m:t>
+            </m:r>
+          </m:sub>
+        </m:sSub>
+        <m:r>
+          <m:t>g</m:t>
+        </m:r>
+        <m:r>
+          <m:rPr>
+            <m:sty m:val="p"/>
+          </m:rPr>
+          <m:t>(</m:t>
+        </m:r>
+        <m:r>
+          <m:t>x</m:t>
+        </m:r>
         <m:r>
           <m:rPr>
             <m:sty m:val="p"/>
           </m:rPr>
           <m:t>)</m:t>
         </m:r>
-        <m:r>
-          <m:rPr>
-            <m:sty m:val="p"/>
-          </m:rPr>
-          <m:t>≥</m:t>
-        </m:r>
-        <m:r>
-          <m:t>g</m:t>
-        </m:r>
-        <m:r>
-          <m:rPr>
-            <m:sty m:val="p"/>
-          </m:rPr>
-          <m:t>(</m:t>
-        </m:r>
-        <m:r>
-          <m:t>x</m:t>
-        </m:r>
-        <m:r>
-          <m:rPr>
-            <m:sty m:val="p"/>
-          </m:rPr>
-          <m:t>)</m:t>
-        </m:r>
-      </m:oMath>
-      <w:r>
-        <w:t xml:space="preserve"> </w:t>
-      </w:r>
-      <w:r>
-        <w:t xml:space="preserve">for every</w:t>
-      </w:r>
-      <w:r>
-        <w:t xml:space="preserve"> </w:t>
-      </w:r>
-      <m:oMath>
-        <m:r>
-          <m:t>x</m:t>
-        </m:r>
       </m:oMath>
       <w:r>
         <w:t xml:space="preserve">.</w:t>
       </w:r>
     </w:p>
-    <w:bookmarkStart w:id="106" w:name="exm-kernel-exponential"/>
+    <w:bookmarkStart w:id="107" w:name="exm-kernel-exponential"/>
     <w:p>
       <w:pPr>
         <w:pStyle w:val="BodyText"/>
@@ -41275,7 +41772,7 @@
         <w:t xml:space="preserve">.</w:t>
       </w:r>
     </w:p>
-    <w:bookmarkEnd w:id="106"/>
+    <w:bookmarkEnd w:id="107"/>
     <w:tbl>
       <w:tblPr>
         <w:tblStyle w:val="Table"/>
@@ -41317,18 +41814,18 @@
                 <wp:inline>
                   <wp:extent cx="152400" cy="152400"/>
                   <wp:effectExtent b="0" l="0" r="0" t="0"/>
-                  <wp:docPr descr="" title="" id="108" name="Picture"/>
+                  <wp:docPr descr="" title="" id="109" name="Picture"/>
                   <a:graphic>
                     <a:graphicData uri="http://schemas.openxmlformats.org/drawingml/2006/picture">
                       <pic:pic>
                         <pic:nvPicPr>
-                          <pic:cNvPr descr="/opt/quarto/share/formats/docx/tip.png" id="109" name="Picture"/>
+                          <pic:cNvPr descr="/opt/quarto/share/formats/docx/tip.png" id="110" name="Picture"/>
                           <pic:cNvPicPr>
                             <a:picLocks noChangeArrowheads="1" noChangeAspect="1"/>
                           </pic:cNvPicPr>
                         </pic:nvPicPr>
                         <pic:blipFill>
-                          <a:blip r:embed="rId107"/>
+                          <a:blip r:embed="rId108"/>
                           <a:stretch>
                             <a:fillRect/>
                           </a:stretch>
@@ -41390,7 +41887,7 @@
             <w:r>
               <w:t xml:space="preserve"> </w:t>
             </w:r>
-            <w:hyperlink r:id="rId110">
+            <w:hyperlink r:id="rId111">
               <w:r>
                 <w:rPr>
                   <w:rStyle w:val="Hyperlink"/>
@@ -41428,7 +41925,7 @@
             <w:r>
               <w:t xml:space="preserve"> </w:t>
             </w:r>
-            <w:hyperlink r:id="rId111">
+            <w:hyperlink r:id="rId112">
               <w:r>
                 <w:rPr>
                   <w:rStyle w:val="Hyperlink"/>
@@ -41454,7 +41951,7 @@
       <w:r>
         <w:t xml:space="preserve"> </w:t>
       </w:r>
-      <w:hyperlink r:id="rId112">
+      <w:hyperlink r:id="rId113">
         <w:r>
           <w:rPr>
             <w:rStyle w:val="Hyperlink"/>
@@ -41471,7 +41968,7 @@
       <w:r>
         <w:t xml:space="preserve"> </w:t>
       </w:r>
-      <w:hyperlink r:id="rId113">
+      <w:hyperlink r:id="rId114">
         <w:r>
           <w:rPr>
             <w:rStyle w:val="Hyperlink"/>
@@ -41501,9 +41998,9 @@
         <w:t xml:space="preserve">.</w:t>
       </w:r>
     </w:p>
-    <w:bookmarkEnd w:id="114"/>
     <w:bookmarkEnd w:id="115"/>
-    <w:bookmarkStart w:id="135" w:name="sec-prob-haz"/>
+    <w:bookmarkEnd w:id="116"/>
+    <w:bookmarkStart w:id="136" w:name="sec-prob-haz"/>
     <w:p>
       <w:pPr>
         <w:pStyle w:val="Heading2"/>
@@ -41512,7 +42009,7 @@
         <w:t xml:space="preserve">3 Survival, hazard, and cumulative hazard functions</w:t>
       </w:r>
     </w:p>
-    <w:bookmarkStart w:id="116" w:name="def-surv-fn"/>
+    <w:bookmarkStart w:id="117" w:name="def-surv-fn"/>
     <w:p>
       <w:pPr>
         <w:pStyle w:val="FirstParagraph"/>
@@ -41731,7 +42228,7 @@
         </m:oMath>
       </m:oMathPara>
     </w:p>
-    <w:bookmarkEnd w:id="116"/>
+    <w:bookmarkEnd w:id="117"/>
     <w:p>
       <w:pPr>
         <w:pStyle w:val="FirstParagraph"/>
@@ -41825,7 +42322,7 @@
         <w:t xml:space="preserve">The definition itself applies to any random variable.</w:t>
       </w:r>
     </w:p>
-    <w:bookmarkStart w:id="117" w:name="thm-survival-expressions-1"/>
+    <w:bookmarkStart w:id="118" w:name="thm-survival-expressions-1"/>
     <w:p>
       <w:pPr>
         <w:pStyle w:val="BodyText"/>
@@ -42118,7 +42615,7 @@
         </m:oMath>
       </m:oMathPara>
     </w:p>
-    <w:bookmarkEnd w:id="117"/>
+    <w:bookmarkEnd w:id="118"/>
     <w:p>
       <w:pPr>
         <w:pStyle w:val="FirstParagraph"/>
@@ -42841,7 +43338,7 @@
         </m:oMath>
       </m:oMathPara>
     </w:p>
-    <w:bookmarkStart w:id="118" w:name="exm-exp-survfn"/>
+    <w:bookmarkStart w:id="119" w:name="exm-exp-survfn"/>
     <w:p>
       <w:pPr>
         <w:pStyle w:val="FirstParagraph"/>
@@ -43747,8 +44244,8 @@
         <w:t xml:space="preserve">.</w:t>
       </w:r>
     </w:p>
-    <w:bookmarkEnd w:id="118"/>
-    <w:bookmarkStart w:id="120" w:name="def-hazard"/>
+    <w:bookmarkEnd w:id="119"/>
+    <w:bookmarkStart w:id="121" w:name="def-hazard"/>
     <w:p>
       <w:pPr>
         <w:pStyle w:val="BodyText"/>
@@ -43965,7 +44462,7 @@
       <w:r>
         <w:t xml:space="preserve"> </w:t>
       </w:r>
-      <w:hyperlink r:id="rId119">
+      <w:hyperlink r:id="rId120">
         <w:r>
           <w:rPr>
             <w:rStyle w:val="Hyperlink"/>
@@ -44206,7 +44703,7 @@
         </m:oMath>
       </m:oMathPara>
     </w:p>
-    <w:bookmarkEnd w:id="120"/>
+    <w:bookmarkEnd w:id="121"/>
     <w:p>
       <w:pPr>
         <w:pStyle w:val="FirstParagraph"/>
@@ -44876,7 +45373,7 @@
         <w:t xml:space="preserve">The math is identical; only the name changes with the valence of the event.</w:t>
       </w:r>
     </w:p>
-    <w:bookmarkStart w:id="122" w:name="exm-hazard-exceeds-one"/>
+    <w:bookmarkStart w:id="123" w:name="exm-hazard-exceeds-one"/>
     <w:p>
       <w:pPr>
         <w:pStyle w:val="BodyText"/>
@@ -46384,7 +46881,7 @@
       <w:r>
         <w:t xml:space="preserve"> </w:t>
       </w:r>
-      <w:hyperlink r:id="rId121">
+      <w:hyperlink r:id="rId122">
         <w:r>
           <w:rPr>
             <w:rStyle w:val="Hyperlink"/>
@@ -46988,8 +47485,8 @@
         <w:t xml:space="preserve">a hazard is a rate, not a probability.</w:t>
       </w:r>
     </w:p>
-    <w:bookmarkEnd w:id="122"/>
-    <w:bookmarkStart w:id="123" w:name="def-discrete-hazard"/>
+    <w:bookmarkEnd w:id="123"/>
+    <w:bookmarkStart w:id="124" w:name="def-discrete-hazard"/>
     <w:p>
       <w:pPr>
         <w:pStyle w:val="BodyText"/>
@@ -47121,7 +47618,7 @@
       <w:r>
         <w:t xml:space="preserve"> </w:t>
       </w:r>
-      <w:hyperlink r:id="rId119">
+      <w:hyperlink r:id="rId120">
         <w:r>
           <w:rPr>
             <w:rStyle w:val="Hyperlink"/>
@@ -47241,8 +47738,8 @@
         </m:oMath>
       </m:oMathPara>
     </w:p>
-    <w:bookmarkEnd w:id="123"/>
-    <w:bookmarkStart w:id="124" w:name="exm-discrete-hazard"/>
+    <w:bookmarkEnd w:id="124"/>
+    <w:bookmarkStart w:id="125" w:name="exm-discrete-hazard"/>
     <w:p>
       <w:pPr>
         <w:pStyle w:val="FirstParagraph"/>
@@ -47986,8 +48483,8 @@
         <w:t xml:space="preserve">having gone without a six so far does not change the chance of a six on the next roll.</w:t>
       </w:r>
     </w:p>
-    <w:bookmarkEnd w:id="124"/>
-    <w:bookmarkStart w:id="125" w:name="cor-discrete-hazard-unit-interval"/>
+    <w:bookmarkEnd w:id="125"/>
+    <w:bookmarkStart w:id="126" w:name="cor-discrete-hazard-unit-interval"/>
     <w:p>
       <w:pPr>
         <w:pStyle w:val="BodyText"/>
@@ -48219,7 +48716,7 @@
         </m:oMath>
       </m:oMathPara>
     </w:p>
-    <w:bookmarkEnd w:id="125"/>
+    <w:bookmarkEnd w:id="126"/>
     <w:p>
       <w:pPr>
         <w:pStyle w:val="FirstParagraph"/>
@@ -48945,7 +49442,7 @@
         <w:t xml:space="preserve">the discrete-time hazard is a probability.</w:t>
       </w:r>
     </w:p>
-    <w:bookmarkStart w:id="126" w:name="thm-hazard-dens-surv"/>
+    <w:bookmarkStart w:id="127" w:name="thm-hazard-dens-surv"/>
     <w:p>
       <w:pPr>
         <w:pStyle w:val="BodyText"/>
@@ -49217,7 +49714,7 @@
         </m:oMath>
       </m:oMathPara>
     </w:p>
-    <w:bookmarkEnd w:id="126"/>
+    <w:bookmarkEnd w:id="127"/>
     <w:p>
       <w:pPr>
         <w:pStyle w:val="FirstParagraph"/>
@@ -49420,7 +49917,7 @@
       <w:r>
         <w:t xml:space="preserve"> </w:t>
       </w:r>
-      <w:hyperlink r:id="rId121">
+      <w:hyperlink r:id="rId122">
         <w:r>
           <w:rPr>
             <w:rStyle w:val="Hyperlink"/>
@@ -50780,7 +51277,7 @@
         </m:oMath>
       </m:oMathPara>
     </w:p>
-    <w:bookmarkStart w:id="127" w:name="exm-exp-haz"/>
+    <w:bookmarkStart w:id="128" w:name="exm-exp-haz"/>
     <w:p>
       <w:pPr>
         <w:pStyle w:val="FirstParagraph"/>
@@ -51500,8 +51997,8 @@
         <w:t xml:space="preserve">.</w:t>
       </w:r>
     </w:p>
-    <w:bookmarkEnd w:id="127"/>
-    <w:bookmarkStart w:id="128" w:name="def-cuhaz"/>
+    <w:bookmarkEnd w:id="128"/>
+    <w:bookmarkStart w:id="129" w:name="def-cuhaz"/>
     <w:p>
       <w:pPr>
         <w:pStyle w:val="BodyText"/>
@@ -51765,8 +52262,8 @@
         </m:oMath>
       </m:oMathPara>
     </w:p>
-    <w:bookmarkEnd w:id="128"/>
-    <w:bookmarkStart w:id="129" w:name="exm-exp-cumhaz"/>
+    <w:bookmarkEnd w:id="129"/>
+    <w:bookmarkStart w:id="130" w:name="exm-exp-cumhaz"/>
     <w:p>
       <w:pPr>
         <w:pStyle w:val="FirstParagraph"/>
@@ -52230,8 +52727,8 @@
         <w:t xml:space="preserve">.</w:t>
       </w:r>
     </w:p>
-    <w:bookmarkEnd w:id="129"/>
-    <w:bookmarkStart w:id="130" w:name="cor-cuhaz-nonneg"/>
+    <w:bookmarkEnd w:id="130"/>
+    <w:bookmarkStart w:id="131" w:name="cor-cuhaz-nonneg"/>
     <w:p>
       <w:pPr>
         <w:pStyle w:val="BodyText"/>
@@ -52469,7 +52966,7 @@
         </m:oMath>
       </m:oMathPara>
     </w:p>
-    <w:bookmarkEnd w:id="130"/>
+    <w:bookmarkEnd w:id="131"/>
     <w:p>
       <w:pPr>
         <w:pStyle w:val="FirstParagraph"/>
@@ -54142,7 +54639,7 @@
         <w:t xml:space="preserve">is the form most survival-analysis texts use.</w:t>
       </w:r>
     </w:p>
-    <w:bookmarkStart w:id="132" w:name="cor-surv-int-haz"/>
+    <w:bookmarkStart w:id="133" w:name="cor-surv-int-haz"/>
     <w:p>
       <w:pPr>
         <w:pStyle w:val="BodyText"/>
@@ -54353,7 +54850,7 @@
       <w:pPr>
         <w:pStyle w:val="BodyText"/>
       </w:pPr>
-      <w:bookmarkStart w:id="131" w:name="eq-surv-int-haz"/>
+      <w:bookmarkStart w:id="132" w:name="eq-surv-int-haz"/>
       <m:oMathPara>
         <m:oMathParaPr>
           <m:jc m:val="center"/>
@@ -54455,9 +54952,9 @@
           </m:r>
         </m:oMath>
       </m:oMathPara>
-      <w:bookmarkEnd w:id="131"/>
+      <w:bookmarkEnd w:id="132"/>
     </w:p>
-    <w:bookmarkEnd w:id="132"/>
+    <w:bookmarkEnd w:id="133"/>
     <w:p>
       <w:pPr>
         <w:pStyle w:val="FirstParagraph"/>
@@ -56033,7 +56530,7 @@
         <w:t xml:space="preserve">.</w:t>
       </w:r>
     </w:p>
-    <w:bookmarkStart w:id="133" w:name="exm-exp-surv-int-haz"/>
+    <w:bookmarkStart w:id="134" w:name="exm-exp-surv-int-haz"/>
     <w:p>
       <w:pPr>
         <w:pStyle w:val="BodyText"/>
@@ -56320,7 +56817,7 @@
         <w:t xml:space="preserve">.</w:t>
       </w:r>
     </w:p>
-    <w:bookmarkEnd w:id="133"/>
+    <w:bookmarkEnd w:id="134"/>
     <w:tbl>
       <w:tblPr>
         <w:tblStyle w:val="Table"/>
@@ -56334,7 +56831,7 @@
       <w:tr>
         <w:tc>
           <w:tcPr/>
-          <w:bookmarkStart w:id="134" w:name="tbl-prob-dist-fns"/>
+          <w:bookmarkStart w:id="135" w:name="tbl-prob-dist-fns"/>
           <w:p>
             <w:pPr>
               <w:jc w:val="center"/>
@@ -57305,7 +57802,7 @@
               </w:tc>
             </w:tr>
           </w:tbl>
-          <w:bookmarkEnd w:id="134"/>
+          <w:bookmarkEnd w:id="135"/>
           <w:p/>
         </w:tc>
       </w:tr>
@@ -58271,8 +58768,8 @@
         </m:oMath>
       </m:oMathPara>
     </w:p>
-    <w:bookmarkEnd w:id="135"/>
-    <w:bookmarkStart w:id="181" w:name="references"/>
+    <w:bookmarkEnd w:id="136"/>
+    <w:bookmarkStart w:id="182" w:name="references"/>
     <w:p>
       <w:pPr>
         <w:pStyle w:val="Heading2"/>
@@ -58281,8 +58778,8 @@
         <w:t xml:space="preserve">References</w:t>
       </w:r>
     </w:p>
-    <w:bookmarkStart w:id="180" w:name="refs"/>
-    <w:bookmarkStart w:id="137" w:name="ref-wikipedia_random_variable"/>
+    <w:bookmarkStart w:id="181" w:name="refs"/>
+    <w:bookmarkStart w:id="138" w:name="ref-wikipedia_random_variable"/>
     <w:p>
       <w:pPr>
         <w:pStyle w:val="Bibliography"/>
@@ -58329,7 +58826,7 @@
       <w:r>
         <w:t xml:space="preserve"> </w:t>
       </w:r>
-      <w:hyperlink r:id="rId136">
+      <w:hyperlink r:id="rId137">
         <w:r>
           <w:rPr>
             <w:rStyle w:val="Hyperlink"/>
@@ -58338,8 +58835,8 @@
         </w:r>
       </w:hyperlink>
     </w:p>
-    <w:bookmarkEnd w:id="137"/>
-    <w:bookmarkStart w:id="139" w:name="ref-wikipedia_probability_mass_function"/>
+    <w:bookmarkEnd w:id="138"/>
+    <w:bookmarkStart w:id="140" w:name="ref-wikipedia_probability_mass_function"/>
     <w:p>
       <w:pPr>
         <w:pStyle w:val="Bibliography"/>
@@ -58386,7 +58883,7 @@
       <w:r>
         <w:t xml:space="preserve"> </w:t>
       </w:r>
-      <w:hyperlink r:id="rId138">
+      <w:hyperlink r:id="rId139">
         <w:r>
           <w:rPr>
             <w:rStyle w:val="Hyperlink"/>
@@ -58395,8 +58892,8 @@
         </w:r>
       </w:hyperlink>
     </w:p>
-    <w:bookmarkEnd w:id="139"/>
-    <w:bookmarkStart w:id="141" w:name="ref-wikipedia_bernoulli_distribution"/>
+    <w:bookmarkEnd w:id="140"/>
+    <w:bookmarkStart w:id="142" w:name="ref-wikipedia_bernoulli_distribution"/>
     <w:p>
       <w:pPr>
         <w:pStyle w:val="Bibliography"/>
@@ -58443,7 +58940,7 @@
       <w:r>
         <w:t xml:space="preserve"> </w:t>
       </w:r>
-      <w:hyperlink r:id="rId140">
+      <w:hyperlink r:id="rId141">
         <w:r>
           <w:rPr>
             <w:rStyle w:val="Hyperlink"/>
@@ -58452,8 +58949,8 @@
         </w:r>
       </w:hyperlink>
     </w:p>
-    <w:bookmarkEnd w:id="141"/>
-    <w:bookmarkStart w:id="143" w:name="X284569a1076713b35b76605781ea41e303e6132"/>
+    <w:bookmarkEnd w:id="142"/>
+    <w:bookmarkStart w:id="144" w:name="X284569a1076713b35b76605781ea41e303e6132"/>
     <w:p>
       <w:pPr>
         <w:pStyle w:val="Bibliography"/>
@@ -58500,7 +58997,7 @@
       <w:r>
         <w:t xml:space="preserve"> </w:t>
       </w:r>
-      <w:hyperlink r:id="rId142">
+      <w:hyperlink r:id="rId143">
         <w:r>
           <w:rPr>
             <w:rStyle w:val="Hyperlink"/>
@@ -58509,8 +59006,8 @@
         </w:r>
       </w:hyperlink>
     </w:p>
-    <w:bookmarkEnd w:id="143"/>
-    <w:bookmarkStart w:id="145" w:name="X8e40b323e1cebef129773974979d417183cf94f"/>
+    <w:bookmarkEnd w:id="144"/>
+    <w:bookmarkStart w:id="146" w:name="X8e40b323e1cebef129773974979d417183cf94f"/>
     <w:p>
       <w:pPr>
         <w:pStyle w:val="Bibliography"/>
@@ -58557,7 +59054,7 @@
       <w:r>
         <w:t xml:space="preserve"> </w:t>
       </w:r>
-      <w:hyperlink r:id="rId144">
+      <w:hyperlink r:id="rId145">
         <w:r>
           <w:rPr>
             <w:rStyle w:val="Hyperlink"/>
@@ -58566,8 +59063,8 @@
         </w:r>
       </w:hyperlink>
     </w:p>
-    <w:bookmarkEnd w:id="145"/>
-    <w:bookmarkStart w:id="147" w:name="ref-wikipedia_normal_distribution"/>
+    <w:bookmarkEnd w:id="146"/>
+    <w:bookmarkStart w:id="148" w:name="ref-wikipedia_normal_distribution"/>
     <w:p>
       <w:pPr>
         <w:pStyle w:val="Bibliography"/>
@@ -58614,7 +59111,7 @@
       <w:r>
         <w:t xml:space="preserve"> </w:t>
       </w:r>
-      <w:hyperlink r:id="rId146">
+      <w:hyperlink r:id="rId147">
         <w:r>
           <w:rPr>
             <w:rStyle w:val="Hyperlink"/>
@@ -58623,8 +59120,8 @@
         </w:r>
       </w:hyperlink>
     </w:p>
-    <w:bookmarkEnd w:id="147"/>
-    <w:bookmarkStart w:id="149" w:name="ref-CaseBerg01"/>
+    <w:bookmarkEnd w:id="148"/>
+    <w:bookmarkStart w:id="150" w:name="ref-CaseBerg01"/>
     <w:p>
       <w:pPr>
         <w:pStyle w:val="Bibliography"/>
@@ -58657,7 +59154,7 @@
       <w:r>
         <w:t xml:space="preserve"> </w:t>
       </w:r>
-      <w:hyperlink r:id="rId148">
+      <w:hyperlink r:id="rId149">
         <w:r>
           <w:rPr>
             <w:rStyle w:val="Hyperlink"/>
@@ -58666,8 +59163,8 @@
         </w:r>
       </w:hyperlink>
     </w:p>
-    <w:bookmarkEnd w:id="149"/>
-    <w:bookmarkStart w:id="151" w:name="ref-wikipedia_exponential_distribution"/>
+    <w:bookmarkEnd w:id="150"/>
+    <w:bookmarkStart w:id="152" w:name="ref-wikipedia_exponential_distribution"/>
     <w:p>
       <w:pPr>
         <w:pStyle w:val="Bibliography"/>
@@ -58714,7 +59211,7 @@
       <w:r>
         <w:t xml:space="preserve"> </w:t>
       </w:r>
-      <w:hyperlink r:id="rId150">
+      <w:hyperlink r:id="rId151">
         <w:r>
           <w:rPr>
             <w:rStyle w:val="Hyperlink"/>
@@ -58723,8 +59220,8 @@
         </w:r>
       </w:hyperlink>
     </w:p>
-    <w:bookmarkEnd w:id="151"/>
-    <w:bookmarkStart w:id="153" w:name="X94f7c881ef14f58a67183d1131099bc3b3af124"/>
+    <w:bookmarkEnd w:id="152"/>
+    <w:bookmarkStart w:id="154" w:name="X94f7c881ef14f58a67183d1131099bc3b3af124"/>
     <w:p>
       <w:pPr>
         <w:pStyle w:val="Bibliography"/>
@@ -58771,7 +59268,7 @@
       <w:r>
         <w:t xml:space="preserve"> </w:t>
       </w:r>
-      <w:hyperlink r:id="rId152">
+      <w:hyperlink r:id="rId153">
         <w:r>
           <w:rPr>
             <w:rStyle w:val="Hyperlink"/>
@@ -58780,8 +59277,8 @@
         </w:r>
       </w:hyperlink>
     </w:p>
-    <w:bookmarkEnd w:id="153"/>
-    <w:bookmarkStart w:id="154" w:name="ref-billingsley1995probability"/>
+    <w:bookmarkEnd w:id="154"/>
+    <w:bookmarkStart w:id="155" w:name="ref-billingsley1995probability"/>
     <w:p>
       <w:pPr>
         <w:pStyle w:val="Bibliography"/>
@@ -58812,8 +59309,8 @@
         <w:t xml:space="preserve">, 3rd ed. in Wiley series in probability and mathematical statistics. New York: Wiley, 1995.</w:t>
       </w:r>
     </w:p>
-    <w:bookmarkEnd w:id="154"/>
-    <w:bookmarkStart w:id="156" w:name="ref-wikipedia_quantile_function"/>
+    <w:bookmarkEnd w:id="155"/>
+    <w:bookmarkStart w:id="157" w:name="ref-wikipedia_quantile_function"/>
     <w:p>
       <w:pPr>
         <w:pStyle w:val="Bibliography"/>
@@ -58860,7 +59357,7 @@
       <w:r>
         <w:t xml:space="preserve"> </w:t>
       </w:r>
-      <w:hyperlink r:id="rId155">
+      <w:hyperlink r:id="rId156">
         <w:r>
           <w:rPr>
             <w:rStyle w:val="Hyperlink"/>
@@ -58869,8 +59366,8 @@
         </w:r>
       </w:hyperlink>
     </w:p>
-    <w:bookmarkEnd w:id="156"/>
-    <w:bookmarkStart w:id="157" w:name="ref-me4"/>
+    <w:bookmarkEnd w:id="157"/>
+    <w:bookmarkStart w:id="158" w:name="ref-me4"/>
     <w:p>
       <w:pPr>
         <w:pStyle w:val="Bibliography"/>
@@ -58901,8 +59398,8 @@
         <w:t xml:space="preserve">, Fourth edition. Philadelphia: Wolters Kluwer, 2021.</w:t>
       </w:r>
     </w:p>
-    <w:bookmarkEnd w:id="157"/>
-    <w:bookmarkStart w:id="159" w:name="Xaf27294aed242081dab0bdcf1e3d8373c0fed17"/>
+    <w:bookmarkEnd w:id="158"/>
+    <w:bookmarkStart w:id="160" w:name="Xaf27294aed242081dab0bdcf1e3d8373c0fed17"/>
     <w:p>
       <w:pPr>
         <w:pStyle w:val="Bibliography"/>
@@ -58949,7 +59446,7 @@
       <w:r>
         <w:t xml:space="preserve"> </w:t>
       </w:r>
-      <w:hyperlink r:id="rId158">
+      <w:hyperlink r:id="rId159">
         <w:r>
           <w:rPr>
             <w:rStyle w:val="Hyperlink"/>
@@ -58958,8 +59455,8 @@
         </w:r>
       </w:hyperlink>
     </w:p>
-    <w:bookmarkEnd w:id="159"/>
-    <w:bookmarkStart w:id="161" w:name="ref-wikipedia_marginal_distribution"/>
+    <w:bookmarkEnd w:id="160"/>
+    <w:bookmarkStart w:id="162" w:name="ref-wikipedia_marginal_distribution"/>
     <w:p>
       <w:pPr>
         <w:pStyle w:val="Bibliography"/>
@@ -59006,7 +59503,7 @@
       <w:r>
         <w:t xml:space="preserve"> </w:t>
       </w:r>
-      <w:hyperlink r:id="rId160">
+      <w:hyperlink r:id="rId161">
         <w:r>
           <w:rPr>
             <w:rStyle w:val="Hyperlink"/>
@@ -59015,8 +59512,8 @@
         </w:r>
       </w:hyperlink>
     </w:p>
-    <w:bookmarkEnd w:id="161"/>
-    <w:bookmarkStart w:id="162" w:name="ref-hutchinson2024data471"/>
+    <w:bookmarkEnd w:id="162"/>
+    <w:bookmarkStart w:id="163" w:name="ref-hutchinson2024data471"/>
     <w:p>
       <w:pPr>
         <w:pStyle w:val="Bibliography"/>
@@ -59055,8 +59552,8 @@
         <w:t xml:space="preserve">Western Washington University, 2024.</w:t>
       </w:r>
     </w:p>
-    <w:bookmarkEnd w:id="162"/>
-    <w:bookmarkStart w:id="164" w:name="ref-hutchinson_wwu_ml_videos"/>
+    <w:bookmarkEnd w:id="163"/>
+    <w:bookmarkStart w:id="165" w:name="ref-hutchinson_wwu_ml_videos"/>
     <w:p>
       <w:pPr>
         <w:pStyle w:val="Bibliography"/>
@@ -59109,7 +59606,7 @@
       <w:r>
         <w:t xml:space="preserve"> </w:t>
       </w:r>
-      <w:hyperlink r:id="rId163">
+      <w:hyperlink r:id="rId164">
         <w:r>
           <w:rPr>
             <w:rStyle w:val="Hyperlink"/>
@@ -59118,8 +59615,8 @@
         </w:r>
       </w:hyperlink>
     </w:p>
-    <w:bookmarkEnd w:id="164"/>
-    <w:bookmarkStart w:id="166" w:name="ref-fiveminuteai_probstat"/>
+    <w:bookmarkEnd w:id="165"/>
+    <w:bookmarkStart w:id="167" w:name="ref-fiveminuteai_probstat"/>
     <w:p>
       <w:pPr>
         <w:pStyle w:val="Bibliography"/>
@@ -59151,7 +59648,7 @@
       <w:r>
         <w:t xml:space="preserve"> </w:t>
       </w:r>
-      <w:hyperlink r:id="rId165">
+      <w:hyperlink r:id="rId166">
         <w:r>
           <w:rPr>
             <w:rStyle w:val="Hyperlink"/>
@@ -59160,8 +59657,8 @@
         </w:r>
       </w:hyperlink>
     </w:p>
-    <w:bookmarkEnd w:id="166"/>
-    <w:bookmarkStart w:id="168" w:name="ref-wikipedia_survival_function"/>
+    <w:bookmarkEnd w:id="167"/>
+    <w:bookmarkStart w:id="169" w:name="ref-wikipedia_survival_function"/>
     <w:p>
       <w:pPr>
         <w:pStyle w:val="Bibliography"/>
@@ -59208,7 +59705,7 @@
       <w:r>
         <w:t xml:space="preserve"> </w:t>
       </w:r>
-      <w:hyperlink r:id="rId167">
+      <w:hyperlink r:id="rId168">
         <w:r>
           <w:rPr>
             <w:rStyle w:val="Hyperlink"/>
@@ -59217,8 +59714,8 @@
         </w:r>
       </w:hyperlink>
     </w:p>
-    <w:bookmarkEnd w:id="168"/>
-    <w:bookmarkStart w:id="170" w:name="ref-wikipedia_failure_rate"/>
+    <w:bookmarkEnd w:id="169"/>
+    <w:bookmarkStart w:id="171" w:name="ref-wikipedia_failure_rate"/>
     <w:p>
       <w:pPr>
         <w:pStyle w:val="Bibliography"/>
@@ -59265,7 +59762,7 @@
       <w:r>
         <w:t xml:space="preserve"> </w:t>
       </w:r>
-      <w:hyperlink r:id="rId169">
+      <w:hyperlink r:id="rId170">
         <w:r>
           <w:rPr>
             <w:rStyle w:val="Hyperlink"/>
@@ -59274,8 +59771,8 @@
         </w:r>
       </w:hyperlink>
     </w:p>
-    <w:bookmarkEnd w:id="170"/>
-    <w:bookmarkStart w:id="172" w:name="ref-dobson4e"/>
+    <w:bookmarkEnd w:id="171"/>
+    <w:bookmarkStart w:id="173" w:name="ref-dobson4e"/>
     <w:p>
       <w:pPr>
         <w:pStyle w:val="Bibliography"/>
@@ -59308,7 +59805,7 @@
       <w:r>
         <w:t xml:space="preserve"> </w:t>
       </w:r>
-      <w:hyperlink r:id="rId171">
+      <w:hyperlink r:id="rId172">
         <w:r>
           <w:rPr>
             <w:rStyle w:val="Hyperlink"/>
@@ -59320,8 +59817,8 @@
         <w:t xml:space="preserve">.</w:t>
       </w:r>
     </w:p>
-    <w:bookmarkEnd w:id="172"/>
-    <w:bookmarkStart w:id="174" w:name="ref-vittinghoff2e"/>
+    <w:bookmarkEnd w:id="173"/>
+    <w:bookmarkStart w:id="175" w:name="ref-vittinghoff2e"/>
     <w:p>
       <w:pPr>
         <w:pStyle w:val="Bibliography"/>
@@ -59354,7 +59851,7 @@
       <w:r>
         <w:t xml:space="preserve"> </w:t>
       </w:r>
-      <w:hyperlink r:id="rId173">
+      <w:hyperlink r:id="rId174">
         <w:r>
           <w:rPr>
             <w:rStyle w:val="Hyperlink"/>
@@ -59366,8 +59863,8 @@
         <w:t xml:space="preserve">.</w:t>
       </w:r>
     </w:p>
-    <w:bookmarkEnd w:id="174"/>
-    <w:bookmarkStart w:id="176" w:name="ref-klein2003survival"/>
+    <w:bookmarkEnd w:id="175"/>
+    <w:bookmarkStart w:id="177" w:name="ref-klein2003survival"/>
     <w:p>
       <w:pPr>
         <w:pStyle w:val="Bibliography"/>
@@ -59400,7 +59897,7 @@
       <w:r>
         <w:t xml:space="preserve"> </w:t>
       </w:r>
-      <w:hyperlink r:id="rId175">
+      <w:hyperlink r:id="rId176">
         <w:r>
           <w:rPr>
             <w:rStyle w:val="Hyperlink"/>
@@ -59409,8 +59906,8 @@
         </w:r>
       </w:hyperlink>
     </w:p>
-    <w:bookmarkEnd w:id="176"/>
-    <w:bookmarkStart w:id="178" w:name="ref-kleinbaum2012survival"/>
+    <w:bookmarkEnd w:id="177"/>
+    <w:bookmarkStart w:id="179" w:name="ref-kleinbaum2012survival"/>
     <w:p>
       <w:pPr>
         <w:pStyle w:val="Bibliography"/>
@@ -59443,7 +59940,7 @@
       <w:r>
         <w:t xml:space="preserve"> </w:t>
       </w:r>
-      <w:hyperlink r:id="rId177">
+      <w:hyperlink r:id="rId178">
         <w:r>
           <w:rPr>
             <w:rStyle w:val="Hyperlink"/>
@@ -59452,8 +59949,8 @@
         </w:r>
       </w:hyperlink>
     </w:p>
-    <w:bookmarkEnd w:id="178"/>
-    <w:bookmarkStart w:id="179" w:name="ref-kalbfleisch2011statistical"/>
+    <w:bookmarkEnd w:id="179"/>
+    <w:bookmarkStart w:id="180" w:name="ref-kalbfleisch2011statistical"/>
     <w:p>
       <w:pPr>
         <w:pStyle w:val="Bibliography"/>
@@ -59484,9 +59981,9 @@
         <w:t xml:space="preserve">. John Wiley &amp; Sons, 2011.</w:t>
       </w:r>
     </w:p>
-    <w:bookmarkEnd w:id="179"/>
     <w:bookmarkEnd w:id="180"/>
     <w:bookmarkEnd w:id="181"/>
+    <w:bookmarkEnd w:id="182"/>
     <w:sectPr>
       <w:footnotePr>
         <w:numRestart w:val="eachSect"/>

</xml_diff>